<commit_message>
Added a avoidance of forfeiture defense.
</commit_message>
<xml_diff>
--- a/docassemble/MAEvictionDefense/data/templates/SummaryProcessAnswer.docx
+++ b/docassemble/MAEvictionDefense/data/templates/SummaryProcessAnswer.docx
@@ -115,11 +115,19 @@
       </w:r>
       <w:proofErr w:type="spellStart"/>
       <w:r>
-        <w:t>include_docx_template</w:t>
-      </w:r>
-      <w:proofErr w:type="spellEnd"/>
-      <w:r>
-        <w:t>('include_CaseCaption.docx',</w:t>
+        <w:t>include_docx_</w:t>
+      </w:r>
+      <w:proofErr w:type="gramStart"/>
+      <w:r>
+        <w:t>template</w:t>
+      </w:r>
+      <w:proofErr w:type="spellEnd"/>
+      <w:r>
+        <w:t>(</w:t>
+      </w:r>
+      <w:proofErr w:type="gramEnd"/>
+      <w:r>
+        <w:t>'include_CaseCaption.docx',</w:t>
       </w:r>
       <w:proofErr w:type="spellStart"/>
       <w:r>
@@ -158,10 +166,12 @@
         <w:t xml:space="preserve">TRIAL DATE: {% if </w:t>
       </w:r>
       <w:proofErr w:type="spellStart"/>
+      <w:proofErr w:type="gramStart"/>
       <w:r>
         <w:t>case.status</w:t>
       </w:r>
       <w:proofErr w:type="spellEnd"/>
+      <w:proofErr w:type="gramEnd"/>
       <w:r>
         <w:t xml:space="preserve"> == "late" %} {{</w:t>
       </w:r>
@@ -179,7 +189,15 @@
         <w:spacing w:line="276" w:lineRule="auto"/>
       </w:pPr>
       <w:r>
-        <w:t xml:space="preserve">{% endif %}{% if </w:t>
+        <w:t xml:space="preserve">{% endif </w:t>
+      </w:r>
+      <w:proofErr w:type="gramStart"/>
+      <w:r>
+        <w:t>%}{</w:t>
+      </w:r>
+      <w:proofErr w:type="gramEnd"/>
+      <w:r>
+        <w:t xml:space="preserve">% if </w:t>
       </w:r>
       <w:proofErr w:type="spellStart"/>
       <w:r>
@@ -225,7 +243,15 @@
         <w:spacing w:line="276" w:lineRule="auto"/>
       </w:pPr>
       <w:r>
-        <w:t>My name is {{ tenant.name }}.</w:t>
+        <w:t xml:space="preserve">My name is </w:t>
+      </w:r>
+      <w:proofErr w:type="gramStart"/>
+      <w:r>
+        <w:t>{{ tenant.name</w:t>
+      </w:r>
+      <w:proofErr w:type="gramEnd"/>
+      <w:r>
+        <w:t xml:space="preserve"> }}.</w:t>
       </w:r>
     </w:p>
     <w:p>
@@ -238,19 +264,35 @@
         <w:spacing w:line="276" w:lineRule="auto"/>
       </w:pPr>
       <w:r>
-        <w:t xml:space="preserve">I live at {{ </w:t>
-      </w:r>
-      <w:proofErr w:type="spellStart"/>
-      <w:r>
-        <w:t>tenant.address.on_one_line</w:t>
-      </w:r>
-      <w:proofErr w:type="spellEnd"/>
-      <w:r>
-        <w:t xml:space="preserve">() }}. I moved in on or about {{ </w:t>
-      </w:r>
-      <w:proofErr w:type="spellStart"/>
-      <w:r>
-        <w:t>facts.tenant_movein</w:t>
+        <w:t xml:space="preserve">I live at </w:t>
+      </w:r>
+      <w:proofErr w:type="gramStart"/>
+      <w:r>
+        <w:t xml:space="preserve">{{ </w:t>
+      </w:r>
+      <w:proofErr w:type="spellStart"/>
+      <w:r>
+        <w:t>tenant</w:t>
+      </w:r>
+      <w:proofErr w:type="gramEnd"/>
+      <w:r>
+        <w:t>.address.on_one_line</w:t>
+      </w:r>
+      <w:proofErr w:type="spellEnd"/>
+      <w:r>
+        <w:t xml:space="preserve">() }}. I moved in on or about </w:t>
+      </w:r>
+      <w:proofErr w:type="gramStart"/>
+      <w:r>
+        <w:t xml:space="preserve">{{ </w:t>
+      </w:r>
+      <w:proofErr w:type="spellStart"/>
+      <w:r>
+        <w:t>facts</w:t>
+      </w:r>
+      <w:proofErr w:type="gramEnd"/>
+      <w:r>
+        <w:t>.tenant_movein</w:t>
       </w:r>
       <w:proofErr w:type="spellEnd"/>
       <w:r>
@@ -267,7 +309,15 @@
         <w:spacing w:line="276" w:lineRule="auto"/>
       </w:pPr>
       <w:r>
-        <w:t>My rent is {{ currency(</w:t>
+        <w:t xml:space="preserve">My rent is </w:t>
+      </w:r>
+      <w:proofErr w:type="gramStart"/>
+      <w:r>
+        <w:t>{{ currency</w:t>
+      </w:r>
+      <w:proofErr w:type="gramEnd"/>
+      <w:r>
+        <w:t>(</w:t>
       </w:r>
       <w:proofErr w:type="spellStart"/>
       <w:r>
@@ -310,8 +360,13 @@
         <w:t xml:space="preserve">{%p if </w:t>
       </w:r>
       <w:proofErr w:type="spellStart"/>
-      <w:r>
-        <w:t>facts.tenant_has_subsidy</w:t>
+      <w:proofErr w:type="gramStart"/>
+      <w:r>
+        <w:t>facts.tenant</w:t>
+      </w:r>
+      <w:proofErr w:type="gramEnd"/>
+      <w:r>
+        <w:t>_has_subsidy</w:t>
       </w:r>
       <w:proofErr w:type="spellEnd"/>
       <w:r>
@@ -347,19 +402,24 @@
         <w:t xml:space="preserve">I receive a rent subsidy. {% if </w:t>
       </w:r>
       <w:proofErr w:type="spellStart"/>
+      <w:proofErr w:type="gramStart"/>
+      <w:r>
+        <w:t>facts.tenant</w:t>
+      </w:r>
+      <w:proofErr w:type="gramEnd"/>
+      <w:r>
+        <w:t>_contract_rent</w:t>
+      </w:r>
+      <w:proofErr w:type="spellEnd"/>
+      <w:r>
+        <w:t xml:space="preserve"> %}The full contract rent is {{ currency(</w:t>
+      </w:r>
+      <w:proofErr w:type="spellStart"/>
       <w:r>
         <w:t>facts.tenant_contract_rent</w:t>
       </w:r>
       <w:proofErr w:type="spellEnd"/>
       <w:r>
-        <w:t xml:space="preserve"> %}The full contract rent is {{ currency(</w:t>
-      </w:r>
-      <w:proofErr w:type="spellStart"/>
-      <w:r>
-        <w:t>facts.tenant_contract_rent</w:t>
-      </w:r>
-      <w:proofErr w:type="spellEnd"/>
-      <w:r>
         <w:t>) }}. {% endif %}</w:t>
       </w:r>
     </w:p>
@@ -379,8 +439,13 @@
         <w:t xml:space="preserve">{%p if </w:t>
       </w:r>
       <w:proofErr w:type="spellStart"/>
-      <w:r>
-        <w:t>facts.tenant_has_lease</w:t>
+      <w:proofErr w:type="gramStart"/>
+      <w:r>
+        <w:t>facts.tenant</w:t>
+      </w:r>
+      <w:proofErr w:type="gramEnd"/>
+      <w:r>
+        <w:t>_has_lease</w:t>
       </w:r>
       <w:proofErr w:type="spellEnd"/>
       <w:r>
@@ -463,7 +528,15 @@
         <w:spacing w:line="276" w:lineRule="auto"/>
       </w:pPr>
       <w:r>
-        <w:t xml:space="preserve">I deny that I owe the amount of rent or use and occupancy listed in the landlord’s complaint. </w:t>
+        <w:t xml:space="preserve">I deny that I owe the amount of rent or </w:t>
+      </w:r>
+      <w:proofErr w:type="gramStart"/>
+      <w:r>
+        <w:t>use</w:t>
+      </w:r>
+      <w:proofErr w:type="gramEnd"/>
+      <w:r>
+        <w:t xml:space="preserve"> and occupancy listed in the landlord’s complaint. </w:t>
       </w:r>
     </w:p>
     <w:p>
@@ -676,7 +749,15 @@
       </w:r>
       <w:proofErr w:type="spellStart"/>
       <w:r>
-        <w:t>initial_defense.improper_time_given</w:t>
+        <w:t>initial_</w:t>
+      </w:r>
+      <w:proofErr w:type="gramStart"/>
+      <w:r>
+        <w:t>defense.improper</w:t>
+      </w:r>
+      <w:proofErr w:type="gramEnd"/>
+      <w:r>
+        <w:t>_time_given</w:t>
       </w:r>
       <w:proofErr w:type="spellEnd"/>
       <w:r>
@@ -715,7 +796,15 @@
       </w:r>
       <w:proofErr w:type="spellStart"/>
       <w:r>
-        <w:t>initial_defense.need_ntq</w:t>
+        <w:t>initial_</w:t>
+      </w:r>
+      <w:proofErr w:type="gramStart"/>
+      <w:r>
+        <w:t>defense.need</w:t>
+      </w:r>
+      <w:proofErr w:type="gramEnd"/>
+      <w:r>
+        <w:t>_ntq</w:t>
       </w:r>
       <w:proofErr w:type="spellEnd"/>
       <w:r>
@@ -790,7 +879,15 @@
       </w:r>
       <w:proofErr w:type="spellStart"/>
       <w:r>
-        <w:t>initial_defense.premature_commencement</w:t>
+        <w:t>initial_</w:t>
+      </w:r>
+      <w:proofErr w:type="gramStart"/>
+      <w:r>
+        <w:t>defense.premature</w:t>
+      </w:r>
+      <w:proofErr w:type="gramEnd"/>
+      <w:r>
+        <w:t>_commencement</w:t>
       </w:r>
       <w:proofErr w:type="spellEnd"/>
       <w:r>
@@ -807,7 +904,15 @@
         <w:suppressAutoHyphens/>
       </w:pPr>
       <w:r>
-        <w:t xml:space="preserve">The landlord started this case before the Notice to Quit expired. </w:t>
+        <w:t xml:space="preserve">The landlord started this case before the Notice to </w:t>
+      </w:r>
+      <w:proofErr w:type="gramStart"/>
+      <w:r>
+        <w:t>Quit</w:t>
+      </w:r>
+      <w:proofErr w:type="gramEnd"/>
+      <w:r>
+        <w:t xml:space="preserve"> expired. </w:t>
       </w:r>
     </w:p>
     <w:p>
@@ -828,9 +933,14 @@
       </w:r>
       <w:proofErr w:type="spellStart"/>
       <w:r>
-        <w:t>initial_defense.varney</w:t>
-      </w:r>
-      <w:proofErr w:type="spellEnd"/>
+        <w:t>initial_</w:t>
+      </w:r>
+      <w:proofErr w:type="gramStart"/>
+      <w:r>
+        <w:t>defense.varney</w:t>
+      </w:r>
+      <w:proofErr w:type="spellEnd"/>
+      <w:proofErr w:type="gramEnd"/>
       <w:r>
         <w:t xml:space="preserve"> %}</w:t>
       </w:r>
@@ -845,7 +955,15 @@
         <w:suppressAutoHyphens/>
       </w:pPr>
       <w:r>
-        <w:t>The landlord is a corporation or other business entity and this case was not brought by an attorney so it should be dismissed.</w:t>
+        <w:t xml:space="preserve">The landlord is a corporation or other business </w:t>
+      </w:r>
+      <w:proofErr w:type="gramStart"/>
+      <w:r>
+        <w:t>entity</w:t>
+      </w:r>
+      <w:proofErr w:type="gramEnd"/>
+      <w:r>
+        <w:t xml:space="preserve"> and this case was not brought by an attorney so it should be dismissed.</w:t>
       </w:r>
     </w:p>
     <w:p>
@@ -867,7 +985,15 @@
       </w:r>
       <w:proofErr w:type="spellStart"/>
       <w:r>
-        <w:t>initial_defense.defective_summons</w:t>
+        <w:t>initial_</w:t>
+      </w:r>
+      <w:proofErr w:type="gramStart"/>
+      <w:r>
+        <w:t>defense.defective</w:t>
+      </w:r>
+      <w:proofErr w:type="gramEnd"/>
+      <w:r>
+        <w:t>_summons</w:t>
       </w:r>
       <w:proofErr w:type="spellEnd"/>
       <w:r>
@@ -914,9 +1040,14 @@
       </w:r>
       <w:proofErr w:type="spellStart"/>
       <w:r>
-        <w:t>initial_defense.cure</w:t>
-      </w:r>
-      <w:proofErr w:type="spellEnd"/>
+        <w:t>initial_</w:t>
+      </w:r>
+      <w:proofErr w:type="gramStart"/>
+      <w:r>
+        <w:t>defense.cure</w:t>
+      </w:r>
+      <w:proofErr w:type="spellEnd"/>
+      <w:proofErr w:type="gramEnd"/>
       <w:r>
         <w:t xml:space="preserve"> %}</w:t>
       </w:r>
@@ -992,7 +1123,15 @@
       </w:r>
       <w:proofErr w:type="spellStart"/>
       <w:r>
-        <w:t>initial_defense.inconsistent_reasons</w:t>
+        <w:t>initial_</w:t>
+      </w:r>
+      <w:proofErr w:type="gramStart"/>
+      <w:r>
+        <w:t>defense.inconsistent</w:t>
+      </w:r>
+      <w:proofErr w:type="gramEnd"/>
+      <w:r>
+        <w:t>_reasons</w:t>
       </w:r>
       <w:proofErr w:type="spellEnd"/>
       <w:r>
@@ -1071,19 +1210,25 @@
       </w:r>
       <w:proofErr w:type="spellStart"/>
       <w:r>
-        <w:t>showifdef</w:t>
-      </w:r>
-      <w:proofErr w:type="spellEnd"/>
-      <w:r>
-        <w:t>('</w:t>
-      </w:r>
-      <w:proofErr w:type="spellStart"/>
-      <w:r>
-        <w:t>initial_defense.custom_reason_for_dismissal</w:t>
-      </w:r>
-      <w:proofErr w:type="spellEnd"/>
-      <w:r>
-        <w:t>') %}</w:t>
+        <w:t>initial_</w:t>
+      </w:r>
+      <w:proofErr w:type="gramStart"/>
+      <w:r>
+        <w:t>defense.</w:t>
+      </w:r>
+      <w:r>
+        <w:t>avoidance</w:t>
+      </w:r>
+      <w:proofErr w:type="gramEnd"/>
+      <w:r>
+        <w:t>_of_forfeiture</w:t>
+      </w:r>
+      <w:proofErr w:type="spellEnd"/>
+      <w:r>
+        <w:t xml:space="preserve"> </w:t>
+      </w:r>
+      <w:r>
+        <w:t>%}</w:t>
       </w:r>
     </w:p>
     <w:p>
@@ -1096,15 +1241,7 @@
         <w:suppressAutoHyphens/>
       </w:pPr>
       <w:r>
-        <w:t xml:space="preserve">The landlord’s case should be dismissed because {{ </w:t>
-      </w:r>
-      <w:proofErr w:type="spellStart"/>
-      <w:r>
-        <w:t>initial_defense.custom_reason_for_dismissal</w:t>
-      </w:r>
-      <w:proofErr w:type="spellEnd"/>
-      <w:r>
-        <w:t xml:space="preserve"> }}.</w:t>
+        <w:t>Based on principles of equity and fairness, it is unfair to evict me.</w:t>
       </w:r>
     </w:p>
     <w:p>
@@ -1118,14 +1255,90 @@
     </w:p>
     <w:p>
       <w:pPr>
-        <w:pStyle w:val="BodyText"/>
+        <w:pStyle w:val="ListwithNoSpace"/>
+        <w:ind w:left="360"/>
       </w:pPr>
       <w:r>
         <w:t xml:space="preserve">{%p if </w:t>
       </w:r>
       <w:proofErr w:type="spellStart"/>
       <w:r>
-        <w:t>facts.tenant_has_subsidy</w:t>
+        <w:t>showifdef</w:t>
+      </w:r>
+      <w:proofErr w:type="spellEnd"/>
+      <w:r>
+        <w:t>('</w:t>
+      </w:r>
+      <w:proofErr w:type="spellStart"/>
+      <w:r>
+        <w:t>initial_</w:t>
+      </w:r>
+      <w:proofErr w:type="gramStart"/>
+      <w:r>
+        <w:t>defense.custom</w:t>
+      </w:r>
+      <w:proofErr w:type="gramEnd"/>
+      <w:r>
+        <w:t>_reason_for_dismissal</w:t>
+      </w:r>
+      <w:proofErr w:type="spellEnd"/>
+      <w:r>
+        <w:t>') %}</w:t>
+      </w:r>
+    </w:p>
+    <w:p>
+      <w:pPr>
+        <w:pStyle w:val="ListwithNoSpace"/>
+        <w:numPr>
+          <w:ilvl w:val="0"/>
+          <w:numId w:val="14"/>
+        </w:numPr>
+        <w:suppressAutoHyphens/>
+      </w:pPr>
+      <w:r>
+        <w:t xml:space="preserve">The landlord’s case should be dismissed because </w:t>
+      </w:r>
+      <w:proofErr w:type="gramStart"/>
+      <w:r>
+        <w:t xml:space="preserve">{{ </w:t>
+      </w:r>
+      <w:proofErr w:type="spellStart"/>
+      <w:r>
+        <w:t>initial</w:t>
+      </w:r>
+      <w:proofErr w:type="gramEnd"/>
+      <w:r>
+        <w:t>_defense.custom_reason_for_dismissal</w:t>
+      </w:r>
+      <w:proofErr w:type="spellEnd"/>
+      <w:r>
+        <w:t xml:space="preserve"> }}.</w:t>
+      </w:r>
+    </w:p>
+    <w:p>
+      <w:pPr>
+        <w:pStyle w:val="ListwithNoSpace"/>
+        <w:ind w:left="360"/>
+      </w:pPr>
+      <w:r>
+        <w:t>{%p endif %}</w:t>
+      </w:r>
+    </w:p>
+    <w:p>
+      <w:pPr>
+        <w:pStyle w:val="BodyText"/>
+      </w:pPr>
+      <w:r>
+        <w:t xml:space="preserve">{%p if </w:t>
+      </w:r>
+      <w:proofErr w:type="spellStart"/>
+      <w:proofErr w:type="gramStart"/>
+      <w:r>
+        <w:t>facts.tenant</w:t>
+      </w:r>
+      <w:proofErr w:type="gramEnd"/>
+      <w:r>
+        <w:t>_has_subsidy</w:t>
       </w:r>
       <w:proofErr w:type="spellEnd"/>
       <w:r>
@@ -1348,7 +1561,15 @@
         <w:contextualSpacing/>
       </w:pPr>
       <w:r>
-        <w:t xml:space="preserve">I am a tenant in public or subsidized housing and the landlord did not give me my right to a grievance hearing or conference as required by the lease and/or program rules or I requested a hearing/conference and the process was not completed before I received the complaint. </w:t>
+        <w:t>I am a tenant in public or subsidized housing and the landlord did not give me my right to a grievance hearing or conference as required by the lease and/or program rules or I requested a hearing/</w:t>
+      </w:r>
+      <w:proofErr w:type="gramStart"/>
+      <w:r>
+        <w:t>conference</w:t>
+      </w:r>
+      <w:proofErr w:type="gramEnd"/>
+      <w:r>
+        <w:t xml:space="preserve"> and the process was not completed before I received the complaint. </w:t>
       </w:r>
     </w:p>
     <w:p>
@@ -1374,9 +1595,14 @@
       </w:r>
       <w:proofErr w:type="spellStart"/>
       <w:r>
-        <w:t>subsidized_housing.vawa</w:t>
-      </w:r>
-      <w:proofErr w:type="spellEnd"/>
+        <w:t>subsidized_</w:t>
+      </w:r>
+      <w:proofErr w:type="gramStart"/>
+      <w:r>
+        <w:t>housing.vawa</w:t>
+      </w:r>
+      <w:proofErr w:type="spellEnd"/>
+      <w:proofErr w:type="gramEnd"/>
       <w:r>
         <w:t xml:space="preserve"> %}</w:t>
       </w:r>
@@ -1393,6 +1619,7 @@
         <w:contextualSpacing/>
       </w:pPr>
       <w:r>
+        <w:lastRenderedPageBreak/>
         <w:t>I reside in federal public housing or subsidized Section 8 or other covered federal housing and have a defense under the Violence Against Women Act (42 U.S.C. 14043e-11).</w:t>
       </w:r>
     </w:p>
@@ -1404,7 +1631,6 @@
         <w:contextualSpacing/>
       </w:pPr>
       <w:r>
-        <w:lastRenderedPageBreak/>
         <w:t>{%p endif %}</w:t>
       </w:r>
     </w:p>
@@ -1444,8 +1670,13 @@
         <w:pStyle w:val="Caption"/>
         <w:spacing w:line="276" w:lineRule="auto"/>
       </w:pPr>
-      <w:r>
-        <w:t xml:space="preserve">Defense{% if </w:t>
+      <w:proofErr w:type="gramStart"/>
+      <w:r>
+        <w:t>Defense{</w:t>
+      </w:r>
+      <w:proofErr w:type="gramEnd"/>
+      <w:r>
+        <w:t xml:space="preserve">% if </w:t>
       </w:r>
       <w:proofErr w:type="spellStart"/>
       <w:r>
@@ -1498,8 +1729,13 @@
         <w:t xml:space="preserve">{%p if </w:t>
       </w:r>
       <w:proofErr w:type="spellStart"/>
-      <w:r>
-        <w:t>retaliation.withheld_rent</w:t>
+      <w:proofErr w:type="gramStart"/>
+      <w:r>
+        <w:t>retaliation.withheld</w:t>
+      </w:r>
+      <w:proofErr w:type="gramEnd"/>
+      <w:r>
+        <w:t>_rent</w:t>
       </w:r>
       <w:proofErr w:type="spellEnd"/>
       <w:r>
@@ -1543,8 +1779,13 @@
         <w:t xml:space="preserve">{%p if </w:t>
       </w:r>
       <w:proofErr w:type="spellStart"/>
-      <w:r>
-        <w:t>retaliation.badconditions_to_landlord</w:t>
+      <w:proofErr w:type="gramStart"/>
+      <w:r>
+        <w:t>retaliation.badconditions</w:t>
+      </w:r>
+      <w:proofErr w:type="gramEnd"/>
+      <w:r>
+        <w:t>_to_landlord</w:t>
       </w:r>
       <w:proofErr w:type="spellEnd"/>
       <w:r>
@@ -1588,8 +1829,13 @@
         <w:t xml:space="preserve">{%p if </w:t>
       </w:r>
       <w:proofErr w:type="spellStart"/>
-      <w:r>
-        <w:t>retaliation.badconditions_to_agency</w:t>
+      <w:proofErr w:type="gramStart"/>
+      <w:r>
+        <w:t>retaliation.badconditions</w:t>
+      </w:r>
+      <w:proofErr w:type="gramEnd"/>
+      <w:r>
+        <w:t>_to_agency</w:t>
       </w:r>
       <w:proofErr w:type="spellEnd"/>
       <w:r>
@@ -1633,8 +1879,13 @@
         <w:t xml:space="preserve">{%p if </w:t>
       </w:r>
       <w:proofErr w:type="spellStart"/>
-      <w:r>
-        <w:t>retaliation.tenant_union</w:t>
+      <w:proofErr w:type="gramStart"/>
+      <w:r>
+        <w:t>retaliation.tenant</w:t>
+      </w:r>
+      <w:proofErr w:type="gramEnd"/>
+      <w:r>
+        <w:t>_union</w:t>
       </w:r>
       <w:proofErr w:type="spellEnd"/>
       <w:r>
@@ -1678,8 +1929,13 @@
         <w:t xml:space="preserve">{%p if </w:t>
       </w:r>
       <w:proofErr w:type="spellStart"/>
-      <w:r>
-        <w:t>retaliation.brought_claim</w:t>
+      <w:proofErr w:type="gramStart"/>
+      <w:r>
+        <w:t>retaliation.brought</w:t>
+      </w:r>
+      <w:proofErr w:type="gramEnd"/>
+      <w:r>
+        <w:t>_claim</w:t>
       </w:r>
       <w:proofErr w:type="spellEnd"/>
       <w:r>
@@ -1723,8 +1979,13 @@
         <w:t xml:space="preserve">{%p if </w:t>
       </w:r>
       <w:proofErr w:type="spellStart"/>
-      <w:r>
-        <w:t>retaliation.protection_or_prevention_order</w:t>
+      <w:proofErr w:type="gramStart"/>
+      <w:r>
+        <w:t>retaliation.protection</w:t>
+      </w:r>
+      <w:proofErr w:type="gramEnd"/>
+      <w:r>
+        <w:t>_or_prevention_order</w:t>
       </w:r>
       <w:proofErr w:type="spellEnd"/>
       <w:r>
@@ -1743,8 +2004,13 @@
         <w:contextualSpacing/>
       </w:pPr>
       <w:r>
-        <w:t>I or a member of my household took action to obtain a protection order under G.L. c. 209A or a harassment prevention order under G.L. c. 258E;</w:t>
-      </w:r>
+        <w:t xml:space="preserve">I or a member of my household took action to obtain a protection order under G.L. c. 209A or a harassment prevention order under G.L. c. </w:t>
+      </w:r>
+      <w:proofErr w:type="gramStart"/>
+      <w:r>
+        <w:t>258E;</w:t>
+      </w:r>
+      <w:proofErr w:type="gramEnd"/>
     </w:p>
     <w:p>
       <w:pPr>
@@ -1768,8 +2034,13 @@
         <w:t xml:space="preserve">{%p if </w:t>
       </w:r>
       <w:proofErr w:type="spellStart"/>
-      <w:r>
-        <w:t>retaliation.domestic_violence</w:t>
+      <w:proofErr w:type="gramStart"/>
+      <w:r>
+        <w:t>retaliation.domestic</w:t>
+      </w:r>
+      <w:proofErr w:type="gramEnd"/>
+      <w:r>
+        <w:t>_violence</w:t>
       </w:r>
       <w:proofErr w:type="spellEnd"/>
       <w:r>
@@ -1813,8 +2084,13 @@
         <w:t xml:space="preserve">{%p if </w:t>
       </w:r>
       <w:proofErr w:type="spellStart"/>
-      <w:r>
-        <w:t>retaliation.survivor_rights</w:t>
+      <w:proofErr w:type="gramStart"/>
+      <w:r>
+        <w:t>retaliation.survivor</w:t>
+      </w:r>
+      <w:proofErr w:type="gramEnd"/>
+      <w:r>
+        <w:t>_rights</w:t>
       </w:r>
       <w:proofErr w:type="spellEnd"/>
       <w:r>
@@ -1833,6 +2109,7 @@
         <w:contextualSpacing/>
       </w:pPr>
       <w:r>
+        <w:lastRenderedPageBreak/>
         <w:t>I am a survivor of abuse, sexual assault, rape or stalking and the landlord is evicting me for exercising my rights to break my lease or change my locks for safety reasons under G.L. c. 186, §§23-29.</w:t>
       </w:r>
     </w:p>
@@ -1844,7 +2121,6 @@
         <w:contextualSpacing/>
       </w:pPr>
       <w:r>
-        <w:lastRenderedPageBreak/>
         <w:t>{%p endif %}</w:t>
       </w:r>
     </w:p>
@@ -1856,7 +2132,15 @@
         <w:contextualSpacing/>
       </w:pPr>
       <w:r>
-        <w:t xml:space="preserve">{%p  if </w:t>
+        <w:t>{%</w:t>
+      </w:r>
+      <w:proofErr w:type="gramStart"/>
+      <w:r>
+        <w:t>p  if</w:t>
+      </w:r>
+      <w:proofErr w:type="gramEnd"/>
+      <w:r>
+        <w:t xml:space="preserve"> </w:t>
       </w:r>
       <w:proofErr w:type="spellStart"/>
       <w:r>
@@ -1878,12 +2162,17 @@
         <w:spacing w:after="144"/>
         <w:contextualSpacing/>
       </w:pPr>
+      <w:proofErr w:type="gramStart"/>
       <w:r>
         <w:t xml:space="preserve">{{ </w:t>
       </w:r>
       <w:proofErr w:type="spellStart"/>
       <w:r>
-        <w:t>retaliation.other</w:t>
+        <w:t>retaliation</w:t>
+      </w:r>
+      <w:proofErr w:type="gramEnd"/>
+      <w:r>
+        <w:t>.other</w:t>
       </w:r>
       <w:proofErr w:type="spellEnd"/>
       <w:r>
@@ -1918,7 +2207,15 @@
         <w:pStyle w:val="BodyText"/>
       </w:pPr>
       <w:r>
-        <w:t>{%p if retaliation.within_6_months %}</w:t>
+        <w:t xml:space="preserve">{%p if </w:t>
+      </w:r>
+      <w:proofErr w:type="gramStart"/>
+      <w:r>
+        <w:t>retaliation.within</w:t>
+      </w:r>
+      <w:proofErr w:type="gramEnd"/>
+      <w:r>
+        <w:t>_6_months %}</w:t>
       </w:r>
     </w:p>
     <w:p>
@@ -1931,7 +2228,15 @@
         <w:suppressAutoHyphens/>
       </w:pPr>
       <w:r>
-        <w:t xml:space="preserve"> I am entitled to a presumption of retaliation because the landlord took action against me within 6 months of any of the above.</w:t>
+        <w:t xml:space="preserve"> I am entitled to a presumption of retaliation because the landlord </w:t>
+      </w:r>
+      <w:proofErr w:type="gramStart"/>
+      <w:r>
+        <w:t>took action</w:t>
+      </w:r>
+      <w:proofErr w:type="gramEnd"/>
+      <w:r>
+        <w:t xml:space="preserve"> against me within 6 months of any of the above.</w:t>
       </w:r>
     </w:p>
     <w:p>
@@ -1976,8 +2281,13 @@
         <w:pStyle w:val="Caption"/>
         <w:spacing w:line="276" w:lineRule="auto"/>
       </w:pPr>
-      <w:r>
-        <w:t xml:space="preserve">Defense{% if </w:t>
+      <w:proofErr w:type="gramStart"/>
+      <w:r>
+        <w:t>Defense{</w:t>
+      </w:r>
+      <w:proofErr w:type="gramEnd"/>
+      <w:r>
+        <w:t xml:space="preserve">% if </w:t>
       </w:r>
       <w:proofErr w:type="spellStart"/>
       <w:r>
@@ -2007,7 +2317,15 @@
       </w:r>
       <w:r>
         <w:br/>
-        <w:t xml:space="preserve">Federal Fair Housing Act; Americans With Disabilities Act; </w:t>
+        <w:t xml:space="preserve">Federal Fair Housing Act; Americans </w:t>
+      </w:r>
+      <w:proofErr w:type="gramStart"/>
+      <w:r>
+        <w:t>With</w:t>
+      </w:r>
+      <w:proofErr w:type="gramEnd"/>
+      <w:r>
+        <w:t xml:space="preserve"> Disabilities Act; </w:t>
       </w:r>
       <w:r>
         <w:br/>
@@ -2038,8 +2356,13 @@
         <w:t xml:space="preserve">{%p for class in </w:t>
       </w:r>
       <w:proofErr w:type="spellStart"/>
-      <w:r>
-        <w:t>discrimination.protected_classes.true_values</w:t>
+      <w:proofErr w:type="gramStart"/>
+      <w:r>
+        <w:t>discrimination.protected</w:t>
+      </w:r>
+      <w:proofErr w:type="gramEnd"/>
+      <w:r>
+        <w:t>_classes.true_values</w:t>
       </w:r>
       <w:proofErr w:type="spellEnd"/>
       <w:r>
@@ -2057,8 +2380,13 @@
         <w:spacing w:after="144"/>
         <w:contextualSpacing/>
       </w:pPr>
-      <w:r>
-        <w:t>{{ class }}</w:t>
+      <w:proofErr w:type="gramStart"/>
+      <w:r>
+        <w:t>{{ class</w:t>
+      </w:r>
+      <w:proofErr w:type="gramEnd"/>
+      <w:r>
+        <w:t xml:space="preserve"> }}</w:t>
       </w:r>
     </w:p>
     <w:p>
@@ -2087,11 +2415,19 @@
         <w:ind w:left="360"/>
       </w:pPr>
       <w:r>
-        <w:t xml:space="preserve">{%p if  </w:t>
-      </w:r>
-      <w:proofErr w:type="spellStart"/>
-      <w:r>
-        <w:t>delay_in_raft</w:t>
+        <w:t xml:space="preserve">{%p </w:t>
+      </w:r>
+      <w:proofErr w:type="gramStart"/>
+      <w:r>
+        <w:t xml:space="preserve">if  </w:t>
+      </w:r>
+      <w:proofErr w:type="spellStart"/>
+      <w:r>
+        <w:t>delay</w:t>
+      </w:r>
+      <w:proofErr w:type="gramEnd"/>
+      <w:r>
+        <w:t>_in_raft</w:t>
       </w:r>
       <w:proofErr w:type="spellEnd"/>
       <w:r>
@@ -2148,8 +2484,13 @@
         <w:t xml:space="preserve">and </w:t>
       </w:r>
       <w:proofErr w:type="spellStart"/>
-      <w:r>
-        <w:t>disability.request_reasonable_accommodation</w:t>
+      <w:proofErr w:type="gramStart"/>
+      <w:r>
+        <w:t>disability.request</w:t>
+      </w:r>
+      <w:proofErr w:type="gramEnd"/>
+      <w:r>
+        <w:t>_reasonable_accommodation</w:t>
       </w:r>
       <w:proofErr w:type="spellEnd"/>
       <w:r>
@@ -2177,7 +2518,6 @@
         <w:rPr>
           <w:rFonts w:ascii="Garamond" w:hAnsi="Garamond"/>
         </w:rPr>
-        <w:lastRenderedPageBreak/>
         <w:t xml:space="preserve">See BHA vs. </w:t>
       </w:r>
       <w:proofErr w:type="spellStart"/>
@@ -2205,7 +2545,15 @@
         <w:suppressAutoHyphens/>
       </w:pPr>
       <w:r>
-        <w:t>I (and/or a member of my household) have a disability and I request/have requested that the landlord make changes in its rules or do what is necessary for me to have a fair housing opportunity. Failing to provide a reasonable accommodation to a qualified person with a disability is disability-based discrimination. Note: This may include allowing the tenant to get help or do something necessary to address a lease violation.</w:t>
+        <w:t xml:space="preserve">I (and/or a member of my household) have a </w:t>
+      </w:r>
+      <w:proofErr w:type="gramStart"/>
+      <w:r>
+        <w:t>disability</w:t>
+      </w:r>
+      <w:proofErr w:type="gramEnd"/>
+      <w:r>
+        <w:t xml:space="preserve"> and I request/have requested that the landlord make changes in its rules or do what is necessary for me to have a fair housing opportunity. Failing to provide a reasonable accommodation to a qualified person with a disability is disability-based discrimination. Note: This may include allowing the tenant to get help or do something necessary to address a lease violation.</w:t>
       </w:r>
     </w:p>
     <w:p>
@@ -2225,10 +2573,12 @@
         <w:t xml:space="preserve">{%p if </w:t>
       </w:r>
       <w:proofErr w:type="spellStart"/>
+      <w:proofErr w:type="gramStart"/>
       <w:r>
         <w:t>claims.harassment</w:t>
       </w:r>
       <w:proofErr w:type="spellEnd"/>
+      <w:proofErr w:type="gramEnd"/>
       <w:r>
         <w:t xml:space="preserve"> %}</w:t>
       </w:r>
@@ -2295,8 +2645,13 @@
         <w:t xml:space="preserve">{%p if </w:t>
       </w:r>
       <w:proofErr w:type="spellStart"/>
-      <w:r>
-        <w:t>discrimination.sexual_harassment.pressured_sexual_favors</w:t>
+      <w:proofErr w:type="gramStart"/>
+      <w:r>
+        <w:t>discrimination.sexual</w:t>
+      </w:r>
+      <w:proofErr w:type="gramEnd"/>
+      <w:r>
+        <w:t>_harassment.pressured_sexual_favors</w:t>
       </w:r>
       <w:proofErr w:type="spellEnd"/>
       <w:r>
@@ -2340,8 +2695,13 @@
         <w:t xml:space="preserve">{%p if </w:t>
       </w:r>
       <w:proofErr w:type="spellStart"/>
-      <w:r>
-        <w:t>discrimination.sexual_harassment.tenancy_terms_changed</w:t>
+      <w:proofErr w:type="gramStart"/>
+      <w:r>
+        <w:t>discrimination.sexual</w:t>
+      </w:r>
+      <w:proofErr w:type="gramEnd"/>
+      <w:r>
+        <w:t>_harassment.tenancy_terms_changed</w:t>
       </w:r>
       <w:proofErr w:type="spellEnd"/>
       <w:r>
@@ -2385,8 +2745,13 @@
         <w:t xml:space="preserve">{%p if </w:t>
       </w:r>
       <w:proofErr w:type="spellStart"/>
-      <w:r>
-        <w:t>discrimination.sexual_harassment.unsafe_or_uncomfortable</w:t>
+      <w:proofErr w:type="gramStart"/>
+      <w:r>
+        <w:t>discrimination.sexual</w:t>
+      </w:r>
+      <w:proofErr w:type="gramEnd"/>
+      <w:r>
+        <w:t>_harassment.unsafe_or_uncomfortable</w:t>
       </w:r>
       <w:proofErr w:type="spellEnd"/>
       <w:r>
@@ -2405,7 +2770,15 @@
         <w:contextualSpacing/>
       </w:pPr>
       <w:r>
-        <w:t>I felt unsafe or uncomfortable in my home as a result of sexual harassment.</w:t>
+        <w:t xml:space="preserve">I felt unsafe or uncomfortable in my home </w:t>
+      </w:r>
+      <w:proofErr w:type="gramStart"/>
+      <w:r>
+        <w:t>as a result of</w:t>
+      </w:r>
+      <w:proofErr w:type="gramEnd"/>
+      <w:r>
+        <w:t xml:space="preserve"> sexual harassment.</w:t>
       </w:r>
     </w:p>
     <w:p>
@@ -2519,6 +2892,7 @@
         <w:ind w:left="360"/>
       </w:pPr>
       <w:r>
+        <w:lastRenderedPageBreak/>
         <w:t xml:space="preserve">{%p if </w:t>
       </w:r>
       <w:proofErr w:type="spellStart"/>
@@ -2549,7 +2923,6 @@
         <w:ind w:left="360"/>
       </w:pPr>
       <w:r>
-        <w:lastRenderedPageBreak/>
         <w:t>{%p endif %}</w:t>
       </w:r>
     </w:p>
@@ -2654,7 +3027,21 @@
         <w:rPr>
           <w:rFonts w:ascii="Garamond" w:hAnsi="Garamond"/>
         </w:rPr>
-        <w:t>bad_conditions.have_conditions</w:t>
+        <w:t>bad_</w:t>
+      </w:r>
+      <w:proofErr w:type="gramStart"/>
+      <w:r>
+        <w:rPr>
+          <w:rFonts w:ascii="Garamond" w:hAnsi="Garamond"/>
+        </w:rPr>
+        <w:t>conditions.have</w:t>
+      </w:r>
+      <w:proofErr w:type="gramEnd"/>
+      <w:r>
+        <w:rPr>
+          <w:rFonts w:ascii="Garamond" w:hAnsi="Garamond"/>
+        </w:rPr>
+        <w:t>_conditions</w:t>
       </w:r>
       <w:proofErr w:type="spellEnd"/>
       <w:r>
@@ -2726,7 +3113,15 @@
       </w:r>
       <w:proofErr w:type="spellStart"/>
       <w:r>
-        <w:t>bad_conditions.conditions.true_values</w:t>
+        <w:t>bad_</w:t>
+      </w:r>
+      <w:proofErr w:type="gramStart"/>
+      <w:r>
+        <w:t>conditions.conditions</w:t>
+      </w:r>
+      <w:proofErr w:type="gramEnd"/>
+      <w:r>
+        <w:t>.true_values</w:t>
       </w:r>
       <w:proofErr w:type="spellEnd"/>
       <w:r>
@@ -2744,8 +3139,13 @@
         <w:spacing w:after="144"/>
         <w:contextualSpacing/>
       </w:pPr>
-      <w:r>
-        <w:t>{{ condition }}</w:t>
+      <w:proofErr w:type="gramStart"/>
+      <w:r>
+        <w:t>{{ condition</w:t>
+      </w:r>
+      <w:proofErr w:type="gramEnd"/>
+      <w:r>
+        <w:t xml:space="preserve"> }}</w:t>
       </w:r>
     </w:p>
     <w:p>
@@ -2779,9 +3179,14 @@
       </w:r>
       <w:proofErr w:type="spellStart"/>
       <w:r>
-        <w:t>bad_conditions.conditions</w:t>
-      </w:r>
-      <w:proofErr w:type="spellEnd"/>
+        <w:t>bad_</w:t>
+      </w:r>
+      <w:proofErr w:type="gramStart"/>
+      <w:r>
+        <w:t>conditions.conditions</w:t>
+      </w:r>
+      <w:proofErr w:type="spellEnd"/>
+      <w:proofErr w:type="gramEnd"/>
       <w:r>
         <w:t>['other'] %}</w:t>
       </w:r>
@@ -2797,12 +3202,17 @@
         <w:spacing w:after="144"/>
         <w:contextualSpacing/>
       </w:pPr>
+      <w:proofErr w:type="gramStart"/>
       <w:r>
         <w:t xml:space="preserve">{{ </w:t>
       </w:r>
       <w:proofErr w:type="spellStart"/>
       <w:r>
-        <w:t>bad_conditions.other_condition</w:t>
+        <w:t>bad</w:t>
+      </w:r>
+      <w:proofErr w:type="gramEnd"/>
+      <w:r>
+        <w:t>_conditions.other_condition</w:t>
       </w:r>
       <w:proofErr w:type="spellEnd"/>
       <w:r>
@@ -2832,11 +3242,19 @@
       </w:r>
       <w:proofErr w:type="spellStart"/>
       <w:r>
-        <w:t>bad_conditions.landlord_notified.any_true</w:t>
-      </w:r>
-      <w:proofErr w:type="spellEnd"/>
-      <w:r>
-        <w:t>() %}</w:t>
+        <w:t>bad_conditions.landlord_notified.any_</w:t>
+      </w:r>
+      <w:proofErr w:type="gramStart"/>
+      <w:r>
+        <w:t>true</w:t>
+      </w:r>
+      <w:proofErr w:type="spellEnd"/>
+      <w:r>
+        <w:t>(</w:t>
+      </w:r>
+      <w:proofErr w:type="gramEnd"/>
+      <w:r>
+        <w:t>) %}</w:t>
       </w:r>
     </w:p>
     <w:p>
@@ -2864,7 +3282,15 @@
       </w:r>
       <w:proofErr w:type="spellStart"/>
       <w:r>
-        <w:t>bad_conditions.landlord_notified.true_values</w:t>
+        <w:t>bad_</w:t>
+      </w:r>
+      <w:proofErr w:type="gramStart"/>
+      <w:r>
+        <w:t>conditions.landlord</w:t>
+      </w:r>
+      <w:proofErr w:type="gramEnd"/>
+      <w:r>
+        <w:t>_notified.true_values</w:t>
       </w:r>
       <w:proofErr w:type="spellEnd"/>
       <w:r>
@@ -2882,8 +3308,13 @@
         <w:spacing w:after="144"/>
         <w:contextualSpacing/>
       </w:pPr>
-      <w:r>
-        <w:t>{{ notified}}</w:t>
+      <w:proofErr w:type="gramStart"/>
+      <w:r>
+        <w:t>{{ notified</w:t>
+      </w:r>
+      <w:proofErr w:type="gramEnd"/>
+      <w:r>
+        <w:t>}}</w:t>
       </w:r>
     </w:p>
     <w:p>
@@ -2916,7 +3347,11 @@
       </w:r>
       <w:r>
         <w:br/>
-        <w:t xml:space="preserve">(a) the full market rental value of my home in good condition, and (b) the reduced value of my home in its bad condition. </w:t>
+        <w:t xml:space="preserve">(a) the full market rental value of my home in good condition, and (b) the reduced value of my </w:t>
+      </w:r>
+      <w:r>
+        <w:lastRenderedPageBreak/>
+        <w:t xml:space="preserve">home in its bad condition. </w:t>
       </w:r>
       <w:r>
         <w:rPr>
@@ -2936,7 +3371,6 @@
         <w:contextualSpacing/>
       </w:pPr>
       <w:r>
-        <w:lastRenderedPageBreak/>
         <w:tab/>
         <w:t>{%p endif %}</w:t>
       </w:r>
@@ -2968,9 +3402,14 @@
       </w:r>
       <w:proofErr w:type="spellStart"/>
       <w:r>
-        <w:t>security_deposit.violated</w:t>
-      </w:r>
-      <w:proofErr w:type="spellEnd"/>
+        <w:t>security_</w:t>
+      </w:r>
+      <w:proofErr w:type="gramStart"/>
+      <w:r>
+        <w:t>deposit.violated</w:t>
+      </w:r>
+      <w:proofErr w:type="spellEnd"/>
+      <w:proofErr w:type="gramEnd"/>
       <w:r>
         <w:t xml:space="preserve"> %}</w:t>
       </w:r>
@@ -3020,11 +3459,19 @@
         <w:suppressAutoHyphens/>
       </w:pPr>
       <w:r>
-        <w:t xml:space="preserve">I paid a security deposit of $ {{ </w:t>
-      </w:r>
-      <w:proofErr w:type="spellStart"/>
-      <w:r>
-        <w:t>security_deposit.amount</w:t>
+        <w:t xml:space="preserve">I paid a security deposit of $ </w:t>
+      </w:r>
+      <w:proofErr w:type="gramStart"/>
+      <w:r>
+        <w:t xml:space="preserve">{{ </w:t>
+      </w:r>
+      <w:proofErr w:type="spellStart"/>
+      <w:r>
+        <w:t>security</w:t>
+      </w:r>
+      <w:proofErr w:type="gramEnd"/>
+      <w:r>
+        <w:t>_deposit.amount</w:t>
       </w:r>
       <w:proofErr w:type="spellEnd"/>
       <w:r>
@@ -3056,7 +3503,15 @@
       </w:r>
       <w:proofErr w:type="spellStart"/>
       <w:r>
-        <w:t>security_deposit.violations.true_values</w:t>
+        <w:t>security_</w:t>
+      </w:r>
+      <w:proofErr w:type="gramStart"/>
+      <w:r>
+        <w:t>deposit.violations</w:t>
+      </w:r>
+      <w:proofErr w:type="gramEnd"/>
+      <w:r>
+        <w:t>.true_values</w:t>
       </w:r>
       <w:proofErr w:type="spellEnd"/>
       <w:r>
@@ -3126,9 +3581,14 @@
       </w:r>
       <w:proofErr w:type="spellStart"/>
       <w:r>
-        <w:t>last_months_rent.violated</w:t>
-      </w:r>
-      <w:proofErr w:type="spellEnd"/>
+        <w:t>last_months_</w:t>
+      </w:r>
+      <w:proofErr w:type="gramStart"/>
+      <w:r>
+        <w:t>rent.violated</w:t>
+      </w:r>
+      <w:proofErr w:type="spellEnd"/>
+      <w:proofErr w:type="gramEnd"/>
       <w:r>
         <w:t xml:space="preserve"> %}</w:t>
       </w:r>
@@ -3181,11 +3641,19 @@
         <w:suppressAutoHyphens/>
       </w:pPr>
       <w:r>
-        <w:t xml:space="preserve">I paid last month’s rent of $ {{ </w:t>
-      </w:r>
-      <w:proofErr w:type="spellStart"/>
-      <w:r>
-        <w:t>last_months_rent.amount</w:t>
+        <w:t xml:space="preserve">I paid last month’s rent of $ </w:t>
+      </w:r>
+      <w:proofErr w:type="gramStart"/>
+      <w:r>
+        <w:t xml:space="preserve">{{ </w:t>
+      </w:r>
+      <w:proofErr w:type="spellStart"/>
+      <w:r>
+        <w:t>last</w:t>
+      </w:r>
+      <w:proofErr w:type="gramEnd"/>
+      <w:r>
+        <w:t>_months_rent.amount</w:t>
       </w:r>
       <w:proofErr w:type="spellEnd"/>
       <w:r>
@@ -3216,10 +3684,12 @@
         <w:t xml:space="preserve">{%p if </w:t>
       </w:r>
       <w:proofErr w:type="spellStart"/>
+      <w:proofErr w:type="gramStart"/>
       <w:r>
         <w:t>bqe.violated</w:t>
       </w:r>
       <w:proofErr w:type="spellEnd"/>
+      <w:proofErr w:type="gramEnd"/>
       <w:r>
         <w:t xml:space="preserve"> %}</w:t>
       </w:r>
@@ -3246,6 +3716,7 @@
         <w:pStyle w:val="CenterTitle"/>
       </w:pPr>
       <w:r>
+        <w:lastRenderedPageBreak/>
         <w:t>Interference with Utilities and Use of Home</w:t>
       </w:r>
       <w:r>
@@ -3271,7 +3742,6 @@
         <w:suppressAutoHyphens/>
       </w:pPr>
       <w:r>
-        <w:lastRenderedPageBreak/>
         <w:t xml:space="preserve"> The landlord did the following:</w:t>
       </w:r>
     </w:p>
@@ -3286,10 +3756,12 @@
         <w:t xml:space="preserve">{%p if </w:t>
       </w:r>
       <w:proofErr w:type="spellStart"/>
+      <w:proofErr w:type="gramStart"/>
       <w:r>
         <w:t>bqe.heat</w:t>
       </w:r>
       <w:proofErr w:type="spellEnd"/>
+      <w:proofErr w:type="gramEnd"/>
       <w:r>
         <w:t xml:space="preserve"> %}</w:t>
       </w:r>
@@ -3376,8 +3848,13 @@
         <w:t xml:space="preserve">{%p if </w:t>
       </w:r>
       <w:proofErr w:type="spellStart"/>
-      <w:r>
-        <w:t>bqe.unpaid_utilities</w:t>
+      <w:proofErr w:type="gramStart"/>
+      <w:r>
+        <w:t>bqe.unpaid</w:t>
+      </w:r>
+      <w:proofErr w:type="gramEnd"/>
+      <w:r>
+        <w:t>_utilities</w:t>
       </w:r>
       <w:proofErr w:type="spellEnd"/>
       <w:r>
@@ -3421,8 +3898,13 @@
         <w:t xml:space="preserve">{%p if </w:t>
       </w:r>
       <w:proofErr w:type="spellStart"/>
-      <w:r>
-        <w:t>bqe.shutoff_utilities</w:t>
+      <w:proofErr w:type="gramStart"/>
+      <w:r>
+        <w:t>bqe.shutoff</w:t>
+      </w:r>
+      <w:proofErr w:type="gramEnd"/>
+      <w:r>
+        <w:t>_utilities</w:t>
       </w:r>
       <w:proofErr w:type="spellEnd"/>
       <w:r>
@@ -3466,8 +3948,13 @@
         <w:t xml:space="preserve">{%p if </w:t>
       </w:r>
       <w:proofErr w:type="spellStart"/>
-      <w:r>
-        <w:t>bqe.locked_out</w:t>
+      <w:proofErr w:type="gramStart"/>
+      <w:r>
+        <w:t>bqe.locked</w:t>
+      </w:r>
+      <w:proofErr w:type="gramEnd"/>
+      <w:r>
+        <w:t>_out</w:t>
       </w:r>
       <w:proofErr w:type="spellEnd"/>
       <w:r>
@@ -3511,8 +3998,13 @@
         <w:t xml:space="preserve">{%p if </w:t>
       </w:r>
       <w:proofErr w:type="spellStart"/>
-      <w:r>
-        <w:t>bqe.removed_possessions</w:t>
+      <w:proofErr w:type="gramStart"/>
+      <w:r>
+        <w:t>bqe.removed</w:t>
+      </w:r>
+      <w:proofErr w:type="gramEnd"/>
+      <w:r>
+        <w:t>_possessions</w:t>
       </w:r>
       <w:proofErr w:type="spellEnd"/>
       <w:r>
@@ -3601,8 +4093,13 @@
         <w:t xml:space="preserve">{%p if </w:t>
       </w:r>
       <w:proofErr w:type="spellStart"/>
-      <w:r>
-        <w:t>bqe.entered_without_permission</w:t>
+      <w:proofErr w:type="gramStart"/>
+      <w:r>
+        <w:t>bqe.entered</w:t>
+      </w:r>
+      <w:proofErr w:type="gramEnd"/>
+      <w:r>
+        <w:t>_without_permission</w:t>
       </w:r>
       <w:proofErr w:type="spellEnd"/>
       <w:r>
@@ -3646,10 +4143,12 @@
         <w:t xml:space="preserve">{%p if </w:t>
       </w:r>
       <w:proofErr w:type="spellStart"/>
+      <w:proofErr w:type="gramStart"/>
       <w:r>
         <w:t>bqe.other</w:t>
       </w:r>
       <w:proofErr w:type="spellEnd"/>
+      <w:proofErr w:type="gramEnd"/>
       <w:r>
         <w:t xml:space="preserve"> %}</w:t>
       </w:r>
@@ -3666,11 +4165,19 @@
         <w:contextualSpacing/>
       </w:pPr>
       <w:r>
-        <w:t xml:space="preserve">Interfered with my right to enjoy my home in other ways by {{ </w:t>
-      </w:r>
-      <w:proofErr w:type="spellStart"/>
-      <w:r>
-        <w:t>bqe.other</w:t>
+        <w:t xml:space="preserve">Interfered with my right to enjoy my home in other ways by </w:t>
+      </w:r>
+      <w:proofErr w:type="gramStart"/>
+      <w:r>
+        <w:t xml:space="preserve">{{ </w:t>
+      </w:r>
+      <w:proofErr w:type="spellStart"/>
+      <w:r>
+        <w:t>bqe</w:t>
+      </w:r>
+      <w:proofErr w:type="gramEnd"/>
+      <w:r>
+        <w:t>.other</w:t>
       </w:r>
       <w:proofErr w:type="spellEnd"/>
       <w:r>
@@ -3698,10 +4205,12 @@
         <w:t xml:space="preserve">{%p if </w:t>
       </w:r>
       <w:proofErr w:type="spellStart"/>
+      <w:proofErr w:type="gramStart"/>
       <w:r>
         <w:t>claims.utilities</w:t>
       </w:r>
       <w:proofErr w:type="spellEnd"/>
+      <w:proofErr w:type="gramEnd"/>
       <w:r>
         <w:t xml:space="preserve"> %}</w:t>
       </w:r>
@@ -3716,8 +4225,13 @@
         <w:t xml:space="preserve">{%p if </w:t>
       </w:r>
       <w:proofErr w:type="spellStart"/>
-      <w:r>
-        <w:t>bqe.billed_no_agreement</w:t>
+      <w:proofErr w:type="gramStart"/>
+      <w:r>
+        <w:t>bqe.billed</w:t>
+      </w:r>
+      <w:proofErr w:type="gramEnd"/>
+      <w:r>
+        <w:t>_no_agreement</w:t>
       </w:r>
       <w:proofErr w:type="spellEnd"/>
       <w:r>
@@ -3734,7 +4248,15 @@
         <w:suppressAutoHyphens/>
       </w:pPr>
       <w:r>
-        <w:t xml:space="preserve">I have been billed for heat, hot water, electricity and/or gas and the landlord and I did not have a written agreement requiring me to pay for these utilities. I request that the landlord promptly start paying for such utilities.  This defense and counterclaim entitles me to damages under G.L. c. 186, §14, and c. 93A. See also Mass. Sanitary Code, 105 CMR 410.354. </w:t>
+        <w:t xml:space="preserve">I have been billed for heat, hot water, electricity and/or gas and the landlord and I did not have a written agreement requiring me to pay for these utilities. I request that the landlord promptly start paying for such utilities.  This defense and counterclaim </w:t>
+      </w:r>
+      <w:proofErr w:type="gramStart"/>
+      <w:r>
+        <w:t>entitles</w:t>
+      </w:r>
+      <w:proofErr w:type="gramEnd"/>
+      <w:r>
+        <w:t xml:space="preserve"> me to damages under G.L. c. 186, §14, and c. 93A. See also Mass. Sanitary Code, 105 CMR 410.354. </w:t>
       </w:r>
     </w:p>
     <w:p>
@@ -3752,11 +4274,17 @@
         <w:ind w:left="360"/>
       </w:pPr>
       <w:r>
+        <w:lastRenderedPageBreak/>
         <w:t xml:space="preserve">{%p if </w:t>
       </w:r>
       <w:proofErr w:type="spellStart"/>
-      <w:r>
-        <w:t>bqe.billed_for_others</w:t>
+      <w:proofErr w:type="gramStart"/>
+      <w:r>
+        <w:t>bqe.billed</w:t>
+      </w:r>
+      <w:proofErr w:type="gramEnd"/>
+      <w:r>
+        <w:t>_for_others</w:t>
       </w:r>
       <w:proofErr w:type="spellEnd"/>
       <w:r>
@@ -3773,11 +4301,15 @@
         <w:suppressAutoHyphens/>
       </w:pPr>
       <w:r>
-        <w:t xml:space="preserve">I have been billed for gas, oil and/or electricity that go to other people’s apartments or common areas (such as hallways, stairways, basements, or porches). This defense and </w:t>
-      </w:r>
-      <w:r>
-        <w:lastRenderedPageBreak/>
-        <w:t xml:space="preserve">counterclaim entitles me to damages under G.L. c. 186, §14, and/or c. 93A. See also Mass. Sanitary Code, 105 CMR 410.354. </w:t>
+        <w:t xml:space="preserve">I have been billed for gas, oil and/or electricity that go to other people’s apartments or common areas (such as hallways, stairways, basements, or porches). This defense and counterclaim </w:t>
+      </w:r>
+      <w:proofErr w:type="gramStart"/>
+      <w:r>
+        <w:t>entitles</w:t>
+      </w:r>
+      <w:proofErr w:type="gramEnd"/>
+      <w:r>
+        <w:t xml:space="preserve"> me to damages under G.L. c. 186, §14, and/or c. 93A. See also Mass. Sanitary Code, 105 CMR 410.354. </w:t>
       </w:r>
     </w:p>
     <w:p>
@@ -3802,7 +4334,15 @@
         <w:pStyle w:val="BodyText"/>
       </w:pPr>
       <w:r>
-        <w:t>This defense and counterclaim entitles me to three times the rent (calculated at the full contract rent for tenants with subsidies) or my actual damages, whichever is greater.</w:t>
+        <w:t xml:space="preserve">This defense and counterclaim </w:t>
+      </w:r>
+      <w:proofErr w:type="gramStart"/>
+      <w:r>
+        <w:t>entitles</w:t>
+      </w:r>
+      <w:proofErr w:type="gramEnd"/>
+      <w:r>
+        <w:t xml:space="preserve"> me to three times the rent (calculated at the full contract rent for tenants with subsidies) or my actual damages, whichever is greater.</w:t>
       </w:r>
     </w:p>
     <w:p>
@@ -3837,8 +4377,13 @@
         <w:t xml:space="preserve">{%p if </w:t>
       </w:r>
       <w:proofErr w:type="spellStart"/>
-      <w:r>
-        <w:t>facts.tenant_has_subsidy</w:t>
+      <w:proofErr w:type="gramStart"/>
+      <w:r>
+        <w:t>facts.tenant</w:t>
+      </w:r>
+      <w:proofErr w:type="gramEnd"/>
+      <w:r>
+        <w:t>_has_subsidy</w:t>
       </w:r>
       <w:proofErr w:type="spellEnd"/>
       <w:r>
@@ -3890,7 +4435,15 @@
       </w:r>
       <w:proofErr w:type="spellStart"/>
       <w:r>
-        <w:t>subsidized_housing.stopped_payment</w:t>
+        <w:t>subsidized_</w:t>
+      </w:r>
+      <w:proofErr w:type="gramStart"/>
+      <w:r>
+        <w:t>housing.stopped</w:t>
+      </w:r>
+      <w:proofErr w:type="gramEnd"/>
+      <w:r>
+        <w:t>_payment</w:t>
       </w:r>
       <w:proofErr w:type="spellEnd"/>
       <w:r>
@@ -3942,7 +4495,15 @@
       </w:r>
       <w:proofErr w:type="spellStart"/>
       <w:r>
-        <w:t>subsidized_housing.improper_rent_calculation</w:t>
+        <w:t>subsidized_</w:t>
+      </w:r>
+      <w:proofErr w:type="gramStart"/>
+      <w:r>
+        <w:t>housing.improper</w:t>
+      </w:r>
+      <w:proofErr w:type="gramEnd"/>
+      <w:r>
+        <w:t>_rent_calculation</w:t>
       </w:r>
       <w:proofErr w:type="spellEnd"/>
       <w:r>
@@ -3981,7 +4542,15 @@
       </w:r>
       <w:proofErr w:type="spellStart"/>
       <w:r>
-        <w:t>subsidized_housing.landlord_overcharged</w:t>
+        <w:t>subsidized_</w:t>
+      </w:r>
+      <w:proofErr w:type="gramStart"/>
+      <w:r>
+        <w:t>housing.landlord</w:t>
+      </w:r>
+      <w:proofErr w:type="gramEnd"/>
+      <w:r>
+        <w:t>_overcharged</w:t>
       </w:r>
       <w:proofErr w:type="spellEnd"/>
       <w:r>
@@ -4023,6 +4592,7 @@
         <w:pStyle w:val="BodyText"/>
       </w:pPr>
       <w:r>
+        <w:lastRenderedPageBreak/>
         <w:t>{%p if plead_93a %}</w:t>
       </w:r>
     </w:p>
@@ -4036,7 +4606,6 @@
         <w:pStyle w:val="Caption"/>
       </w:pPr>
       <w:r>
-        <w:lastRenderedPageBreak/>
         <w:t>Defense &amp; Counterclaim</w:t>
       </w:r>
       <w:r>
@@ -4098,7 +4667,15 @@
       </w:r>
       <w:proofErr w:type="spellStart"/>
       <w:r>
-        <w:t>consumer_protection.late_fees</w:t>
+        <w:t>consumer_</w:t>
+      </w:r>
+      <w:proofErr w:type="gramStart"/>
+      <w:r>
+        <w:t>protection.late</w:t>
+      </w:r>
+      <w:proofErr w:type="gramEnd"/>
+      <w:r>
+        <w:t>_fees</w:t>
       </w:r>
       <w:proofErr w:type="spellEnd"/>
       <w:r>
@@ -4143,7 +4720,15 @@
       </w:r>
       <w:proofErr w:type="spellStart"/>
       <w:r>
-        <w:t>consumer_protection.nonagreed_rent</w:t>
+        <w:t>consumer_</w:t>
+      </w:r>
+      <w:proofErr w:type="gramStart"/>
+      <w:r>
+        <w:t>protection.nonagreed</w:t>
+      </w:r>
+      <w:proofErr w:type="gramEnd"/>
+      <w:r>
+        <w:t>_rent</w:t>
       </w:r>
       <w:proofErr w:type="spellEnd"/>
       <w:r>
@@ -4188,7 +4773,15 @@
       </w:r>
       <w:proofErr w:type="spellStart"/>
       <w:r>
-        <w:t>consumer_protection.unlawful_court_fees</w:t>
+        <w:t>consumer_</w:t>
+      </w:r>
+      <w:proofErr w:type="gramStart"/>
+      <w:r>
+        <w:t>protection.unlawful</w:t>
+      </w:r>
+      <w:proofErr w:type="gramEnd"/>
+      <w:r>
+        <w:t>_court_fees</w:t>
       </w:r>
       <w:proofErr w:type="spellEnd"/>
       <w:r>
@@ -4233,7 +4826,15 @@
       </w:r>
       <w:proofErr w:type="spellStart"/>
       <w:r>
-        <w:t>consumer_protection.unlawful_lease_terms</w:t>
+        <w:t>consumer_</w:t>
+      </w:r>
+      <w:proofErr w:type="gramStart"/>
+      <w:r>
+        <w:t>protection.unlawful</w:t>
+      </w:r>
+      <w:proofErr w:type="gramEnd"/>
+      <w:r>
+        <w:t>_lease_terms</w:t>
       </w:r>
       <w:proofErr w:type="spellEnd"/>
       <w:r>
@@ -4278,9 +4879,14 @@
       </w:r>
       <w:proofErr w:type="spellStart"/>
       <w:r>
-        <w:t>consumer_protection.other</w:t>
-      </w:r>
-      <w:proofErr w:type="spellEnd"/>
+        <w:t>consumer_</w:t>
+      </w:r>
+      <w:proofErr w:type="gramStart"/>
+      <w:r>
+        <w:t>protection.other</w:t>
+      </w:r>
+      <w:proofErr w:type="spellEnd"/>
+      <w:proofErr w:type="gramEnd"/>
       <w:r>
         <w:t xml:space="preserve"> %}</w:t>
       </w:r>
@@ -4297,11 +4903,19 @@
         <w:contextualSpacing/>
       </w:pPr>
       <w:r>
-        <w:t xml:space="preserve">Other: {{ </w:t>
-      </w:r>
-      <w:proofErr w:type="spellStart"/>
-      <w:r>
-        <w:t>consumer_protection.other_reason</w:t>
+        <w:t xml:space="preserve">Other: </w:t>
+      </w:r>
+      <w:proofErr w:type="gramStart"/>
+      <w:r>
+        <w:t xml:space="preserve">{{ </w:t>
+      </w:r>
+      <w:proofErr w:type="spellStart"/>
+      <w:r>
+        <w:t>consumer</w:t>
+      </w:r>
+      <w:proofErr w:type="gramEnd"/>
+      <w:r>
+        <w:t>_protection.other_reason</w:t>
       </w:r>
       <w:proofErr w:type="spellEnd"/>
       <w:r>
@@ -4344,13 +4958,18 @@
         <w:pStyle w:val="BodyText"/>
       </w:pPr>
       <w:r>
-        <w:t xml:space="preserve">{%p if  </w:t>
+        <w:t xml:space="preserve">{%p </w:t>
+      </w:r>
+      <w:proofErr w:type="gramStart"/>
+      <w:r>
+        <w:t xml:space="preserve">if  </w:t>
       </w:r>
       <w:proofErr w:type="spellStart"/>
       <w:r>
         <w:t>eviction_all_reasons.get</w:t>
       </w:r>
       <w:proofErr w:type="spellEnd"/>
+      <w:proofErr w:type="gramEnd"/>
       <w:r>
         <w:t>("nonpayment") %}</w:t>
       </w:r>
@@ -4484,8 +5103,13 @@
         <w:t>('</w:t>
       </w:r>
       <w:proofErr w:type="spellStart"/>
-      <w:r>
-        <w:t>other.vendor_payments</w:t>
+      <w:proofErr w:type="gramStart"/>
+      <w:r>
+        <w:t>other.vendor</w:t>
+      </w:r>
+      <w:proofErr w:type="gramEnd"/>
+      <w:r>
+        <w:t>_payments</w:t>
       </w:r>
       <w:proofErr w:type="spellEnd"/>
       <w:r>
@@ -4523,8 +5147,13 @@
         <w:t>{%p if not (</w:t>
       </w:r>
       <w:proofErr w:type="spellStart"/>
-      <w:r>
-        <w:t>facts.tenant_has_subsidy</w:t>
+      <w:proofErr w:type="gramStart"/>
+      <w:r>
+        <w:t>facts.tenant</w:t>
+      </w:r>
+      <w:proofErr w:type="gramEnd"/>
+      <w:r>
+        <w:t>_has_subsidy</w:t>
       </w:r>
       <w:proofErr w:type="spellEnd"/>
       <w:r>
@@ -4565,11 +5194,19 @@
       </w:r>
       <w:proofErr w:type="spellStart"/>
       <w:r>
-        <w:t>condo_violations.any_true</w:t>
-      </w:r>
-      <w:proofErr w:type="spellEnd"/>
-      <w:r>
-        <w:t>()) or (defined('</w:t>
+        <w:t>condo_violations.any_</w:t>
+      </w:r>
+      <w:proofErr w:type="gramStart"/>
+      <w:r>
+        <w:t>true</w:t>
+      </w:r>
+      <w:proofErr w:type="spellEnd"/>
+      <w:r>
+        <w:t>(</w:t>
+      </w:r>
+      <w:proofErr w:type="gramEnd"/>
+      <w:r>
+        <w:t>)) or (defined('</w:t>
       </w:r>
       <w:proofErr w:type="spellStart"/>
       <w:r>
@@ -4611,7 +5248,15 @@
       </w:r>
       <w:proofErr w:type="spellStart"/>
       <w:r>
-        <w:t>condo_violations.true_values</w:t>
+        <w:t>condo_</w:t>
+      </w:r>
+      <w:proofErr w:type="gramStart"/>
+      <w:r>
+        <w:t>violations.true</w:t>
+      </w:r>
+      <w:proofErr w:type="gramEnd"/>
+      <w:r>
+        <w:t>_values</w:t>
       </w:r>
       <w:proofErr w:type="spellEnd"/>
       <w:r>
@@ -4627,8 +5272,13 @@
         </w:numPr>
         <w:suppressAutoHyphens/>
       </w:pPr>
-      <w:r>
-        <w:t>{{ violation }}</w:t>
+      <w:proofErr w:type="gramStart"/>
+      <w:r>
+        <w:t>{{ violation</w:t>
+      </w:r>
+      <w:proofErr w:type="gramEnd"/>
+      <w:r>
+        <w:t xml:space="preserve"> }}</w:t>
       </w:r>
     </w:p>
     <w:p>
@@ -4688,7 +5338,15 @@
       </w:r>
       <w:proofErr w:type="spellStart"/>
       <w:r>
-        <w:t>condo_local_violations.true_values</w:t>
+        <w:t>condo_local_</w:t>
+      </w:r>
+      <w:proofErr w:type="gramStart"/>
+      <w:r>
+        <w:t>violations.true</w:t>
+      </w:r>
+      <w:proofErr w:type="gramEnd"/>
+      <w:r>
+        <w:t>_values</w:t>
       </w:r>
       <w:proofErr w:type="spellEnd"/>
       <w:r>
@@ -4704,8 +5362,13 @@
         </w:numPr>
         <w:suppressAutoHyphens/>
       </w:pPr>
-      <w:r>
-        <w:t>{{ violation }}</w:t>
+      <w:proofErr w:type="gramStart"/>
+      <w:r>
+        <w:t>{{ violation</w:t>
+      </w:r>
+      <w:proofErr w:type="gramEnd"/>
+      <w:r>
+        <w:t xml:space="preserve"> }}</w:t>
       </w:r>
     </w:p>
     <w:p>
@@ -4769,8 +5432,13 @@
         <w:t>('</w:t>
       </w:r>
       <w:proofErr w:type="spellStart"/>
-      <w:r>
-        <w:t>other.repair_and_deduct_statute</w:t>
+      <w:proofErr w:type="gramStart"/>
+      <w:r>
+        <w:t>other.repair</w:t>
+      </w:r>
+      <w:proofErr w:type="gramEnd"/>
+      <w:r>
+        <w:t>_and_deduct_statute</w:t>
       </w:r>
       <w:proofErr w:type="spellEnd"/>
       <w:r>
@@ -4817,8 +5485,13 @@
         <w:t>('</w:t>
       </w:r>
       <w:proofErr w:type="spellStart"/>
-      <w:r>
-        <w:t>other.water_violation</w:t>
+      <w:proofErr w:type="gramStart"/>
+      <w:r>
+        <w:t>other.water</w:t>
+      </w:r>
+      <w:proofErr w:type="gramEnd"/>
+      <w:r>
+        <w:t>_violation</w:t>
       </w:r>
       <w:proofErr w:type="spellEnd"/>
       <w:r>
@@ -4856,8 +5529,13 @@
         <w:t>{%p if not (</w:t>
       </w:r>
       <w:proofErr w:type="spellStart"/>
-      <w:r>
-        <w:t>facts.tenant_has_subsidy</w:t>
+      <w:proofErr w:type="gramStart"/>
+      <w:r>
+        <w:t>facts.tenant</w:t>
+      </w:r>
+      <w:proofErr w:type="gramEnd"/>
+      <w:r>
+        <w:t>_has_subsidy</w:t>
       </w:r>
       <w:proofErr w:type="spellEnd"/>
       <w:r>
@@ -4904,8 +5582,13 @@
         <w:t xml:space="preserve">{%p if </w:t>
       </w:r>
       <w:proofErr w:type="spellStart"/>
-      <w:r>
-        <w:t>postforeclosure.failure_to_comply</w:t>
+      <w:proofErr w:type="gramStart"/>
+      <w:r>
+        <w:t>postforeclosure.failure</w:t>
+      </w:r>
+      <w:proofErr w:type="gramEnd"/>
+      <w:r>
+        <w:t>_to_comply</w:t>
       </w:r>
       <w:proofErr w:type="spellEnd"/>
       <w:r>
@@ -4957,8 +5640,13 @@
         <w:t xml:space="preserve">{%p if </w:t>
       </w:r>
       <w:proofErr w:type="spellStart"/>
-      <w:r>
-        <w:t>postforeclosure.unfair_loan_mod</w:t>
+      <w:proofErr w:type="gramStart"/>
+      <w:r>
+        <w:t>postforeclosure.unfair</w:t>
+      </w:r>
+      <w:proofErr w:type="gramEnd"/>
+      <w:r>
+        <w:t>_loan_mod</w:t>
       </w:r>
       <w:proofErr w:type="spellEnd"/>
       <w:r>
@@ -5002,8 +5690,13 @@
         <w:t xml:space="preserve">{%p if </w:t>
       </w:r>
       <w:proofErr w:type="spellStart"/>
-      <w:r>
-        <w:t>postforeclosure.unfair_notices</w:t>
+      <w:proofErr w:type="gramStart"/>
+      <w:r>
+        <w:t>postforeclosure.unfair</w:t>
+      </w:r>
+      <w:proofErr w:type="gramEnd"/>
+      <w:r>
+        <w:t>_notices</w:t>
       </w:r>
       <w:proofErr w:type="spellEnd"/>
       <w:r>
@@ -5047,8 +5740,13 @@
         <w:t xml:space="preserve">{%p if </w:t>
       </w:r>
       <w:proofErr w:type="spellStart"/>
-      <w:r>
-        <w:t>postforeclosure.unfair_loan_based_on_income</w:t>
+      <w:proofErr w:type="gramStart"/>
+      <w:r>
+        <w:t>postforeclosure.unfair</w:t>
+      </w:r>
+      <w:proofErr w:type="gramEnd"/>
+      <w:r>
+        <w:t>_loan_based_on_income</w:t>
       </w:r>
       <w:proofErr w:type="spellEnd"/>
       <w:r>
@@ -5110,7 +5808,15 @@
       </w:r>
       <w:proofErr w:type="spellStart"/>
       <w:r>
-        <w:t>initial_defense.custom_other</w:t>
+        <w:t>initial_</w:t>
+      </w:r>
+      <w:proofErr w:type="gramStart"/>
+      <w:r>
+        <w:t>defense.custom</w:t>
+      </w:r>
+      <w:proofErr w:type="gramEnd"/>
+      <w:r>
+        <w:t>_other</w:t>
       </w:r>
       <w:proofErr w:type="spellEnd"/>
       <w:r>
@@ -5188,7 +5894,15 @@
       </w:r>
       <w:proofErr w:type="spellStart"/>
       <w:r>
-        <w:t>initial_defense.custom_other</w:t>
+        <w:t>initial_</w:t>
+      </w:r>
+      <w:proofErr w:type="gramStart"/>
+      <w:r>
+        <w:t>defense.custom</w:t>
+      </w:r>
+      <w:proofErr w:type="gramEnd"/>
+      <w:r>
+        <w:t>_other</w:t>
       </w:r>
       <w:proofErr w:type="spellEnd"/>
       <w:r>
@@ -5214,8 +5928,13 @@
         <w:t>{%p if not (</w:t>
       </w:r>
       <w:proofErr w:type="spellStart"/>
-      <w:r>
-        <w:t>facts.tenant_has_subsidy</w:t>
+      <w:proofErr w:type="gramStart"/>
+      <w:r>
+        <w:t>facts.tenant</w:t>
+      </w:r>
+      <w:proofErr w:type="gramEnd"/>
+      <w:r>
+        <w:t>_has_subsidy</w:t>
       </w:r>
       <w:proofErr w:type="spellEnd"/>
       <w:r>
@@ -5309,7 +6028,15 @@
       </w:r>
       <w:proofErr w:type="spellStart"/>
       <w:r>
-        <w:t>postforeclosure.no_just_cause.bona_fide_protections</w:t>
+        <w:t>postforeclosure.no_just_</w:t>
+      </w:r>
+      <w:proofErr w:type="gramStart"/>
+      <w:r>
+        <w:t>cause.bona</w:t>
+      </w:r>
+      <w:proofErr w:type="gramEnd"/>
+      <w:r>
+        <w:t>_fide_protections</w:t>
       </w:r>
       <w:proofErr w:type="spellEnd"/>
       <w:r>
@@ -5426,7 +6153,15 @@
         <w:suppressAutoHyphens/>
       </w:pPr>
       <w:r>
-        <w:t>This defense and counterclaim entitles me to possession and damages under G.L. c. 186, §14, and/or c. 93A.</w:t>
+        <w:t xml:space="preserve">This defense and counterclaim </w:t>
+      </w:r>
+      <w:proofErr w:type="gramStart"/>
+      <w:r>
+        <w:t>entitles</w:t>
+      </w:r>
+      <w:proofErr w:type="gramEnd"/>
+      <w:r>
+        <w:t xml:space="preserve"> me to possession and damages under G.L. c. 186, §14, and/or c. 93A.</w:t>
       </w:r>
     </w:p>
     <w:p>
@@ -5498,7 +6233,21 @@
         <w:rPr>
           <w:color w:val="000000"/>
         </w:rPr>
-        <w:t>postforeclosure.no_just_cause.bona_fide_protections</w:t>
+        <w:t>postforeclosure.no_just_</w:t>
+      </w:r>
+      <w:proofErr w:type="gramStart"/>
+      <w:r>
+        <w:rPr>
+          <w:color w:val="000000"/>
+        </w:rPr>
+        <w:t>cause.bona</w:t>
+      </w:r>
+      <w:proofErr w:type="gramEnd"/>
+      <w:r>
+        <w:rPr>
+          <w:color w:val="000000"/>
+        </w:rPr>
+        <w:t>_fide_protections</w:t>
       </w:r>
       <w:proofErr w:type="spellEnd"/>
       <w:r>
@@ -5575,7 +6324,15 @@
         <w:ind w:left="360"/>
       </w:pPr>
       <w:r>
-        <w:t>{%p if postforeclosure.notice_provisions.less_than_30_days %}</w:t>
+        <w:t xml:space="preserve">{%p if </w:t>
+      </w:r>
+      <w:proofErr w:type="gramStart"/>
+      <w:r>
+        <w:t>postforeclosure.notice</w:t>
+      </w:r>
+      <w:proofErr w:type="gramEnd"/>
+      <w:r>
+        <w:t>_provisions.less_than_30_days %}</w:t>
       </w:r>
     </w:p>
     <w:p>
@@ -5707,7 +6464,15 @@
         <w:ind w:left="360"/>
       </w:pPr>
       <w:r>
-        <w:t>{%p if postforeclosure.notice_provisions.plaintiff_did_not_inform_amount %}</w:t>
+        <w:t xml:space="preserve">{%p if </w:t>
+      </w:r>
+      <w:proofErr w:type="gramStart"/>
+      <w:r>
+        <w:t>postforeclosure.notice</w:t>
+      </w:r>
+      <w:proofErr w:type="gramEnd"/>
+      <w:r>
+        <w:t>_provisions.plaintiff_did_not_inform_amount %}</w:t>
       </w:r>
     </w:p>
     <w:p>
@@ -5738,7 +6503,15 @@
         <w:ind w:left="360"/>
       </w:pPr>
       <w:r>
-        <w:t>{%p if postforeclosure.notice_provisions.plaintiff_did_not_comply_with_requirements %}</w:t>
+        <w:t xml:space="preserve">{%p if </w:t>
+      </w:r>
+      <w:proofErr w:type="gramStart"/>
+      <w:r>
+        <w:t>postforeclosure.notice</w:t>
+      </w:r>
+      <w:proofErr w:type="gramEnd"/>
+      <w:r>
+        <w:t>_provisions.plaintiff_did_not_comply_with_requirements %}</w:t>
       </w:r>
     </w:p>
     <w:p>
@@ -5774,7 +6547,15 @@
         <w:suppressAutoHyphens/>
       </w:pPr>
       <w:r>
-        <w:t>This defense and counterclaim entitles me to possession and damages under G.L. c. 186, §14, and/or G.L. c. 93A.</w:t>
+        <w:t xml:space="preserve">This defense and counterclaim </w:t>
+      </w:r>
+      <w:proofErr w:type="gramStart"/>
+      <w:r>
+        <w:t>entitles</w:t>
+      </w:r>
+      <w:proofErr w:type="gramEnd"/>
+      <w:r>
+        <w:t xml:space="preserve"> me to possession and damages under G.L. c. 186, §14, and/or G.L. c. 93A.</w:t>
       </w:r>
     </w:p>
     <w:p>
@@ -5922,8 +6703,13 @@
         <w:t>{%p if not (</w:t>
       </w:r>
       <w:proofErr w:type="spellStart"/>
-      <w:r>
-        <w:t>facts.tenant_has_subsidy</w:t>
+      <w:proofErr w:type="gramStart"/>
+      <w:r>
+        <w:t>facts.tenant</w:t>
+      </w:r>
+      <w:proofErr w:type="gramEnd"/>
+      <w:r>
+        <w:t>_has_subsidy</w:t>
       </w:r>
       <w:proofErr w:type="spellEnd"/>
       <w:r>
@@ -6038,8 +6824,21 @@
         </w:numPr>
         <w:suppressAutoHyphens/>
       </w:pPr>
-      <w:r>
-        <w:t>I  am entitled to the opportunity to pay to the court within seven (7) days the difference between what the court finds I owe my landlord and what the landlord owes me in order to keep possession of my home. If I can show the court during this time period that I am eligible for RAFT assistance to help me pay the difference, I request that the court enjoin the landlord from refusing to accept RAFT pursuant to G.L. c. 151B.</w:t>
+      <w:proofErr w:type="gramStart"/>
+      <w:r>
+        <w:t>I  am</w:t>
+      </w:r>
+      <w:proofErr w:type="gramEnd"/>
+      <w:r>
+        <w:t xml:space="preserve"> entitled to the opportunity to pay to the court within seven (7) days the difference between what the court finds I owe my landlord and what the landlord owes me in order to keep possession of my home. If I can show the court during this </w:t>
+      </w:r>
+      <w:proofErr w:type="gramStart"/>
+      <w:r>
+        <w:t>time period</w:t>
+      </w:r>
+      <w:proofErr w:type="gramEnd"/>
+      <w:r>
+        <w:t xml:space="preserve"> that I am eligible for RAFT assistance to help me pay the difference, I request that the court enjoin the landlord from refusing to accept RAFT pursuant to G.L. c. 151B.</w:t>
       </w:r>
     </w:p>
     <w:p>
@@ -6051,7 +6850,15 @@
       </w:r>
       <w:proofErr w:type="spellStart"/>
       <w:r>
-        <w:t>bad_conditions.have_conditions</w:t>
+        <w:t>bad_</w:t>
+      </w:r>
+      <w:proofErr w:type="gramStart"/>
+      <w:r>
+        <w:t>conditions.have</w:t>
+      </w:r>
+      <w:proofErr w:type="gramEnd"/>
+      <w:r>
+        <w:t>_conditions</w:t>
       </w:r>
       <w:proofErr w:type="spellEnd"/>
       <w:r>
@@ -6159,7 +6966,15 @@
         <w:pStyle w:val="CenterTitle4"/>
       </w:pPr>
       <w:r>
-        <w:t xml:space="preserve">Federal Fair Housing Act; Americans With Disabilities Act; Section 504 </w:t>
+        <w:t xml:space="preserve">Federal Fair Housing Act; Americans </w:t>
+      </w:r>
+      <w:proofErr w:type="gramStart"/>
+      <w:r>
+        <w:t>With</w:t>
+      </w:r>
+      <w:proofErr w:type="gramEnd"/>
+      <w:r>
+        <w:t xml:space="preserve"> Disabilities Act; Section 504 </w:t>
       </w:r>
       <w:r>
         <w:br/>
@@ -6176,7 +6991,15 @@
         <w:suppressAutoHyphens/>
       </w:pPr>
       <w:r>
-        <w:t>I and/or a member of my household have a disability and I request the court to order the landlord to accommodate the disability by stopping the eviction and/or taking steps to provide an accommodation to allow me to remain in my home.</w:t>
+        <w:t xml:space="preserve">I and/or a member of my household have a </w:t>
+      </w:r>
+      <w:proofErr w:type="gramStart"/>
+      <w:r>
+        <w:t>disability</w:t>
+      </w:r>
+      <w:proofErr w:type="gramEnd"/>
+      <w:r>
+        <w:t xml:space="preserve"> and I request the court to order the landlord to accommodate the disability by stopping the eviction and/or taking steps to provide an accommodation to allow me to remain in my home.</w:t>
       </w:r>
     </w:p>
     <w:p>
@@ -6208,7 +7031,15 @@
         <w:pStyle w:val="CenterTitle"/>
       </w:pPr>
       <w:r>
-        <w:t>The Court Should Find That I Was Not At Fault</w:t>
+        <w:t xml:space="preserve">The Court Should Find That I Was Not </w:t>
+      </w:r>
+      <w:proofErr w:type="gramStart"/>
+      <w:r>
+        <w:t>At</w:t>
+      </w:r>
+      <w:proofErr w:type="gramEnd"/>
+      <w:r>
+        <w:t xml:space="preserve"> Fault</w:t>
       </w:r>
     </w:p>
     <w:p>
@@ -6439,12 +7270,17 @@
         <w:pStyle w:val="BodyText"/>
         <w:ind w:left="1080"/>
       </w:pPr>
+      <w:proofErr w:type="gramStart"/>
       <w:r>
         <w:t xml:space="preserve">{{ </w:t>
       </w:r>
       <w:proofErr w:type="spellStart"/>
       <w:r>
-        <w:t>needs_time_because</w:t>
+        <w:t>needs</w:t>
+      </w:r>
+      <w:proofErr w:type="gramEnd"/>
+      <w:r>
+        <w:t>_time_because</w:t>
       </w:r>
       <w:proofErr w:type="spellEnd"/>
       <w:r>
@@ -6527,8 +7363,13 @@
         <w:t xml:space="preserve"> and </w:t>
       </w:r>
       <w:proofErr w:type="spellStart"/>
-      <w:r>
-        <w:t>tenant.needs_interpreter</w:t>
+      <w:proofErr w:type="gramStart"/>
+      <w:r>
+        <w:t>tenant.needs</w:t>
+      </w:r>
+      <w:proofErr w:type="gramEnd"/>
+      <w:r>
+        <w:t>_interpreter</w:t>
       </w:r>
       <w:proofErr w:type="spellEnd"/>
       <w:r>
@@ -6576,8 +7417,17 @@
         <w:suppressAutoHyphens/>
       </w:pPr>
       <w:r>
-        <w:t xml:space="preserve">English is not my first language and I need an interpreter to allow me to effectively defend my case. I request my right to an interpreter for all court proceedings. I need an interpreter who speaks </w:t>
-      </w:r>
+        <w:t xml:space="preserve">English is not my first </w:t>
+      </w:r>
+      <w:proofErr w:type="gramStart"/>
+      <w:r>
+        <w:t>language</w:t>
+      </w:r>
+      <w:proofErr w:type="gramEnd"/>
+      <w:r>
+        <w:t xml:space="preserve"> and I need an interpreter to allow me to effectively defend my case. I request my right to an interpreter for all court proceedings. I need an interpreter who speaks </w:t>
+      </w:r>
+      <w:proofErr w:type="gramStart"/>
       <w:r>
         <w:rPr>
           <w:b/>
@@ -6589,7 +7439,14 @@
         <w:rPr>
           <w:b/>
         </w:rPr>
-        <w:t>tenant.preferred_language</w:t>
+        <w:t>tenant</w:t>
+      </w:r>
+      <w:proofErr w:type="gramEnd"/>
+      <w:r>
+        <w:rPr>
+          <w:b/>
+        </w:rPr>
+        <w:t>.preferred_language</w:t>
       </w:r>
       <w:proofErr w:type="spellEnd"/>
       <w:r>
@@ -6617,8 +7474,13 @@
         <w:t xml:space="preserve">{{p </w:t>
       </w:r>
       <w:proofErr w:type="spellStart"/>
-      <w:r>
-        <w:t>include_docx_template</w:t>
+      <w:proofErr w:type="gramStart"/>
+      <w:r>
+        <w:t>include</w:t>
+      </w:r>
+      <w:proofErr w:type="gramEnd"/>
+      <w:r>
+        <w:t>_docx_template</w:t>
       </w:r>
       <w:proofErr w:type="spellEnd"/>
       <w:r>
@@ -6674,7 +7536,15 @@
     </w:r>
     <w:proofErr w:type="spellEnd"/>
     <w:r>
-      <w:t xml:space="preserve"> %}Prepared with Assistance of Counsel{% endif %}</w:t>
+      <w:t xml:space="preserve"> </w:t>
+    </w:r>
+    <w:proofErr w:type="gramStart"/>
+    <w:r>
+      <w:t>%}Prepared</w:t>
+    </w:r>
+    <w:proofErr w:type="gramEnd"/>
+    <w:r>
+      <w:t xml:space="preserve"> with Assistance of Counsel{% endif %}</w:t>
     </w:r>
     <w:r>
       <w:ptab w:relativeTo="margin" w:alignment="center" w:leader="none"/>
@@ -9283,7 +10153,6 @@
   <w:style w:type="character" w:default="1" w:styleId="DefaultParagraphFont">
     <w:name w:val="Default Paragraph Font"/>
     <w:uiPriority w:val="1"/>
-    <w:semiHidden/>
     <w:unhideWhenUsed/>
   </w:style>
   <w:style w:type="table" w:default="1" w:styleId="TableNormal">

</xml_diff>

<commit_message>
Added handling for RAFT discrimination defense
</commit_message>
<xml_diff>
--- a/docassemble/MAEvictionDefense/data/templates/SummaryProcessAnswer.docx
+++ b/docassemble/MAEvictionDefense/data/templates/SummaryProcessAnswer.docx
@@ -4,42 +4,154 @@
   <w:body>
     <w:p>
       <w:r>
-        <w:t xml:space="preserve">{%p set answer_title = 'SUMMARY PROCESS ANSWER' %} </w:t>
-      </w:r>
-    </w:p>
-    <w:p>
-      <w:r>
-        <w:t>{%p if plead_counterclaims %}</w:t>
-      </w:r>
-    </w:p>
-    <w:p>
-      <w:r>
-        <w:t>{%p set answer_title = answer_title + "\nWITH COUNTERCLAIMS" %}</w:t>
-      </w:r>
-    </w:p>
-    <w:p>
-      <w:r>
-        <w:t>{%p endif %}</w:t>
-      </w:r>
-    </w:p>
-    <w:p>
-      <w:r>
-        <w:t>{%p if claim_jurytrial %}</w:t>
-      </w:r>
-    </w:p>
-    <w:p>
-      <w:r>
-        <w:t>{%p set answer_title = answer_title + "\nWITH JURY TRIAL REQUEST" %}</w:t>
-      </w:r>
-    </w:p>
-    <w:p>
-      <w:r>
-        <w:t>{%p endif %}</w:t>
-      </w:r>
-    </w:p>
-    <w:p>
-      <w:r>
-        <w:t>{{p include_docx_template('include_CaseCaption.docx',caption_title = 'ANSWER FORM',caption_subtitle=answer_title) }}</w:t>
+        <w:t xml:space="preserve">{%p set </w:t>
+      </w:r>
+      <w:proofErr w:type="spellStart"/>
+      <w:r>
+        <w:t>answer_title</w:t>
+      </w:r>
+      <w:proofErr w:type="spellEnd"/>
+      <w:r>
+        <w:t xml:space="preserve"> = 'SUMMARY PROCESS ANSWER' %} </w:t>
+      </w:r>
+    </w:p>
+    <w:p>
+      <w:r>
+        <w:t xml:space="preserve">{%p if </w:t>
+      </w:r>
+      <w:proofErr w:type="spellStart"/>
+      <w:r>
+        <w:t>plead_counterclaims</w:t>
+      </w:r>
+      <w:proofErr w:type="spellEnd"/>
+      <w:r>
+        <w:t xml:space="preserve"> %}</w:t>
+      </w:r>
+    </w:p>
+    <w:p>
+      <w:r>
+        <w:t xml:space="preserve">{%p set </w:t>
+      </w:r>
+      <w:proofErr w:type="spellStart"/>
+      <w:r>
+        <w:t>answer_title</w:t>
+      </w:r>
+      <w:proofErr w:type="spellEnd"/>
+      <w:r>
+        <w:t xml:space="preserve"> = </w:t>
+      </w:r>
+      <w:proofErr w:type="spellStart"/>
+      <w:r>
+        <w:t>answer_title</w:t>
+      </w:r>
+      <w:proofErr w:type="spellEnd"/>
+      <w:r>
+        <w:t xml:space="preserve"> + "\</w:t>
+      </w:r>
+      <w:proofErr w:type="spellStart"/>
+      <w:r>
+        <w:t>nWITH</w:t>
+      </w:r>
+      <w:proofErr w:type="spellEnd"/>
+      <w:r>
+        <w:t xml:space="preserve"> COUNTERCLAIMS" %}</w:t>
+      </w:r>
+    </w:p>
+    <w:p>
+      <w:r>
+        <w:t>{%p endif %}</w:t>
+      </w:r>
+    </w:p>
+    <w:p>
+      <w:r>
+        <w:t xml:space="preserve">{%p if </w:t>
+      </w:r>
+      <w:proofErr w:type="spellStart"/>
+      <w:r>
+        <w:t>claim_jurytrial</w:t>
+      </w:r>
+      <w:proofErr w:type="spellEnd"/>
+      <w:r>
+        <w:t xml:space="preserve"> %}</w:t>
+      </w:r>
+    </w:p>
+    <w:p>
+      <w:r>
+        <w:t xml:space="preserve">{%p set </w:t>
+      </w:r>
+      <w:proofErr w:type="spellStart"/>
+      <w:r>
+        <w:t>answer_title</w:t>
+      </w:r>
+      <w:proofErr w:type="spellEnd"/>
+      <w:r>
+        <w:t xml:space="preserve"> = </w:t>
+      </w:r>
+      <w:proofErr w:type="spellStart"/>
+      <w:r>
+        <w:t>answer_title</w:t>
+      </w:r>
+      <w:proofErr w:type="spellEnd"/>
+      <w:r>
+        <w:t xml:space="preserve"> + "\</w:t>
+      </w:r>
+      <w:proofErr w:type="spellStart"/>
+      <w:r>
+        <w:t>nWITH</w:t>
+      </w:r>
+      <w:proofErr w:type="spellEnd"/>
+      <w:r>
+        <w:t xml:space="preserve"> JURY TRIAL REQUEST" %}</w:t>
+      </w:r>
+    </w:p>
+    <w:p>
+      <w:r>
+        <w:t>{%p endif %}</w:t>
+      </w:r>
+    </w:p>
+    <w:p>
+      <w:r>
+        <w:t xml:space="preserve">{{p </w:t>
+      </w:r>
+      <w:proofErr w:type="spellStart"/>
+      <w:r>
+        <w:t>include_docx_</w:t>
+      </w:r>
+      <w:proofErr w:type="gramStart"/>
+      <w:r>
+        <w:t>template</w:t>
+      </w:r>
+      <w:proofErr w:type="spellEnd"/>
+      <w:r>
+        <w:t>(</w:t>
+      </w:r>
+      <w:proofErr w:type="gramEnd"/>
+      <w:r>
+        <w:t>'include_CaseCaption.docx',</w:t>
+      </w:r>
+      <w:proofErr w:type="spellStart"/>
+      <w:r>
+        <w:t>caption_title</w:t>
+      </w:r>
+      <w:proofErr w:type="spellEnd"/>
+      <w:r>
+        <w:t xml:space="preserve"> = 'ANSWER FORM',</w:t>
+      </w:r>
+      <w:proofErr w:type="spellStart"/>
+      <w:r>
+        <w:t>caption_subtitle</w:t>
+      </w:r>
+      <w:proofErr w:type="spellEnd"/>
+      <w:r>
+        <w:t>=</w:t>
+      </w:r>
+      <w:proofErr w:type="spellStart"/>
+      <w:r>
+        <w:t>answer_title</w:t>
+      </w:r>
+      <w:proofErr w:type="spellEnd"/>
+      <w:r>
+        <w:t>) }}</w:t>
       </w:r>
     </w:p>
     <w:p/>
@@ -53,8 +165,23 @@
         </w:rPr>
         <w:t xml:space="preserve">TRIAL DATE: {% if </w:t>
       </w:r>
-      <w:r>
-        <w:t>case.status == "late" %} {{case.original_date}}(No Discovery requested)</w:t>
+      <w:proofErr w:type="spellStart"/>
+      <w:proofErr w:type="gramStart"/>
+      <w:r>
+        <w:t>case.status</w:t>
+      </w:r>
+      <w:proofErr w:type="spellEnd"/>
+      <w:proofErr w:type="gramEnd"/>
+      <w:r>
+        <w:t xml:space="preserve"> == "late" %} {{</w:t>
+      </w:r>
+      <w:proofErr w:type="spellStart"/>
+      <w:r>
+        <w:t>case.original_date</w:t>
+      </w:r>
+      <w:proofErr w:type="spellEnd"/>
+      <w:r>
+        <w:t>}}(No Discovery requested)</w:t>
       </w:r>
     </w:p>
     <w:p>
@@ -62,7 +189,31 @@
         <w:spacing w:line="276" w:lineRule="auto"/>
       </w:pPr>
       <w:r>
-        <w:t>{% endif %}{% if case.status == "summons" %}Rescheduled Trial Date: {{case.rescheduled_date}} (Discovery requested)</w:t>
+        <w:t xml:space="preserve">{% endif </w:t>
+      </w:r>
+      <w:proofErr w:type="gramStart"/>
+      <w:r>
+        <w:t>%}{</w:t>
+      </w:r>
+      <w:proofErr w:type="gramEnd"/>
+      <w:r>
+        <w:t xml:space="preserve">% if </w:t>
+      </w:r>
+      <w:proofErr w:type="spellStart"/>
+      <w:r>
+        <w:t>case.status</w:t>
+      </w:r>
+      <w:proofErr w:type="spellEnd"/>
+      <w:r>
+        <w:t xml:space="preserve"> == "summons" %}Rescheduled Trial Date: {{</w:t>
+      </w:r>
+      <w:proofErr w:type="spellStart"/>
+      <w:r>
+        <w:t>case.rescheduled_date</w:t>
+      </w:r>
+      <w:proofErr w:type="spellEnd"/>
+      <w:r>
+        <w:t>}} (Discovery requested)</w:t>
       </w:r>
     </w:p>
     <w:p>
@@ -92,7 +243,15 @@
         <w:spacing w:line="276" w:lineRule="auto"/>
       </w:pPr>
       <w:r>
-        <w:t>My name is {{ tenant.name }}.</w:t>
+        <w:t xml:space="preserve">My name is </w:t>
+      </w:r>
+      <w:proofErr w:type="gramStart"/>
+      <w:r>
+        <w:t>{{ tenant.name</w:t>
+      </w:r>
+      <w:proofErr w:type="gramEnd"/>
+      <w:r>
+        <w:t xml:space="preserve"> }}.</w:t>
       </w:r>
     </w:p>
     <w:p>
@@ -105,7 +264,39 @@
         <w:spacing w:line="276" w:lineRule="auto"/>
       </w:pPr>
       <w:r>
-        <w:t>I live at {{ tenant.address.on_one_line() }}. I moved in on or about {{ facts.tenant_movein }}.</w:t>
+        <w:t xml:space="preserve">I live at </w:t>
+      </w:r>
+      <w:proofErr w:type="gramStart"/>
+      <w:r>
+        <w:t xml:space="preserve">{{ </w:t>
+      </w:r>
+      <w:proofErr w:type="spellStart"/>
+      <w:r>
+        <w:t>tenant</w:t>
+      </w:r>
+      <w:proofErr w:type="gramEnd"/>
+      <w:r>
+        <w:t>.address.on_one_line</w:t>
+      </w:r>
+      <w:proofErr w:type="spellEnd"/>
+      <w:r>
+        <w:t xml:space="preserve">() }}. I moved in on or about </w:t>
+      </w:r>
+      <w:proofErr w:type="gramStart"/>
+      <w:r>
+        <w:t xml:space="preserve">{{ </w:t>
+      </w:r>
+      <w:proofErr w:type="spellStart"/>
+      <w:r>
+        <w:t>facts</w:t>
+      </w:r>
+      <w:proofErr w:type="gramEnd"/>
+      <w:r>
+        <w:t>.tenant_movein</w:t>
+      </w:r>
+      <w:proofErr w:type="spellEnd"/>
+      <w:r>
+        <w:t xml:space="preserve"> }}.</w:t>
       </w:r>
     </w:p>
     <w:p>
@@ -118,7 +309,47 @@
         <w:spacing w:line="276" w:lineRule="auto"/>
       </w:pPr>
       <w:r>
-        <w:t>My rent is {{ currency(showifdef('facts.tenant_rent_share')) }} per {{ showifdef('facts.tenant_rent_frequency') }}.</w:t>
+        <w:t xml:space="preserve">My rent is </w:t>
+      </w:r>
+      <w:proofErr w:type="gramStart"/>
+      <w:r>
+        <w:t>{{ currency</w:t>
+      </w:r>
+      <w:proofErr w:type="gramEnd"/>
+      <w:r>
+        <w:t>(</w:t>
+      </w:r>
+      <w:proofErr w:type="spellStart"/>
+      <w:r>
+        <w:t>showifdef</w:t>
+      </w:r>
+      <w:proofErr w:type="spellEnd"/>
+      <w:r>
+        <w:t>('</w:t>
+      </w:r>
+      <w:proofErr w:type="spellStart"/>
+      <w:r>
+        <w:t>facts.tenant_rent_share</w:t>
+      </w:r>
+      <w:proofErr w:type="spellEnd"/>
+      <w:r>
+        <w:t xml:space="preserve">')) }} per {{ </w:t>
+      </w:r>
+      <w:proofErr w:type="spellStart"/>
+      <w:r>
+        <w:t>showifdef</w:t>
+      </w:r>
+      <w:proofErr w:type="spellEnd"/>
+      <w:r>
+        <w:t>('</w:t>
+      </w:r>
+      <w:proofErr w:type="spellStart"/>
+      <w:r>
+        <w:t>facts.tenant_rent_frequency</w:t>
+      </w:r>
+      <w:proofErr w:type="spellEnd"/>
+      <w:r>
+        <w:t>') }}.</w:t>
       </w:r>
     </w:p>
     <w:p>
@@ -126,7 +357,36 @@
         <w:spacing w:line="276" w:lineRule="auto"/>
       </w:pPr>
       <w:r>
-        <w:t>{%p if facts.tenant_has_subsidy and subsidy_type in ["Section 8 voucher","MRVP","HUD multi-family"] %}</w:t>
+        <w:t xml:space="preserve">{%p if </w:t>
+      </w:r>
+      <w:proofErr w:type="spellStart"/>
+      <w:proofErr w:type="gramStart"/>
+      <w:r>
+        <w:t>facts.tenant</w:t>
+      </w:r>
+      <w:proofErr w:type="gramEnd"/>
+      <w:r>
+        <w:t>_has_subsidy</w:t>
+      </w:r>
+      <w:proofErr w:type="spellEnd"/>
+      <w:r>
+        <w:t xml:space="preserve"> and </w:t>
+      </w:r>
+      <w:proofErr w:type="spellStart"/>
+      <w:r>
+        <w:t>subsidy_type</w:t>
+      </w:r>
+      <w:proofErr w:type="spellEnd"/>
+      <w:r>
+        <w:t xml:space="preserve"> in ["Section 8 </w:t>
+      </w:r>
+      <w:proofErr w:type="spellStart"/>
+      <w:r>
+        <w:t>voucher","MRVP","HUD</w:t>
+      </w:r>
+      <w:proofErr w:type="spellEnd"/>
+      <w:r>
+        <w:t xml:space="preserve"> multi-family"] %}</w:t>
       </w:r>
     </w:p>
     <w:p>
@@ -139,7 +399,28 @@
         <w:spacing w:line="276" w:lineRule="auto"/>
       </w:pPr>
       <w:r>
-        <w:t>I receive a rent subsidy. {% if facts.tenant_contract_rent %}The full contract rent is {{ currency(facts.tenant_contract_rent) }}. {% endif %}</w:t>
+        <w:t xml:space="preserve">I receive a rent subsidy. {% if </w:t>
+      </w:r>
+      <w:proofErr w:type="spellStart"/>
+      <w:proofErr w:type="gramStart"/>
+      <w:r>
+        <w:t>facts.tenant</w:t>
+      </w:r>
+      <w:proofErr w:type="gramEnd"/>
+      <w:r>
+        <w:t>_contract_rent</w:t>
+      </w:r>
+      <w:proofErr w:type="spellEnd"/>
+      <w:r>
+        <w:t xml:space="preserve"> %}The full contract rent is {{ currency(</w:t>
+      </w:r>
+      <w:proofErr w:type="spellStart"/>
+      <w:r>
+        <w:t>facts.tenant_contract_rent</w:t>
+      </w:r>
+      <w:proofErr w:type="spellEnd"/>
+      <w:r>
+        <w:t>) }}. {% endif %}</w:t>
       </w:r>
     </w:p>
     <w:p>
@@ -155,7 +436,20 @@
         <w:spacing w:line="276" w:lineRule="auto"/>
       </w:pPr>
       <w:r>
-        <w:t xml:space="preserve">{%p if facts.tenant_has_lease %} </w:t>
+        <w:t xml:space="preserve">{%p if </w:t>
+      </w:r>
+      <w:proofErr w:type="spellStart"/>
+      <w:proofErr w:type="gramStart"/>
+      <w:r>
+        <w:t>facts.tenant</w:t>
+      </w:r>
+      <w:proofErr w:type="gramEnd"/>
+      <w:r>
+        <w:t>_has_lease</w:t>
+      </w:r>
+      <w:proofErr w:type="spellEnd"/>
+      <w:r>
+        <w:t xml:space="preserve"> %} </w:t>
       </w:r>
     </w:p>
     <w:p>
@@ -197,7 +491,31 @@
         <w:spacing w:line="276" w:lineRule="auto"/>
       </w:pPr>
       <w:r>
-        <w:t>{%p if "nonpayment" in eviction_reason or defined('dont_owe_rent') and dont_owe_rent %}</w:t>
+        <w:t xml:space="preserve">{%p if "nonpayment" in </w:t>
+      </w:r>
+      <w:proofErr w:type="spellStart"/>
+      <w:r>
+        <w:t>eviction_reason</w:t>
+      </w:r>
+      <w:proofErr w:type="spellEnd"/>
+      <w:r>
+        <w:t xml:space="preserve"> or defined('</w:t>
+      </w:r>
+      <w:proofErr w:type="spellStart"/>
+      <w:r>
+        <w:t>dont_owe_rent</w:t>
+      </w:r>
+      <w:proofErr w:type="spellEnd"/>
+      <w:r>
+        <w:t xml:space="preserve">') and </w:t>
+      </w:r>
+      <w:proofErr w:type="spellStart"/>
+      <w:r>
+        <w:t>dont_owe_rent</w:t>
+      </w:r>
+      <w:proofErr w:type="spellEnd"/>
+      <w:r>
+        <w:t xml:space="preserve"> %}</w:t>
       </w:r>
     </w:p>
     <w:p>
@@ -210,7 +528,15 @@
         <w:spacing w:line="276" w:lineRule="auto"/>
       </w:pPr>
       <w:r>
-        <w:t xml:space="preserve">I deny that I owe the amount of rent or use and occupancy listed in the landlord’s complaint. </w:t>
+        <w:t xml:space="preserve">I deny that I owe the amount of rent or </w:t>
+      </w:r>
+      <w:proofErr w:type="gramStart"/>
+      <w:r>
+        <w:t>use</w:t>
+      </w:r>
+      <w:proofErr w:type="gramEnd"/>
+      <w:r>
+        <w:t xml:space="preserve"> and occupancy listed in the landlord’s complaint. </w:t>
       </w:r>
     </w:p>
     <w:p>
@@ -257,7 +583,15 @@
         <w:pStyle w:val="ListwithNoSpace"/>
       </w:pPr>
       <w:r>
-        <w:t>{%p if initial_defense.no_ntq %}</w:t>
+        <w:t xml:space="preserve">{%p if </w:t>
+      </w:r>
+      <w:proofErr w:type="spellStart"/>
+      <w:r>
+        <w:t>initial_defense.no_ntq</w:t>
+      </w:r>
+      <w:proofErr w:type="spellEnd"/>
+      <w:r>
+        <w:t xml:space="preserve"> %}</w:t>
       </w:r>
     </w:p>
     <w:p>
@@ -286,7 +620,23 @@
         <w:pStyle w:val="ListwithNoSpace"/>
       </w:pPr>
       <w:r>
-        <w:t>{%p if eviction_reason == 'nonpayment' and not tenant_got_accompanying_form %}</w:t>
+        <w:t xml:space="preserve">{%p if </w:t>
+      </w:r>
+      <w:proofErr w:type="spellStart"/>
+      <w:r>
+        <w:t>eviction_reason</w:t>
+      </w:r>
+      <w:proofErr w:type="spellEnd"/>
+      <w:r>
+        <w:t xml:space="preserve"> == 'nonpayment' and not </w:t>
+      </w:r>
+      <w:proofErr w:type="spellStart"/>
+      <w:r>
+        <w:t>tenant_got_accompanying_form</w:t>
+      </w:r>
+      <w:proofErr w:type="spellEnd"/>
+      <w:r>
+        <w:t xml:space="preserve"> %}</w:t>
       </w:r>
     </w:p>
     <w:p>
@@ -326,7 +676,15 @@
         <w:pStyle w:val="ListwithNoSpace"/>
       </w:pPr>
       <w:r>
-        <w:t>{%p if initial_defense.no_proper_termination %}</w:t>
+        <w:t xml:space="preserve">{%p if </w:t>
+      </w:r>
+      <w:proofErr w:type="spellStart"/>
+      <w:r>
+        <w:t>initial_defense.no_proper_termination</w:t>
+      </w:r>
+      <w:proofErr w:type="spellEnd"/>
+      <w:r>
+        <w:t xml:space="preserve"> %}</w:t>
       </w:r>
     </w:p>
     <w:p>
@@ -348,7 +706,15 @@
         <w:ind w:firstLine="643"/>
       </w:pPr>
       <w:r>
-        <w:t>{%p if initial_defense.ntq_defective %}</w:t>
+        <w:t xml:space="preserve">{%p if </w:t>
+      </w:r>
+      <w:proofErr w:type="spellStart"/>
+      <w:r>
+        <w:t>initial_defense.ntq_defective</w:t>
+      </w:r>
+      <w:proofErr w:type="spellEnd"/>
+      <w:r>
+        <w:t xml:space="preserve"> %}</w:t>
       </w:r>
     </w:p>
     <w:p>
@@ -379,7 +745,23 @@
         <w:ind w:left="720"/>
       </w:pPr>
       <w:r>
-        <w:t>{%p if initial_defense.improper_time_given %}</w:t>
+        <w:t xml:space="preserve">{%p if </w:t>
+      </w:r>
+      <w:proofErr w:type="spellStart"/>
+      <w:r>
+        <w:t>initial_</w:t>
+      </w:r>
+      <w:proofErr w:type="gramStart"/>
+      <w:r>
+        <w:t>defense.improper</w:t>
+      </w:r>
+      <w:proofErr w:type="gramEnd"/>
+      <w:r>
+        <w:t>_time_given</w:t>
+      </w:r>
+      <w:proofErr w:type="spellEnd"/>
+      <w:r>
+        <w:t xml:space="preserve"> %}</w:t>
       </w:r>
     </w:p>
     <w:p>
@@ -410,7 +792,31 @@
         <w:ind w:left="720"/>
       </w:pPr>
       <w:r>
-        <w:t>{%p if initial_defense.need_ntq and initial_defense.no_ntq %}</w:t>
+        <w:t xml:space="preserve">{%p if </w:t>
+      </w:r>
+      <w:proofErr w:type="spellStart"/>
+      <w:r>
+        <w:t>initial_</w:t>
+      </w:r>
+      <w:proofErr w:type="gramStart"/>
+      <w:r>
+        <w:t>defense.need</w:t>
+      </w:r>
+      <w:proofErr w:type="gramEnd"/>
+      <w:r>
+        <w:t>_ntq</w:t>
+      </w:r>
+      <w:proofErr w:type="spellEnd"/>
+      <w:r>
+        <w:t xml:space="preserve"> and </w:t>
+      </w:r>
+      <w:proofErr w:type="spellStart"/>
+      <w:r>
+        <w:t>initial_defense.no_ntq</w:t>
+      </w:r>
+      <w:proofErr w:type="spellEnd"/>
+      <w:r>
+        <w:t xml:space="preserve"> %}</w:t>
       </w:r>
     </w:p>
     <w:p>
@@ -469,7 +875,23 @@
         <w:pStyle w:val="ListwithNoSpace"/>
       </w:pPr>
       <w:r>
-        <w:t>{%p if initial_defense.premature_commencement %}</w:t>
+        <w:t xml:space="preserve">{%p if </w:t>
+      </w:r>
+      <w:proofErr w:type="spellStart"/>
+      <w:r>
+        <w:t>initial_</w:t>
+      </w:r>
+      <w:proofErr w:type="gramStart"/>
+      <w:r>
+        <w:t>defense.premature</w:t>
+      </w:r>
+      <w:proofErr w:type="gramEnd"/>
+      <w:r>
+        <w:t>_commencement</w:t>
+      </w:r>
+      <w:proofErr w:type="spellEnd"/>
+      <w:r>
+        <w:t xml:space="preserve"> %}</w:t>
       </w:r>
     </w:p>
     <w:p>
@@ -482,7 +904,15 @@
         <w:suppressAutoHyphens/>
       </w:pPr>
       <w:r>
-        <w:t xml:space="preserve">The landlord started this case before the Notice to Quit expired. </w:t>
+        <w:t xml:space="preserve">The landlord started this case before the Notice to </w:t>
+      </w:r>
+      <w:proofErr w:type="gramStart"/>
+      <w:r>
+        <w:t>Quit</w:t>
+      </w:r>
+      <w:proofErr w:type="gramEnd"/>
+      <w:r>
+        <w:t xml:space="preserve"> expired. </w:t>
       </w:r>
     </w:p>
     <w:p>
@@ -499,7 +929,20 @@
         <w:ind w:left="360"/>
       </w:pPr>
       <w:r>
-        <w:t>{%p if initial_defense.varney %}</w:t>
+        <w:t xml:space="preserve">{%p if </w:t>
+      </w:r>
+      <w:proofErr w:type="spellStart"/>
+      <w:r>
+        <w:t>initial_</w:t>
+      </w:r>
+      <w:proofErr w:type="gramStart"/>
+      <w:r>
+        <w:t>defense.varney</w:t>
+      </w:r>
+      <w:proofErr w:type="spellEnd"/>
+      <w:proofErr w:type="gramEnd"/>
+      <w:r>
+        <w:t xml:space="preserve"> %}</w:t>
       </w:r>
     </w:p>
     <w:p>
@@ -512,7 +955,15 @@
         <w:suppressAutoHyphens/>
       </w:pPr>
       <w:r>
-        <w:t>The landlord is a corporation or other business entity and this case was not brought by an attorney so it should be dismissed.</w:t>
+        <w:t xml:space="preserve">The landlord is a corporation or other business </w:t>
+      </w:r>
+      <w:proofErr w:type="gramStart"/>
+      <w:r>
+        <w:t>entity</w:t>
+      </w:r>
+      <w:proofErr w:type="gramEnd"/>
+      <w:r>
+        <w:t xml:space="preserve"> and this case was not brought by an attorney so it should be dismissed.</w:t>
       </w:r>
     </w:p>
     <w:p>
@@ -530,7 +981,23 @@
         <w:ind w:left="360"/>
       </w:pPr>
       <w:r>
-        <w:t>{%p if initial_defense.defective_summons %}</w:t>
+        <w:t xml:space="preserve">{%p if </w:t>
+      </w:r>
+      <w:proofErr w:type="spellStart"/>
+      <w:r>
+        <w:t>initial_</w:t>
+      </w:r>
+      <w:proofErr w:type="gramStart"/>
+      <w:r>
+        <w:t>defense.defective</w:t>
+      </w:r>
+      <w:proofErr w:type="gramEnd"/>
+      <w:r>
+        <w:t>_summons</w:t>
+      </w:r>
+      <w:proofErr w:type="spellEnd"/>
+      <w:r>
+        <w:t xml:space="preserve"> %}</w:t>
       </w:r>
     </w:p>
     <w:p>
@@ -561,7 +1028,28 @@
         <w:ind w:left="360"/>
       </w:pPr>
       <w:r>
-        <w:t>{%p if eviction_reason == 'nonpayment' and initial_defense.cure %}</w:t>
+        <w:t xml:space="preserve">{%p if </w:t>
+      </w:r>
+      <w:proofErr w:type="spellStart"/>
+      <w:r>
+        <w:t>eviction_reason</w:t>
+      </w:r>
+      <w:proofErr w:type="spellEnd"/>
+      <w:r>
+        <w:t xml:space="preserve"> == 'nonpayment' and </w:t>
+      </w:r>
+      <w:proofErr w:type="spellStart"/>
+      <w:r>
+        <w:t>initial_</w:t>
+      </w:r>
+      <w:proofErr w:type="gramStart"/>
+      <w:r>
+        <w:t>defense.cure</w:t>
+      </w:r>
+      <w:proofErr w:type="spellEnd"/>
+      <w:proofErr w:type="gramEnd"/>
+      <w:r>
+        <w:t xml:space="preserve"> %}</w:t>
       </w:r>
     </w:p>
     <w:p>
@@ -592,7 +1080,15 @@
         <w:ind w:left="360"/>
       </w:pPr>
       <w:r>
-        <w:t>{%p if initial_defense.new_tenancy %}</w:t>
+        <w:t xml:space="preserve">{%p if </w:t>
+      </w:r>
+      <w:proofErr w:type="spellStart"/>
+      <w:r>
+        <w:t>initial_defense.new_tenancy</w:t>
+      </w:r>
+      <w:proofErr w:type="spellEnd"/>
+      <w:r>
+        <w:t xml:space="preserve"> %}</w:t>
       </w:r>
     </w:p>
     <w:p>
@@ -623,7 +1119,23 @@
         <w:ind w:left="360"/>
       </w:pPr>
       <w:r>
-        <w:t>{%p if initial_defense.inconsistent_reasons %}</w:t>
+        <w:t xml:space="preserve">{%p if </w:t>
+      </w:r>
+      <w:proofErr w:type="spellStart"/>
+      <w:r>
+        <w:t>initial_</w:t>
+      </w:r>
+      <w:proofErr w:type="gramStart"/>
+      <w:r>
+        <w:t>defense.inconsistent</w:t>
+      </w:r>
+      <w:proofErr w:type="gramEnd"/>
+      <w:r>
+        <w:t>_reasons</w:t>
+      </w:r>
+      <w:proofErr w:type="spellEnd"/>
+      <w:r>
+        <w:t xml:space="preserve"> %}</w:t>
       </w:r>
     </w:p>
     <w:p>
@@ -655,7 +1167,15 @@
         <w:ind w:left="360"/>
       </w:pPr>
       <w:r>
-        <w:t>{%p if initial_defense.no_standing %}</w:t>
+        <w:t xml:space="preserve">{%p if </w:t>
+      </w:r>
+      <w:proofErr w:type="spellStart"/>
+      <w:r>
+        <w:t>initial_defense.no_standing</w:t>
+      </w:r>
+      <w:proofErr w:type="spellEnd"/>
+      <w:r>
+        <w:t xml:space="preserve"> %}</w:t>
       </w:r>
     </w:p>
     <w:p>
@@ -686,7 +1206,31 @@
         <w:ind w:left="360"/>
       </w:pPr>
       <w:r>
-        <w:t>{%p if showifdef('initial_defense.custom_reason_for_dismissal') %}</w:t>
+        <w:t xml:space="preserve">{%p if </w:t>
+      </w:r>
+      <w:proofErr w:type="spellStart"/>
+      <w:r>
+        <w:t>showifdef</w:t>
+      </w:r>
+      <w:proofErr w:type="spellEnd"/>
+      <w:r>
+        <w:t>('</w:t>
+      </w:r>
+      <w:proofErr w:type="spellStart"/>
+      <w:r>
+        <w:t>initial_</w:t>
+      </w:r>
+      <w:proofErr w:type="gramStart"/>
+      <w:r>
+        <w:t>defense.custom</w:t>
+      </w:r>
+      <w:proofErr w:type="gramEnd"/>
+      <w:r>
+        <w:t>_reason_for_dismissal</w:t>
+      </w:r>
+      <w:proofErr w:type="spellEnd"/>
+      <w:r>
+        <w:t>') %}</w:t>
       </w:r>
     </w:p>
     <w:p>
@@ -699,7 +1243,23 @@
         <w:suppressAutoHyphens/>
       </w:pPr>
       <w:r>
-        <w:t>The landlord’s case should be dismissed because {{ initial_defense.custom_reason_for_dismissal }}.</w:t>
+        <w:t xml:space="preserve">The landlord’s case should be dismissed because </w:t>
+      </w:r>
+      <w:proofErr w:type="gramStart"/>
+      <w:r>
+        <w:t xml:space="preserve">{{ </w:t>
+      </w:r>
+      <w:proofErr w:type="spellStart"/>
+      <w:r>
+        <w:t>initial</w:t>
+      </w:r>
+      <w:proofErr w:type="gramEnd"/>
+      <w:r>
+        <w:t>_defense.custom_reason_for_dismissal</w:t>
+      </w:r>
+      <w:proofErr w:type="spellEnd"/>
+      <w:r>
+        <w:t xml:space="preserve"> }}.</w:t>
       </w:r>
     </w:p>
     <w:p>
@@ -716,7 +1276,20 @@
         <w:pStyle w:val="BodyText"/>
       </w:pPr>
       <w:r>
-        <w:t>{%p if facts.tenant_has_subsidy %}</w:t>
+        <w:t xml:space="preserve">{%p if </w:t>
+      </w:r>
+      <w:proofErr w:type="spellStart"/>
+      <w:proofErr w:type="gramStart"/>
+      <w:r>
+        <w:t>facts.tenant</w:t>
+      </w:r>
+      <w:proofErr w:type="gramEnd"/>
+      <w:r>
+        <w:t>_has_subsidy</w:t>
+      </w:r>
+      <w:proofErr w:type="spellEnd"/>
+      <w:r>
+        <w:t xml:space="preserve"> %}</w:t>
       </w:r>
     </w:p>
     <w:p>
@@ -761,7 +1334,15 @@
         <w:ind w:left="720"/>
       </w:pPr>
       <w:r>
-        <w:t>{%p if subsidized_housing.no_proper_termination %}</w:t>
+        <w:t xml:space="preserve">{%p if </w:t>
+      </w:r>
+      <w:proofErr w:type="spellStart"/>
+      <w:r>
+        <w:t>subsidized_housing.no_proper_termination</w:t>
+      </w:r>
+      <w:proofErr w:type="spellEnd"/>
+      <w:r>
+        <w:t xml:space="preserve"> %}</w:t>
       </w:r>
     </w:p>
     <w:p>
@@ -798,7 +1379,23 @@
         <w:contextualSpacing/>
       </w:pPr>
       <w:r>
-        <w:t>{%p if subsidy_type in ['Section 8 voucher'] and subsidized_housing.no_ntq_to_agency %}</w:t>
+        <w:t xml:space="preserve">{%p if </w:t>
+      </w:r>
+      <w:proofErr w:type="spellStart"/>
+      <w:r>
+        <w:t>subsidy_type</w:t>
+      </w:r>
+      <w:proofErr w:type="spellEnd"/>
+      <w:r>
+        <w:t xml:space="preserve"> in ['Section 8 voucher'] and </w:t>
+      </w:r>
+      <w:proofErr w:type="spellStart"/>
+      <w:r>
+        <w:t>subsidized_housing.no_ntq_to_agency</w:t>
+      </w:r>
+      <w:proofErr w:type="spellEnd"/>
+      <w:r>
+        <w:t xml:space="preserve"> %}</w:t>
       </w:r>
     </w:p>
     <w:p>
@@ -835,7 +1432,15 @@
         <w:contextualSpacing/>
       </w:pPr>
       <w:r>
-        <w:t>{%p if subsidized_housing.no_just_cause %}</w:t>
+        <w:t xml:space="preserve">{%p if </w:t>
+      </w:r>
+      <w:proofErr w:type="spellStart"/>
+      <w:r>
+        <w:t>subsidized_housing.no_just_cause</w:t>
+      </w:r>
+      <w:proofErr w:type="spellEnd"/>
+      <w:r>
+        <w:t xml:space="preserve"> %}</w:t>
       </w:r>
     </w:p>
     <w:p>
@@ -872,7 +1477,23 @@
         <w:contextualSpacing/>
       </w:pPr>
       <w:r>
-        <w:t>{%p if showifdef('subsidized_housing.no_hearing_or_conference') %}</w:t>
+        <w:t xml:space="preserve">{%p if </w:t>
+      </w:r>
+      <w:proofErr w:type="spellStart"/>
+      <w:r>
+        <w:t>showifdef</w:t>
+      </w:r>
+      <w:proofErr w:type="spellEnd"/>
+      <w:r>
+        <w:t>('</w:t>
+      </w:r>
+      <w:proofErr w:type="spellStart"/>
+      <w:r>
+        <w:t>subsidized_housing.no_hearing_or_conference</w:t>
+      </w:r>
+      <w:proofErr w:type="spellEnd"/>
+      <w:r>
+        <w:t>') %}</w:t>
       </w:r>
     </w:p>
     <w:p>
@@ -887,7 +1508,15 @@
         <w:contextualSpacing/>
       </w:pPr>
       <w:r>
-        <w:t xml:space="preserve">I am a tenant in public or subsidized housing and the landlord did not give me my right to a grievance hearing or conference as required by the lease and/or program rules or I requested a hearing/conference and the process was not completed before I received the complaint. </w:t>
+        <w:t>I am a tenant in public or subsidized housing and the landlord did not give me my right to a grievance hearing or conference as required by the lease and/or program rules or I requested a hearing/</w:t>
+      </w:r>
+      <w:proofErr w:type="gramStart"/>
+      <w:r>
+        <w:t>conference</w:t>
+      </w:r>
+      <w:proofErr w:type="gramEnd"/>
+      <w:r>
+        <w:t xml:space="preserve"> and the process was not completed before I received the complaint. </w:t>
       </w:r>
     </w:p>
     <w:p>
@@ -909,7 +1538,20 @@
         <w:contextualSpacing/>
       </w:pPr>
       <w:r>
-        <w:t>{%p if subsidized_housing.vawa %}</w:t>
+        <w:t xml:space="preserve">{%p if </w:t>
+      </w:r>
+      <w:proofErr w:type="spellStart"/>
+      <w:r>
+        <w:t>subsidized_</w:t>
+      </w:r>
+      <w:proofErr w:type="gramStart"/>
+      <w:r>
+        <w:t>housing.vawa</w:t>
+      </w:r>
+      <w:proofErr w:type="spellEnd"/>
+      <w:proofErr w:type="gramEnd"/>
+      <w:r>
+        <w:t xml:space="preserve"> %}</w:t>
       </w:r>
     </w:p>
     <w:p>
@@ -954,7 +1596,15 @@
         <w:pStyle w:val="BodyText"/>
       </w:pPr>
       <w:r>
-        <w:t>{%p if retaliation.is_retaliated %}</w:t>
+        <w:t xml:space="preserve">{%p if </w:t>
+      </w:r>
+      <w:proofErr w:type="spellStart"/>
+      <w:r>
+        <w:t>retaliation.is_retaliated</w:t>
+      </w:r>
+      <w:proofErr w:type="spellEnd"/>
+      <w:r>
+        <w:t xml:space="preserve"> %}</w:t>
       </w:r>
     </w:p>
     <w:p>
@@ -967,8 +1617,21 @@
         <w:pStyle w:val="Caption"/>
         <w:spacing w:line="276" w:lineRule="auto"/>
       </w:pPr>
-      <w:r>
-        <w:t>Defense{% if plead_counterclaims %} and Counterclaim{% endif %}</w:t>
+      <w:proofErr w:type="gramStart"/>
+      <w:r>
+        <w:t>Defense{</w:t>
+      </w:r>
+      <w:proofErr w:type="gramEnd"/>
+      <w:r>
+        <w:t xml:space="preserve">% if </w:t>
+      </w:r>
+      <w:proofErr w:type="spellStart"/>
+      <w:r>
+        <w:t>plead_counterclaims</w:t>
+      </w:r>
+      <w:proofErr w:type="spellEnd"/>
+      <w:r>
+        <w:t xml:space="preserve"> %} and Counterclaim{% endif %}</w:t>
       </w:r>
     </w:p>
     <w:p>
@@ -1010,7 +1673,20 @@
         <w:contextualSpacing/>
       </w:pPr>
       <w:r>
-        <w:t>{%p if retaliation.withheld_rent %}</w:t>
+        <w:t xml:space="preserve">{%p if </w:t>
+      </w:r>
+      <w:proofErr w:type="spellStart"/>
+      <w:proofErr w:type="gramStart"/>
+      <w:r>
+        <w:t>retaliation.withheld</w:t>
+      </w:r>
+      <w:proofErr w:type="gramEnd"/>
+      <w:r>
+        <w:t>_rent</w:t>
+      </w:r>
+      <w:proofErr w:type="spellEnd"/>
+      <w:r>
+        <w:t xml:space="preserve"> %}</w:t>
       </w:r>
     </w:p>
     <w:p>
@@ -1047,7 +1723,20 @@
         <w:contextualSpacing/>
       </w:pPr>
       <w:r>
-        <w:t>{%p if retaliation.badconditions_to_landlord %}</w:t>
+        <w:t xml:space="preserve">{%p if </w:t>
+      </w:r>
+      <w:proofErr w:type="spellStart"/>
+      <w:proofErr w:type="gramStart"/>
+      <w:r>
+        <w:t>retaliation.badconditions</w:t>
+      </w:r>
+      <w:proofErr w:type="gramEnd"/>
+      <w:r>
+        <w:t>_to_landlord</w:t>
+      </w:r>
+      <w:proofErr w:type="spellEnd"/>
+      <w:r>
+        <w:t xml:space="preserve"> %}</w:t>
       </w:r>
     </w:p>
     <w:p>
@@ -1084,7 +1773,20 @@
         <w:contextualSpacing/>
       </w:pPr>
       <w:r>
-        <w:t>{%p if retaliation.badconditions_to_agency %}</w:t>
+        <w:t xml:space="preserve">{%p if </w:t>
+      </w:r>
+      <w:proofErr w:type="spellStart"/>
+      <w:proofErr w:type="gramStart"/>
+      <w:r>
+        <w:t>retaliation.badconditions</w:t>
+      </w:r>
+      <w:proofErr w:type="gramEnd"/>
+      <w:r>
+        <w:t>_to_agency</w:t>
+      </w:r>
+      <w:proofErr w:type="spellEnd"/>
+      <w:r>
+        <w:t xml:space="preserve"> %}</w:t>
       </w:r>
     </w:p>
     <w:p>
@@ -1121,7 +1823,20 @@
         <w:contextualSpacing/>
       </w:pPr>
       <w:r>
-        <w:t>{%p if retaliation.tenant_union %}</w:t>
+        <w:t xml:space="preserve">{%p if </w:t>
+      </w:r>
+      <w:proofErr w:type="spellStart"/>
+      <w:proofErr w:type="gramStart"/>
+      <w:r>
+        <w:t>retaliation.tenant</w:t>
+      </w:r>
+      <w:proofErr w:type="gramEnd"/>
+      <w:r>
+        <w:t>_union</w:t>
+      </w:r>
+      <w:proofErr w:type="spellEnd"/>
+      <w:r>
+        <w:t xml:space="preserve"> %}</w:t>
       </w:r>
     </w:p>
     <w:p>
@@ -1158,7 +1873,20 @@
         <w:contextualSpacing/>
       </w:pPr>
       <w:r>
-        <w:t>{%p if retaliation.brought_claim %}</w:t>
+        <w:t xml:space="preserve">{%p if </w:t>
+      </w:r>
+      <w:proofErr w:type="spellStart"/>
+      <w:proofErr w:type="gramStart"/>
+      <w:r>
+        <w:t>retaliation.brought</w:t>
+      </w:r>
+      <w:proofErr w:type="gramEnd"/>
+      <w:r>
+        <w:t>_claim</w:t>
+      </w:r>
+      <w:proofErr w:type="spellEnd"/>
+      <w:r>
+        <w:t xml:space="preserve"> %}</w:t>
       </w:r>
     </w:p>
     <w:p>
@@ -1195,7 +1923,20 @@
         <w:contextualSpacing/>
       </w:pPr>
       <w:r>
-        <w:t>{%p if retaliation.protection_or_prevention_order %}</w:t>
+        <w:t xml:space="preserve">{%p if </w:t>
+      </w:r>
+      <w:proofErr w:type="spellStart"/>
+      <w:proofErr w:type="gramStart"/>
+      <w:r>
+        <w:t>retaliation.protection</w:t>
+      </w:r>
+      <w:proofErr w:type="gramEnd"/>
+      <w:r>
+        <w:t>_or_prevention_order</w:t>
+      </w:r>
+      <w:proofErr w:type="spellEnd"/>
+      <w:r>
+        <w:t xml:space="preserve"> %}</w:t>
       </w:r>
     </w:p>
     <w:p>
@@ -1210,8 +1951,13 @@
         <w:contextualSpacing/>
       </w:pPr>
       <w:r>
-        <w:t>I or a member of my household took action to obtain a protection order under G.L. c. 209A or a harassment prevention order under G.L. c. 258E;</w:t>
-      </w:r>
+        <w:t xml:space="preserve">I or a member of my household took action to obtain a protection order under G.L. c. 209A or a harassment prevention order under G.L. c. </w:t>
+      </w:r>
+      <w:proofErr w:type="gramStart"/>
+      <w:r>
+        <w:t>258E;</w:t>
+      </w:r>
+      <w:proofErr w:type="gramEnd"/>
     </w:p>
     <w:p>
       <w:pPr>
@@ -1232,7 +1978,20 @@
         <w:contextualSpacing/>
       </w:pPr>
       <w:r>
-        <w:t>{%p if retaliation.domestic_violence %}</w:t>
+        <w:t xml:space="preserve">{%p if </w:t>
+      </w:r>
+      <w:proofErr w:type="spellStart"/>
+      <w:proofErr w:type="gramStart"/>
+      <w:r>
+        <w:t>retaliation.domestic</w:t>
+      </w:r>
+      <w:proofErr w:type="gramEnd"/>
+      <w:r>
+        <w:t>_violence</w:t>
+      </w:r>
+      <w:proofErr w:type="spellEnd"/>
+      <w:r>
+        <w:t xml:space="preserve"> %}</w:t>
       </w:r>
     </w:p>
     <w:p>
@@ -1269,7 +2028,20 @@
         <w:contextualSpacing/>
       </w:pPr>
       <w:r>
-        <w:t>{%p if retaliation.survivor_rights %}</w:t>
+        <w:t xml:space="preserve">{%p if </w:t>
+      </w:r>
+      <w:proofErr w:type="spellStart"/>
+      <w:proofErr w:type="gramStart"/>
+      <w:r>
+        <w:t>retaliation.survivor</w:t>
+      </w:r>
+      <w:proofErr w:type="gramEnd"/>
+      <w:r>
+        <w:t>_rights</w:t>
+      </w:r>
+      <w:proofErr w:type="spellEnd"/>
+      <w:r>
+        <w:t xml:space="preserve"> %}</w:t>
       </w:r>
     </w:p>
     <w:p>
@@ -1307,7 +2079,23 @@
         <w:contextualSpacing/>
       </w:pPr>
       <w:r>
-        <w:t>{%p  if show_retaliation_other  %}</w:t>
+        <w:t>{%</w:t>
+      </w:r>
+      <w:proofErr w:type="gramStart"/>
+      <w:r>
+        <w:t>p  if</w:t>
+      </w:r>
+      <w:proofErr w:type="gramEnd"/>
+      <w:r>
+        <w:t xml:space="preserve"> </w:t>
+      </w:r>
+      <w:proofErr w:type="spellStart"/>
+      <w:r>
+        <w:t>show_retaliation_other</w:t>
+      </w:r>
+      <w:proofErr w:type="spellEnd"/>
+      <w:r>
+        <w:t xml:space="preserve">  %}</w:t>
       </w:r>
     </w:p>
     <w:p>
@@ -1321,8 +2109,21 @@
         <w:spacing w:after="144"/>
         <w:contextualSpacing/>
       </w:pPr>
-      <w:r>
-        <w:t>{{ retaliation.other }}</w:t>
+      <w:proofErr w:type="gramStart"/>
+      <w:r>
+        <w:t xml:space="preserve">{{ </w:t>
+      </w:r>
+      <w:proofErr w:type="spellStart"/>
+      <w:r>
+        <w:t>retaliation</w:t>
+      </w:r>
+      <w:proofErr w:type="gramEnd"/>
+      <w:r>
+        <w:t>.other</w:t>
+      </w:r>
+      <w:proofErr w:type="spellEnd"/>
+      <w:r>
+        <w:t xml:space="preserve"> }}</w:t>
       </w:r>
     </w:p>
     <w:p>
@@ -1353,7 +2154,15 @@
         <w:pStyle w:val="BodyText"/>
       </w:pPr>
       <w:r>
-        <w:t>{%p if retaliation.within_6_months %}</w:t>
+        <w:t xml:space="preserve">{%p if </w:t>
+      </w:r>
+      <w:proofErr w:type="gramStart"/>
+      <w:r>
+        <w:t>retaliation.within</w:t>
+      </w:r>
+      <w:proofErr w:type="gramEnd"/>
+      <w:r>
+        <w:t>_6_months %}</w:t>
       </w:r>
     </w:p>
     <w:p>
@@ -1366,31 +2175,47 @@
         <w:suppressAutoHyphens/>
       </w:pPr>
       <w:r>
-        <w:t xml:space="preserve"> I am entitled to a presumption of retaliation because the landlord took action against me within 6 months of any of the above.</w:t>
-      </w:r>
-    </w:p>
-    <w:p>
-      <w:pPr>
-        <w:pStyle w:val="BodyText"/>
-      </w:pPr>
-      <w:r>
-        <w:t>{%p endif %}</w:t>
-      </w:r>
-    </w:p>
-    <w:p>
-      <w:pPr>
-        <w:pStyle w:val="BodyText"/>
-      </w:pPr>
-      <w:r>
-        <w:t>{%p endif %}</w:t>
-      </w:r>
-    </w:p>
-    <w:p>
-      <w:pPr>
-        <w:pStyle w:val="BodyText"/>
-      </w:pPr>
-      <w:r>
-        <w:t>{%p if tenant.is_discriminated %}</w:t>
+        <w:t xml:space="preserve"> I am entitled to a presumption of retaliation because the landlord </w:t>
+      </w:r>
+      <w:proofErr w:type="gramStart"/>
+      <w:r>
+        <w:t>took action</w:t>
+      </w:r>
+      <w:proofErr w:type="gramEnd"/>
+      <w:r>
+        <w:t xml:space="preserve"> against me within 6 months of any of the above.</w:t>
+      </w:r>
+    </w:p>
+    <w:p>
+      <w:pPr>
+        <w:pStyle w:val="BodyText"/>
+      </w:pPr>
+      <w:r>
+        <w:t>{%p endif %}</w:t>
+      </w:r>
+    </w:p>
+    <w:p>
+      <w:pPr>
+        <w:pStyle w:val="BodyText"/>
+      </w:pPr>
+      <w:r>
+        <w:t>{%p endif %}</w:t>
+      </w:r>
+    </w:p>
+    <w:p>
+      <w:pPr>
+        <w:pStyle w:val="BodyText"/>
+      </w:pPr>
+      <w:r>
+        <w:t xml:space="preserve">{%p if </w:t>
+      </w:r>
+      <w:proofErr w:type="spellStart"/>
+      <w:r>
+        <w:t>tenant.is_discriminated</w:t>
+      </w:r>
+      <w:proofErr w:type="spellEnd"/>
+      <w:r>
+        <w:t xml:space="preserve"> %}</w:t>
       </w:r>
     </w:p>
     <w:p>
@@ -1403,8 +2228,21 @@
         <w:pStyle w:val="Caption"/>
         <w:spacing w:line="276" w:lineRule="auto"/>
       </w:pPr>
-      <w:r>
-        <w:t>Defense{% if plead_counterclaims %} and Counterclaim{% endif %}</w:t>
+      <w:proofErr w:type="gramStart"/>
+      <w:r>
+        <w:t>Defense{</w:t>
+      </w:r>
+      <w:proofErr w:type="gramEnd"/>
+      <w:r>
+        <w:t xml:space="preserve">% if </w:t>
+      </w:r>
+      <w:proofErr w:type="spellStart"/>
+      <w:r>
+        <w:t>plead_counterclaims</w:t>
+      </w:r>
+      <w:proofErr w:type="spellEnd"/>
+      <w:r>
+        <w:t xml:space="preserve"> %} and Counterclaim{% endif %}</w:t>
       </w:r>
     </w:p>
     <w:p>
@@ -1426,7 +2264,15 @@
       </w:r>
       <w:r>
         <w:br/>
-        <w:t xml:space="preserve">Federal Fair Housing Act; Americans With Disabilities Act; </w:t>
+        <w:t xml:space="preserve">Federal Fair Housing Act; Americans </w:t>
+      </w:r>
+      <w:proofErr w:type="gramStart"/>
+      <w:r>
+        <w:t>With</w:t>
+      </w:r>
+      <w:proofErr w:type="gramEnd"/>
+      <w:r>
+        <w:t xml:space="preserve"> Disabilities Act; </w:t>
       </w:r>
       <w:r>
         <w:br/>
@@ -1454,7 +2300,20 @@
         <w:contextualSpacing/>
       </w:pPr>
       <w:r>
-        <w:t>{%p for class in discrimination.protected_classes.true_values() %}</w:t>
+        <w:t xml:space="preserve">{%p for class in </w:t>
+      </w:r>
+      <w:proofErr w:type="spellStart"/>
+      <w:proofErr w:type="gramStart"/>
+      <w:r>
+        <w:t>discrimination.protected</w:t>
+      </w:r>
+      <w:proofErr w:type="gramEnd"/>
+      <w:r>
+        <w:t>_classes.true_values</w:t>
+      </w:r>
+      <w:proofErr w:type="spellEnd"/>
+      <w:r>
+        <w:t>() %}</w:t>
       </w:r>
     </w:p>
     <w:p>
@@ -1468,8 +2327,13 @@
         <w:spacing w:after="144"/>
         <w:contextualSpacing/>
       </w:pPr>
-      <w:r>
-        <w:t>{{ class }}</w:t>
+      <w:proofErr w:type="gramStart"/>
+      <w:r>
+        <w:t>{{ class</w:t>
+      </w:r>
+      <w:proofErr w:type="gramEnd"/>
+      <w:r>
+        <w:t xml:space="preserve"> }}</w:t>
       </w:r>
     </w:p>
     <w:p>
@@ -1480,7 +2344,15 @@
         <w:contextualSpacing/>
       </w:pPr>
       <w:r>
-        <w:t>{%p endfor %}</w:t>
+        <w:t xml:space="preserve">{%p </w:t>
+      </w:r>
+      <w:proofErr w:type="spellStart"/>
+      <w:r>
+        <w:t>endfor</w:t>
+      </w:r>
+      <w:proofErr w:type="spellEnd"/>
+      <w:r>
+        <w:t xml:space="preserve"> %}</w:t>
       </w:r>
     </w:p>
     <w:p>
@@ -1490,7 +2362,51 @@
         <w:ind w:left="360"/>
       </w:pPr>
       <w:r>
-        <w:t>{%p if  delay_in_raft %}</w:t>
+        <w:t xml:space="preserve">{%p </w:t>
+      </w:r>
+      <w:r>
+        <w:t xml:space="preserve">if </w:t>
+      </w:r>
+      <w:proofErr w:type="spellStart"/>
+      <w:r>
+        <w:t>eviction_reason</w:t>
+      </w:r>
+      <w:proofErr w:type="spellEnd"/>
+      <w:r>
+        <w:t xml:space="preserve"> == </w:t>
+      </w:r>
+      <w:r>
+        <w:t>‘</w:t>
+      </w:r>
+      <w:r>
+        <w:t>nonpayment</w:t>
+      </w:r>
+      <w:r>
+        <w:t>’</w:t>
+      </w:r>
+      <w:r>
+        <w:t xml:space="preserve"> and </w:t>
+      </w:r>
+      <w:proofErr w:type="spellStart"/>
+      <w:r>
+        <w:t>delay_in_raft</w:t>
+      </w:r>
+      <w:proofErr w:type="spellEnd"/>
+      <w:r>
+        <w:t xml:space="preserve"> and </w:t>
+      </w:r>
+      <w:proofErr w:type="spellStart"/>
+      <w:proofErr w:type="gramStart"/>
+      <w:r>
+        <w:t>discrimination.raft</w:t>
+      </w:r>
+      <w:proofErr w:type="gramEnd"/>
+      <w:r>
+        <w:t>_refusal</w:t>
+      </w:r>
+      <w:proofErr w:type="spellEnd"/>
+      <w:r>
+        <w:t xml:space="preserve"> %}</w:t>
       </w:r>
     </w:p>
     <w:p>
@@ -1529,13 +2445,31 @@
         <w:pStyle w:val="BodyText"/>
       </w:pPr>
       <w:r>
-        <w:t xml:space="preserve">{%p if tenant.is_disabled </w:t>
+        <w:t xml:space="preserve">{%p if </w:t>
+      </w:r>
+      <w:proofErr w:type="spellStart"/>
+      <w:r>
+        <w:t>tenant.is_disabled</w:t>
+      </w:r>
+      <w:proofErr w:type="spellEnd"/>
+      <w:r>
+        <w:t xml:space="preserve"> </w:t>
       </w:r>
       <w:r>
         <w:t xml:space="preserve">and </w:t>
       </w:r>
-      <w:r>
-        <w:t>disability.request_reasonable_accommodation %}</w:t>
+      <w:proofErr w:type="spellStart"/>
+      <w:proofErr w:type="gramStart"/>
+      <w:r>
+        <w:t>disability.request</w:t>
+      </w:r>
+      <w:proofErr w:type="gramEnd"/>
+      <w:r>
+        <w:t>_reasonable_accommodation</w:t>
+      </w:r>
+      <w:proofErr w:type="spellEnd"/>
+      <w:r>
+        <w:t xml:space="preserve"> %}</w:t>
       </w:r>
     </w:p>
     <w:p>
@@ -1560,348 +2494,487 @@
           <w:rFonts w:ascii="Garamond" w:hAnsi="Garamond"/>
         </w:rPr>
         <w:lastRenderedPageBreak/>
-        <w:t xml:space="preserve">See BHA vs. Bridgewaters, 452 Mass, 833 (2009) </w:t>
-      </w:r>
-    </w:p>
-    <w:p>
-      <w:pPr>
-        <w:pStyle w:val="BodyText"/>
-        <w:numPr>
-          <w:ilvl w:val="0"/>
-          <w:numId w:val="14"/>
-        </w:numPr>
-        <w:suppressAutoHyphens/>
-      </w:pPr>
-      <w:r>
-        <w:t>I (and/or a member of my household) have a disability and I request/have requested that the landlord make changes in its rules or do what is necessary for me to have a fair housing opportunity. Failing to provide a reasonable accommodation to a qualified person with a disability is disability-based discrimination. Note: This may include allowing the tenant to get help or do something necessary to address a lease violation.</w:t>
-      </w:r>
-    </w:p>
-    <w:p>
-      <w:pPr>
-        <w:pStyle w:val="BodyText"/>
-        <w:suppressAutoHyphens/>
-      </w:pPr>
-      <w:r>
-        <w:t>{%p endif %}</w:t>
-      </w:r>
-    </w:p>
-    <w:p>
-      <w:pPr>
-        <w:pStyle w:val="BodyText"/>
-      </w:pPr>
-      <w:r>
-        <w:t>{%p if claims.harassment %}</w:t>
-      </w:r>
-    </w:p>
-    <w:p>
-      <w:pPr>
-        <w:pStyle w:val="BodyText"/>
-      </w:pPr>
-    </w:p>
-    <w:p>
-      <w:pPr>
-        <w:pStyle w:val="CenterTitle"/>
-      </w:pPr>
-      <w:r>
-        <w:t>Sexual Harassment</w:t>
-      </w:r>
-    </w:p>
-    <w:p>
-      <w:pPr>
-        <w:pStyle w:val="CenterTitle4"/>
-      </w:pPr>
+        <w:t xml:space="preserve">See BHA vs. </w:t>
+      </w:r>
+      <w:proofErr w:type="spellStart"/>
       <w:r>
         <w:rPr>
           <w:rFonts w:ascii="Garamond" w:hAnsi="Garamond"/>
         </w:rPr>
-        <w:t xml:space="preserve">See Gnerre v. MCAD, 402 Mass. 502 (1988); Mass. Gen. Laws c. 151B, §4(6) </w:t>
-      </w:r>
-    </w:p>
-    <w:p>
-      <w:pPr>
-        <w:pStyle w:val="BodyText"/>
-        <w:numPr>
-          <w:ilvl w:val="0"/>
-          <w:numId w:val="14"/>
-        </w:numPr>
-        <w:suppressAutoHyphens/>
-      </w:pPr>
-      <w:r>
-        <w:t xml:space="preserve">My landlord (or an agent/representative of my landlord) discriminated against me based on my sex/gender by sexually harassing me. This activity made my apartment less desirable to me. </w:t>
-      </w:r>
-    </w:p>
-    <w:p>
-      <w:pPr>
-        <w:pStyle w:val="BodyText"/>
-        <w:spacing w:after="144"/>
-        <w:ind w:left="720"/>
-        <w:contextualSpacing/>
-      </w:pPr>
-      <w:r>
-        <w:t>{%p if discrimination.sexual_harassment.pressured_sexual_favors %}</w:t>
-      </w:r>
-    </w:p>
-    <w:p>
-      <w:pPr>
-        <w:pStyle w:val="BodyText"/>
-        <w:numPr>
-          <w:ilvl w:val="1"/>
-          <w:numId w:val="17"/>
-        </w:numPr>
-        <w:suppressAutoHyphens/>
-        <w:spacing w:after="144"/>
-        <w:contextualSpacing/>
-      </w:pPr>
-      <w:r>
-        <w:t>I have been asked or pressured to give sexual favors.</w:t>
-      </w:r>
-    </w:p>
-    <w:p>
-      <w:pPr>
-        <w:pStyle w:val="BodyText"/>
-        <w:spacing w:after="144"/>
-        <w:ind w:left="720"/>
-        <w:contextualSpacing/>
-      </w:pPr>
-      <w:r>
-        <w:t>{%p endif %}</w:t>
-      </w:r>
-    </w:p>
-    <w:p>
-      <w:pPr>
-        <w:pStyle w:val="BodyText"/>
-        <w:spacing w:after="144"/>
-        <w:ind w:left="720"/>
-        <w:contextualSpacing/>
-      </w:pPr>
-      <w:r>
-        <w:t>{%p if discrimination.sexual_harassment.tenancy_terms_changed %}</w:t>
-      </w:r>
-    </w:p>
-    <w:p>
-      <w:pPr>
-        <w:pStyle w:val="BodyText"/>
-        <w:numPr>
-          <w:ilvl w:val="1"/>
-          <w:numId w:val="17"/>
-        </w:numPr>
-        <w:suppressAutoHyphens/>
-        <w:spacing w:after="144"/>
-        <w:contextualSpacing/>
-      </w:pPr>
-      <w:r>
-        <w:t>Terms of my tenancy were changed because of my response to the sexual harassment.</w:t>
-      </w:r>
-    </w:p>
-    <w:p>
-      <w:pPr>
-        <w:pStyle w:val="BodyText"/>
-        <w:spacing w:after="144"/>
-        <w:ind w:left="720"/>
-        <w:contextualSpacing/>
-      </w:pPr>
-      <w:r>
-        <w:t>{%p endif %}</w:t>
-      </w:r>
-    </w:p>
-    <w:p>
-      <w:pPr>
-        <w:pStyle w:val="BodyText"/>
-        <w:spacing w:after="144"/>
-        <w:ind w:left="720"/>
-        <w:contextualSpacing/>
-      </w:pPr>
-      <w:r>
-        <w:t>{%p if discrimination.sexual_harassment.unsafe_or_uncomfortable %}</w:t>
-      </w:r>
-    </w:p>
-    <w:p>
-      <w:pPr>
-        <w:pStyle w:val="BodyText"/>
-        <w:numPr>
-          <w:ilvl w:val="1"/>
-          <w:numId w:val="17"/>
-        </w:numPr>
-        <w:suppressAutoHyphens/>
-        <w:spacing w:after="144"/>
-        <w:contextualSpacing/>
-      </w:pPr>
-      <w:r>
-        <w:t>I felt unsafe or uncomfortable in my home as a result of sexual harassment.</w:t>
-      </w:r>
-    </w:p>
-    <w:p>
-      <w:pPr>
-        <w:pStyle w:val="BodyText"/>
-        <w:spacing w:after="144"/>
-        <w:ind w:left="720"/>
-        <w:contextualSpacing/>
-      </w:pPr>
-      <w:r>
-        <w:t>{%p endif %}</w:t>
-      </w:r>
-    </w:p>
-    <w:p>
-      <w:pPr>
-        <w:pStyle w:val="BodyText"/>
-        <w:spacing w:after="144"/>
-        <w:contextualSpacing/>
-      </w:pPr>
-      <w:bookmarkStart w:id="0" w:name="_Hlk495920767"/>
-      <w:bookmarkEnd w:id="0"/>
-      <w:r>
-        <w:t>{%p endif %}</w:t>
-      </w:r>
-    </w:p>
-    <w:p>
-      <w:pPr>
-        <w:pStyle w:val="BodyText"/>
-        <w:spacing w:after="144"/>
-        <w:contextualSpacing/>
-      </w:pPr>
-      <w:r>
-        <w:t>{%p if eviction_reason == "fault" %}</w:t>
-      </w:r>
-    </w:p>
-    <w:p>
-      <w:pPr>
-        <w:pStyle w:val="BodyText"/>
-      </w:pPr>
-    </w:p>
-    <w:p>
-      <w:pPr>
-        <w:pStyle w:val="Caption"/>
-        <w:spacing w:line="276" w:lineRule="auto"/>
-      </w:pPr>
-      <w:r>
-        <w:t>Defense</w:t>
-      </w:r>
-    </w:p>
-    <w:p>
-      <w:pPr>
-        <w:pStyle w:val="CenterTitle"/>
-        <w:spacing w:line="360" w:lineRule="auto"/>
-      </w:pPr>
-      <w:r>
-        <w:t>Tenant Not Responsible for Alleged Behavior</w:t>
-      </w:r>
-    </w:p>
-    <w:p>
-      <w:pPr>
-        <w:pStyle w:val="BodyText"/>
-        <w:spacing w:after="144"/>
-        <w:ind w:left="360"/>
-        <w:contextualSpacing/>
-      </w:pPr>
-      <w:r>
-        <w:t>{%p if fault.did_not_occur %}</w:t>
-      </w:r>
-    </w:p>
-    <w:p>
-      <w:pPr>
-        <w:pStyle w:val="BodyText"/>
-        <w:numPr>
-          <w:ilvl w:val="0"/>
-          <w:numId w:val="14"/>
-        </w:numPr>
-        <w:suppressAutoHyphens/>
-      </w:pPr>
-      <w:r>
-        <w:t>I/a household member/guest did not do what my landlord alleges is the reason for eviction.</w:t>
-      </w:r>
-    </w:p>
-    <w:p>
-      <w:pPr>
-        <w:pStyle w:val="BodyText"/>
-        <w:ind w:left="360"/>
-      </w:pPr>
-      <w:r>
-        <w:t>{%p endif %}</w:t>
-      </w:r>
-    </w:p>
-    <w:p>
-      <w:pPr>
-        <w:pStyle w:val="BodyText"/>
-        <w:ind w:left="360"/>
-      </w:pPr>
-      <w:r>
-        <w:t>{%p if fault.not_violation_of_agreement %}</w:t>
-      </w:r>
-    </w:p>
-    <w:p>
-      <w:pPr>
-        <w:pStyle w:val="BodyText"/>
-        <w:numPr>
-          <w:ilvl w:val="0"/>
-          <w:numId w:val="14"/>
-        </w:numPr>
-        <w:suppressAutoHyphens/>
-      </w:pPr>
-      <w:r>
-        <w:t>What my landlord is claiming is not a violation of the rental agreement.</w:t>
-      </w:r>
-    </w:p>
-    <w:p>
-      <w:pPr>
-        <w:pStyle w:val="BodyText"/>
-        <w:ind w:left="360"/>
-      </w:pPr>
-      <w:r>
-        <w:lastRenderedPageBreak/>
-        <w:t>{%p endif %}</w:t>
-      </w:r>
-    </w:p>
-    <w:p>
-      <w:pPr>
-        <w:pStyle w:val="BodyText"/>
-        <w:ind w:left="360"/>
-      </w:pPr>
-      <w:r>
-        <w:t>{%p if fault.no_control_of_guest %}</w:t>
-      </w:r>
-    </w:p>
-    <w:p>
-      <w:pPr>
-        <w:pStyle w:val="BodyText"/>
-        <w:numPr>
-          <w:ilvl w:val="0"/>
-          <w:numId w:val="14"/>
-        </w:numPr>
-        <w:suppressAutoHyphens/>
-      </w:pPr>
-      <w:r>
-        <w:t>I am a tenant in state public housing and the landlord is evicting me for alleged behavior of a household member, guest, or someone over whom I had no control. I did not violate my lease or any law. I had no way to control or no reason to know about the alleged behavior.</w:t>
-      </w:r>
-    </w:p>
-    <w:p>
-      <w:pPr>
-        <w:pStyle w:val="BodyText"/>
-        <w:ind w:left="360"/>
-      </w:pPr>
-      <w:r>
-        <w:t>{%p endif %}</w:t>
-      </w:r>
-    </w:p>
-    <w:p>
-      <w:pPr>
-        <w:pStyle w:val="BodyText"/>
-      </w:pPr>
+        <w:t>Bridgewaters</w:t>
+      </w:r>
+      <w:proofErr w:type="spellEnd"/>
       <w:r>
         <w:rPr>
           <w:rFonts w:ascii="Garamond" w:hAnsi="Garamond"/>
         </w:rPr>
-        <w:t>{%p endif %}</w:t>
-      </w:r>
-    </w:p>
-    <w:p>
-      <w:pPr>
-        <w:pStyle w:val="BodyText"/>
+        <w:t xml:space="preserve">, 452 Mass, 833 (2009) </w:t>
+      </w:r>
+    </w:p>
+    <w:p>
+      <w:pPr>
+        <w:pStyle w:val="BodyText"/>
+        <w:numPr>
+          <w:ilvl w:val="0"/>
+          <w:numId w:val="14"/>
+        </w:numPr>
+        <w:suppressAutoHyphens/>
+      </w:pPr>
+      <w:r>
+        <w:t xml:space="preserve">I (and/or a member of my household) have a </w:t>
+      </w:r>
+      <w:proofErr w:type="gramStart"/>
+      <w:r>
+        <w:t>disability</w:t>
+      </w:r>
+      <w:proofErr w:type="gramEnd"/>
+      <w:r>
+        <w:t xml:space="preserve"> and I request/have requested that the landlord make changes in its rules or do what is necessary for me to have a fair housing opportunity. Failing to provide a reasonable accommodation to a qualified person with a disability is disability-based discrimination. Note: This may include allowing the tenant to get help or do something necessary to address a lease violation.</w:t>
+      </w:r>
+    </w:p>
+    <w:p>
+      <w:pPr>
+        <w:pStyle w:val="BodyText"/>
+        <w:suppressAutoHyphens/>
+      </w:pPr>
+      <w:r>
+        <w:t>{%p endif %}</w:t>
+      </w:r>
+    </w:p>
+    <w:p>
+      <w:pPr>
+        <w:pStyle w:val="BodyText"/>
+      </w:pPr>
+      <w:r>
+        <w:t xml:space="preserve">{%p if </w:t>
+      </w:r>
+      <w:proofErr w:type="spellStart"/>
+      <w:proofErr w:type="gramStart"/>
+      <w:r>
+        <w:t>claims.harassment</w:t>
+      </w:r>
+      <w:proofErr w:type="spellEnd"/>
+      <w:proofErr w:type="gramEnd"/>
+      <w:r>
+        <w:t xml:space="preserve"> %}</w:t>
+      </w:r>
+    </w:p>
+    <w:p>
+      <w:pPr>
+        <w:pStyle w:val="BodyText"/>
+      </w:pPr>
+    </w:p>
+    <w:p>
+      <w:pPr>
+        <w:pStyle w:val="CenterTitle"/>
+      </w:pPr>
+      <w:r>
+        <w:t>Sexual Harassment</w:t>
+      </w:r>
+    </w:p>
+    <w:p>
+      <w:pPr>
+        <w:pStyle w:val="CenterTitle4"/>
       </w:pPr>
       <w:r>
         <w:rPr>
           <w:rFonts w:ascii="Garamond" w:hAnsi="Garamond"/>
         </w:rPr>
-        <w:t>{%p if plead_counterclaims %}</w:t>
+        <w:t xml:space="preserve">See </w:t>
+      </w:r>
+      <w:proofErr w:type="spellStart"/>
+      <w:r>
+        <w:rPr>
+          <w:rFonts w:ascii="Garamond" w:hAnsi="Garamond"/>
+        </w:rPr>
+        <w:t>Gnerre</w:t>
+      </w:r>
+      <w:proofErr w:type="spellEnd"/>
+      <w:r>
+        <w:rPr>
+          <w:rFonts w:ascii="Garamond" w:hAnsi="Garamond"/>
+        </w:rPr>
+        <w:t xml:space="preserve"> v. MCAD, 402 Mass. 502 (1988); Mass. Gen. Laws c. 151B, §4(6) </w:t>
+      </w:r>
+    </w:p>
+    <w:p>
+      <w:pPr>
+        <w:pStyle w:val="BodyText"/>
+        <w:numPr>
+          <w:ilvl w:val="0"/>
+          <w:numId w:val="14"/>
+        </w:numPr>
+        <w:suppressAutoHyphens/>
+      </w:pPr>
+      <w:r>
+        <w:t xml:space="preserve">My landlord (or an agent/representative of my landlord) discriminated against me based on my sex/gender by sexually harassing me. This activity made my apartment less desirable to me. </w:t>
+      </w:r>
+    </w:p>
+    <w:p>
+      <w:pPr>
+        <w:pStyle w:val="BodyText"/>
+        <w:spacing w:after="144"/>
+        <w:ind w:left="720"/>
+        <w:contextualSpacing/>
+      </w:pPr>
+      <w:r>
+        <w:t xml:space="preserve">{%p if </w:t>
+      </w:r>
+      <w:proofErr w:type="spellStart"/>
+      <w:proofErr w:type="gramStart"/>
+      <w:r>
+        <w:t>discrimination.sexual</w:t>
+      </w:r>
+      <w:proofErr w:type="gramEnd"/>
+      <w:r>
+        <w:t>_harassment.pressured_sexual_favors</w:t>
+      </w:r>
+      <w:proofErr w:type="spellEnd"/>
+      <w:r>
+        <w:t xml:space="preserve"> %}</w:t>
+      </w:r>
+    </w:p>
+    <w:p>
+      <w:pPr>
+        <w:pStyle w:val="BodyText"/>
+        <w:numPr>
+          <w:ilvl w:val="1"/>
+          <w:numId w:val="17"/>
+        </w:numPr>
+        <w:suppressAutoHyphens/>
+        <w:spacing w:after="144"/>
+        <w:contextualSpacing/>
+      </w:pPr>
+      <w:r>
+        <w:t>I have been asked or pressured to give sexual favors.</w:t>
+      </w:r>
+    </w:p>
+    <w:p>
+      <w:pPr>
+        <w:pStyle w:val="BodyText"/>
+        <w:spacing w:after="144"/>
+        <w:ind w:left="720"/>
+        <w:contextualSpacing/>
+      </w:pPr>
+      <w:r>
+        <w:t>{%p endif %}</w:t>
+      </w:r>
+    </w:p>
+    <w:p>
+      <w:pPr>
+        <w:pStyle w:val="BodyText"/>
+        <w:spacing w:after="144"/>
+        <w:ind w:left="720"/>
+        <w:contextualSpacing/>
+      </w:pPr>
+      <w:r>
+        <w:t xml:space="preserve">{%p if </w:t>
+      </w:r>
+      <w:proofErr w:type="spellStart"/>
+      <w:proofErr w:type="gramStart"/>
+      <w:r>
+        <w:t>discrimination.sexual</w:t>
+      </w:r>
+      <w:proofErr w:type="gramEnd"/>
+      <w:r>
+        <w:t>_harassment.tenancy_terms_changed</w:t>
+      </w:r>
+      <w:proofErr w:type="spellEnd"/>
+      <w:r>
+        <w:t xml:space="preserve"> %}</w:t>
+      </w:r>
+    </w:p>
+    <w:p>
+      <w:pPr>
+        <w:pStyle w:val="BodyText"/>
+        <w:numPr>
+          <w:ilvl w:val="1"/>
+          <w:numId w:val="17"/>
+        </w:numPr>
+        <w:suppressAutoHyphens/>
+        <w:spacing w:after="144"/>
+        <w:contextualSpacing/>
+      </w:pPr>
+      <w:r>
+        <w:t>Terms of my tenancy were changed because of my response to the sexual harassment.</w:t>
+      </w:r>
+    </w:p>
+    <w:p>
+      <w:pPr>
+        <w:pStyle w:val="BodyText"/>
+        <w:spacing w:after="144"/>
+        <w:ind w:left="720"/>
+        <w:contextualSpacing/>
+      </w:pPr>
+      <w:r>
+        <w:t>{%p endif %}</w:t>
+      </w:r>
+    </w:p>
+    <w:p>
+      <w:pPr>
+        <w:pStyle w:val="BodyText"/>
+        <w:spacing w:after="144"/>
+        <w:ind w:left="720"/>
+        <w:contextualSpacing/>
+      </w:pPr>
+      <w:r>
+        <w:t xml:space="preserve">{%p if </w:t>
+      </w:r>
+      <w:proofErr w:type="spellStart"/>
+      <w:proofErr w:type="gramStart"/>
+      <w:r>
+        <w:t>discrimination.sexual</w:t>
+      </w:r>
+      <w:proofErr w:type="gramEnd"/>
+      <w:r>
+        <w:t>_harassment.unsafe_or_uncomfortable</w:t>
+      </w:r>
+      <w:proofErr w:type="spellEnd"/>
+      <w:r>
+        <w:t xml:space="preserve"> %}</w:t>
+      </w:r>
+    </w:p>
+    <w:p>
+      <w:pPr>
+        <w:pStyle w:val="BodyText"/>
+        <w:numPr>
+          <w:ilvl w:val="1"/>
+          <w:numId w:val="17"/>
+        </w:numPr>
+        <w:suppressAutoHyphens/>
+        <w:spacing w:after="144"/>
+        <w:contextualSpacing/>
+      </w:pPr>
+      <w:r>
+        <w:t xml:space="preserve">I felt unsafe or uncomfortable in my home </w:t>
+      </w:r>
+      <w:proofErr w:type="gramStart"/>
+      <w:r>
+        <w:t>as a result of</w:t>
+      </w:r>
+      <w:proofErr w:type="gramEnd"/>
+      <w:r>
+        <w:t xml:space="preserve"> sexual harassment.</w:t>
+      </w:r>
+    </w:p>
+    <w:p>
+      <w:pPr>
+        <w:pStyle w:val="BodyText"/>
+        <w:spacing w:after="144"/>
+        <w:ind w:left="720"/>
+        <w:contextualSpacing/>
+      </w:pPr>
+      <w:r>
+        <w:t>{%p endif %}</w:t>
+      </w:r>
+    </w:p>
+    <w:p>
+      <w:pPr>
+        <w:pStyle w:val="BodyText"/>
+        <w:spacing w:after="144"/>
+        <w:contextualSpacing/>
+      </w:pPr>
+      <w:bookmarkStart w:id="0" w:name="_Hlk495920767"/>
+      <w:bookmarkEnd w:id="0"/>
+      <w:r>
+        <w:t>{%p endif %}</w:t>
+      </w:r>
+    </w:p>
+    <w:p>
+      <w:pPr>
+        <w:pStyle w:val="BodyText"/>
+        <w:spacing w:after="144"/>
+        <w:contextualSpacing/>
+      </w:pPr>
+      <w:r>
+        <w:t xml:space="preserve">{%p if </w:t>
+      </w:r>
+      <w:proofErr w:type="spellStart"/>
+      <w:r>
+        <w:t>eviction_reason</w:t>
+      </w:r>
+      <w:proofErr w:type="spellEnd"/>
+      <w:r>
+        <w:t xml:space="preserve"> == "fault" %}</w:t>
+      </w:r>
+    </w:p>
+    <w:p>
+      <w:pPr>
+        <w:pStyle w:val="BodyText"/>
+      </w:pPr>
+    </w:p>
+    <w:p>
+      <w:pPr>
+        <w:pStyle w:val="Caption"/>
+        <w:spacing w:line="276" w:lineRule="auto"/>
+      </w:pPr>
+      <w:r>
+        <w:t>Defense</w:t>
+      </w:r>
+    </w:p>
+    <w:p>
+      <w:pPr>
+        <w:pStyle w:val="CenterTitle"/>
+        <w:spacing w:line="360" w:lineRule="auto"/>
+      </w:pPr>
+      <w:r>
+        <w:t>Tenant Not Responsible for Alleged Behavior</w:t>
+      </w:r>
+    </w:p>
+    <w:p>
+      <w:pPr>
+        <w:pStyle w:val="BodyText"/>
+        <w:spacing w:after="144"/>
+        <w:ind w:left="360"/>
+        <w:contextualSpacing/>
+      </w:pPr>
+      <w:r>
+        <w:t xml:space="preserve">{%p if </w:t>
+      </w:r>
+      <w:proofErr w:type="spellStart"/>
+      <w:r>
+        <w:t>fault.did_not_occur</w:t>
+      </w:r>
+      <w:proofErr w:type="spellEnd"/>
+      <w:r>
+        <w:t xml:space="preserve"> %}</w:t>
+      </w:r>
+    </w:p>
+    <w:p>
+      <w:pPr>
+        <w:pStyle w:val="BodyText"/>
+        <w:numPr>
+          <w:ilvl w:val="0"/>
+          <w:numId w:val="14"/>
+        </w:numPr>
+        <w:suppressAutoHyphens/>
+      </w:pPr>
+      <w:r>
+        <w:t>I/a household member/guest did not do what my landlord alleges is the reason for eviction.</w:t>
+      </w:r>
+    </w:p>
+    <w:p>
+      <w:pPr>
+        <w:pStyle w:val="BodyText"/>
+        <w:ind w:left="360"/>
+      </w:pPr>
+      <w:r>
+        <w:t>{%p endif %}</w:t>
+      </w:r>
+    </w:p>
+    <w:p>
+      <w:pPr>
+        <w:pStyle w:val="BodyText"/>
+        <w:ind w:left="360"/>
+      </w:pPr>
+      <w:r>
+        <w:t xml:space="preserve">{%p if </w:t>
+      </w:r>
+      <w:proofErr w:type="spellStart"/>
+      <w:r>
+        <w:t>fault.not_violation_of_agreement</w:t>
+      </w:r>
+      <w:proofErr w:type="spellEnd"/>
+      <w:r>
+        <w:t xml:space="preserve"> %}</w:t>
+      </w:r>
+    </w:p>
+    <w:p>
+      <w:pPr>
+        <w:pStyle w:val="BodyText"/>
+        <w:numPr>
+          <w:ilvl w:val="0"/>
+          <w:numId w:val="14"/>
+        </w:numPr>
+        <w:suppressAutoHyphens/>
+      </w:pPr>
+      <w:r>
+        <w:t>What my landlord is claiming is not a violation of the rental agreement.</w:t>
+      </w:r>
+    </w:p>
+    <w:p>
+      <w:pPr>
+        <w:pStyle w:val="BodyText"/>
+        <w:ind w:left="360"/>
+      </w:pPr>
+      <w:r>
+        <w:lastRenderedPageBreak/>
+        <w:t>{%p endif %}</w:t>
+      </w:r>
+    </w:p>
+    <w:p>
+      <w:pPr>
+        <w:pStyle w:val="BodyText"/>
+        <w:ind w:left="360"/>
+      </w:pPr>
+      <w:r>
+        <w:t xml:space="preserve">{%p if </w:t>
+      </w:r>
+      <w:proofErr w:type="spellStart"/>
+      <w:r>
+        <w:t>fault.no_control_of_guest</w:t>
+      </w:r>
+      <w:proofErr w:type="spellEnd"/>
+      <w:r>
+        <w:t xml:space="preserve"> %}</w:t>
+      </w:r>
+    </w:p>
+    <w:p>
+      <w:pPr>
+        <w:pStyle w:val="BodyText"/>
+        <w:numPr>
+          <w:ilvl w:val="0"/>
+          <w:numId w:val="14"/>
+        </w:numPr>
+        <w:suppressAutoHyphens/>
+      </w:pPr>
+      <w:r>
+        <w:t>I am a tenant in state public housing and the landlord is evicting me for alleged behavior of a household member, guest, or someone over whom I had no control. I did not violate my lease or any law. I had no way to control or no reason to know about the alleged behavior.</w:t>
+      </w:r>
+    </w:p>
+    <w:p>
+      <w:pPr>
+        <w:pStyle w:val="BodyText"/>
+        <w:ind w:left="360"/>
+      </w:pPr>
+      <w:r>
+        <w:t>{%p endif %}</w:t>
+      </w:r>
+    </w:p>
+    <w:p>
+      <w:pPr>
+        <w:pStyle w:val="BodyText"/>
+      </w:pPr>
+      <w:r>
+        <w:rPr>
+          <w:rFonts w:ascii="Garamond" w:hAnsi="Garamond"/>
+        </w:rPr>
+        <w:t>{%p endif %}</w:t>
+      </w:r>
+    </w:p>
+    <w:p>
+      <w:pPr>
+        <w:pStyle w:val="BodyText"/>
+      </w:pPr>
+      <w:r>
+        <w:rPr>
+          <w:rFonts w:ascii="Garamond" w:hAnsi="Garamond"/>
+        </w:rPr>
+        <w:t xml:space="preserve">{%p if </w:t>
+      </w:r>
+      <w:proofErr w:type="spellStart"/>
+      <w:r>
+        <w:rPr>
+          <w:rFonts w:ascii="Garamond" w:hAnsi="Garamond"/>
+        </w:rPr>
+        <w:t>plead_counterclaims</w:t>
+      </w:r>
+      <w:proofErr w:type="spellEnd"/>
+      <w:r>
+        <w:rPr>
+          <w:rFonts w:ascii="Garamond" w:hAnsi="Garamond"/>
+        </w:rPr>
+        <w:t xml:space="preserve"> %}</w:t>
       </w:r>
     </w:p>
     <w:p>
@@ -1923,7 +2996,35 @@
         <w:rPr>
           <w:rFonts w:ascii="Garamond" w:hAnsi="Garamond"/>
         </w:rPr>
-        <w:t>{%p if bad_conditions.have_conditions %}</w:t>
+        <w:t xml:space="preserve">{%p if </w:t>
+      </w:r>
+      <w:proofErr w:type="spellStart"/>
+      <w:r>
+        <w:rPr>
+          <w:rFonts w:ascii="Garamond" w:hAnsi="Garamond"/>
+        </w:rPr>
+        <w:t>bad_</w:t>
+      </w:r>
+      <w:proofErr w:type="gramStart"/>
+      <w:r>
+        <w:rPr>
+          <w:rFonts w:ascii="Garamond" w:hAnsi="Garamond"/>
+        </w:rPr>
+        <w:t>conditions.have</w:t>
+      </w:r>
+      <w:proofErr w:type="gramEnd"/>
+      <w:r>
+        <w:rPr>
+          <w:rFonts w:ascii="Garamond" w:hAnsi="Garamond"/>
+        </w:rPr>
+        <w:t>_conditions</w:t>
+      </w:r>
+      <w:proofErr w:type="spellEnd"/>
+      <w:r>
+        <w:rPr>
+          <w:rFonts w:ascii="Garamond" w:hAnsi="Garamond"/>
+        </w:rPr>
+        <w:t xml:space="preserve"> %}</w:t>
       </w:r>
     </w:p>
     <w:p>
@@ -1984,7 +3085,23 @@
         <w:ind w:left="360" w:firstLine="283"/>
       </w:pPr>
       <w:r>
-        <w:t>{%p for condition in bad_conditions.conditions.true_values() %}</w:t>
+        <w:t xml:space="preserve">{%p for condition in </w:t>
+      </w:r>
+      <w:proofErr w:type="spellStart"/>
+      <w:r>
+        <w:t>bad_</w:t>
+      </w:r>
+      <w:proofErr w:type="gramStart"/>
+      <w:r>
+        <w:t>conditions.conditions</w:t>
+      </w:r>
+      <w:proofErr w:type="gramEnd"/>
+      <w:r>
+        <w:t>.true_values</w:t>
+      </w:r>
+      <w:proofErr w:type="spellEnd"/>
+      <w:r>
+        <w:t>() %}</w:t>
       </w:r>
     </w:p>
     <w:p>
@@ -1998,8 +3115,13 @@
         <w:spacing w:after="144"/>
         <w:contextualSpacing/>
       </w:pPr>
-      <w:r>
-        <w:t>{{ condition }}</w:t>
+      <w:proofErr w:type="gramStart"/>
+      <w:r>
+        <w:t>{{ condition</w:t>
+      </w:r>
+      <w:proofErr w:type="gramEnd"/>
+      <w:r>
+        <w:t xml:space="preserve"> }}</w:t>
       </w:r>
     </w:p>
     <w:p>
@@ -2010,7 +3132,15 @@
         <w:contextualSpacing/>
       </w:pPr>
       <w:r>
-        <w:t>{%p endfor %}</w:t>
+        <w:t xml:space="preserve">{%p </w:t>
+      </w:r>
+      <w:proofErr w:type="spellStart"/>
+      <w:r>
+        <w:t>endfor</w:t>
+      </w:r>
+      <w:proofErr w:type="spellEnd"/>
+      <w:r>
+        <w:t xml:space="preserve"> %}</w:t>
       </w:r>
     </w:p>
     <w:p>
@@ -2021,7 +3151,20 @@
         <w:contextualSpacing/>
       </w:pPr>
       <w:r>
-        <w:t>{%p if bad_conditions.conditions['other'] %}</w:t>
+        <w:t xml:space="preserve">{%p if </w:t>
+      </w:r>
+      <w:proofErr w:type="spellStart"/>
+      <w:r>
+        <w:t>bad_</w:t>
+      </w:r>
+      <w:proofErr w:type="gramStart"/>
+      <w:r>
+        <w:t>conditions.conditions</w:t>
+      </w:r>
+      <w:proofErr w:type="spellEnd"/>
+      <w:proofErr w:type="gramEnd"/>
+      <w:r>
+        <w:t>['other'] %}</w:t>
       </w:r>
     </w:p>
     <w:p>
@@ -2035,8 +3178,21 @@
         <w:spacing w:after="144"/>
         <w:contextualSpacing/>
       </w:pPr>
-      <w:r>
-        <w:t>{{ bad_conditions.other_condition }}</w:t>
+      <w:proofErr w:type="gramStart"/>
+      <w:r>
+        <w:t xml:space="preserve">{{ </w:t>
+      </w:r>
+      <w:proofErr w:type="spellStart"/>
+      <w:r>
+        <w:t>bad</w:t>
+      </w:r>
+      <w:proofErr w:type="gramEnd"/>
+      <w:r>
+        <w:t>_conditions.other_condition</w:t>
+      </w:r>
+      <w:proofErr w:type="spellEnd"/>
+      <w:r>
+        <w:t xml:space="preserve"> }}</w:t>
       </w:r>
     </w:p>
     <w:p>
@@ -2058,7 +3214,23 @@
       </w:pPr>
       <w:r>
         <w:tab/>
-        <w:t>{%p if bad_conditions.landlord_notified.any_true() %}</w:t>
+        <w:t xml:space="preserve">{%p if </w:t>
+      </w:r>
+      <w:proofErr w:type="spellStart"/>
+      <w:r>
+        <w:t>bad_conditions.landlord_notified.any_</w:t>
+      </w:r>
+      <w:proofErr w:type="gramStart"/>
+      <w:r>
+        <w:t>true</w:t>
+      </w:r>
+      <w:proofErr w:type="spellEnd"/>
+      <w:r>
+        <w:t>(</w:t>
+      </w:r>
+      <w:proofErr w:type="gramEnd"/>
+      <w:r>
+        <w:t>) %}</w:t>
       </w:r>
     </w:p>
     <w:p>
@@ -2082,7 +3254,23 @@
         <w:contextualSpacing/>
       </w:pPr>
       <w:r>
-        <w:t>{%p for notified in bad_conditions.landlord_notified.true_values() %}</w:t>
+        <w:t xml:space="preserve">{%p for notified in </w:t>
+      </w:r>
+      <w:proofErr w:type="spellStart"/>
+      <w:r>
+        <w:t>bad_</w:t>
+      </w:r>
+      <w:proofErr w:type="gramStart"/>
+      <w:r>
+        <w:t>conditions.landlord</w:t>
+      </w:r>
+      <w:proofErr w:type="gramEnd"/>
+      <w:r>
+        <w:t>_notified.true_values</w:t>
+      </w:r>
+      <w:proofErr w:type="spellEnd"/>
+      <w:r>
+        <w:t>() %}</w:t>
       </w:r>
     </w:p>
     <w:p>
@@ -2096,8 +3284,13 @@
         <w:spacing w:after="144"/>
         <w:contextualSpacing/>
       </w:pPr>
-      <w:r>
-        <w:t>{{ notified}}</w:t>
+      <w:proofErr w:type="gramStart"/>
+      <w:r>
+        <w:t>{{ notified</w:t>
+      </w:r>
+      <w:proofErr w:type="gramEnd"/>
+      <w:r>
+        <w:t>}}</w:t>
       </w:r>
     </w:p>
     <w:p>
@@ -2108,7 +3301,15 @@
         <w:contextualSpacing/>
       </w:pPr>
       <w:r>
-        <w:t>{%p endfor %}</w:t>
+        <w:t xml:space="preserve">{%p </w:t>
+      </w:r>
+      <w:proofErr w:type="spellStart"/>
+      <w:r>
+        <w:t>endfor</w:t>
+      </w:r>
+      <w:proofErr w:type="spellEnd"/>
+      <w:r>
+        <w:t xml:space="preserve"> %}</w:t>
       </w:r>
     </w:p>
     <w:p>
@@ -2162,7 +3363,28 @@
         <w:contextualSpacing/>
       </w:pPr>
       <w:r>
-        <w:t>{%p if paid_deposit and security_deposit.violated %}</w:t>
+        <w:t xml:space="preserve">{%p if </w:t>
+      </w:r>
+      <w:proofErr w:type="spellStart"/>
+      <w:r>
+        <w:t>paid_deposit</w:t>
+      </w:r>
+      <w:proofErr w:type="spellEnd"/>
+      <w:r>
+        <w:t xml:space="preserve"> and </w:t>
+      </w:r>
+      <w:proofErr w:type="spellStart"/>
+      <w:r>
+        <w:t>security_</w:t>
+      </w:r>
+      <w:proofErr w:type="gramStart"/>
+      <w:r>
+        <w:t>deposit.violated</w:t>
+      </w:r>
+      <w:proofErr w:type="spellEnd"/>
+      <w:proofErr w:type="gramEnd"/>
+      <w:r>
+        <w:t xml:space="preserve"> %}</w:t>
       </w:r>
     </w:p>
     <w:p>
@@ -2210,7 +3432,23 @@
         <w:suppressAutoHyphens/>
       </w:pPr>
       <w:r>
-        <w:t xml:space="preserve">I paid a security deposit of $ {{ security_deposit.amount }} to my current/former (circle which one) landlord. </w:t>
+        <w:t xml:space="preserve">I paid a security deposit of $ </w:t>
+      </w:r>
+      <w:proofErr w:type="gramStart"/>
+      <w:r>
+        <w:t xml:space="preserve">{{ </w:t>
+      </w:r>
+      <w:proofErr w:type="spellStart"/>
+      <w:r>
+        <w:t>security</w:t>
+      </w:r>
+      <w:proofErr w:type="gramEnd"/>
+      <w:r>
+        <w:t>_deposit.amount</w:t>
+      </w:r>
+      <w:proofErr w:type="spellEnd"/>
+      <w:r>
+        <w:t xml:space="preserve"> }} to my current/former (circle which one) landlord. </w:t>
       </w:r>
     </w:p>
     <w:p>
@@ -2234,7 +3472,23 @@
         <w:contextualSpacing/>
       </w:pPr>
       <w:r>
-        <w:t>{%p for violation in security_deposit.violations.true_values() %}</w:t>
+        <w:t xml:space="preserve">{%p for violation in </w:t>
+      </w:r>
+      <w:proofErr w:type="spellStart"/>
+      <w:r>
+        <w:t>security_</w:t>
+      </w:r>
+      <w:proofErr w:type="gramStart"/>
+      <w:r>
+        <w:t>deposit.violations</w:t>
+      </w:r>
+      <w:proofErr w:type="gramEnd"/>
+      <w:r>
+        <w:t>.true_values</w:t>
+      </w:r>
+      <w:proofErr w:type="spellEnd"/>
+      <w:r>
+        <w:t>() %}</w:t>
       </w:r>
     </w:p>
     <w:p>
@@ -2260,27 +3514,56 @@
         <w:contextualSpacing/>
       </w:pPr>
       <w:r>
-        <w:t xml:space="preserve">{%p endfor %} </w:t>
-      </w:r>
-    </w:p>
-    <w:p>
-      <w:pPr>
-        <w:pStyle w:val="BodyText"/>
-        <w:spacing w:after="144"/>
-        <w:contextualSpacing/>
-      </w:pPr>
-      <w:r>
-        <w:t>{%p endif %}</w:t>
-      </w:r>
-    </w:p>
-    <w:p>
-      <w:pPr>
-        <w:pStyle w:val="BodyText"/>
-        <w:spacing w:after="144"/>
-        <w:contextualSpacing/>
-      </w:pPr>
-      <w:r>
-        <w:t>{%p if paid_lmr and last_months_rent.violated %}</w:t>
+        <w:t xml:space="preserve">{%p </w:t>
+      </w:r>
+      <w:proofErr w:type="spellStart"/>
+      <w:r>
+        <w:t>endfor</w:t>
+      </w:r>
+      <w:proofErr w:type="spellEnd"/>
+      <w:r>
+        <w:t xml:space="preserve"> %} </w:t>
+      </w:r>
+    </w:p>
+    <w:p>
+      <w:pPr>
+        <w:pStyle w:val="BodyText"/>
+        <w:spacing w:after="144"/>
+        <w:contextualSpacing/>
+      </w:pPr>
+      <w:r>
+        <w:t>{%p endif %}</w:t>
+      </w:r>
+    </w:p>
+    <w:p>
+      <w:pPr>
+        <w:pStyle w:val="BodyText"/>
+        <w:spacing w:after="144"/>
+        <w:contextualSpacing/>
+      </w:pPr>
+      <w:r>
+        <w:t xml:space="preserve">{%p if </w:t>
+      </w:r>
+      <w:proofErr w:type="spellStart"/>
+      <w:r>
+        <w:t>paid_lmr</w:t>
+      </w:r>
+      <w:proofErr w:type="spellEnd"/>
+      <w:r>
+        <w:t xml:space="preserve"> and </w:t>
+      </w:r>
+      <w:proofErr w:type="spellStart"/>
+      <w:r>
+        <w:t>last_months_</w:t>
+      </w:r>
+      <w:proofErr w:type="gramStart"/>
+      <w:r>
+        <w:t>rent.violated</w:t>
+      </w:r>
+      <w:proofErr w:type="spellEnd"/>
+      <w:proofErr w:type="gramEnd"/>
+      <w:r>
+        <w:t xml:space="preserve"> %}</w:t>
       </w:r>
     </w:p>
     <w:p>
@@ -2331,23 +3614,57 @@
         <w:suppressAutoHyphens/>
       </w:pPr>
       <w:r>
-        <w:t>I paid last month’s rent of $ {{ last_months_rent.amount }} to my {{last_months_rent.to_whom }} landlord and my landlord has not paid me yearly interest or given me rent credit for this interest, entitling me to three times the amount of interest owed.</w:t>
-      </w:r>
-    </w:p>
-    <w:p>
-      <w:pPr>
-        <w:pStyle w:val="BodyText"/>
-      </w:pPr>
-      <w:r>
-        <w:t>{%p endif %}</w:t>
-      </w:r>
-    </w:p>
-    <w:p>
-      <w:pPr>
-        <w:pStyle w:val="BodyText"/>
-      </w:pPr>
-      <w:r>
-        <w:t>{%p if bqe.violated %}</w:t>
+        <w:t xml:space="preserve">I paid last month’s rent of $ </w:t>
+      </w:r>
+      <w:proofErr w:type="gramStart"/>
+      <w:r>
+        <w:t xml:space="preserve">{{ </w:t>
+      </w:r>
+      <w:proofErr w:type="spellStart"/>
+      <w:r>
+        <w:t>last</w:t>
+      </w:r>
+      <w:proofErr w:type="gramEnd"/>
+      <w:r>
+        <w:t>_months_rent.amount</w:t>
+      </w:r>
+      <w:proofErr w:type="spellEnd"/>
+      <w:r>
+        <w:t xml:space="preserve"> }} to my {{</w:t>
+      </w:r>
+      <w:proofErr w:type="spellStart"/>
+      <w:r>
+        <w:t>last_months_rent.to_whom</w:t>
+      </w:r>
+      <w:proofErr w:type="spellEnd"/>
+      <w:r>
+        <w:t xml:space="preserve"> }} landlord and my landlord has not paid me yearly interest or given me rent credit for this interest, entitling me to three times the amount of interest owed.</w:t>
+      </w:r>
+    </w:p>
+    <w:p>
+      <w:pPr>
+        <w:pStyle w:val="BodyText"/>
+      </w:pPr>
+      <w:r>
+        <w:t>{%p endif %}</w:t>
+      </w:r>
+    </w:p>
+    <w:p>
+      <w:pPr>
+        <w:pStyle w:val="BodyText"/>
+      </w:pPr>
+      <w:r>
+        <w:t xml:space="preserve">{%p if </w:t>
+      </w:r>
+      <w:proofErr w:type="spellStart"/>
+      <w:proofErr w:type="gramStart"/>
+      <w:r>
+        <w:t>bqe.violated</w:t>
+      </w:r>
+      <w:proofErr w:type="spellEnd"/>
+      <w:proofErr w:type="gramEnd"/>
+      <w:r>
+        <w:t xml:space="preserve"> %}</w:t>
       </w:r>
     </w:p>
     <w:p>
@@ -2409,7 +3726,17 @@
         <w:contextualSpacing/>
       </w:pPr>
       <w:r>
-        <w:t>{%p if bqe.heat %}</w:t>
+        <w:t xml:space="preserve">{%p if </w:t>
+      </w:r>
+      <w:proofErr w:type="spellStart"/>
+      <w:proofErr w:type="gramStart"/>
+      <w:r>
+        <w:t>bqe.heat</w:t>
+      </w:r>
+      <w:proofErr w:type="spellEnd"/>
+      <w:proofErr w:type="gramEnd"/>
+      <w:r>
+        <w:t xml:space="preserve"> %}</w:t>
       </w:r>
     </w:p>
     <w:p>
@@ -2446,7 +3773,15 @@
         <w:contextualSpacing/>
       </w:pPr>
       <w:r>
-        <w:t>{%p if bqe.hot_water %}</w:t>
+        <w:t xml:space="preserve">{%p if </w:t>
+      </w:r>
+      <w:proofErr w:type="spellStart"/>
+      <w:r>
+        <w:t>bqe.hot_water</w:t>
+      </w:r>
+      <w:proofErr w:type="spellEnd"/>
+      <w:r>
+        <w:t xml:space="preserve"> %}</w:t>
       </w:r>
     </w:p>
     <w:p>
@@ -2483,7 +3818,20 @@
         <w:contextualSpacing/>
       </w:pPr>
       <w:r>
-        <w:t>{%p if bqe.unpaid_utilities %}</w:t>
+        <w:t xml:space="preserve">{%p if </w:t>
+      </w:r>
+      <w:proofErr w:type="spellStart"/>
+      <w:proofErr w:type="gramStart"/>
+      <w:r>
+        <w:t>bqe.unpaid</w:t>
+      </w:r>
+      <w:proofErr w:type="gramEnd"/>
+      <w:r>
+        <w:t>_utilities</w:t>
+      </w:r>
+      <w:proofErr w:type="spellEnd"/>
+      <w:r>
+        <w:t xml:space="preserve"> %}</w:t>
       </w:r>
     </w:p>
     <w:p>
@@ -2520,7 +3868,20 @@
         <w:contextualSpacing/>
       </w:pPr>
       <w:r>
-        <w:t>{%p if bqe.shutoff_utilities %}</w:t>
+        <w:t xml:space="preserve">{%p if </w:t>
+      </w:r>
+      <w:proofErr w:type="spellStart"/>
+      <w:proofErr w:type="gramStart"/>
+      <w:r>
+        <w:t>bqe.shutoff</w:t>
+      </w:r>
+      <w:proofErr w:type="gramEnd"/>
+      <w:r>
+        <w:t>_utilities</w:t>
+      </w:r>
+      <w:proofErr w:type="spellEnd"/>
+      <w:r>
+        <w:t xml:space="preserve"> %}</w:t>
       </w:r>
     </w:p>
     <w:p>
@@ -2557,7 +3918,20 @@
         <w:contextualSpacing/>
       </w:pPr>
       <w:r>
-        <w:t>{%p if bqe.locked_out %}</w:t>
+        <w:t xml:space="preserve">{%p if </w:t>
+      </w:r>
+      <w:proofErr w:type="spellStart"/>
+      <w:proofErr w:type="gramStart"/>
+      <w:r>
+        <w:t>bqe.locked</w:t>
+      </w:r>
+      <w:proofErr w:type="gramEnd"/>
+      <w:r>
+        <w:t>_out</w:t>
+      </w:r>
+      <w:proofErr w:type="spellEnd"/>
+      <w:r>
+        <w:t xml:space="preserve"> %}</w:t>
       </w:r>
     </w:p>
     <w:p>
@@ -2594,7 +3968,20 @@
         <w:contextualSpacing/>
       </w:pPr>
       <w:r>
-        <w:t>{%p if bqe.removed_possessions %}</w:t>
+        <w:t xml:space="preserve">{%p if </w:t>
+      </w:r>
+      <w:proofErr w:type="spellStart"/>
+      <w:proofErr w:type="gramStart"/>
+      <w:r>
+        <w:t>bqe.removed</w:t>
+      </w:r>
+      <w:proofErr w:type="gramEnd"/>
+      <w:r>
+        <w:t>_possessions</w:t>
+      </w:r>
+      <w:proofErr w:type="spellEnd"/>
+      <w:r>
+        <w:t xml:space="preserve"> %}</w:t>
       </w:r>
     </w:p>
     <w:p>
@@ -2631,7 +4018,15 @@
         <w:contextualSpacing/>
       </w:pPr>
       <w:r>
-        <w:t>{%p if bqe.bad_conditions %}</w:t>
+        <w:t xml:space="preserve">{%p if </w:t>
+      </w:r>
+      <w:proofErr w:type="spellStart"/>
+      <w:r>
+        <w:t>bqe.bad_conditions</w:t>
+      </w:r>
+      <w:proofErr w:type="spellEnd"/>
+      <w:r>
+        <w:t xml:space="preserve"> %}</w:t>
       </w:r>
     </w:p>
     <w:p>
@@ -2668,7 +4063,20 @@
         <w:contextualSpacing/>
       </w:pPr>
       <w:r>
-        <w:t>{%p if bqe.entered_without_permission %}</w:t>
+        <w:t xml:space="preserve">{%p if </w:t>
+      </w:r>
+      <w:proofErr w:type="spellStart"/>
+      <w:proofErr w:type="gramStart"/>
+      <w:r>
+        <w:t>bqe.entered</w:t>
+      </w:r>
+      <w:proofErr w:type="gramEnd"/>
+      <w:r>
+        <w:t>_without_permission</w:t>
+      </w:r>
+      <w:proofErr w:type="spellEnd"/>
+      <w:r>
+        <w:t xml:space="preserve"> %}</w:t>
       </w:r>
     </w:p>
     <w:p>
@@ -2705,7 +4113,17 @@
         <w:contextualSpacing/>
       </w:pPr>
       <w:r>
-        <w:t>{%p if bqe.other %}</w:t>
+        <w:t xml:space="preserve">{%p if </w:t>
+      </w:r>
+      <w:proofErr w:type="spellStart"/>
+      <w:proofErr w:type="gramStart"/>
+      <w:r>
+        <w:t>bqe.other</w:t>
+      </w:r>
+      <w:proofErr w:type="spellEnd"/>
+      <w:proofErr w:type="gramEnd"/>
+      <w:r>
+        <w:t xml:space="preserve"> %}</w:t>
       </w:r>
     </w:p>
     <w:p>
@@ -2720,7 +4138,23 @@
         <w:contextualSpacing/>
       </w:pPr>
       <w:r>
-        <w:t xml:space="preserve">Interfered with my right to enjoy my home in other ways by {{ bqe.other }} </w:t>
+        <w:t xml:space="preserve">Interfered with my right to enjoy my home in other ways by </w:t>
+      </w:r>
+      <w:proofErr w:type="gramStart"/>
+      <w:r>
+        <w:t xml:space="preserve">{{ </w:t>
+      </w:r>
+      <w:proofErr w:type="spellStart"/>
+      <w:r>
+        <w:t>bqe</w:t>
+      </w:r>
+      <w:proofErr w:type="gramEnd"/>
+      <w:r>
+        <w:t>.other</w:t>
+      </w:r>
+      <w:proofErr w:type="spellEnd"/>
+      <w:r>
+        <w:t xml:space="preserve"> }} </w:t>
       </w:r>
     </w:p>
     <w:p>
@@ -2741,17 +4175,40 @@
         <w:contextualSpacing/>
       </w:pPr>
       <w:r>
-        <w:t>{%p if claims.utilities %}</w:t>
-      </w:r>
-    </w:p>
-    <w:p>
-      <w:pPr>
-        <w:pStyle w:val="BodyText"/>
-        <w:spacing w:after="144"/>
-        <w:contextualSpacing/>
-      </w:pPr>
-      <w:r>
-        <w:t>{%p if bqe.billed_no_agreement %}</w:t>
+        <w:t xml:space="preserve">{%p if </w:t>
+      </w:r>
+      <w:proofErr w:type="spellStart"/>
+      <w:proofErr w:type="gramStart"/>
+      <w:r>
+        <w:t>claims.utilities</w:t>
+      </w:r>
+      <w:proofErr w:type="spellEnd"/>
+      <w:proofErr w:type="gramEnd"/>
+      <w:r>
+        <w:t xml:space="preserve"> %}</w:t>
+      </w:r>
+    </w:p>
+    <w:p>
+      <w:pPr>
+        <w:pStyle w:val="BodyText"/>
+        <w:spacing w:after="144"/>
+        <w:contextualSpacing/>
+      </w:pPr>
+      <w:r>
+        <w:t xml:space="preserve">{%p if </w:t>
+      </w:r>
+      <w:proofErr w:type="spellStart"/>
+      <w:proofErr w:type="gramStart"/>
+      <w:r>
+        <w:t>bqe.billed</w:t>
+      </w:r>
+      <w:proofErr w:type="gramEnd"/>
+      <w:r>
+        <w:t>_no_agreement</w:t>
+      </w:r>
+      <w:proofErr w:type="spellEnd"/>
+      <w:r>
+        <w:t xml:space="preserve"> %}</w:t>
       </w:r>
     </w:p>
     <w:p>
@@ -2764,7 +4221,15 @@
         <w:suppressAutoHyphens/>
       </w:pPr>
       <w:r>
-        <w:t xml:space="preserve">I have been billed for heat, hot water, electricity and/or gas and the landlord and I did not have a written agreement requiring me to pay for these utilities. I request that the landlord promptly start paying for such utilities.  This defense and counterclaim entitles me to damages under G.L. c. 186, §14, and c. 93A. See also Mass. Sanitary Code, 105 CMR 410.354. </w:t>
+        <w:t xml:space="preserve">I have been billed for heat, hot water, electricity and/or gas and the landlord and I did not have a written agreement requiring me to pay for these utilities. I request that the landlord promptly start paying for such utilities.  This defense and counterclaim </w:t>
+      </w:r>
+      <w:proofErr w:type="gramStart"/>
+      <w:r>
+        <w:t>entitles</w:t>
+      </w:r>
+      <w:proofErr w:type="gramEnd"/>
+      <w:r>
+        <w:t xml:space="preserve"> me to damages under G.L. c. 186, §14, and c. 93A. See also Mass. Sanitary Code, 105 CMR 410.354. </w:t>
       </w:r>
     </w:p>
     <w:p>
@@ -2782,7 +4247,20 @@
         <w:ind w:left="360"/>
       </w:pPr>
       <w:r>
-        <w:t>{%p if bqe.billed_for_others %}</w:t>
+        <w:t xml:space="preserve">{%p if </w:t>
+      </w:r>
+      <w:proofErr w:type="spellStart"/>
+      <w:proofErr w:type="gramStart"/>
+      <w:r>
+        <w:t>bqe.billed</w:t>
+      </w:r>
+      <w:proofErr w:type="gramEnd"/>
+      <w:r>
+        <w:t>_for_others</w:t>
+      </w:r>
+      <w:proofErr w:type="spellEnd"/>
+      <w:r>
+        <w:t xml:space="preserve"> %}</w:t>
       </w:r>
     </w:p>
     <w:p>
@@ -2799,7 +4277,15 @@
       </w:r>
       <w:r>
         <w:lastRenderedPageBreak/>
-        <w:t xml:space="preserve">counterclaim entitles me to damages under G.L. c. 186, §14, and/or c. 93A. See also Mass. Sanitary Code, 105 CMR 410.354. </w:t>
+        <w:t xml:space="preserve">counterclaim </w:t>
+      </w:r>
+      <w:proofErr w:type="gramStart"/>
+      <w:r>
+        <w:t>entitles</w:t>
+      </w:r>
+      <w:proofErr w:type="gramEnd"/>
+      <w:r>
+        <w:t xml:space="preserve"> me to damages under G.L. c. 186, §14, and/or c. 93A. See also Mass. Sanitary Code, 105 CMR 410.354. </w:t>
       </w:r>
     </w:p>
     <w:p>
@@ -2824,7 +4310,15 @@
         <w:pStyle w:val="BodyText"/>
       </w:pPr>
       <w:r>
-        <w:t>This defense and counterclaim entitles me to three times the rent (calculated at the full contract rent for tenants with subsidies) or my actual damages, whichever is greater.</w:t>
+        <w:t xml:space="preserve">This defense and counterclaim </w:t>
+      </w:r>
+      <w:proofErr w:type="gramStart"/>
+      <w:r>
+        <w:t>entitles</w:t>
+      </w:r>
+      <w:proofErr w:type="gramEnd"/>
+      <w:r>
+        <w:t xml:space="preserve"> me to three times the rent (calculated at the full contract rent for tenants with subsidies) or my actual damages, whichever is greater.</w:t>
       </w:r>
     </w:p>
     <w:p>
@@ -2856,7 +4350,20 @@
         <w:pStyle w:val="BodyText"/>
       </w:pPr>
       <w:r>
-        <w:t>{%p if facts.tenant_has_subsidy %}</w:t>
+        <w:t xml:space="preserve">{%p if </w:t>
+      </w:r>
+      <w:proofErr w:type="spellStart"/>
+      <w:proofErr w:type="gramStart"/>
+      <w:r>
+        <w:t>facts.tenant</w:t>
+      </w:r>
+      <w:proofErr w:type="gramEnd"/>
+      <w:r>
+        <w:t>_has_subsidy</w:t>
+      </w:r>
+      <w:proofErr w:type="spellEnd"/>
+      <w:r>
+        <w:t xml:space="preserve"> %}</w:t>
       </w:r>
     </w:p>
     <w:p>
@@ -2892,7 +4399,31 @@
         <w:ind w:left="360"/>
       </w:pPr>
       <w:r>
-        <w:t>{%p if subsidy_type in ['Section 8 voucher', 'MRVP'] and subsidized_housing.stopped_payment %}</w:t>
+        <w:t xml:space="preserve">{%p if </w:t>
+      </w:r>
+      <w:proofErr w:type="spellStart"/>
+      <w:r>
+        <w:t>subsidy_type</w:t>
+      </w:r>
+      <w:proofErr w:type="spellEnd"/>
+      <w:r>
+        <w:t xml:space="preserve"> in ['Section 8 voucher', 'MRVP'] and </w:t>
+      </w:r>
+      <w:proofErr w:type="spellStart"/>
+      <w:r>
+        <w:t>subsidized_</w:t>
+      </w:r>
+      <w:proofErr w:type="gramStart"/>
+      <w:r>
+        <w:t>housing.stopped</w:t>
+      </w:r>
+      <w:proofErr w:type="gramEnd"/>
+      <w:r>
+        <w:t>_payment</w:t>
+      </w:r>
+      <w:proofErr w:type="spellEnd"/>
+      <w:r>
+        <w:t xml:space="preserve"> %}</w:t>
       </w:r>
     </w:p>
     <w:p>
@@ -2936,7 +4467,23 @@
         <w:ind w:left="360"/>
       </w:pPr>
       <w:r>
-        <w:t>{%p if subsidized_housing.improper_rent_calculation %}</w:t>
+        <w:t xml:space="preserve">{%p if </w:t>
+      </w:r>
+      <w:proofErr w:type="spellStart"/>
+      <w:r>
+        <w:t>subsidized_</w:t>
+      </w:r>
+      <w:proofErr w:type="gramStart"/>
+      <w:r>
+        <w:t>housing.improper</w:t>
+      </w:r>
+      <w:proofErr w:type="gramEnd"/>
+      <w:r>
+        <w:t>_rent_calculation</w:t>
+      </w:r>
+      <w:proofErr w:type="spellEnd"/>
+      <w:r>
+        <w:t xml:space="preserve"> %}</w:t>
       </w:r>
     </w:p>
     <w:p>
@@ -2967,7 +4514,23 @@
         <w:ind w:left="360"/>
       </w:pPr>
       <w:r>
-        <w:t>{%p if subsidized_housing.landlord_overcharged %}</w:t>
+        <w:t xml:space="preserve">{%p if </w:t>
+      </w:r>
+      <w:proofErr w:type="spellStart"/>
+      <w:r>
+        <w:t>subsidized_</w:t>
+      </w:r>
+      <w:proofErr w:type="gramStart"/>
+      <w:r>
+        <w:t>housing.landlord</w:t>
+      </w:r>
+      <w:proofErr w:type="gramEnd"/>
+      <w:r>
+        <w:t>_overcharged</w:t>
+      </w:r>
+      <w:proofErr w:type="spellEnd"/>
+      <w:r>
+        <w:t xml:space="preserve"> %}</w:t>
       </w:r>
     </w:p>
     <w:p>
@@ -3076,7 +4639,23 @@
         <w:contextualSpacing/>
       </w:pPr>
       <w:r>
-        <w:t>{%p if consumer_protection.late_fees %}</w:t>
+        <w:t xml:space="preserve">{%p if </w:t>
+      </w:r>
+      <w:proofErr w:type="spellStart"/>
+      <w:r>
+        <w:t>consumer_</w:t>
+      </w:r>
+      <w:proofErr w:type="gramStart"/>
+      <w:r>
+        <w:t>protection.late</w:t>
+      </w:r>
+      <w:proofErr w:type="gramEnd"/>
+      <w:r>
+        <w:t>_fees</w:t>
+      </w:r>
+      <w:proofErr w:type="spellEnd"/>
+      <w:r>
+        <w:t xml:space="preserve"> %}</w:t>
       </w:r>
     </w:p>
     <w:p>
@@ -3113,7 +4692,23 @@
         <w:contextualSpacing/>
       </w:pPr>
       <w:r>
-        <w:t>{%p if consumer_protection.nonagreed_rent %}</w:t>
+        <w:t xml:space="preserve">{%p if </w:t>
+      </w:r>
+      <w:proofErr w:type="spellStart"/>
+      <w:r>
+        <w:t>consumer_</w:t>
+      </w:r>
+      <w:proofErr w:type="gramStart"/>
+      <w:r>
+        <w:t>protection.nonagreed</w:t>
+      </w:r>
+      <w:proofErr w:type="gramEnd"/>
+      <w:r>
+        <w:t>_rent</w:t>
+      </w:r>
+      <w:proofErr w:type="spellEnd"/>
+      <w:r>
+        <w:t xml:space="preserve"> %}</w:t>
       </w:r>
     </w:p>
     <w:p>
@@ -3150,7 +4745,23 @@
         <w:contextualSpacing/>
       </w:pPr>
       <w:r>
-        <w:t>{%p if consumer_protection.unlawful_court_fees %}</w:t>
+        <w:t xml:space="preserve">{%p if </w:t>
+      </w:r>
+      <w:proofErr w:type="spellStart"/>
+      <w:r>
+        <w:t>consumer_</w:t>
+      </w:r>
+      <w:proofErr w:type="gramStart"/>
+      <w:r>
+        <w:t>protection.unlawful</w:t>
+      </w:r>
+      <w:proofErr w:type="gramEnd"/>
+      <w:r>
+        <w:t>_court_fees</w:t>
+      </w:r>
+      <w:proofErr w:type="spellEnd"/>
+      <w:r>
+        <w:t xml:space="preserve"> %}</w:t>
       </w:r>
     </w:p>
     <w:p>
@@ -3187,7 +4798,23 @@
         <w:contextualSpacing/>
       </w:pPr>
       <w:r>
-        <w:t>{%p if consumer_protection.unlawful_lease_terms %}</w:t>
+        <w:t xml:space="preserve">{%p if </w:t>
+      </w:r>
+      <w:proofErr w:type="spellStart"/>
+      <w:r>
+        <w:t>consumer_</w:t>
+      </w:r>
+      <w:proofErr w:type="gramStart"/>
+      <w:r>
+        <w:t>protection.unlawful</w:t>
+      </w:r>
+      <w:proofErr w:type="gramEnd"/>
+      <w:r>
+        <w:t>_lease_terms</w:t>
+      </w:r>
+      <w:proofErr w:type="spellEnd"/>
+      <w:r>
+        <w:t xml:space="preserve"> %}</w:t>
       </w:r>
     </w:p>
     <w:p>
@@ -3224,7 +4851,20 @@
         <w:contextualSpacing/>
       </w:pPr>
       <w:r>
-        <w:t>{%p if consumer_protection.other %}</w:t>
+        <w:t xml:space="preserve">{%p if </w:t>
+      </w:r>
+      <w:proofErr w:type="spellStart"/>
+      <w:r>
+        <w:t>consumer_</w:t>
+      </w:r>
+      <w:proofErr w:type="gramStart"/>
+      <w:r>
+        <w:t>protection.other</w:t>
+      </w:r>
+      <w:proofErr w:type="spellEnd"/>
+      <w:proofErr w:type="gramEnd"/>
+      <w:r>
+        <w:t xml:space="preserve"> %}</w:t>
       </w:r>
     </w:p>
     <w:p>
@@ -3239,7 +4879,23 @@
         <w:contextualSpacing/>
       </w:pPr>
       <w:r>
-        <w:t>Other: {{ consumer_protection.other_reason }}</w:t>
+        <w:t xml:space="preserve">Other: </w:t>
+      </w:r>
+      <w:proofErr w:type="gramStart"/>
+      <w:r>
+        <w:t xml:space="preserve">{{ </w:t>
+      </w:r>
+      <w:proofErr w:type="spellStart"/>
+      <w:r>
+        <w:t>consumer</w:t>
+      </w:r>
+      <w:proofErr w:type="gramEnd"/>
+      <w:r>
+        <w:t>_protection.other_reason</w:t>
+      </w:r>
+      <w:proofErr w:type="spellEnd"/>
+      <w:r>
+        <w:t xml:space="preserve"> }}</w:t>
       </w:r>
     </w:p>
     <w:p>
@@ -3280,7 +4936,20 @@
         <w:pStyle w:val="BodyText"/>
       </w:pPr>
       <w:r>
-        <w:t>{%p if  eviction_all_reasons.get("nonpayment") %}</w:t>
+        <w:t xml:space="preserve">{%p </w:t>
+      </w:r>
+      <w:proofErr w:type="gramStart"/>
+      <w:r>
+        <w:t xml:space="preserve">if  </w:t>
+      </w:r>
+      <w:proofErr w:type="spellStart"/>
+      <w:r>
+        <w:t>eviction_all_reasons.get</w:t>
+      </w:r>
+      <w:proofErr w:type="spellEnd"/>
+      <w:proofErr w:type="gramEnd"/>
+      <w:r>
+        <w:t>("nonpayment") %}</w:t>
       </w:r>
     </w:p>
     <w:p>
@@ -3407,7 +5076,28 @@
         <w:ind w:left="360"/>
       </w:pPr>
       <w:r>
-        <w:t>{%p if showifdef('other.vendor_payments') %}</w:t>
+        <w:t xml:space="preserve">{%p if </w:t>
+      </w:r>
+      <w:proofErr w:type="spellStart"/>
+      <w:r>
+        <w:t>showifdef</w:t>
+      </w:r>
+      <w:proofErr w:type="spellEnd"/>
+      <w:r>
+        <w:t>('</w:t>
+      </w:r>
+      <w:proofErr w:type="spellStart"/>
+      <w:proofErr w:type="gramStart"/>
+      <w:r>
+        <w:t>other.vendor</w:t>
+      </w:r>
+      <w:proofErr w:type="gramEnd"/>
+      <w:r>
+        <w:t>_payments</w:t>
+      </w:r>
+      <w:proofErr w:type="spellEnd"/>
+      <w:r>
+        <w:t>') %}</w:t>
       </w:r>
     </w:p>
     <w:p>
@@ -3438,7 +5128,28 @@
         <w:ind w:left="360"/>
       </w:pPr>
       <w:r>
-        <w:t>{%p if not (facts.tenant_has_subsidy and subsidy_type == 'public housing') %}</w:t>
+        <w:t>{%p if not (</w:t>
+      </w:r>
+      <w:proofErr w:type="spellStart"/>
+      <w:proofErr w:type="gramStart"/>
+      <w:r>
+        <w:t>facts.tenant</w:t>
+      </w:r>
+      <w:proofErr w:type="gramEnd"/>
+      <w:r>
+        <w:t>_has_subsidy</w:t>
+      </w:r>
+      <w:proofErr w:type="spellEnd"/>
+      <w:r>
+        <w:t xml:space="preserve"> and </w:t>
+      </w:r>
+      <w:proofErr w:type="spellStart"/>
+      <w:r>
+        <w:t>subsidy_type</w:t>
+      </w:r>
+      <w:proofErr w:type="spellEnd"/>
+      <w:r>
+        <w:t xml:space="preserve"> == 'public housing') %}</w:t>
       </w:r>
     </w:p>
     <w:p>
@@ -3447,7 +5158,55 @@
         <w:ind w:left="360"/>
       </w:pPr>
       <w:r>
-        <w:t>{%p if is_condo_conversion and (defined('condo_violations') and condo_violations.any_true()) or (defined('condo_local_violations') and condo_local_violations.any_true() ) %}</w:t>
+        <w:t xml:space="preserve">{%p if </w:t>
+      </w:r>
+      <w:proofErr w:type="spellStart"/>
+      <w:r>
+        <w:t>is_condo_conversion</w:t>
+      </w:r>
+      <w:proofErr w:type="spellEnd"/>
+      <w:r>
+        <w:t xml:space="preserve"> and (defined('</w:t>
+      </w:r>
+      <w:proofErr w:type="spellStart"/>
+      <w:r>
+        <w:t>condo_violations</w:t>
+      </w:r>
+      <w:proofErr w:type="spellEnd"/>
+      <w:r>
+        <w:t xml:space="preserve">') and </w:t>
+      </w:r>
+      <w:proofErr w:type="spellStart"/>
+      <w:r>
+        <w:t>condo_violations.any_</w:t>
+      </w:r>
+      <w:proofErr w:type="gramStart"/>
+      <w:r>
+        <w:t>true</w:t>
+      </w:r>
+      <w:proofErr w:type="spellEnd"/>
+      <w:r>
+        <w:t>(</w:t>
+      </w:r>
+      <w:proofErr w:type="gramEnd"/>
+      <w:r>
+        <w:t>)) or (defined('</w:t>
+      </w:r>
+      <w:proofErr w:type="spellStart"/>
+      <w:r>
+        <w:t>condo_local_violations</w:t>
+      </w:r>
+      <w:proofErr w:type="spellEnd"/>
+      <w:r>
+        <w:t xml:space="preserve">') and </w:t>
+      </w:r>
+      <w:proofErr w:type="spellStart"/>
+      <w:r>
+        <w:t>condo_local_violations.any_true</w:t>
+      </w:r>
+      <w:proofErr w:type="spellEnd"/>
+      <w:r>
+        <w:t>() ) %}</w:t>
       </w:r>
     </w:p>
     <w:p>
@@ -3469,7 +5228,23 @@
         <w:ind w:left="720"/>
       </w:pPr>
       <w:r>
-        <w:t>{%p for violation in condo_violations.true_values() %}</w:t>
+        <w:t xml:space="preserve">{%p for violation in </w:t>
+      </w:r>
+      <w:proofErr w:type="spellStart"/>
+      <w:r>
+        <w:t>condo_</w:t>
+      </w:r>
+      <w:proofErr w:type="gramStart"/>
+      <w:r>
+        <w:t>violations.true</w:t>
+      </w:r>
+      <w:proofErr w:type="gramEnd"/>
+      <w:r>
+        <w:t>_values</w:t>
+      </w:r>
+      <w:proofErr w:type="spellEnd"/>
+      <w:r>
+        <w:t>() %}</w:t>
       </w:r>
     </w:p>
     <w:p>
@@ -3481,8 +5256,13 @@
         </w:numPr>
         <w:suppressAutoHyphens/>
       </w:pPr>
-      <w:r>
-        <w:t>{{ violation }}</w:t>
+      <w:proofErr w:type="gramStart"/>
+      <w:r>
+        <w:t>{{ violation</w:t>
+      </w:r>
+      <w:proofErr w:type="gramEnd"/>
+      <w:r>
+        <w:t xml:space="preserve"> }}</w:t>
       </w:r>
     </w:p>
     <w:p>
@@ -3491,7 +5271,15 @@
         <w:ind w:left="720"/>
       </w:pPr>
       <w:r>
-        <w:t>{%p endfor %}</w:t>
+        <w:t xml:space="preserve">{%p </w:t>
+      </w:r>
+      <w:proofErr w:type="spellStart"/>
+      <w:r>
+        <w:t>endfor</w:t>
+      </w:r>
+      <w:proofErr w:type="spellEnd"/>
+      <w:r>
+        <w:t xml:space="preserve"> %}</w:t>
       </w:r>
     </w:p>
     <w:p>
@@ -3500,7 +5288,15 @@
         <w:ind w:left="720"/>
       </w:pPr>
       <w:r>
-        <w:t>{%p if defined('condo_local_violations') %}</w:t>
+        <w:t>{%p if defined('</w:t>
+      </w:r>
+      <w:proofErr w:type="spellStart"/>
+      <w:r>
+        <w:t>condo_local_violations</w:t>
+      </w:r>
+      <w:proofErr w:type="spellEnd"/>
+      <w:r>
+        <w:t>') %}</w:t>
       </w:r>
     </w:p>
     <w:p>
@@ -3522,7 +5318,23 @@
         <w:ind w:left="1080"/>
       </w:pPr>
       <w:r>
-        <w:t>{%p for violation in condo_local_violations.true_values() %}</w:t>
+        <w:t xml:space="preserve">{%p for violation in </w:t>
+      </w:r>
+      <w:proofErr w:type="spellStart"/>
+      <w:r>
+        <w:t>condo_local_</w:t>
+      </w:r>
+      <w:proofErr w:type="gramStart"/>
+      <w:r>
+        <w:t>violations.true</w:t>
+      </w:r>
+      <w:proofErr w:type="gramEnd"/>
+      <w:r>
+        <w:t>_values</w:t>
+      </w:r>
+      <w:proofErr w:type="spellEnd"/>
+      <w:r>
+        <w:t>() %}</w:t>
       </w:r>
     </w:p>
     <w:p>
@@ -3534,8 +5346,13 @@
         </w:numPr>
         <w:suppressAutoHyphens/>
       </w:pPr>
-      <w:r>
-        <w:t>{{ violation }}</w:t>
+      <w:proofErr w:type="gramStart"/>
+      <w:r>
+        <w:t>{{ violation</w:t>
+      </w:r>
+      <w:proofErr w:type="gramEnd"/>
+      <w:r>
+        <w:t xml:space="preserve"> }}</w:t>
       </w:r>
     </w:p>
     <w:p>
@@ -3544,7 +5361,15 @@
         <w:ind w:left="1080"/>
       </w:pPr>
       <w:r>
-        <w:t>{%p endfor %}</w:t>
+        <w:t xml:space="preserve">{%p </w:t>
+      </w:r>
+      <w:proofErr w:type="spellStart"/>
+      <w:r>
+        <w:t>endfor</w:t>
+      </w:r>
+      <w:proofErr w:type="spellEnd"/>
+      <w:r>
+        <w:t xml:space="preserve"> %}</w:t>
       </w:r>
     </w:p>
     <w:p>
@@ -3580,7 +5405,28 @@
         <w:ind w:left="360"/>
       </w:pPr>
       <w:r>
-        <w:t>{%p if showifdef('other.repair_and_deduct_statute') %}</w:t>
+        <w:t xml:space="preserve">{%p if </w:t>
+      </w:r>
+      <w:proofErr w:type="spellStart"/>
+      <w:r>
+        <w:t>showifdef</w:t>
+      </w:r>
+      <w:proofErr w:type="spellEnd"/>
+      <w:r>
+        <w:t>('</w:t>
+      </w:r>
+      <w:proofErr w:type="spellStart"/>
+      <w:proofErr w:type="gramStart"/>
+      <w:r>
+        <w:t>other.repair</w:t>
+      </w:r>
+      <w:proofErr w:type="gramEnd"/>
+      <w:r>
+        <w:t>_and_deduct_statute</w:t>
+      </w:r>
+      <w:proofErr w:type="spellEnd"/>
+      <w:r>
+        <w:t>') %}</w:t>
       </w:r>
     </w:p>
     <w:p>
@@ -3611,7 +5457,28 @@
         <w:ind w:left="360"/>
       </w:pPr>
       <w:r>
-        <w:t>{%p if showifdef('other.water_violation') %}</w:t>
+        <w:t xml:space="preserve">{%p if </w:t>
+      </w:r>
+      <w:proofErr w:type="spellStart"/>
+      <w:r>
+        <w:t>showifdef</w:t>
+      </w:r>
+      <w:proofErr w:type="spellEnd"/>
+      <w:r>
+        <w:t>('</w:t>
+      </w:r>
+      <w:proofErr w:type="spellStart"/>
+      <w:proofErr w:type="gramStart"/>
+      <w:r>
+        <w:t>other.water</w:t>
+      </w:r>
+      <w:proofErr w:type="gramEnd"/>
+      <w:r>
+        <w:t>_violation</w:t>
+      </w:r>
+      <w:proofErr w:type="spellEnd"/>
+      <w:r>
+        <w:t>') %}</w:t>
       </w:r>
     </w:p>
     <w:p>
@@ -3643,7 +5510,36 @@
         <w:ind w:left="360"/>
       </w:pPr>
       <w:r>
-        <w:t>{%p if not (facts.tenant_has_subsidy and subsidy_type == 'public housing') and postforeclosure.is_foreclosed %}</w:t>
+        <w:t>{%p if not (</w:t>
+      </w:r>
+      <w:proofErr w:type="spellStart"/>
+      <w:proofErr w:type="gramStart"/>
+      <w:r>
+        <w:t>facts.tenant</w:t>
+      </w:r>
+      <w:proofErr w:type="gramEnd"/>
+      <w:r>
+        <w:t>_has_subsidy</w:t>
+      </w:r>
+      <w:proofErr w:type="spellEnd"/>
+      <w:r>
+        <w:t xml:space="preserve"> and </w:t>
+      </w:r>
+      <w:proofErr w:type="spellStart"/>
+      <w:r>
+        <w:t>subsidy_type</w:t>
+      </w:r>
+      <w:proofErr w:type="spellEnd"/>
+      <w:r>
+        <w:t xml:space="preserve"> == 'public housing') and </w:t>
+      </w:r>
+      <w:proofErr w:type="spellStart"/>
+      <w:r>
+        <w:t>postforeclosure.is_foreclosed</w:t>
+      </w:r>
+      <w:proofErr w:type="spellEnd"/>
+      <w:r>
+        <w:t xml:space="preserve"> %}</w:t>
       </w:r>
     </w:p>
     <w:p>
@@ -3667,7 +5563,20 @@
         <w:contextualSpacing/>
       </w:pPr>
       <w:r>
-        <w:t>{%p if postforeclosure.failure_to_comply %}</w:t>
+        <w:t xml:space="preserve">{%p if </w:t>
+      </w:r>
+      <w:proofErr w:type="spellStart"/>
+      <w:proofErr w:type="gramStart"/>
+      <w:r>
+        <w:t>postforeclosure.failure</w:t>
+      </w:r>
+      <w:proofErr w:type="gramEnd"/>
+      <w:r>
+        <w:t>_to_comply</w:t>
+      </w:r>
+      <w:proofErr w:type="spellEnd"/>
+      <w:r>
+        <w:t xml:space="preserve"> %}</w:t>
       </w:r>
     </w:p>
     <w:p>
@@ -3682,7 +5591,15 @@
         <w:contextualSpacing/>
       </w:pPr>
       <w:r>
-        <w:t xml:space="preserve">The foreclosure is void due to failure to comply with the: (i) power of sale in the mortgage contract, (ii) statutory or regulatory foreclosure requirements, and/or (iii) Note holding/transfer requirements pursuant to applicable law. </w:t>
+        <w:t>The foreclosure is void due to failure to comply with the: (</w:t>
+      </w:r>
+      <w:proofErr w:type="spellStart"/>
+      <w:r>
+        <w:t>i</w:t>
+      </w:r>
+      <w:proofErr w:type="spellEnd"/>
+      <w:r>
+        <w:t xml:space="preserve">) power of sale in the mortgage contract, (ii) statutory or regulatory foreclosure requirements, and/or (iii) Note holding/transfer requirements pursuant to applicable law. </w:t>
       </w:r>
     </w:p>
     <w:p>
@@ -3704,7 +5621,20 @@
         <w:contextualSpacing/>
       </w:pPr>
       <w:r>
-        <w:t>{%p if postforeclosure.unfair_loan_mod %}</w:t>
+        <w:t xml:space="preserve">{%p if </w:t>
+      </w:r>
+      <w:proofErr w:type="spellStart"/>
+      <w:proofErr w:type="gramStart"/>
+      <w:r>
+        <w:t>postforeclosure.unfair</w:t>
+      </w:r>
+      <w:proofErr w:type="gramEnd"/>
+      <w:r>
+        <w:t>_loan_mod</w:t>
+      </w:r>
+      <w:proofErr w:type="spellEnd"/>
+      <w:r>
+        <w:t xml:space="preserve"> %}</w:t>
       </w:r>
     </w:p>
     <w:p>
@@ -3741,7 +5671,20 @@
         <w:contextualSpacing/>
       </w:pPr>
       <w:r>
-        <w:t>{%p if postforeclosure.unfair_notices %}</w:t>
+        <w:t xml:space="preserve">{%p if </w:t>
+      </w:r>
+      <w:proofErr w:type="spellStart"/>
+      <w:proofErr w:type="gramStart"/>
+      <w:r>
+        <w:t>postforeclosure.unfair</w:t>
+      </w:r>
+      <w:proofErr w:type="gramEnd"/>
+      <w:r>
+        <w:t>_notices</w:t>
+      </w:r>
+      <w:proofErr w:type="spellEnd"/>
+      <w:r>
+        <w:t xml:space="preserve"> %}</w:t>
       </w:r>
     </w:p>
     <w:p>
@@ -3778,7 +5721,20 @@
         <w:contextualSpacing/>
       </w:pPr>
       <w:r>
-        <w:t>{%p if postforeclosure.unfair_loan_based_on_income %}</w:t>
+        <w:t xml:space="preserve">{%p if </w:t>
+      </w:r>
+      <w:proofErr w:type="spellStart"/>
+      <w:proofErr w:type="gramStart"/>
+      <w:r>
+        <w:t>postforeclosure.unfair</w:t>
+      </w:r>
+      <w:proofErr w:type="gramEnd"/>
+      <w:r>
+        <w:t>_loan_based_on_income</w:t>
+      </w:r>
+      <w:proofErr w:type="spellEnd"/>
+      <w:r>
+        <w:t xml:space="preserve"> %}</w:t>
       </w:r>
     </w:p>
     <w:p>
@@ -3824,7 +5780,31 @@
         <w:ind w:left="360"/>
       </w:pPr>
       <w:r>
-        <w:t>{%p if showifdef('initial_defense.custom_other') %}</w:t>
+        <w:t xml:space="preserve">{%p if </w:t>
+      </w:r>
+      <w:proofErr w:type="spellStart"/>
+      <w:r>
+        <w:t>showifdef</w:t>
+      </w:r>
+      <w:proofErr w:type="spellEnd"/>
+      <w:r>
+        <w:t>('</w:t>
+      </w:r>
+      <w:proofErr w:type="spellStart"/>
+      <w:r>
+        <w:t>initial_</w:t>
+      </w:r>
+      <w:proofErr w:type="gramStart"/>
+      <w:r>
+        <w:t>defense.custom</w:t>
+      </w:r>
+      <w:proofErr w:type="gramEnd"/>
+      <w:r>
+        <w:t>_other</w:t>
+      </w:r>
+      <w:proofErr w:type="spellEnd"/>
+      <w:r>
+        <w:t>') %}</w:t>
       </w:r>
     </w:p>
     <w:p>
@@ -3834,7 +5814,15 @@
         <w:ind w:left="360"/>
       </w:pPr>
       <w:r>
-        <w:t>{%p if delay_in_raft%}</w:t>
+        <w:t xml:space="preserve">{%p if </w:t>
+      </w:r>
+      <w:proofErr w:type="spellStart"/>
+      <w:r>
+        <w:t>delay_in_raft</w:t>
+      </w:r>
+      <w:proofErr w:type="spellEnd"/>
+      <w:r>
+        <w:t>%}</w:t>
       </w:r>
     </w:p>
     <w:p>
@@ -3886,7 +5874,23 @@
         <w:suppressAutoHyphens/>
       </w:pPr>
       <w:r>
-        <w:t>{{initial_defense.custom_other}}</w:t>
+        <w:t>{{</w:t>
+      </w:r>
+      <w:proofErr w:type="spellStart"/>
+      <w:r>
+        <w:t>initial_</w:t>
+      </w:r>
+      <w:proofErr w:type="gramStart"/>
+      <w:r>
+        <w:t>defense.custom</w:t>
+      </w:r>
+      <w:proofErr w:type="gramEnd"/>
+      <w:r>
+        <w:t>_other</w:t>
+      </w:r>
+      <w:proofErr w:type="spellEnd"/>
+      <w:r>
+        <w:t>}}</w:t>
       </w:r>
     </w:p>
     <w:p>
@@ -3904,7 +5908,36 @@
         <w:ind w:left="360"/>
       </w:pPr>
       <w:r>
-        <w:t>{%p if not (facts.tenant_has_subsidy and subsidy_type == 'public housing') and postforeclosure.is_foreclosed %}</w:t>
+        <w:t>{%p if not (</w:t>
+      </w:r>
+      <w:proofErr w:type="spellStart"/>
+      <w:proofErr w:type="gramStart"/>
+      <w:r>
+        <w:t>facts.tenant</w:t>
+      </w:r>
+      <w:proofErr w:type="gramEnd"/>
+      <w:r>
+        <w:t>_has_subsidy</w:t>
+      </w:r>
+      <w:proofErr w:type="spellEnd"/>
+      <w:r>
+        <w:t xml:space="preserve"> and </w:t>
+      </w:r>
+      <w:proofErr w:type="spellStart"/>
+      <w:r>
+        <w:t>subsidy_type</w:t>
+      </w:r>
+      <w:proofErr w:type="spellEnd"/>
+      <w:r>
+        <w:t xml:space="preserve"> == 'public housing') and </w:t>
+      </w:r>
+      <w:proofErr w:type="spellStart"/>
+      <w:r>
+        <w:t>postforeclosure.is_foreclosed</w:t>
+      </w:r>
+      <w:proofErr w:type="spellEnd"/>
+      <w:r>
+        <w:t xml:space="preserve"> %}</w:t>
       </w:r>
     </w:p>
     <w:p>
@@ -3975,7 +6008,23 @@
         <w:ind w:left="360"/>
       </w:pPr>
       <w:r>
-        <w:t>{%p if postforeclosure.no_just_cause.bona_fide_protections %}</w:t>
+        <w:t xml:space="preserve">{%p if </w:t>
+      </w:r>
+      <w:proofErr w:type="spellStart"/>
+      <w:r>
+        <w:t>postforeclosure.no_just_</w:t>
+      </w:r>
+      <w:proofErr w:type="gramStart"/>
+      <w:r>
+        <w:t>cause.bona</w:t>
+      </w:r>
+      <w:proofErr w:type="gramEnd"/>
+      <w:r>
+        <w:t>_fide_protections</w:t>
+      </w:r>
+      <w:proofErr w:type="spellEnd"/>
+      <w:r>
+        <w:t xml:space="preserve"> %}</w:t>
       </w:r>
     </w:p>
     <w:p>
@@ -4006,7 +6055,15 @@
         <w:ind w:left="360"/>
       </w:pPr>
       <w:r>
-        <w:t>{%p if postforeclosure.no_just_cause.no_binding_purchase %}</w:t>
+        <w:t xml:space="preserve">{%p if </w:t>
+      </w:r>
+      <w:proofErr w:type="spellStart"/>
+      <w:r>
+        <w:t>postforeclosure.no_just_cause.no_binding_purchase</w:t>
+      </w:r>
+      <w:proofErr w:type="spellEnd"/>
+      <w:r>
+        <w:t xml:space="preserve"> %}</w:t>
       </w:r>
     </w:p>
     <w:p>
@@ -4037,7 +6094,15 @@
         <w:ind w:left="360"/>
       </w:pPr>
       <w:r>
-        <w:t>{%p if postforeclosure.no_just_cause.ntq_or_other_actions %}</w:t>
+        <w:t xml:space="preserve">{%p if </w:t>
+      </w:r>
+      <w:proofErr w:type="spellStart"/>
+      <w:r>
+        <w:t>postforeclosure.no_just_cause.ntq_or_other_actions</w:t>
+      </w:r>
+      <w:proofErr w:type="spellEnd"/>
+      <w:r>
+        <w:t xml:space="preserve"> %}</w:t>
       </w:r>
     </w:p>
     <w:p>
@@ -4072,7 +6137,15 @@
         <w:suppressAutoHyphens/>
       </w:pPr>
       <w:r>
-        <w:t>This defense and counterclaim entitles me to possession and damages under G.L. c. 186, §14, and/or c. 93A.</w:t>
+        <w:t xml:space="preserve">This defense and counterclaim </w:t>
+      </w:r>
+      <w:proofErr w:type="gramStart"/>
+      <w:r>
+        <w:t>entitles</w:t>
+      </w:r>
+      <w:proofErr w:type="gramEnd"/>
+      <w:r>
+        <w:t xml:space="preserve"> me to possession and damages under G.L. c. 186, §14, and/or c. 93A.</w:t>
       </w:r>
     </w:p>
     <w:p>
@@ -4136,7 +6209,35 @@
         <w:rPr>
           <w:color w:val="000000"/>
         </w:rPr>
-        <w:t>{%p if postforeclosure.no_just_cause.bona_fide_protections %}</w:t>
+        <w:t xml:space="preserve">{%p if </w:t>
+      </w:r>
+      <w:proofErr w:type="spellStart"/>
+      <w:r>
+        <w:rPr>
+          <w:color w:val="000000"/>
+        </w:rPr>
+        <w:t>postforeclosure.no_just_</w:t>
+      </w:r>
+      <w:proofErr w:type="gramStart"/>
+      <w:r>
+        <w:rPr>
+          <w:color w:val="000000"/>
+        </w:rPr>
+        <w:t>cause.bona</w:t>
+      </w:r>
+      <w:proofErr w:type="gramEnd"/>
+      <w:r>
+        <w:rPr>
+          <w:color w:val="000000"/>
+        </w:rPr>
+        <w:t>_fide_protections</w:t>
+      </w:r>
+      <w:proofErr w:type="spellEnd"/>
+      <w:r>
+        <w:rPr>
+          <w:color w:val="000000"/>
+        </w:rPr>
+        <w:t xml:space="preserve"> %}</w:t>
       </w:r>
     </w:p>
     <w:p>
@@ -4168,7 +6269,15 @@
       </w:pPr>
       <w:r>
         <w:lastRenderedPageBreak/>
-        <w:t>{%p if postforeclosure.notice_provisions.no_plaintiff_info %}</w:t>
+        <w:t xml:space="preserve">{%p if </w:t>
+      </w:r>
+      <w:proofErr w:type="spellStart"/>
+      <w:r>
+        <w:t>postforeclosure.notice_provisions.no_plaintiff_info</w:t>
+      </w:r>
+      <w:proofErr w:type="spellEnd"/>
+      <w:r>
+        <w:t xml:space="preserve"> %}</w:t>
       </w:r>
     </w:p>
     <w:p>
@@ -4199,7 +6308,15 @@
         <w:ind w:left="360"/>
       </w:pPr>
       <w:r>
-        <w:t>{%p if postforeclosure.notice_provisions.less_than_30_days %}</w:t>
+        <w:t xml:space="preserve">{%p if </w:t>
+      </w:r>
+      <w:proofErr w:type="gramStart"/>
+      <w:r>
+        <w:t>postforeclosure.notice</w:t>
+      </w:r>
+      <w:proofErr w:type="gramEnd"/>
+      <w:r>
+        <w:t>_provisions.less_than_30_days %}</w:t>
       </w:r>
     </w:p>
     <w:p>
@@ -4230,7 +6347,15 @@
         <w:ind w:left="360"/>
       </w:pPr>
       <w:r>
-        <w:t>{%p if postforeclosure.notice_provisions.no_right_to_court_notice %}</w:t>
+        <w:t xml:space="preserve">{%p if </w:t>
+      </w:r>
+      <w:proofErr w:type="spellStart"/>
+      <w:r>
+        <w:t>postforeclosure.notice_provisions.no_right_to_court_notice</w:t>
+      </w:r>
+      <w:proofErr w:type="spellEnd"/>
+      <w:r>
+        <w:t xml:space="preserve"> %}</w:t>
       </w:r>
     </w:p>
     <w:p>
@@ -4323,7 +6448,15 @@
         <w:ind w:left="360"/>
       </w:pPr>
       <w:r>
-        <w:t>{%p if postforeclosure.notice_provisions.plaintiff_did_not_inform_amount %}</w:t>
+        <w:t xml:space="preserve">{%p if </w:t>
+      </w:r>
+      <w:proofErr w:type="gramStart"/>
+      <w:r>
+        <w:t>postforeclosure.notice</w:t>
+      </w:r>
+      <w:proofErr w:type="gramEnd"/>
+      <w:r>
+        <w:t>_provisions.plaintiff_did_not_inform_amount %}</w:t>
       </w:r>
     </w:p>
     <w:p>
@@ -4354,7 +6487,15 @@
         <w:ind w:left="360"/>
       </w:pPr>
       <w:r>
-        <w:t>{%p if postforeclosure.notice_provisions.plaintiff_did_not_comply_with_requirements %}</w:t>
+        <w:t xml:space="preserve">{%p if </w:t>
+      </w:r>
+      <w:proofErr w:type="gramStart"/>
+      <w:r>
+        <w:t>postforeclosure.notice</w:t>
+      </w:r>
+      <w:proofErr w:type="gramEnd"/>
+      <w:r>
+        <w:t>_provisions.plaintiff_did_not_comply_with_requirements %}</w:t>
       </w:r>
     </w:p>
     <w:p>
@@ -4389,7 +6530,15 @@
         <w:suppressAutoHyphens/>
       </w:pPr>
       <w:r>
-        <w:t>This defense and counterclaim entitles me to possession and damages under G.L. c. 186, §14, and/or G.L. c. 93A.</w:t>
+        <w:t xml:space="preserve">This defense and counterclaim </w:t>
+      </w:r>
+      <w:proofErr w:type="gramStart"/>
+      <w:r>
+        <w:t>entitles</w:t>
+      </w:r>
+      <w:proofErr w:type="gramEnd"/>
+      <w:r>
+        <w:t xml:space="preserve"> me to possession and damages under G.L. c. 186, §14, and/or G.L. c. 93A.</w:t>
       </w:r>
     </w:p>
     <w:p>
@@ -4428,7 +6577,15 @@
         <w:ind w:left="360"/>
       </w:pPr>
       <w:r>
-        <w:t>{%p if postforeclosure.no_standing %}</w:t>
+        <w:t xml:space="preserve">{%p if </w:t>
+      </w:r>
+      <w:proofErr w:type="spellStart"/>
+      <w:r>
+        <w:t>postforeclosure.no_standing</w:t>
+      </w:r>
+      <w:proofErr w:type="spellEnd"/>
+      <w:r>
+        <w:t xml:space="preserve"> %}</w:t>
       </w:r>
     </w:p>
     <w:p>
@@ -4527,7 +6684,36 @@
         <w:suppressAutoHyphens/>
       </w:pPr>
       <w:r>
-        <w:t>{%p if not (facts.tenant_has_subsidy and subsidy_type == 'public housing') and postforeclosure.is_foreclosed %}</w:t>
+        <w:t>{%p if not (</w:t>
+      </w:r>
+      <w:proofErr w:type="spellStart"/>
+      <w:proofErr w:type="gramStart"/>
+      <w:r>
+        <w:t>facts.tenant</w:t>
+      </w:r>
+      <w:proofErr w:type="gramEnd"/>
+      <w:r>
+        <w:t>_has_subsidy</w:t>
+      </w:r>
+      <w:proofErr w:type="spellEnd"/>
+      <w:r>
+        <w:t xml:space="preserve"> and </w:t>
+      </w:r>
+      <w:proofErr w:type="spellStart"/>
+      <w:r>
+        <w:t>subsidy_type</w:t>
+      </w:r>
+      <w:proofErr w:type="spellEnd"/>
+      <w:r>
+        <w:t xml:space="preserve"> == 'public housing') and </w:t>
+      </w:r>
+      <w:proofErr w:type="spellStart"/>
+      <w:r>
+        <w:t>postforeclosure.is_foreclosed</w:t>
+      </w:r>
+      <w:proofErr w:type="spellEnd"/>
+      <w:r>
+        <w:t xml:space="preserve"> %}</w:t>
       </w:r>
     </w:p>
     <w:p>
@@ -4622,16 +6808,45 @@
         </w:numPr>
         <w:suppressAutoHyphens/>
       </w:pPr>
-      <w:r>
-        <w:t>I  am entitled to the opportunity to pay to the court within seven (7) days the difference between what the court finds I owe my landlord and what the landlord owes me in order to keep possession of my home. If I can show the court during this time period that I am eligible for RAFT assistance to help me pay the difference, I request that the court enjoin the landlord from refusing to accept RAFT pursuant to G.L. c. 151B.</w:t>
-      </w:r>
-    </w:p>
-    <w:p>
-      <w:pPr>
-        <w:pStyle w:val="BodyText"/>
-      </w:pPr>
-      <w:r>
-        <w:t>{%p if bad_conditions.have_conditions %}</w:t>
+      <w:proofErr w:type="gramStart"/>
+      <w:r>
+        <w:t>I  am</w:t>
+      </w:r>
+      <w:proofErr w:type="gramEnd"/>
+      <w:r>
+        <w:t xml:space="preserve"> entitled to the opportunity to pay to the court within seven (7) days the difference between what the court finds I owe my landlord and what the landlord owes me in order to keep possession of my home. If I can show the court during this </w:t>
+      </w:r>
+      <w:proofErr w:type="gramStart"/>
+      <w:r>
+        <w:t>time period</w:t>
+      </w:r>
+      <w:proofErr w:type="gramEnd"/>
+      <w:r>
+        <w:t xml:space="preserve"> that I am eligible for RAFT assistance to help me pay the difference, I request that the court enjoin the landlord from refusing to accept RAFT pursuant to G.L. c. 151B.</w:t>
+      </w:r>
+    </w:p>
+    <w:p>
+      <w:pPr>
+        <w:pStyle w:val="BodyText"/>
+      </w:pPr>
+      <w:r>
+        <w:t xml:space="preserve">{%p if </w:t>
+      </w:r>
+      <w:proofErr w:type="spellStart"/>
+      <w:r>
+        <w:t>bad_</w:t>
+      </w:r>
+      <w:proofErr w:type="gramStart"/>
+      <w:r>
+        <w:t>conditions.have</w:t>
+      </w:r>
+      <w:proofErr w:type="gramEnd"/>
+      <w:r>
+        <w:t>_conditions</w:t>
+      </w:r>
+      <w:proofErr w:type="spellEnd"/>
+      <w:r>
+        <w:t xml:space="preserve"> %}</w:t>
       </w:r>
     </w:p>
     <w:p>
@@ -4682,23 +6897,39 @@
         <w:pStyle w:val="BodyText"/>
       </w:pPr>
       <w:r>
-        <w:t>{# end plead_counterclaims #}</w:t>
-      </w:r>
-    </w:p>
-    <w:p>
-      <w:pPr>
-        <w:pStyle w:val="BodyText"/>
-      </w:pPr>
-      <w:r>
-        <w:t>{%p endif %}</w:t>
-      </w:r>
-    </w:p>
-    <w:p>
-      <w:pPr>
-        <w:pStyle w:val="BodyText"/>
-      </w:pPr>
-      <w:r>
-        <w:t>{%p if tenant.is_disabled %}</w:t>
+        <w:t xml:space="preserve">{# end </w:t>
+      </w:r>
+      <w:proofErr w:type="spellStart"/>
+      <w:r>
+        <w:t>plead_counterclaims</w:t>
+      </w:r>
+      <w:proofErr w:type="spellEnd"/>
+      <w:r>
+        <w:t xml:space="preserve"> #}</w:t>
+      </w:r>
+    </w:p>
+    <w:p>
+      <w:pPr>
+        <w:pStyle w:val="BodyText"/>
+      </w:pPr>
+      <w:r>
+        <w:t>{%p endif %}</w:t>
+      </w:r>
+    </w:p>
+    <w:p>
+      <w:pPr>
+        <w:pStyle w:val="BodyText"/>
+      </w:pPr>
+      <w:r>
+        <w:t xml:space="preserve">{%p if </w:t>
+      </w:r>
+      <w:proofErr w:type="spellStart"/>
+      <w:r>
+        <w:t>tenant.is_disabled</w:t>
+      </w:r>
+      <w:proofErr w:type="spellEnd"/>
+      <w:r>
+        <w:t xml:space="preserve"> %}</w:t>
       </w:r>
     </w:p>
     <w:p>
@@ -4719,7 +6950,15 @@
         <w:pStyle w:val="CenterTitle4"/>
       </w:pPr>
       <w:r>
-        <w:t xml:space="preserve">Federal Fair Housing Act; Americans With Disabilities Act; Section 504 </w:t>
+        <w:t xml:space="preserve">Federal Fair Housing Act; Americans </w:t>
+      </w:r>
+      <w:proofErr w:type="gramStart"/>
+      <w:r>
+        <w:t>With</w:t>
+      </w:r>
+      <w:proofErr w:type="gramEnd"/>
+      <w:r>
+        <w:t xml:space="preserve"> Disabilities Act; Section 504 </w:t>
       </w:r>
       <w:r>
         <w:br/>
@@ -4736,23 +6975,39 @@
         <w:suppressAutoHyphens/>
       </w:pPr>
       <w:r>
-        <w:t>I and/or a member of my household have a disability and I request the court to order the landlord to accommodate the disability by stopping the eviction and/or taking steps to provide an accommodation to allow me to remain in my home.</w:t>
-      </w:r>
-    </w:p>
-    <w:p>
-      <w:pPr>
-        <w:pStyle w:val="BodyText"/>
-      </w:pPr>
-      <w:r>
-        <w:t>{%p endif %}</w:t>
-      </w:r>
-    </w:p>
-    <w:p>
-      <w:pPr>
-        <w:pStyle w:val="BodyText"/>
-      </w:pPr>
-      <w:r>
-        <w:t>{%p if eviction_reason == "fault" %}</w:t>
+        <w:t xml:space="preserve">I and/or a member of my household have a </w:t>
+      </w:r>
+      <w:proofErr w:type="gramStart"/>
+      <w:r>
+        <w:t>disability</w:t>
+      </w:r>
+      <w:proofErr w:type="gramEnd"/>
+      <w:r>
+        <w:t xml:space="preserve"> and I request the court to order the landlord to accommodate the disability by stopping the eviction and/or taking steps to provide an accommodation to allow me to remain in my home.</w:t>
+      </w:r>
+    </w:p>
+    <w:p>
+      <w:pPr>
+        <w:pStyle w:val="BodyText"/>
+      </w:pPr>
+      <w:r>
+        <w:t>{%p endif %}</w:t>
+      </w:r>
+    </w:p>
+    <w:p>
+      <w:pPr>
+        <w:pStyle w:val="BodyText"/>
+      </w:pPr>
+      <w:r>
+        <w:t xml:space="preserve">{%p if </w:t>
+      </w:r>
+      <w:proofErr w:type="spellStart"/>
+      <w:r>
+        <w:t>eviction_reason</w:t>
+      </w:r>
+      <w:proofErr w:type="spellEnd"/>
+      <w:r>
+        <w:t xml:space="preserve"> == "fault" %}</w:t>
       </w:r>
     </w:p>
     <w:p>
@@ -4760,7 +7015,15 @@
         <w:pStyle w:val="CenterTitle"/>
       </w:pPr>
       <w:r>
-        <w:t>The Court Should Find That I Was Not At Fault</w:t>
+        <w:t xml:space="preserve">The Court Should Find That I Was Not </w:t>
+      </w:r>
+      <w:proofErr w:type="gramStart"/>
+      <w:r>
+        <w:t>At</w:t>
+      </w:r>
+      <w:proofErr w:type="gramEnd"/>
+      <w:r>
+        <w:t xml:space="preserve"> Fault</w:t>
       </w:r>
     </w:p>
     <w:p>
@@ -4796,7 +7059,15 @@
         <w:pStyle w:val="BodyText"/>
       </w:pPr>
       <w:r>
-        <w:t>{%p if eviction_all_reasons.get("nonpayment") %}</w:t>
+        <w:t xml:space="preserve">{%p if </w:t>
+      </w:r>
+      <w:proofErr w:type="spellStart"/>
+      <w:r>
+        <w:t>eviction_all_reasons.get</w:t>
+      </w:r>
+      <w:proofErr w:type="spellEnd"/>
+      <w:r>
+        <w:t>("nonpayment") %}</w:t>
       </w:r>
     </w:p>
     <w:p>
@@ -4841,7 +7112,15 @@
         <w:pStyle w:val="BodyText"/>
       </w:pPr>
       <w:r>
-        <w:t>{%p if delay_in_raft %}</w:t>
+        <w:t xml:space="preserve">{%p if </w:t>
+      </w:r>
+      <w:proofErr w:type="spellStart"/>
+      <w:r>
+        <w:t>delay_in_raft</w:t>
+      </w:r>
+      <w:proofErr w:type="spellEnd"/>
+      <w:r>
+        <w:t xml:space="preserve"> %}</w:t>
       </w:r>
     </w:p>
     <w:p>
@@ -4924,7 +7203,15 @@
         <w:ind w:left="720"/>
       </w:pPr>
       <w:r>
-        <w:t>{%p if tenant.is_disabled or tenant.is_over60 %}</w:t>
+        <w:t xml:space="preserve">{%p if </w:t>
+      </w:r>
+      <w:proofErr w:type="spellStart"/>
+      <w:r>
+        <w:t>tenant.is_disabled</w:t>
+      </w:r>
+      <w:proofErr w:type="spellEnd"/>
+      <w:r>
+        <w:t xml:space="preserve"> or tenant.is_over60 %}</w:t>
       </w:r>
     </w:p>
     <w:p>
@@ -4967,16 +7254,37 @@
         <w:pStyle w:val="BodyText"/>
         <w:ind w:left="1080"/>
       </w:pPr>
-      <w:r>
-        <w:t>{{ needs_time_because }}</w:t>
-      </w:r>
-    </w:p>
-    <w:p>
-      <w:pPr>
-        <w:pStyle w:val="BodyText"/>
-      </w:pPr>
-      <w:r>
-        <w:t>{% if claim_jurytrial %}</w:t>
+      <w:proofErr w:type="gramStart"/>
+      <w:r>
+        <w:t xml:space="preserve">{{ </w:t>
+      </w:r>
+      <w:proofErr w:type="spellStart"/>
+      <w:r>
+        <w:t>needs</w:t>
+      </w:r>
+      <w:proofErr w:type="gramEnd"/>
+      <w:r>
+        <w:t>_time_because</w:t>
+      </w:r>
+      <w:proofErr w:type="spellEnd"/>
+      <w:r>
+        <w:t xml:space="preserve"> }}</w:t>
+      </w:r>
+    </w:p>
+    <w:p>
+      <w:pPr>
+        <w:pStyle w:val="BodyText"/>
+      </w:pPr>
+      <w:r>
+        <w:t xml:space="preserve">{% if </w:t>
+      </w:r>
+      <w:proofErr w:type="spellStart"/>
+      <w:r>
+        <w:t>claim_jurytrial</w:t>
+      </w:r>
+      <w:proofErr w:type="spellEnd"/>
+      <w:r>
+        <w:t xml:space="preserve"> %}</w:t>
       </w:r>
     </w:p>
     <w:p>
@@ -5028,7 +7336,28 @@
         <w:spacing w:line="276" w:lineRule="auto"/>
       </w:pPr>
       <w:r>
-        <w:t>{%p if tenant.is_nonnativespeaker and tenant.needs_interpreter %}</w:t>
+        <w:t xml:space="preserve">{%p if </w:t>
+      </w:r>
+      <w:proofErr w:type="spellStart"/>
+      <w:r>
+        <w:t>tenant.is_nonnativespeaker</w:t>
+      </w:r>
+      <w:proofErr w:type="spellEnd"/>
+      <w:r>
+        <w:t xml:space="preserve"> and </w:t>
+      </w:r>
+      <w:proofErr w:type="spellStart"/>
+      <w:proofErr w:type="gramStart"/>
+      <w:r>
+        <w:t>tenant.needs</w:t>
+      </w:r>
+      <w:proofErr w:type="gramEnd"/>
+      <w:r>
+        <w:t>_interpreter</w:t>
+      </w:r>
+      <w:proofErr w:type="spellEnd"/>
+      <w:r>
+        <w:t xml:space="preserve"> %}</w:t>
       </w:r>
     </w:p>
     <w:p>
@@ -5051,7 +7380,15 @@
         <w:spacing w:line="360" w:lineRule="auto"/>
       </w:pPr>
       <w:r>
-        <w:t>M.G.L., ch. 261 §27A et. seq.</w:t>
+        <w:t xml:space="preserve">M.G.L., </w:t>
+      </w:r>
+      <w:proofErr w:type="spellStart"/>
+      <w:r>
+        <w:t>ch.</w:t>
+      </w:r>
+      <w:proofErr w:type="spellEnd"/>
+      <w:r>
+        <w:t xml:space="preserve"> 261 §27A et. seq.</w:t>
       </w:r>
     </w:p>
     <w:p>
@@ -5064,13 +7401,43 @@
         <w:suppressAutoHyphens/>
       </w:pPr>
       <w:r>
-        <w:t xml:space="preserve">English is not my first language and I need an interpreter to allow me to effectively defend my case. I request my right to an interpreter for all court proceedings. I need an interpreter who speaks </w:t>
-      </w:r>
+        <w:t xml:space="preserve">English is not my first </w:t>
+      </w:r>
+      <w:proofErr w:type="gramStart"/>
+      <w:r>
+        <w:t>language</w:t>
+      </w:r>
+      <w:proofErr w:type="gramEnd"/>
+      <w:r>
+        <w:t xml:space="preserve"> and I need an interpreter to allow me to effectively defend my case. I request my right to an interpreter for all court proceedings. I need an interpreter who speaks </w:t>
+      </w:r>
+      <w:proofErr w:type="gramStart"/>
       <w:r>
         <w:rPr>
           <w:b/>
         </w:rPr>
-        <w:t>{{ tenant.preferred_language }}.</w:t>
+        <w:t xml:space="preserve">{{ </w:t>
+      </w:r>
+      <w:proofErr w:type="spellStart"/>
+      <w:r>
+        <w:rPr>
+          <w:b/>
+        </w:rPr>
+        <w:t>tenant</w:t>
+      </w:r>
+      <w:proofErr w:type="gramEnd"/>
+      <w:r>
+        <w:rPr>
+          <w:b/>
+        </w:rPr>
+        <w:t>.preferred_language</w:t>
+      </w:r>
+      <w:proofErr w:type="spellEnd"/>
+      <w:r>
+        <w:rPr>
+          <w:b/>
+        </w:rPr>
+        <w:t xml:space="preserve"> }}.</w:t>
       </w:r>
     </w:p>
     <w:p>
@@ -5088,7 +7455,20 @@
         <w:pStyle w:val="BodyText"/>
       </w:pPr>
       <w:r>
-        <w:t>{{p include_docx_template('include_SignatureBlock.docx')}}</w:t>
+        <w:t xml:space="preserve">{{p </w:t>
+      </w:r>
+      <w:proofErr w:type="spellStart"/>
+      <w:proofErr w:type="gramStart"/>
+      <w:r>
+        <w:t>include</w:t>
+      </w:r>
+      <w:proofErr w:type="gramEnd"/>
+      <w:r>
+        <w:t>_docx_template</w:t>
+      </w:r>
+      <w:proofErr w:type="spellEnd"/>
+      <w:r>
+        <w:t>('include_SignatureBlock.docx')}}</w:t>
       </w:r>
     </w:p>
     <w:p/>
@@ -5134,11 +7514,21 @@
     <w:r>
       <w:t xml:space="preserve">{% if </w:t>
     </w:r>
+    <w:proofErr w:type="spellStart"/>
     <w:r>
       <w:t>prepared_with_aoc</w:t>
     </w:r>
+    <w:proofErr w:type="spellEnd"/>
     <w:r>
-      <w:t xml:space="preserve"> %}Prepared with Assistance of Counsel{% endif %}</w:t>
+      <w:t xml:space="preserve"> </w:t>
+    </w:r>
+    <w:proofErr w:type="gramStart"/>
+    <w:r>
+      <w:t>%}Prepared</w:t>
+    </w:r>
+    <w:proofErr w:type="gramEnd"/>
+    <w:r>
+      <w:t xml:space="preserve"> with Assistance of Counsel{% endif %}</w:t>
     </w:r>
     <w:r>
       <w:ptab w:relativeTo="margin" w:alignment="center" w:leader="none"/>

</xml_diff>

<commit_message>
Updated the Answer DOCX again.
</commit_message>
<xml_diff>
--- a/docassemble/MAEvictionDefense/data/templates/SummaryProcessAnswer.docx
+++ b/docassemble/MAEvictionDefense/data/templates/SummaryProcessAnswer.docx
@@ -1210,27 +1210,22 @@
       </w:r>
       <w:proofErr w:type="spellStart"/>
       <w:r>
-        <w:t>showifdef</w:t>
-      </w:r>
-      <w:proofErr w:type="spellEnd"/>
-      <w:r>
-        <w:t>('</w:t>
-      </w:r>
-      <w:proofErr w:type="spellStart"/>
-      <w:r>
         <w:t>initial_</w:t>
       </w:r>
       <w:proofErr w:type="gramStart"/>
       <w:r>
-        <w:t>defense.custom</w:t>
-      </w:r>
-      <w:proofErr w:type="gramEnd"/>
-      <w:r>
-        <w:t>_reason_for_dismissal</w:t>
-      </w:r>
-      <w:proofErr w:type="spellEnd"/>
-      <w:r>
-        <w:t>') %}</w:t>
+        <w:t>defense.</w:t>
+      </w:r>
+      <w:r>
+        <w:t>avoidance</w:t>
+      </w:r>
+      <w:proofErr w:type="gramEnd"/>
+      <w:r>
+        <w:t>_of_forfeiture</w:t>
+      </w:r>
+      <w:proofErr w:type="spellEnd"/>
+      <w:r>
+        <w:t xml:space="preserve"> %}</w:t>
       </w:r>
     </w:p>
     <w:p>
@@ -1243,23 +1238,7 @@
         <w:suppressAutoHyphens/>
       </w:pPr>
       <w:r>
-        <w:t xml:space="preserve">The landlord’s case should be dismissed because </w:t>
-      </w:r>
-      <w:proofErr w:type="gramStart"/>
-      <w:r>
-        <w:t xml:space="preserve">{{ </w:t>
-      </w:r>
-      <w:proofErr w:type="spellStart"/>
-      <w:r>
-        <w:t>initial</w:t>
-      </w:r>
-      <w:proofErr w:type="gramEnd"/>
-      <w:r>
-        <w:t>_defense.custom_reason_for_dismissal</w:t>
-      </w:r>
-      <w:proofErr w:type="spellEnd"/>
-      <w:r>
-        <w:t xml:space="preserve"> }}.</w:t>
+        <w:t>Based on principles of equity and fairness, it is unfair to evict me.</w:t>
       </w:r>
     </w:p>
     <w:p>
@@ -1273,6 +1252,77 @@
     </w:p>
     <w:p>
       <w:pPr>
+        <w:pStyle w:val="ListwithNoSpace"/>
+        <w:ind w:left="360"/>
+      </w:pPr>
+      <w:r>
+        <w:t xml:space="preserve">{%p if </w:t>
+      </w:r>
+      <w:proofErr w:type="spellStart"/>
+      <w:r>
+        <w:t>showifdef</w:t>
+      </w:r>
+      <w:proofErr w:type="spellEnd"/>
+      <w:r>
+        <w:t>('</w:t>
+      </w:r>
+      <w:proofErr w:type="spellStart"/>
+      <w:r>
+        <w:t>initial_</w:t>
+      </w:r>
+      <w:proofErr w:type="gramStart"/>
+      <w:r>
+        <w:t>defense.custom</w:t>
+      </w:r>
+      <w:proofErr w:type="gramEnd"/>
+      <w:r>
+        <w:t>_reason_for_dismissal</w:t>
+      </w:r>
+      <w:proofErr w:type="spellEnd"/>
+      <w:r>
+        <w:t>') %}</w:t>
+      </w:r>
+    </w:p>
+    <w:p>
+      <w:pPr>
+        <w:pStyle w:val="ListwithNoSpace"/>
+        <w:numPr>
+          <w:ilvl w:val="0"/>
+          <w:numId w:val="14"/>
+        </w:numPr>
+        <w:suppressAutoHyphens/>
+      </w:pPr>
+      <w:r>
+        <w:t xml:space="preserve">The landlord’s case should be dismissed because </w:t>
+      </w:r>
+      <w:proofErr w:type="gramStart"/>
+      <w:r>
+        <w:t xml:space="preserve">{{ </w:t>
+      </w:r>
+      <w:proofErr w:type="spellStart"/>
+      <w:r>
+        <w:t>initial</w:t>
+      </w:r>
+      <w:proofErr w:type="gramEnd"/>
+      <w:r>
+        <w:t>_defense.custom_reason_for_dismissal</w:t>
+      </w:r>
+      <w:proofErr w:type="spellEnd"/>
+      <w:r>
+        <w:t xml:space="preserve"> }}.</w:t>
+      </w:r>
+    </w:p>
+    <w:p>
+      <w:pPr>
+        <w:pStyle w:val="ListwithNoSpace"/>
+        <w:ind w:left="360"/>
+      </w:pPr>
+      <w:r>
+        <w:t>{%p endif %}</w:t>
+      </w:r>
+    </w:p>
+    <w:p>
+      <w:pPr>
         <w:pStyle w:val="BodyText"/>
       </w:pPr>
       <w:r>
@@ -1566,6 +1616,7 @@
         <w:contextualSpacing/>
       </w:pPr>
       <w:r>
+        <w:lastRenderedPageBreak/>
         <w:t>I reside in federal public housing or subsidized Section 8 or other covered federal housing and have a defense under the Violence Against Women Act (42 U.S.C. 14043e-11).</w:t>
       </w:r>
     </w:p>
@@ -1577,7 +1628,6 @@
         <w:contextualSpacing/>
       </w:pPr>
       <w:r>
-        <w:lastRenderedPageBreak/>
         <w:t>{%p endif %}</w:t>
       </w:r>
     </w:p>
@@ -2056,6 +2106,7 @@
         <w:contextualSpacing/>
       </w:pPr>
       <w:r>
+        <w:lastRenderedPageBreak/>
         <w:t>I am a survivor of abuse, sexual assault, rape or stalking and the landlord is evicting me for exercising my rights to break my lease or change my locks for safety reasons under G.L. c. 186, §§23-29.</w:t>
       </w:r>
     </w:p>
@@ -2067,7 +2118,6 @@
         <w:contextualSpacing/>
       </w:pPr>
       <w:r>
-        <w:lastRenderedPageBreak/>
         <w:t>{%p endif %}</w:t>
       </w:r>
     </w:p>
@@ -2362,10 +2412,7 @@
         <w:ind w:left="360"/>
       </w:pPr>
       <w:r>
-        <w:t xml:space="preserve">{%p </w:t>
-      </w:r>
-      <w:r>
-        <w:t xml:space="preserve">if </w:t>
+        <w:t xml:space="preserve">{%p if </w:t>
       </w:r>
       <w:proofErr w:type="spellStart"/>
       <w:r>
@@ -2373,29 +2420,17 @@
       </w:r>
       <w:proofErr w:type="spellEnd"/>
       <w:r>
-        <w:t xml:space="preserve"> == </w:t>
-      </w:r>
-      <w:r>
-        <w:t>‘</w:t>
-      </w:r>
-      <w:r>
-        <w:t>nonpayment</w:t>
-      </w:r>
-      <w:r>
-        <w:t>’</w:t>
-      </w:r>
+        <w:t xml:space="preserve"> == ‘nonpayment’ and </w:t>
+      </w:r>
+      <w:proofErr w:type="spellStart"/>
+      <w:r>
+        <w:t>delay_in_raft</w:t>
+      </w:r>
+      <w:proofErr w:type="spellEnd"/>
       <w:r>
         <w:t xml:space="preserve"> and </w:t>
       </w:r>
       <w:proofErr w:type="spellStart"/>
-      <w:r>
-        <w:t>delay_in_raft</w:t>
-      </w:r>
-      <w:proofErr w:type="spellEnd"/>
-      <w:r>
-        <w:t xml:space="preserve"> and </w:t>
-      </w:r>
-      <w:proofErr w:type="spellStart"/>
       <w:proofErr w:type="gramStart"/>
       <w:r>
         <w:t>discrimination.raft</w:t>
@@ -2406,7 +2441,10 @@
       </w:r>
       <w:proofErr w:type="spellEnd"/>
       <w:r>
-        <w:t xml:space="preserve"> %}</w:t>
+        <w:t xml:space="preserve"> %</w:t>
+      </w:r>
+      <w:r>
+        <w:t>}</w:t>
       </w:r>
     </w:p>
     <w:p>
@@ -2493,7 +2531,6 @@
         <w:rPr>
           <w:rFonts w:ascii="Garamond" w:hAnsi="Garamond"/>
         </w:rPr>
-        <w:lastRenderedPageBreak/>
         <w:t xml:space="preserve">See BHA vs. </w:t>
       </w:r>
       <w:proofErr w:type="spellStart"/>
@@ -2868,6 +2905,7 @@
         <w:ind w:left="360"/>
       </w:pPr>
       <w:r>
+        <w:lastRenderedPageBreak/>
         <w:t xml:space="preserve">{%p if </w:t>
       </w:r>
       <w:proofErr w:type="spellStart"/>
@@ -2898,7 +2936,6 @@
         <w:ind w:left="360"/>
       </w:pPr>
       <w:r>
-        <w:lastRenderedPageBreak/>
         <w:t>{%p endif %}</w:t>
       </w:r>
     </w:p>
@@ -3323,7 +3360,11 @@
       </w:r>
       <w:r>
         <w:br/>
-        <w:t xml:space="preserve">(a) the full market rental value of my home in good condition, and (b) the reduced value of my home in its bad condition. </w:t>
+        <w:t xml:space="preserve">(a) the full market rental value of my home in good condition, and (b) the reduced value of my </w:t>
+      </w:r>
+      <w:r>
+        <w:lastRenderedPageBreak/>
+        <w:t xml:space="preserve">home in its bad condition. </w:t>
       </w:r>
       <w:r>
         <w:rPr>
@@ -3343,7 +3384,6 @@
         <w:contextualSpacing/>
       </w:pPr>
       <w:r>
-        <w:lastRenderedPageBreak/>
         <w:tab/>
         <w:t>{%p endif %}</w:t>
       </w:r>
@@ -3689,6 +3729,7 @@
         <w:pStyle w:val="CenterTitle"/>
       </w:pPr>
       <w:r>
+        <w:lastRenderedPageBreak/>
         <w:t>Interference with Utilities and Use of Home</w:t>
       </w:r>
       <w:r>
@@ -3714,7 +3755,6 @@
         <w:suppressAutoHyphens/>
       </w:pPr>
       <w:r>
-        <w:lastRenderedPageBreak/>
         <w:t xml:space="preserve"> The landlord did the following:</w:t>
       </w:r>
     </w:p>
@@ -4247,6 +4287,7 @@
         <w:ind w:left="360"/>
       </w:pPr>
       <w:r>
+        <w:lastRenderedPageBreak/>
         <w:t xml:space="preserve">{%p if </w:t>
       </w:r>
       <w:proofErr w:type="spellStart"/>
@@ -4273,11 +4314,7 @@
         <w:suppressAutoHyphens/>
       </w:pPr>
       <w:r>
-        <w:t xml:space="preserve">I have been billed for gas, oil and/or electricity that go to other people’s apartments or common areas (such as hallways, stairways, basements, or porches). This defense and </w:t>
-      </w:r>
-      <w:r>
-        <w:lastRenderedPageBreak/>
-        <w:t xml:space="preserve">counterclaim </w:t>
+        <w:t xml:space="preserve">I have been billed for gas, oil and/or electricity that go to other people’s apartments or common areas (such as hallways, stairways, basements, or porches). This defense and counterclaim </w:t>
       </w:r>
       <w:proofErr w:type="gramStart"/>
       <w:r>
@@ -4568,6 +4605,7 @@
         <w:pStyle w:val="BodyText"/>
       </w:pPr>
       <w:r>
+        <w:lastRenderedPageBreak/>
         <w:t>{%p if plead_93a %}</w:t>
       </w:r>
     </w:p>
@@ -4581,7 +4619,6 @@
         <w:pStyle w:val="Caption"/>
       </w:pPr>
       <w:r>
-        <w:lastRenderedPageBreak/>
         <w:t>Defense &amp; Counterclaim</w:t>
       </w:r>
       <w:r>
@@ -5022,20 +5059,14 @@
         <w:rPr>
           <w:color w:val="000000"/>
         </w:rPr>
+        <w:lastRenderedPageBreak/>
         <w:t xml:space="preserve">Because </w:t>
       </w:r>
       <w:r>
         <w:rPr>
           <w:color w:val="222222"/>
         </w:rPr>
-        <w:t xml:space="preserve">the landlord claimed rent was owed, all court events relating to the landlord’s case should be postponed for a determination of all available rental assistance for which I </w:t>
-      </w:r>
-      <w:r>
-        <w:rPr>
-          <w:color w:val="222222"/>
-        </w:rPr>
-        <w:lastRenderedPageBreak/>
-        <w:t>have applied or will apply, and upon approval and payment of the full rent then due, the landlord’s claims for rent and possession must be dismissed.</w:t>
+        <w:t>the landlord claimed rent was owed, all court events relating to the landlord’s case should be postponed for a determination of all available rental assistance for which I have applied or will apply, and upon approval and payment of the full rent then due, the landlord’s claims for rent and possession must be dismissed.</w:t>
       </w:r>
     </w:p>
     <w:p>
@@ -5457,6 +5488,7 @@
         <w:ind w:left="360"/>
       </w:pPr>
       <w:r>
+        <w:lastRenderedPageBreak/>
         <w:t xml:space="preserve">{%p if </w:t>
       </w:r>
       <w:proofErr w:type="spellStart"/>
@@ -5500,7 +5532,6 @@
         <w:ind w:left="360"/>
       </w:pPr>
       <w:r>
-        <w:lastRenderedPageBreak/>
         <w:t>{%p endif %}</w:t>
       </w:r>
     </w:p>
@@ -5908,6 +5939,7 @@
         <w:ind w:left="360"/>
       </w:pPr>
       <w:r>
+        <w:lastRenderedPageBreak/>
         <w:t>{%p if not (</w:t>
       </w:r>
       <w:proofErr w:type="spellStart"/>
@@ -5951,7 +5983,6 @@
         <w:spacing w:line="360" w:lineRule="auto"/>
       </w:pPr>
       <w:r>
-        <w:lastRenderedPageBreak/>
         <w:t>Evictions after Foreclosure</w:t>
       </w:r>
     </w:p>
@@ -6209,6 +6240,7 @@
         <w:rPr>
           <w:color w:val="000000"/>
         </w:rPr>
+        <w:lastRenderedPageBreak/>
         <w:t xml:space="preserve">{%p if </w:t>
       </w:r>
       <w:proofErr w:type="spellStart"/>
@@ -6268,7 +6300,6 @@
         <w:ind w:left="360"/>
       </w:pPr>
       <w:r>
-        <w:lastRenderedPageBreak/>
         <w:t xml:space="preserve">{%p if </w:t>
       </w:r>
       <w:proofErr w:type="spellStart"/>
@@ -6517,6 +6548,7 @@
         <w:ind w:left="360"/>
       </w:pPr>
       <w:r>
+        <w:lastRenderedPageBreak/>
         <w:t>{%p endif %}</w:t>
       </w:r>
     </w:p>
@@ -6546,7 +6578,6 @@
         <w:pStyle w:val="Caption"/>
       </w:pPr>
       <w:r>
-        <w:lastRenderedPageBreak/>
         <w:t>Defense</w:t>
       </w:r>
     </w:p>
@@ -6782,6 +6813,7 @@
         <w:suppressAutoHyphens/>
       </w:pPr>
       <w:r>
+        <w:lastRenderedPageBreak/>
         <w:t xml:space="preserve">I request that the court apply G.L. c. 239, §8A (which applies both to non-payment and to no fault evictions) to allow me to stay in my home as follows: </w:t>
       </w:r>
     </w:p>
@@ -6795,7 +6827,6 @@
         <w:suppressAutoHyphens/>
       </w:pPr>
       <w:r>
-        <w:lastRenderedPageBreak/>
         <w:t>Because the money owed to me on my counterclaims is greater than the amount of rent owed to the landlord, I win the eviction (possession of the property should be awarded to me in this action); or</w:t>
       </w:r>
     </w:p>
@@ -7041,6 +7072,7 @@
         <w:suppressAutoHyphens/>
       </w:pPr>
       <w:r>
+        <w:lastRenderedPageBreak/>
         <w:t>The court should find that the landlord has not proven that I was at fault. This is a fault eviction case in which the landlord claimed I did something wrong (other than nonpayment of rent). The landlord did not prove that I did anything serious enough to justify eviction; therefore, the court should allow me to stay in my home.</w:t>
       </w:r>
     </w:p>
@@ -7050,7 +7082,6 @@
         <w:ind w:left="360"/>
       </w:pPr>
       <w:r>
-        <w:lastRenderedPageBreak/>
         <w:t>{%p endif %}</w:t>
       </w:r>
     </w:p>
@@ -7276,6 +7307,7 @@
         <w:pStyle w:val="BodyText"/>
       </w:pPr>
       <w:r>
+        <w:lastRenderedPageBreak/>
         <w:t xml:space="preserve">{% if </w:t>
       </w:r>
       <w:proofErr w:type="spellStart"/>
@@ -7306,7 +7338,6 @@
         <w:spacing w:line="360" w:lineRule="auto"/>
       </w:pPr>
       <w:r>
-        <w:lastRenderedPageBreak/>
         <w:t>Part I, Article XV of the Mass. Constitution; USPR 8; Mass. Gen. Laws c. 185C, § 21 and c. 218, §19B</w:t>
       </w:r>
     </w:p>

</xml_diff>

<commit_message>
Broke up the disability and accomodations
</commit_message>
<xml_diff>
--- a/docassemble/MAEvictionDefense/data/templates/SummaryProcessAnswer.docx
+++ b/docassemble/MAEvictionDefense/data/templates/SummaryProcessAnswer.docx
@@ -1,5 +1,55 @@
 
-<file path=word/document.xml><?xml version="1.0" encoding="utf-8"?>
+<file path=docProps\app.xml><?xml version="1.0" encoding="utf-8"?>
+<Properties xmlns="http://schemas.openxmlformats.org/officeDocument/2006/extended-properties" xmlns:vt="http://schemas.openxmlformats.org/officeDocument/2006/docPropsVTypes">
+  <Template>Normal.dotm</Template>
+  <TotalTime>2575</TotalTime>
+  <Pages>19</Pages>
+  <Words>4297</Words>
+  <Characters>24498</Characters>
+  <Application>Microsoft Office Word</Application>
+  <DocSecurity>0</DocSecurity>
+  <Lines>204</Lines>
+  <Paragraphs>57</Paragraphs>
+  <ScaleCrop>false</ScaleCrop>
+  <HeadingPairs>
+    <vt:vector size="2" baseType="variant">
+      <vt:variant>
+        <vt:lpstr>Title</vt:lpstr>
+      </vt:variant>
+      <vt:variant>
+        <vt:i4>1</vt:i4>
+      </vt:variant>
+    </vt:vector>
+  </HeadingPairs>
+  <TitlesOfParts>
+    <vt:vector size="1" baseType="lpstr">
+      <vt:lpstr/>
+    </vt:vector>
+  </TitlesOfParts>
+  <Company/>
+  <LinksUpToDate>false</LinksUpToDate>
+  <CharactersWithSpaces>28738</CharactersWithSpaces>
+  <SharedDoc>false</SharedDoc>
+  <HyperlinksChanged>false</HyperlinksChanged>
+  <AppVersion>16.0000</AppVersion>
+</Properties>
+</file>
+
+<file path=docProps\core.xml><?xml version="1.0" encoding="utf-8"?>
+<cp:coreProperties xmlns:cp="http://schemas.openxmlformats.org/package/2006/metadata/core-properties" xmlns:dc="http://purl.org/dc/elements/1.1/" xmlns:dcterms="http://purl.org/dc/terms/" xmlns:dcmitype="http://purl.org/dc/dcmitype/" xmlns:xsi="http://www.w3.org/2001/XMLSchema-instance">
+  <dc:title/>
+  <dc:subject/>
+  <dc:creator>Tracy Bindel</dc:creator>
+  <dc:description/>
+  <cp:lastModifiedBy>Jim Graszer Jr</cp:lastModifiedBy>
+  <cp:revision>30</cp:revision>
+  <dcterms:created xsi:type="dcterms:W3CDTF">2021-02-10T20:25:00Z</dcterms:created>
+  <dcterms:modified xsi:type="dcterms:W3CDTF">2026-07-02T19:17:00Z</dcterms:modified>
+  <dc:language>en-US</dc:language>
+</cp:coreProperties>
+</file>
+
+<file path=word\document.xml><?xml version="1.0" encoding="utf-8"?>
 <w:document xmlns:wpc="http://schemas.microsoft.com/office/word/2010/wordprocessingCanvas" xmlns:cx="http://schemas.microsoft.com/office/drawing/2014/chartex" xmlns:cx1="http://schemas.microsoft.com/office/drawing/2015/9/8/chartex" xmlns:cx2="http://schemas.microsoft.com/office/drawing/2015/10/21/chartex" xmlns:cx3="http://schemas.microsoft.com/office/drawing/2016/5/9/chartex" xmlns:cx4="http://schemas.microsoft.com/office/drawing/2016/5/10/chartex" xmlns:cx5="http://schemas.microsoft.com/office/drawing/2016/5/11/chartex" xmlns:cx6="http://schemas.microsoft.com/office/drawing/2016/5/12/chartex" xmlns:cx7="http://schemas.microsoft.com/office/drawing/2016/5/13/chartex" xmlns:cx8="http://schemas.microsoft.com/office/drawing/2016/5/14/chartex" xmlns:mc="http://schemas.openxmlformats.org/markup-compatibility/2006" xmlns:aink="http://schemas.microsoft.com/office/drawing/2016/ink" xmlns:am3d="http://schemas.microsoft.com/office/drawing/2017/model3d" xmlns:o="urn:schemas-microsoft-com:office:office" xmlns:oel="http://schemas.microsoft.com/office/2019/extlst" xmlns:r="http://schemas.openxmlformats.org/officeDocument/2006/relationships" xmlns:m="http://schemas.openxmlformats.org/officeDocument/2006/math" xmlns:v="urn:schemas-microsoft-com:vml" xmlns:wp14="http://schemas.microsoft.com/office/word/2010/wordprocessingDrawing" xmlns:wp="http://schemas.openxmlformats.org/drawingml/2006/wordprocessingDrawing" xmlns:w10="urn:schemas-microsoft-com:office:word" xmlns:w="http://schemas.openxmlformats.org/wordprocessingml/2006/main" xmlns:w14="http://schemas.microsoft.com/office/word/2010/wordml" xmlns:w15="http://schemas.microsoft.com/office/word/2012/wordml" xmlns:w16cex="http://schemas.microsoft.com/office/word/2018/wordml/cex" xmlns:w16cid="http://schemas.microsoft.com/office/word/2016/wordml/cid" xmlns:w16="http://schemas.microsoft.com/office/word/2018/wordml" xmlns:w16sdtdh="http://schemas.microsoft.com/office/word/2020/wordml/sdtdatahash" xmlns:w16se="http://schemas.microsoft.com/office/word/2015/wordml/symex" xmlns:wpg="http://schemas.microsoft.com/office/word/2010/wordprocessingGroup" xmlns:wpi="http://schemas.microsoft.com/office/word/2010/wordprocessingInk" xmlns:wne="http://schemas.microsoft.com/office/word/2006/wordml" xmlns:wps="http://schemas.microsoft.com/office/word/2010/wordprocessingShape" mc:Ignorable="w14 w15 w16se w16cid w16 w16cex w16sdtdh wp14">
   <w:body>
     <w:p>
@@ -2483,31 +2533,7 @@
         <w:pStyle w:val="BodyText"/>
       </w:pPr>
       <w:r>
-        <w:t xml:space="preserve">{%p if </w:t>
-      </w:r>
-      <w:proofErr w:type="spellStart"/>
-      <w:r>
-        <w:t>tenant.is_disabled</w:t>
-      </w:r>
-      <w:proofErr w:type="spellEnd"/>
-      <w:r>
-        <w:t xml:space="preserve"> </w:t>
-      </w:r>
-      <w:r>
-        <w:t xml:space="preserve">and </w:t>
-      </w:r>
-      <w:proofErr w:type="spellStart"/>
-      <w:proofErr w:type="gramStart"/>
-      <w:r>
-        <w:t>disability.request</w:t>
-      </w:r>
-      <w:proofErr w:type="gramEnd"/>
-      <w:r>
-        <w:t>_reasonable_accommodation</w:t>
-      </w:r>
-      <w:proofErr w:type="spellEnd"/>
-      <w:r>
-        <w:t xml:space="preserve"> %}</w:t>
+        <w:t xml:space="preserve">{%p if tenant.is_disabled and (disability.request_reasonable_accommodation or disability.unfairly_denied_accommodation) %}</w:t>
       </w:r>
     </w:p>
     <w:p>
@@ -7516,7 +7542,7 @@
 </w:document>
 </file>
 
-<file path=word/endnotes.xml><?xml version="1.0" encoding="utf-8"?>
+<file path=word\endnotes.xml><?xml version="1.0" encoding="utf-8"?>
 <w:endnotes xmlns:wpc="http://schemas.microsoft.com/office/word/2010/wordprocessingCanvas" xmlns:cx="http://schemas.microsoft.com/office/drawing/2014/chartex" xmlns:cx1="http://schemas.microsoft.com/office/drawing/2015/9/8/chartex" xmlns:cx2="http://schemas.microsoft.com/office/drawing/2015/10/21/chartex" xmlns:cx3="http://schemas.microsoft.com/office/drawing/2016/5/9/chartex" xmlns:cx4="http://schemas.microsoft.com/office/drawing/2016/5/10/chartex" xmlns:cx5="http://schemas.microsoft.com/office/drawing/2016/5/11/chartex" xmlns:cx6="http://schemas.microsoft.com/office/drawing/2016/5/12/chartex" xmlns:cx7="http://schemas.microsoft.com/office/drawing/2016/5/13/chartex" xmlns:cx8="http://schemas.microsoft.com/office/drawing/2016/5/14/chartex" xmlns:mc="http://schemas.openxmlformats.org/markup-compatibility/2006" xmlns:aink="http://schemas.microsoft.com/office/drawing/2016/ink" xmlns:am3d="http://schemas.microsoft.com/office/drawing/2017/model3d" xmlns:o="urn:schemas-microsoft-com:office:office" xmlns:oel="http://schemas.microsoft.com/office/2019/extlst" xmlns:r="http://schemas.openxmlformats.org/officeDocument/2006/relationships" xmlns:m="http://schemas.openxmlformats.org/officeDocument/2006/math" xmlns:v="urn:schemas-microsoft-com:vml" xmlns:wp14="http://schemas.microsoft.com/office/word/2010/wordprocessingDrawing" xmlns:wp="http://schemas.openxmlformats.org/drawingml/2006/wordprocessingDrawing" xmlns:w10="urn:schemas-microsoft-com:office:word" xmlns:w="http://schemas.openxmlformats.org/wordprocessingml/2006/main" xmlns:w14="http://schemas.microsoft.com/office/word/2010/wordml" xmlns:w15="http://schemas.microsoft.com/office/word/2012/wordml" xmlns:w16cex="http://schemas.microsoft.com/office/word/2018/wordml/cex" xmlns:w16cid="http://schemas.microsoft.com/office/word/2016/wordml/cid" xmlns:w16="http://schemas.microsoft.com/office/word/2018/wordml" xmlns:w16sdtdh="http://schemas.microsoft.com/office/word/2020/wordml/sdtdatahash" xmlns:w16se="http://schemas.microsoft.com/office/word/2015/wordml/symex" xmlns:wpg="http://schemas.microsoft.com/office/word/2010/wordprocessingGroup" xmlns:wpi="http://schemas.microsoft.com/office/word/2010/wordprocessingInk" xmlns:wne="http://schemas.microsoft.com/office/word/2006/wordml" xmlns:wps="http://schemas.microsoft.com/office/word/2010/wordprocessingShape" mc:Ignorable="w14 w15 w16se w16cid w16 w16cex w16sdtdh wp14">
   <w:endnote w:type="separator" w:id="-1">
     <w:p>
@@ -7535,7 +7561,83 @@
 </w:endnotes>
 </file>
 
-<file path=word/footer1.xml><?xml version="1.0" encoding="utf-8"?>
+<file path=word\fontTable.xml><?xml version="1.0" encoding="utf-8"?>
+<w:fonts xmlns:mc="http://schemas.openxmlformats.org/markup-compatibility/2006" xmlns:r="http://schemas.openxmlformats.org/officeDocument/2006/relationships" xmlns:w="http://schemas.openxmlformats.org/wordprocessingml/2006/main" xmlns:w14="http://schemas.microsoft.com/office/word/2010/wordml" xmlns:w15="http://schemas.microsoft.com/office/word/2012/wordml" xmlns:w16cex="http://schemas.microsoft.com/office/word/2018/wordml/cex" xmlns:w16cid="http://schemas.microsoft.com/office/word/2016/wordml/cid" xmlns:w16="http://schemas.microsoft.com/office/word/2018/wordml" xmlns:w16sdtdh="http://schemas.microsoft.com/office/word/2020/wordml/sdtdatahash" xmlns:w16se="http://schemas.microsoft.com/office/word/2015/wordml/symex" mc:Ignorable="w14 w15 w16se w16cid w16 w16cex w16sdtdh">
+  <w:font w:name="Times New Roman">
+    <w:panose1 w:val="02020603050405020304"/>
+    <w:charset w:val="00"/>
+    <w:family w:val="roman"/>
+    <w:pitch w:val="variable"/>
+    <w:sig w:usb0="E0002EFF" w:usb1="C000785B" w:usb2="00000009" w:usb3="00000000" w:csb0="000001FF" w:csb1="00000000"/>
+  </w:font>
+  <w:font w:name="Symbol">
+    <w:panose1 w:val="05050102010706020507"/>
+    <w:charset w:val="02"/>
+    <w:family w:val="roman"/>
+    <w:pitch w:val="variable"/>
+    <w:sig w:usb0="00000000" w:usb1="10000000" w:usb2="00000000" w:usb3="00000000" w:csb0="80000000" w:csb1="00000000"/>
+  </w:font>
+  <w:font w:name="SimSun">
+    <w:altName w:val="宋体"/>
+    <w:panose1 w:val="02010600030101010101"/>
+    <w:charset w:val="86"/>
+    <w:family w:val="auto"/>
+    <w:pitch w:val="variable"/>
+    <w:sig w:usb0="00000203" w:usb1="288F0000" w:usb2="00000016" w:usb3="00000000" w:csb0="00040001" w:csb1="00000000"/>
+  </w:font>
+  <w:font w:name="Lucida Sans">
+    <w:panose1 w:val="020B0602030504020204"/>
+    <w:charset w:val="00"/>
+    <w:family w:val="swiss"/>
+    <w:pitch w:val="variable"/>
+    <w:sig w:usb0="00000003" w:usb1="00000000" w:usb2="00000000" w:usb3="00000000" w:csb0="00000001" w:csb1="00000000"/>
+  </w:font>
+  <w:font w:name="Arial">
+    <w:panose1 w:val="020B0604020202020204"/>
+    <w:charset w:val="00"/>
+    <w:family w:val="swiss"/>
+    <w:pitch w:val="variable"/>
+    <w:sig w:usb0="E0002EFF" w:usb1="C000785B" w:usb2="00000009" w:usb3="00000000" w:csb0="000001FF" w:csb1="00000000"/>
+  </w:font>
+  <w:font w:name="Microsoft YaHei">
+    <w:panose1 w:val="020B0503020204020204"/>
+    <w:charset w:val="86"/>
+    <w:family w:val="swiss"/>
+    <w:pitch w:val="variable"/>
+    <w:sig w:usb0="80000287" w:usb1="2ACF3C50" w:usb2="00000016" w:usb3="00000000" w:csb0="0004001F" w:csb1="00000000"/>
+  </w:font>
+  <w:font w:name="Mangal">
+    <w:panose1 w:val="00000400000000000000"/>
+    <w:charset w:val="00"/>
+    <w:family w:val="roman"/>
+    <w:pitch w:val="variable"/>
+    <w:sig w:usb0="00008003" w:usb1="00000000" w:usb2="00000000" w:usb3="00000000" w:csb0="00000001" w:csb1="00000000"/>
+  </w:font>
+  <w:font w:name="Garamond">
+    <w:panose1 w:val="02020404030301010803"/>
+    <w:charset w:val="00"/>
+    <w:family w:val="roman"/>
+    <w:pitch w:val="variable"/>
+    <w:sig w:usb0="00000287" w:usb1="00000000" w:usb2="00000000" w:usb3="00000000" w:csb0="0000009F" w:csb1="00000000"/>
+  </w:font>
+  <w:font w:name="Calibri Light">
+    <w:panose1 w:val="020F0302020204030204"/>
+    <w:charset w:val="00"/>
+    <w:family w:val="swiss"/>
+    <w:pitch w:val="variable"/>
+    <w:sig w:usb0="E4002EFF" w:usb1="C000247B" w:usb2="00000009" w:usb3="00000000" w:csb0="000001FF" w:csb1="00000000"/>
+  </w:font>
+  <w:font w:name="Calibri">
+    <w:panose1 w:val="020F0502020204030204"/>
+    <w:charset w:val="00"/>
+    <w:family w:val="swiss"/>
+    <w:pitch w:val="variable"/>
+    <w:sig w:usb0="E4002EFF" w:usb1="C000247B" w:usb2="00000009" w:usb3="00000000" w:csb0="000001FF" w:csb1="00000000"/>
+  </w:font>
+</w:fonts>
+</file>
+
+<file path=word\footer1.xml><?xml version="1.0" encoding="utf-8"?>
 <w:ftr xmlns:wpc="http://schemas.microsoft.com/office/word/2010/wordprocessingCanvas" xmlns:cx="http://schemas.microsoft.com/office/drawing/2014/chartex" xmlns:cx1="http://schemas.microsoft.com/office/drawing/2015/9/8/chartex" xmlns:cx2="http://schemas.microsoft.com/office/drawing/2015/10/21/chartex" xmlns:cx3="http://schemas.microsoft.com/office/drawing/2016/5/9/chartex" xmlns:cx4="http://schemas.microsoft.com/office/drawing/2016/5/10/chartex" xmlns:cx5="http://schemas.microsoft.com/office/drawing/2016/5/11/chartex" xmlns:cx6="http://schemas.microsoft.com/office/drawing/2016/5/12/chartex" xmlns:cx7="http://schemas.microsoft.com/office/drawing/2016/5/13/chartex" xmlns:cx8="http://schemas.microsoft.com/office/drawing/2016/5/14/chartex" xmlns:mc="http://schemas.openxmlformats.org/markup-compatibility/2006" xmlns:aink="http://schemas.microsoft.com/office/drawing/2016/ink" xmlns:am3d="http://schemas.microsoft.com/office/drawing/2017/model3d" xmlns:o="urn:schemas-microsoft-com:office:office" xmlns:oel="http://schemas.microsoft.com/office/2019/extlst" xmlns:r="http://schemas.openxmlformats.org/officeDocument/2006/relationships" xmlns:m="http://schemas.openxmlformats.org/officeDocument/2006/math" xmlns:v="urn:schemas-microsoft-com:vml" xmlns:wp14="http://schemas.microsoft.com/office/word/2010/wordprocessingDrawing" xmlns:wp="http://schemas.openxmlformats.org/drawingml/2006/wordprocessingDrawing" xmlns:w10="urn:schemas-microsoft-com:office:word" xmlns:w="http://schemas.openxmlformats.org/wordprocessingml/2006/main" xmlns:w14="http://schemas.microsoft.com/office/word/2010/wordml" xmlns:w15="http://schemas.microsoft.com/office/word/2012/wordml" xmlns:w16cex="http://schemas.microsoft.com/office/word/2018/wordml/cex" xmlns:w16cid="http://schemas.microsoft.com/office/word/2016/wordml/cid" xmlns:w16="http://schemas.microsoft.com/office/word/2018/wordml" xmlns:w16sdtdh="http://schemas.microsoft.com/office/word/2020/wordml/sdtdatahash" xmlns:w16se="http://schemas.microsoft.com/office/word/2015/wordml/symex" xmlns:wpg="http://schemas.microsoft.com/office/word/2010/wordprocessingGroup" xmlns:wpi="http://schemas.microsoft.com/office/word/2010/wordprocessingInk" xmlns:wne="http://schemas.microsoft.com/office/word/2006/wordml" xmlns:wps="http://schemas.microsoft.com/office/word/2010/wordprocessingShape" mc:Ignorable="w14 w15 w16se w16cid w16 w16cex w16sdtdh wp14">
   <w:p>
     <w:pPr>
@@ -7610,7 +7712,7 @@
 </w:ftr>
 </file>
 
-<file path=word/footnotes.xml><?xml version="1.0" encoding="utf-8"?>
+<file path=word\footnotes.xml><?xml version="1.0" encoding="utf-8"?>
 <w:footnotes xmlns:wpc="http://schemas.microsoft.com/office/word/2010/wordprocessingCanvas" xmlns:cx="http://schemas.microsoft.com/office/drawing/2014/chartex" xmlns:cx1="http://schemas.microsoft.com/office/drawing/2015/9/8/chartex" xmlns:cx2="http://schemas.microsoft.com/office/drawing/2015/10/21/chartex" xmlns:cx3="http://schemas.microsoft.com/office/drawing/2016/5/9/chartex" xmlns:cx4="http://schemas.microsoft.com/office/drawing/2016/5/10/chartex" xmlns:cx5="http://schemas.microsoft.com/office/drawing/2016/5/11/chartex" xmlns:cx6="http://schemas.microsoft.com/office/drawing/2016/5/12/chartex" xmlns:cx7="http://schemas.microsoft.com/office/drawing/2016/5/13/chartex" xmlns:cx8="http://schemas.microsoft.com/office/drawing/2016/5/14/chartex" xmlns:mc="http://schemas.openxmlformats.org/markup-compatibility/2006" xmlns:aink="http://schemas.microsoft.com/office/drawing/2016/ink" xmlns:am3d="http://schemas.microsoft.com/office/drawing/2017/model3d" xmlns:o="urn:schemas-microsoft-com:office:office" xmlns:oel="http://schemas.microsoft.com/office/2019/extlst" xmlns:r="http://schemas.openxmlformats.org/officeDocument/2006/relationships" xmlns:m="http://schemas.openxmlformats.org/officeDocument/2006/math" xmlns:v="urn:schemas-microsoft-com:vml" xmlns:wp14="http://schemas.microsoft.com/office/word/2010/wordprocessingDrawing" xmlns:wp="http://schemas.openxmlformats.org/drawingml/2006/wordprocessingDrawing" xmlns:w10="urn:schemas-microsoft-com:office:word" xmlns:w="http://schemas.openxmlformats.org/wordprocessingml/2006/main" xmlns:w14="http://schemas.microsoft.com/office/word/2010/wordml" xmlns:w15="http://schemas.microsoft.com/office/word/2012/wordml" xmlns:w16cex="http://schemas.microsoft.com/office/word/2018/wordml/cex" xmlns:w16cid="http://schemas.microsoft.com/office/word/2016/wordml/cid" xmlns:w16="http://schemas.microsoft.com/office/word/2018/wordml" xmlns:w16sdtdh="http://schemas.microsoft.com/office/word/2020/wordml/sdtdatahash" xmlns:w16se="http://schemas.microsoft.com/office/word/2015/wordml/symex" xmlns:wpg="http://schemas.microsoft.com/office/word/2010/wordprocessingGroup" xmlns:wpi="http://schemas.microsoft.com/office/word/2010/wordprocessingInk" xmlns:wne="http://schemas.microsoft.com/office/word/2006/wordml" xmlns:wps="http://schemas.microsoft.com/office/word/2010/wordprocessingShape" mc:Ignorable="w14 w15 w16se w16cid w16 w16cex w16sdtdh wp14">
   <w:footnote w:type="separator" w:id="-1">
     <w:p>
@@ -7629,7 +7731,7 @@
 </w:footnotes>
 </file>
 
-<file path=word/numbering.xml><?xml version="1.0" encoding="utf-8"?>
+<file path=word\numbering.xml><?xml version="1.0" encoding="utf-8"?>
 <w:numbering xmlns:wpc="http://schemas.microsoft.com/office/word/2010/wordprocessingCanvas" xmlns:cx="http://schemas.microsoft.com/office/drawing/2014/chartex" xmlns:cx1="http://schemas.microsoft.com/office/drawing/2015/9/8/chartex" xmlns:cx2="http://schemas.microsoft.com/office/drawing/2015/10/21/chartex" xmlns:cx3="http://schemas.microsoft.com/office/drawing/2016/5/9/chartex" xmlns:cx4="http://schemas.microsoft.com/office/drawing/2016/5/10/chartex" xmlns:cx5="http://schemas.microsoft.com/office/drawing/2016/5/11/chartex" xmlns:cx6="http://schemas.microsoft.com/office/drawing/2016/5/12/chartex" xmlns:cx7="http://schemas.microsoft.com/office/drawing/2016/5/13/chartex" xmlns:cx8="http://schemas.microsoft.com/office/drawing/2016/5/14/chartex" xmlns:mc="http://schemas.openxmlformats.org/markup-compatibility/2006" xmlns:aink="http://schemas.microsoft.com/office/drawing/2016/ink" xmlns:am3d="http://schemas.microsoft.com/office/drawing/2017/model3d" xmlns:o="urn:schemas-microsoft-com:office:office" xmlns:oel="http://schemas.microsoft.com/office/2019/extlst" xmlns:r="http://schemas.openxmlformats.org/officeDocument/2006/relationships" xmlns:m="http://schemas.openxmlformats.org/officeDocument/2006/math" xmlns:v="urn:schemas-microsoft-com:vml" xmlns:wp14="http://schemas.microsoft.com/office/word/2010/wordprocessingDrawing" xmlns:wp="http://schemas.openxmlformats.org/drawingml/2006/wordprocessingDrawing" xmlns:w10="urn:schemas-microsoft-com:office:word" xmlns:w="http://schemas.openxmlformats.org/wordprocessingml/2006/main" xmlns:w14="http://schemas.microsoft.com/office/word/2010/wordml" xmlns:w15="http://schemas.microsoft.com/office/word/2012/wordml" xmlns:w16cex="http://schemas.microsoft.com/office/word/2018/wordml/cex" xmlns:w16cid="http://schemas.microsoft.com/office/word/2016/wordml/cid" xmlns:w16="http://schemas.microsoft.com/office/word/2018/wordml" xmlns:w16sdtdh="http://schemas.microsoft.com/office/word/2020/wordml/sdtdatahash" xmlns:w16se="http://schemas.microsoft.com/office/word/2015/wordml/symex" xmlns:wpg="http://schemas.microsoft.com/office/word/2010/wordprocessingGroup" xmlns:wpi="http://schemas.microsoft.com/office/word/2010/wordprocessingInk" xmlns:wne="http://schemas.microsoft.com/office/word/2006/wordml" xmlns:wps="http://schemas.microsoft.com/office/word/2010/wordprocessingShape" mc:Ignorable="w14 w15 w16se w16cid w16 w16cex w16sdtdh wp14">
   <w:abstractNum w:abstractNumId="0" w15:restartNumberingAfterBreak="0">
     <w:nsid w:val="1A6962B9"/>
@@ -9769,7 +9871,218 @@
 </w:numbering>
 </file>
 
-<file path=word/styles.xml><?xml version="1.0" encoding="utf-8"?>
+<file path=word\settings.xml><?xml version="1.0" encoding="utf-8"?>
+<w:settings xmlns:mc="http://schemas.openxmlformats.org/markup-compatibility/2006" xmlns:o="urn:schemas-microsoft-com:office:office" xmlns:r="http://schemas.openxmlformats.org/officeDocument/2006/relationships" xmlns:m="http://schemas.openxmlformats.org/officeDocument/2006/math" xmlns:v="urn:schemas-microsoft-com:vml" xmlns:w10="urn:schemas-microsoft-com:office:word" xmlns:w="http://schemas.openxmlformats.org/wordprocessingml/2006/main" xmlns:w14="http://schemas.microsoft.com/office/word/2010/wordml" xmlns:w15="http://schemas.microsoft.com/office/word/2012/wordml" xmlns:w16cex="http://schemas.microsoft.com/office/word/2018/wordml/cex" xmlns:w16cid="http://schemas.microsoft.com/office/word/2016/wordml/cid" xmlns:w16="http://schemas.microsoft.com/office/word/2018/wordml" xmlns:w16sdtdh="http://schemas.microsoft.com/office/word/2020/wordml/sdtdatahash" xmlns:w16se="http://schemas.microsoft.com/office/word/2015/wordml/symex" xmlns:sl="http://schemas.openxmlformats.org/schemaLibrary/2006/main" mc:Ignorable="w14 w15 w16se w16cid w16 w16cex w16sdtdh">
+  <w:zoom w:percent="100"/>
+  <w:proofState w:spelling="clean" w:grammar="clean"/>
+  <w:defaultTabStop w:val="643"/>
+  <w:characterSpacingControl w:val="doNotCompress"/>
+  <w:hdrShapeDefaults>
+    <o:shapedefaults v:ext="edit" spidmax="2050"/>
+  </w:hdrShapeDefaults>
+  <w:footnotePr>
+    <w:footnote w:id="-1"/>
+    <w:footnote w:id="0"/>
+  </w:footnotePr>
+  <w:endnotePr>
+    <w:endnote w:id="-1"/>
+    <w:endnote w:id="0"/>
+  </w:endnotePr>
+  <w:compat>
+    <w:useFELayout/>
+    <w:compatSetting w:name="compatibilityMode" w:uri="http://schemas.microsoft.com/office/word" w:val="12"/>
+    <w:compatSetting w:name="useWord2013TrackBottomHyphenation" w:uri="http://schemas.microsoft.com/office/word" w:val="1"/>
+  </w:compat>
+  <w:rsids>
+    <w:rsidRoot w:val="009418C5"/>
+    <w:rsid w:val="0000349F"/>
+    <w:rsid w:val="0000362C"/>
+    <w:rsid w:val="000048FC"/>
+    <w:rsid w:val="00010A5B"/>
+    <w:rsid w:val="00015295"/>
+    <w:rsid w:val="000161C6"/>
+    <w:rsid w:val="000546FD"/>
+    <w:rsid w:val="00055B34"/>
+    <w:rsid w:val="00055EF9"/>
+    <w:rsid w:val="000666FD"/>
+    <w:rsid w:val="00073E77"/>
+    <w:rsid w:val="00074A0F"/>
+    <w:rsid w:val="000805C9"/>
+    <w:rsid w:val="000B190A"/>
+    <w:rsid w:val="000C0C2E"/>
+    <w:rsid w:val="0012070E"/>
+    <w:rsid w:val="00127C31"/>
+    <w:rsid w:val="00131408"/>
+    <w:rsid w:val="00154251"/>
+    <w:rsid w:val="00164F34"/>
+    <w:rsid w:val="00182316"/>
+    <w:rsid w:val="001B2EE7"/>
+    <w:rsid w:val="001D5677"/>
+    <w:rsid w:val="001E13E1"/>
+    <w:rsid w:val="002469F2"/>
+    <w:rsid w:val="002471ED"/>
+    <w:rsid w:val="00254AB5"/>
+    <w:rsid w:val="00256284"/>
+    <w:rsid w:val="0027131F"/>
+    <w:rsid w:val="00275727"/>
+    <w:rsid w:val="0028557E"/>
+    <w:rsid w:val="002B1D85"/>
+    <w:rsid w:val="002C0450"/>
+    <w:rsid w:val="002C1FCF"/>
+    <w:rsid w:val="002D63B8"/>
+    <w:rsid w:val="002E1C3D"/>
+    <w:rsid w:val="002E515E"/>
+    <w:rsid w:val="002F13C8"/>
+    <w:rsid w:val="002F2590"/>
+    <w:rsid w:val="0030369A"/>
+    <w:rsid w:val="00304CCE"/>
+    <w:rsid w:val="00316A99"/>
+    <w:rsid w:val="00365AF6"/>
+    <w:rsid w:val="0037370E"/>
+    <w:rsid w:val="0037432C"/>
+    <w:rsid w:val="00380F9D"/>
+    <w:rsid w:val="003A0872"/>
+    <w:rsid w:val="003A42AE"/>
+    <w:rsid w:val="003B4020"/>
+    <w:rsid w:val="003D07BE"/>
+    <w:rsid w:val="003E6CF8"/>
+    <w:rsid w:val="00404B59"/>
+    <w:rsid w:val="00410828"/>
+    <w:rsid w:val="00415E9E"/>
+    <w:rsid w:val="00421628"/>
+    <w:rsid w:val="00424BE7"/>
+    <w:rsid w:val="00426183"/>
+    <w:rsid w:val="0042686B"/>
+    <w:rsid w:val="004339B1"/>
+    <w:rsid w:val="00442E0A"/>
+    <w:rsid w:val="00452C21"/>
+    <w:rsid w:val="004729A6"/>
+    <w:rsid w:val="00477D3D"/>
+    <w:rsid w:val="004A0462"/>
+    <w:rsid w:val="004B2A6F"/>
+    <w:rsid w:val="004B41B0"/>
+    <w:rsid w:val="004C219E"/>
+    <w:rsid w:val="004C4B2B"/>
+    <w:rsid w:val="004D07CD"/>
+    <w:rsid w:val="00516942"/>
+    <w:rsid w:val="005329F2"/>
+    <w:rsid w:val="0053521B"/>
+    <w:rsid w:val="0054239A"/>
+    <w:rsid w:val="00551A43"/>
+    <w:rsid w:val="005C224C"/>
+    <w:rsid w:val="006008E3"/>
+    <w:rsid w:val="00601653"/>
+    <w:rsid w:val="0061133C"/>
+    <w:rsid w:val="0063248D"/>
+    <w:rsid w:val="006427F7"/>
+    <w:rsid w:val="00662ACC"/>
+    <w:rsid w:val="00671AE7"/>
+    <w:rsid w:val="006753BD"/>
+    <w:rsid w:val="0069267C"/>
+    <w:rsid w:val="006B6EDD"/>
+    <w:rsid w:val="007228FF"/>
+    <w:rsid w:val="0072540A"/>
+    <w:rsid w:val="00726329"/>
+    <w:rsid w:val="007819F4"/>
+    <w:rsid w:val="00786722"/>
+    <w:rsid w:val="0079305F"/>
+    <w:rsid w:val="007D49E7"/>
+    <w:rsid w:val="007D59A3"/>
+    <w:rsid w:val="007F70D6"/>
+    <w:rsid w:val="008B7D19"/>
+    <w:rsid w:val="008C0DF4"/>
+    <w:rsid w:val="008C341C"/>
+    <w:rsid w:val="008D14EB"/>
+    <w:rsid w:val="008F0BF7"/>
+    <w:rsid w:val="008F6465"/>
+    <w:rsid w:val="00901A4A"/>
+    <w:rsid w:val="00936AD7"/>
+    <w:rsid w:val="009418C5"/>
+    <w:rsid w:val="00965443"/>
+    <w:rsid w:val="00967D7D"/>
+    <w:rsid w:val="009737F3"/>
+    <w:rsid w:val="00986514"/>
+    <w:rsid w:val="00991D33"/>
+    <w:rsid w:val="009E4FB5"/>
+    <w:rsid w:val="009F1704"/>
+    <w:rsid w:val="00A77DAE"/>
+    <w:rsid w:val="00AB518D"/>
+    <w:rsid w:val="00AC4F10"/>
+    <w:rsid w:val="00B21780"/>
+    <w:rsid w:val="00B31B38"/>
+    <w:rsid w:val="00B326A5"/>
+    <w:rsid w:val="00B33CA0"/>
+    <w:rsid w:val="00B7774F"/>
+    <w:rsid w:val="00BB2621"/>
+    <w:rsid w:val="00BB4B63"/>
+    <w:rsid w:val="00BD1E9A"/>
+    <w:rsid w:val="00BF4924"/>
+    <w:rsid w:val="00C144F5"/>
+    <w:rsid w:val="00C2281D"/>
+    <w:rsid w:val="00C37A72"/>
+    <w:rsid w:val="00C42F0B"/>
+    <w:rsid w:val="00C653A1"/>
+    <w:rsid w:val="00C833C6"/>
+    <w:rsid w:val="00CD4C10"/>
+    <w:rsid w:val="00CF2F49"/>
+    <w:rsid w:val="00D34F19"/>
+    <w:rsid w:val="00D81018"/>
+    <w:rsid w:val="00D9095E"/>
+    <w:rsid w:val="00D96BAE"/>
+    <w:rsid w:val="00DA31B9"/>
+    <w:rsid w:val="00DE21C8"/>
+    <w:rsid w:val="00DE7F28"/>
+    <w:rsid w:val="00E04FBC"/>
+    <w:rsid w:val="00E401AF"/>
+    <w:rsid w:val="00E87BF4"/>
+    <w:rsid w:val="00EB6948"/>
+    <w:rsid w:val="00EB7A59"/>
+    <w:rsid w:val="00ED01C0"/>
+    <w:rsid w:val="00EE781E"/>
+    <w:rsid w:val="00EF45E0"/>
+    <w:rsid w:val="00F06BB0"/>
+    <w:rsid w:val="00F21AB2"/>
+    <w:rsid w:val="00F41A69"/>
+    <w:rsid w:val="00F56197"/>
+    <w:rsid w:val="00F7125C"/>
+    <w:rsid w:val="00FA0C49"/>
+    <w:rsid w:val="00FA6542"/>
+    <w:rsid w:val="00FA7788"/>
+    <w:rsid w:val="00FB50BE"/>
+    <w:rsid w:val="00FD4898"/>
+    <w:rsid w:val="00FE062A"/>
+    <w:rsid w:val="00FF2F5E"/>
+    <w:rsid w:val="00FF462D"/>
+  </w:rsids>
+  <m:mathPr>
+    <m:mathFont m:val="Cambria Math"/>
+    <m:brkBin m:val="before"/>
+    <m:brkBinSub m:val="--"/>
+    <m:smallFrac m:val="0"/>
+    <m:dispDef/>
+    <m:lMargin m:val="0"/>
+    <m:rMargin m:val="0"/>
+    <m:defJc m:val="centerGroup"/>
+    <m:wrapIndent m:val="1440"/>
+    <m:intLim m:val="subSup"/>
+    <m:naryLim m:val="undOvr"/>
+  </m:mathPr>
+  <w:themeFontLang w:val="en-US"/>
+  <w:clrSchemeMapping w:bg1="light1" w:t1="dark1" w:bg2="light2" w:t2="dark2" w:accent1="accent1" w:accent2="accent2" w:accent3="accent3" w:accent4="accent4" w:accent5="accent5" w:accent6="accent6" w:hyperlink="hyperlink" w:followedHyperlink="followedHyperlink"/>
+  <w:shapeDefaults>
+    <o:shapedefaults v:ext="edit" spidmax="2050"/>
+    <o:shapelayout v:ext="edit">
+      <o:idmap v:ext="edit" data="2"/>
+    </o:shapelayout>
+  </w:shapeDefaults>
+  <w:decimalSymbol w:val="."/>
+  <w:listSeparator w:val=","/>
+  <w14:docId w14:val="6F2DCBE4"/>
+  <w15:docId w15:val="{71AD17FC-2805-4B56-9C6D-43F8BB919916}"/>
+</w:settings>
+</file>
+
+<file path=word\styles.xml><?xml version="1.0" encoding="utf-8"?>
 <w:styles xmlns:mc="http://schemas.openxmlformats.org/markup-compatibility/2006" xmlns:r="http://schemas.openxmlformats.org/officeDocument/2006/relationships" xmlns:w="http://schemas.openxmlformats.org/wordprocessingml/2006/main" xmlns:w14="http://schemas.microsoft.com/office/word/2010/wordml" xmlns:w15="http://schemas.microsoft.com/office/word/2012/wordml" xmlns:w16cex="http://schemas.microsoft.com/office/word/2018/wordml/cex" xmlns:w16cid="http://schemas.microsoft.com/office/word/2016/wordml/cid" xmlns:w16="http://schemas.microsoft.com/office/word/2018/wordml" xmlns:w16sdtdh="http://schemas.microsoft.com/office/word/2020/wordml/sdtdatahash" xmlns:w16se="http://schemas.microsoft.com/office/word/2015/wordml/symex" mc:Ignorable="w14 w15 w16se w16cid w16 w16cex w16sdtdh">
   <w:docDefaults>
     <w:rPrDefault>
@@ -10413,7 +10726,7 @@
 </w:styles>
 </file>
 
-<file path=word/theme/theme1.xml><?xml version="1.0" encoding="utf-8"?>
+<file path=word\theme\theme1.xml><?xml version="1.0" encoding="utf-8"?>
 <a:theme xmlns:a="http://schemas.openxmlformats.org/drawingml/2006/main" name="Office Theme">
   <a:themeElements>
     <a:clrScheme name="Office">
@@ -10708,7 +11021,613 @@
 </a:theme>
 </file>
 
-<file path=word/webextensions/taskpanes.xml><?xml version="1.0" encoding="utf-8"?>
+<file path=word\webSettings.xml><?xml version="1.0" encoding="utf-8"?>
+<w:webSettings xmlns:mc="http://schemas.openxmlformats.org/markup-compatibility/2006" xmlns:r="http://schemas.openxmlformats.org/officeDocument/2006/relationships" xmlns:w="http://schemas.openxmlformats.org/wordprocessingml/2006/main" xmlns:w14="http://schemas.microsoft.com/office/word/2010/wordml" xmlns:w15="http://schemas.microsoft.com/office/word/2012/wordml" xmlns:w16cex="http://schemas.microsoft.com/office/word/2018/wordml/cex" xmlns:w16cid="http://schemas.microsoft.com/office/word/2016/wordml/cid" xmlns:w16="http://schemas.microsoft.com/office/word/2018/wordml" xmlns:w16sdtdh="http://schemas.microsoft.com/office/word/2020/wordml/sdtdatahash" xmlns:w16se="http://schemas.microsoft.com/office/word/2015/wordml/symex" mc:Ignorable="w14 w15 w16se w16cid w16 w16cex w16sdtdh">
+  <w:divs>
+    <w:div w:id="137575024">
+      <w:bodyDiv w:val="1"/>
+      <w:marLeft w:val="0"/>
+      <w:marRight w:val="0"/>
+      <w:marTop w:val="0"/>
+      <w:marBottom w:val="0"/>
+      <w:divBdr>
+        <w:top w:val="none" w:sz="0" w:space="0" w:color="auto"/>
+        <w:left w:val="none" w:sz="0" w:space="0" w:color="auto"/>
+        <w:bottom w:val="none" w:sz="0" w:space="0" w:color="auto"/>
+        <w:right w:val="none" w:sz="0" w:space="0" w:color="auto"/>
+      </w:divBdr>
+      <w:divsChild>
+        <w:div w:id="1673681196">
+          <w:marLeft w:val="0"/>
+          <w:marRight w:val="0"/>
+          <w:marTop w:val="0"/>
+          <w:marBottom w:val="0"/>
+          <w:divBdr>
+            <w:top w:val="none" w:sz="0" w:space="0" w:color="auto"/>
+            <w:left w:val="none" w:sz="0" w:space="0" w:color="auto"/>
+            <w:bottom w:val="none" w:sz="0" w:space="0" w:color="auto"/>
+            <w:right w:val="none" w:sz="0" w:space="0" w:color="auto"/>
+          </w:divBdr>
+          <w:divsChild>
+            <w:div w:id="1804232183">
+              <w:marLeft w:val="0"/>
+              <w:marRight w:val="0"/>
+              <w:marTop w:val="0"/>
+              <w:marBottom w:val="0"/>
+              <w:divBdr>
+                <w:top w:val="none" w:sz="0" w:space="0" w:color="auto"/>
+                <w:left w:val="none" w:sz="0" w:space="0" w:color="auto"/>
+                <w:bottom w:val="none" w:sz="0" w:space="0" w:color="auto"/>
+                <w:right w:val="none" w:sz="0" w:space="0" w:color="auto"/>
+              </w:divBdr>
+            </w:div>
+          </w:divsChild>
+        </w:div>
+      </w:divsChild>
+    </w:div>
+    <w:div w:id="194080025">
+      <w:bodyDiv w:val="1"/>
+      <w:marLeft w:val="0"/>
+      <w:marRight w:val="0"/>
+      <w:marTop w:val="0"/>
+      <w:marBottom w:val="0"/>
+      <w:divBdr>
+        <w:top w:val="none" w:sz="0" w:space="0" w:color="auto"/>
+        <w:left w:val="none" w:sz="0" w:space="0" w:color="auto"/>
+        <w:bottom w:val="none" w:sz="0" w:space="0" w:color="auto"/>
+        <w:right w:val="none" w:sz="0" w:space="0" w:color="auto"/>
+      </w:divBdr>
+      <w:divsChild>
+        <w:div w:id="975260237">
+          <w:marLeft w:val="0"/>
+          <w:marRight w:val="0"/>
+          <w:marTop w:val="0"/>
+          <w:marBottom w:val="0"/>
+          <w:divBdr>
+            <w:top w:val="none" w:sz="0" w:space="0" w:color="auto"/>
+            <w:left w:val="none" w:sz="0" w:space="0" w:color="auto"/>
+            <w:bottom w:val="none" w:sz="0" w:space="0" w:color="auto"/>
+            <w:right w:val="none" w:sz="0" w:space="0" w:color="auto"/>
+          </w:divBdr>
+          <w:divsChild>
+            <w:div w:id="271017219">
+              <w:marLeft w:val="0"/>
+              <w:marRight w:val="0"/>
+              <w:marTop w:val="0"/>
+              <w:marBottom w:val="0"/>
+              <w:divBdr>
+                <w:top w:val="none" w:sz="0" w:space="0" w:color="auto"/>
+                <w:left w:val="none" w:sz="0" w:space="0" w:color="auto"/>
+                <w:bottom w:val="none" w:sz="0" w:space="0" w:color="auto"/>
+                <w:right w:val="none" w:sz="0" w:space="0" w:color="auto"/>
+              </w:divBdr>
+            </w:div>
+          </w:divsChild>
+        </w:div>
+      </w:divsChild>
+    </w:div>
+    <w:div w:id="202133138">
+      <w:bodyDiv w:val="1"/>
+      <w:marLeft w:val="0"/>
+      <w:marRight w:val="0"/>
+      <w:marTop w:val="0"/>
+      <w:marBottom w:val="0"/>
+      <w:divBdr>
+        <w:top w:val="none" w:sz="0" w:space="0" w:color="auto"/>
+        <w:left w:val="none" w:sz="0" w:space="0" w:color="auto"/>
+        <w:bottom w:val="none" w:sz="0" w:space="0" w:color="auto"/>
+        <w:right w:val="none" w:sz="0" w:space="0" w:color="auto"/>
+      </w:divBdr>
+      <w:divsChild>
+        <w:div w:id="1273826832">
+          <w:marLeft w:val="0"/>
+          <w:marRight w:val="0"/>
+          <w:marTop w:val="0"/>
+          <w:marBottom w:val="0"/>
+          <w:divBdr>
+            <w:top w:val="none" w:sz="0" w:space="0" w:color="auto"/>
+            <w:left w:val="none" w:sz="0" w:space="0" w:color="auto"/>
+            <w:bottom w:val="none" w:sz="0" w:space="0" w:color="auto"/>
+            <w:right w:val="none" w:sz="0" w:space="0" w:color="auto"/>
+          </w:divBdr>
+          <w:divsChild>
+            <w:div w:id="25065115">
+              <w:marLeft w:val="0"/>
+              <w:marRight w:val="0"/>
+              <w:marTop w:val="0"/>
+              <w:marBottom w:val="0"/>
+              <w:divBdr>
+                <w:top w:val="none" w:sz="0" w:space="0" w:color="auto"/>
+                <w:left w:val="none" w:sz="0" w:space="0" w:color="auto"/>
+                <w:bottom w:val="none" w:sz="0" w:space="0" w:color="auto"/>
+                <w:right w:val="none" w:sz="0" w:space="0" w:color="auto"/>
+              </w:divBdr>
+            </w:div>
+          </w:divsChild>
+        </w:div>
+      </w:divsChild>
+    </w:div>
+    <w:div w:id="433206354">
+      <w:bodyDiv w:val="1"/>
+      <w:marLeft w:val="0"/>
+      <w:marRight w:val="0"/>
+      <w:marTop w:val="0"/>
+      <w:marBottom w:val="0"/>
+      <w:divBdr>
+        <w:top w:val="none" w:sz="0" w:space="0" w:color="auto"/>
+        <w:left w:val="none" w:sz="0" w:space="0" w:color="auto"/>
+        <w:bottom w:val="none" w:sz="0" w:space="0" w:color="auto"/>
+        <w:right w:val="none" w:sz="0" w:space="0" w:color="auto"/>
+      </w:divBdr>
+      <w:divsChild>
+        <w:div w:id="464659653">
+          <w:marLeft w:val="0"/>
+          <w:marRight w:val="0"/>
+          <w:marTop w:val="0"/>
+          <w:marBottom w:val="0"/>
+          <w:divBdr>
+            <w:top w:val="none" w:sz="0" w:space="0" w:color="auto"/>
+            <w:left w:val="none" w:sz="0" w:space="0" w:color="auto"/>
+            <w:bottom w:val="none" w:sz="0" w:space="0" w:color="auto"/>
+            <w:right w:val="none" w:sz="0" w:space="0" w:color="auto"/>
+          </w:divBdr>
+          <w:divsChild>
+            <w:div w:id="1206061511">
+              <w:marLeft w:val="0"/>
+              <w:marRight w:val="0"/>
+              <w:marTop w:val="0"/>
+              <w:marBottom w:val="0"/>
+              <w:divBdr>
+                <w:top w:val="none" w:sz="0" w:space="0" w:color="auto"/>
+                <w:left w:val="none" w:sz="0" w:space="0" w:color="auto"/>
+                <w:bottom w:val="none" w:sz="0" w:space="0" w:color="auto"/>
+                <w:right w:val="none" w:sz="0" w:space="0" w:color="auto"/>
+              </w:divBdr>
+            </w:div>
+          </w:divsChild>
+        </w:div>
+      </w:divsChild>
+    </w:div>
+    <w:div w:id="612445403">
+      <w:bodyDiv w:val="1"/>
+      <w:marLeft w:val="0"/>
+      <w:marRight w:val="0"/>
+      <w:marTop w:val="0"/>
+      <w:marBottom w:val="0"/>
+      <w:divBdr>
+        <w:top w:val="none" w:sz="0" w:space="0" w:color="auto"/>
+        <w:left w:val="none" w:sz="0" w:space="0" w:color="auto"/>
+        <w:bottom w:val="none" w:sz="0" w:space="0" w:color="auto"/>
+        <w:right w:val="none" w:sz="0" w:space="0" w:color="auto"/>
+      </w:divBdr>
+      <w:divsChild>
+        <w:div w:id="2019381865">
+          <w:marLeft w:val="0"/>
+          <w:marRight w:val="0"/>
+          <w:marTop w:val="0"/>
+          <w:marBottom w:val="0"/>
+          <w:divBdr>
+            <w:top w:val="none" w:sz="0" w:space="0" w:color="auto"/>
+            <w:left w:val="none" w:sz="0" w:space="0" w:color="auto"/>
+            <w:bottom w:val="none" w:sz="0" w:space="0" w:color="auto"/>
+            <w:right w:val="none" w:sz="0" w:space="0" w:color="auto"/>
+          </w:divBdr>
+          <w:divsChild>
+            <w:div w:id="129134516">
+              <w:marLeft w:val="0"/>
+              <w:marRight w:val="0"/>
+              <w:marTop w:val="0"/>
+              <w:marBottom w:val="0"/>
+              <w:divBdr>
+                <w:top w:val="none" w:sz="0" w:space="0" w:color="auto"/>
+                <w:left w:val="none" w:sz="0" w:space="0" w:color="auto"/>
+                <w:bottom w:val="none" w:sz="0" w:space="0" w:color="auto"/>
+                <w:right w:val="none" w:sz="0" w:space="0" w:color="auto"/>
+              </w:divBdr>
+            </w:div>
+          </w:divsChild>
+        </w:div>
+      </w:divsChild>
+    </w:div>
+    <w:div w:id="697587167">
+      <w:bodyDiv w:val="1"/>
+      <w:marLeft w:val="0"/>
+      <w:marRight w:val="0"/>
+      <w:marTop w:val="0"/>
+      <w:marBottom w:val="0"/>
+      <w:divBdr>
+        <w:top w:val="none" w:sz="0" w:space="0" w:color="auto"/>
+        <w:left w:val="none" w:sz="0" w:space="0" w:color="auto"/>
+        <w:bottom w:val="none" w:sz="0" w:space="0" w:color="auto"/>
+        <w:right w:val="none" w:sz="0" w:space="0" w:color="auto"/>
+      </w:divBdr>
+      <w:divsChild>
+        <w:div w:id="901253495">
+          <w:marLeft w:val="0"/>
+          <w:marRight w:val="0"/>
+          <w:marTop w:val="0"/>
+          <w:marBottom w:val="0"/>
+          <w:divBdr>
+            <w:top w:val="none" w:sz="0" w:space="0" w:color="auto"/>
+            <w:left w:val="none" w:sz="0" w:space="0" w:color="auto"/>
+            <w:bottom w:val="none" w:sz="0" w:space="0" w:color="auto"/>
+            <w:right w:val="none" w:sz="0" w:space="0" w:color="auto"/>
+          </w:divBdr>
+          <w:divsChild>
+            <w:div w:id="1059329165">
+              <w:marLeft w:val="0"/>
+              <w:marRight w:val="0"/>
+              <w:marTop w:val="0"/>
+              <w:marBottom w:val="0"/>
+              <w:divBdr>
+                <w:top w:val="none" w:sz="0" w:space="0" w:color="auto"/>
+                <w:left w:val="none" w:sz="0" w:space="0" w:color="auto"/>
+                <w:bottom w:val="none" w:sz="0" w:space="0" w:color="auto"/>
+                <w:right w:val="none" w:sz="0" w:space="0" w:color="auto"/>
+              </w:divBdr>
+            </w:div>
+            <w:div w:id="1707027018">
+              <w:marLeft w:val="0"/>
+              <w:marRight w:val="0"/>
+              <w:marTop w:val="0"/>
+              <w:marBottom w:val="0"/>
+              <w:divBdr>
+                <w:top w:val="none" w:sz="0" w:space="0" w:color="auto"/>
+                <w:left w:val="none" w:sz="0" w:space="0" w:color="auto"/>
+                <w:bottom w:val="none" w:sz="0" w:space="0" w:color="auto"/>
+                <w:right w:val="none" w:sz="0" w:space="0" w:color="auto"/>
+              </w:divBdr>
+            </w:div>
+            <w:div w:id="2118256765">
+              <w:marLeft w:val="0"/>
+              <w:marRight w:val="0"/>
+              <w:marTop w:val="0"/>
+              <w:marBottom w:val="0"/>
+              <w:divBdr>
+                <w:top w:val="none" w:sz="0" w:space="0" w:color="auto"/>
+                <w:left w:val="none" w:sz="0" w:space="0" w:color="auto"/>
+                <w:bottom w:val="none" w:sz="0" w:space="0" w:color="auto"/>
+                <w:right w:val="none" w:sz="0" w:space="0" w:color="auto"/>
+              </w:divBdr>
+            </w:div>
+          </w:divsChild>
+        </w:div>
+      </w:divsChild>
+    </w:div>
+    <w:div w:id="805006923">
+      <w:bodyDiv w:val="1"/>
+      <w:marLeft w:val="0"/>
+      <w:marRight w:val="0"/>
+      <w:marTop w:val="0"/>
+      <w:marBottom w:val="0"/>
+      <w:divBdr>
+        <w:top w:val="none" w:sz="0" w:space="0" w:color="auto"/>
+        <w:left w:val="none" w:sz="0" w:space="0" w:color="auto"/>
+        <w:bottom w:val="none" w:sz="0" w:space="0" w:color="auto"/>
+        <w:right w:val="none" w:sz="0" w:space="0" w:color="auto"/>
+      </w:divBdr>
+    </w:div>
+    <w:div w:id="1060055897">
+      <w:bodyDiv w:val="1"/>
+      <w:marLeft w:val="0"/>
+      <w:marRight w:val="0"/>
+      <w:marTop w:val="0"/>
+      <w:marBottom w:val="0"/>
+      <w:divBdr>
+        <w:top w:val="none" w:sz="0" w:space="0" w:color="auto"/>
+        <w:left w:val="none" w:sz="0" w:space="0" w:color="auto"/>
+        <w:bottom w:val="none" w:sz="0" w:space="0" w:color="auto"/>
+        <w:right w:val="none" w:sz="0" w:space="0" w:color="auto"/>
+      </w:divBdr>
+    </w:div>
+    <w:div w:id="1419863448">
+      <w:bodyDiv w:val="1"/>
+      <w:marLeft w:val="0"/>
+      <w:marRight w:val="0"/>
+      <w:marTop w:val="0"/>
+      <w:marBottom w:val="0"/>
+      <w:divBdr>
+        <w:top w:val="none" w:sz="0" w:space="0" w:color="auto"/>
+        <w:left w:val="none" w:sz="0" w:space="0" w:color="auto"/>
+        <w:bottom w:val="none" w:sz="0" w:space="0" w:color="auto"/>
+        <w:right w:val="none" w:sz="0" w:space="0" w:color="auto"/>
+      </w:divBdr>
+    </w:div>
+    <w:div w:id="1517042601">
+      <w:bodyDiv w:val="1"/>
+      <w:marLeft w:val="0"/>
+      <w:marRight w:val="0"/>
+      <w:marTop w:val="0"/>
+      <w:marBottom w:val="0"/>
+      <w:divBdr>
+        <w:top w:val="none" w:sz="0" w:space="0" w:color="auto"/>
+        <w:left w:val="none" w:sz="0" w:space="0" w:color="auto"/>
+        <w:bottom w:val="none" w:sz="0" w:space="0" w:color="auto"/>
+        <w:right w:val="none" w:sz="0" w:space="0" w:color="auto"/>
+      </w:divBdr>
+      <w:divsChild>
+        <w:div w:id="1824740764">
+          <w:marLeft w:val="0"/>
+          <w:marRight w:val="0"/>
+          <w:marTop w:val="0"/>
+          <w:marBottom w:val="0"/>
+          <w:divBdr>
+            <w:top w:val="none" w:sz="0" w:space="0" w:color="auto"/>
+            <w:left w:val="none" w:sz="0" w:space="0" w:color="auto"/>
+            <w:bottom w:val="none" w:sz="0" w:space="0" w:color="auto"/>
+            <w:right w:val="none" w:sz="0" w:space="0" w:color="auto"/>
+          </w:divBdr>
+          <w:divsChild>
+            <w:div w:id="1174298900">
+              <w:marLeft w:val="0"/>
+              <w:marRight w:val="0"/>
+              <w:marTop w:val="0"/>
+              <w:marBottom w:val="0"/>
+              <w:divBdr>
+                <w:top w:val="none" w:sz="0" w:space="0" w:color="auto"/>
+                <w:left w:val="none" w:sz="0" w:space="0" w:color="auto"/>
+                <w:bottom w:val="none" w:sz="0" w:space="0" w:color="auto"/>
+                <w:right w:val="none" w:sz="0" w:space="0" w:color="auto"/>
+              </w:divBdr>
+            </w:div>
+            <w:div w:id="1393849022">
+              <w:marLeft w:val="0"/>
+              <w:marRight w:val="0"/>
+              <w:marTop w:val="0"/>
+              <w:marBottom w:val="0"/>
+              <w:divBdr>
+                <w:top w:val="none" w:sz="0" w:space="0" w:color="auto"/>
+                <w:left w:val="none" w:sz="0" w:space="0" w:color="auto"/>
+                <w:bottom w:val="none" w:sz="0" w:space="0" w:color="auto"/>
+                <w:right w:val="none" w:sz="0" w:space="0" w:color="auto"/>
+              </w:divBdr>
+            </w:div>
+            <w:div w:id="349991320">
+              <w:marLeft w:val="0"/>
+              <w:marRight w:val="0"/>
+              <w:marTop w:val="0"/>
+              <w:marBottom w:val="0"/>
+              <w:divBdr>
+                <w:top w:val="none" w:sz="0" w:space="0" w:color="auto"/>
+                <w:left w:val="none" w:sz="0" w:space="0" w:color="auto"/>
+                <w:bottom w:val="none" w:sz="0" w:space="0" w:color="auto"/>
+                <w:right w:val="none" w:sz="0" w:space="0" w:color="auto"/>
+              </w:divBdr>
+            </w:div>
+          </w:divsChild>
+        </w:div>
+      </w:divsChild>
+    </w:div>
+    <w:div w:id="1584336001">
+      <w:bodyDiv w:val="1"/>
+      <w:marLeft w:val="0"/>
+      <w:marRight w:val="0"/>
+      <w:marTop w:val="0"/>
+      <w:marBottom w:val="0"/>
+      <w:divBdr>
+        <w:top w:val="none" w:sz="0" w:space="0" w:color="auto"/>
+        <w:left w:val="none" w:sz="0" w:space="0" w:color="auto"/>
+        <w:bottom w:val="none" w:sz="0" w:space="0" w:color="auto"/>
+        <w:right w:val="none" w:sz="0" w:space="0" w:color="auto"/>
+      </w:divBdr>
+      <w:divsChild>
+        <w:div w:id="1860584719">
+          <w:marLeft w:val="0"/>
+          <w:marRight w:val="0"/>
+          <w:marTop w:val="0"/>
+          <w:marBottom w:val="0"/>
+          <w:divBdr>
+            <w:top w:val="none" w:sz="0" w:space="0" w:color="auto"/>
+            <w:left w:val="none" w:sz="0" w:space="0" w:color="auto"/>
+            <w:bottom w:val="none" w:sz="0" w:space="0" w:color="auto"/>
+            <w:right w:val="none" w:sz="0" w:space="0" w:color="auto"/>
+          </w:divBdr>
+          <w:divsChild>
+            <w:div w:id="859439670">
+              <w:marLeft w:val="0"/>
+              <w:marRight w:val="0"/>
+              <w:marTop w:val="0"/>
+              <w:marBottom w:val="0"/>
+              <w:divBdr>
+                <w:top w:val="none" w:sz="0" w:space="0" w:color="auto"/>
+                <w:left w:val="none" w:sz="0" w:space="0" w:color="auto"/>
+                <w:bottom w:val="none" w:sz="0" w:space="0" w:color="auto"/>
+                <w:right w:val="none" w:sz="0" w:space="0" w:color="auto"/>
+              </w:divBdr>
+            </w:div>
+            <w:div w:id="1827092296">
+              <w:marLeft w:val="0"/>
+              <w:marRight w:val="0"/>
+              <w:marTop w:val="0"/>
+              <w:marBottom w:val="0"/>
+              <w:divBdr>
+                <w:top w:val="none" w:sz="0" w:space="0" w:color="auto"/>
+                <w:left w:val="none" w:sz="0" w:space="0" w:color="auto"/>
+                <w:bottom w:val="none" w:sz="0" w:space="0" w:color="auto"/>
+                <w:right w:val="none" w:sz="0" w:space="0" w:color="auto"/>
+              </w:divBdr>
+            </w:div>
+            <w:div w:id="1417558456">
+              <w:marLeft w:val="0"/>
+              <w:marRight w:val="0"/>
+              <w:marTop w:val="0"/>
+              <w:marBottom w:val="0"/>
+              <w:divBdr>
+                <w:top w:val="none" w:sz="0" w:space="0" w:color="auto"/>
+                <w:left w:val="none" w:sz="0" w:space="0" w:color="auto"/>
+                <w:bottom w:val="none" w:sz="0" w:space="0" w:color="auto"/>
+                <w:right w:val="none" w:sz="0" w:space="0" w:color="auto"/>
+              </w:divBdr>
+            </w:div>
+          </w:divsChild>
+        </w:div>
+      </w:divsChild>
+    </w:div>
+    <w:div w:id="1607886958">
+      <w:bodyDiv w:val="1"/>
+      <w:marLeft w:val="0"/>
+      <w:marRight w:val="0"/>
+      <w:marTop w:val="0"/>
+      <w:marBottom w:val="0"/>
+      <w:divBdr>
+        <w:top w:val="none" w:sz="0" w:space="0" w:color="auto"/>
+        <w:left w:val="none" w:sz="0" w:space="0" w:color="auto"/>
+        <w:bottom w:val="none" w:sz="0" w:space="0" w:color="auto"/>
+        <w:right w:val="none" w:sz="0" w:space="0" w:color="auto"/>
+      </w:divBdr>
+      <w:divsChild>
+        <w:div w:id="1857184140">
+          <w:marLeft w:val="0"/>
+          <w:marRight w:val="0"/>
+          <w:marTop w:val="0"/>
+          <w:marBottom w:val="0"/>
+          <w:divBdr>
+            <w:top w:val="none" w:sz="0" w:space="0" w:color="auto"/>
+            <w:left w:val="none" w:sz="0" w:space="0" w:color="auto"/>
+            <w:bottom w:val="none" w:sz="0" w:space="0" w:color="auto"/>
+            <w:right w:val="none" w:sz="0" w:space="0" w:color="auto"/>
+          </w:divBdr>
+          <w:divsChild>
+            <w:div w:id="1361126562">
+              <w:marLeft w:val="0"/>
+              <w:marRight w:val="0"/>
+              <w:marTop w:val="0"/>
+              <w:marBottom w:val="0"/>
+              <w:divBdr>
+                <w:top w:val="none" w:sz="0" w:space="0" w:color="auto"/>
+                <w:left w:val="none" w:sz="0" w:space="0" w:color="auto"/>
+                <w:bottom w:val="none" w:sz="0" w:space="0" w:color="auto"/>
+                <w:right w:val="none" w:sz="0" w:space="0" w:color="auto"/>
+              </w:divBdr>
+            </w:div>
+          </w:divsChild>
+        </w:div>
+      </w:divsChild>
+    </w:div>
+    <w:div w:id="1631864470">
+      <w:bodyDiv w:val="1"/>
+      <w:marLeft w:val="0"/>
+      <w:marRight w:val="0"/>
+      <w:marTop w:val="0"/>
+      <w:marBottom w:val="0"/>
+      <w:divBdr>
+        <w:top w:val="none" w:sz="0" w:space="0" w:color="auto"/>
+        <w:left w:val="none" w:sz="0" w:space="0" w:color="auto"/>
+        <w:bottom w:val="none" w:sz="0" w:space="0" w:color="auto"/>
+        <w:right w:val="none" w:sz="0" w:space="0" w:color="auto"/>
+      </w:divBdr>
+      <w:divsChild>
+        <w:div w:id="667831991">
+          <w:marLeft w:val="0"/>
+          <w:marRight w:val="0"/>
+          <w:marTop w:val="0"/>
+          <w:marBottom w:val="0"/>
+          <w:divBdr>
+            <w:top w:val="none" w:sz="0" w:space="0" w:color="auto"/>
+            <w:left w:val="none" w:sz="0" w:space="0" w:color="auto"/>
+            <w:bottom w:val="none" w:sz="0" w:space="0" w:color="auto"/>
+            <w:right w:val="none" w:sz="0" w:space="0" w:color="auto"/>
+          </w:divBdr>
+          <w:divsChild>
+            <w:div w:id="1825394788">
+              <w:marLeft w:val="0"/>
+              <w:marRight w:val="0"/>
+              <w:marTop w:val="0"/>
+              <w:marBottom w:val="0"/>
+              <w:divBdr>
+                <w:top w:val="none" w:sz="0" w:space="0" w:color="auto"/>
+                <w:left w:val="none" w:sz="0" w:space="0" w:color="auto"/>
+                <w:bottom w:val="none" w:sz="0" w:space="0" w:color="auto"/>
+                <w:right w:val="none" w:sz="0" w:space="0" w:color="auto"/>
+              </w:divBdr>
+            </w:div>
+          </w:divsChild>
+        </w:div>
+      </w:divsChild>
+    </w:div>
+    <w:div w:id="2040544721">
+      <w:bodyDiv w:val="1"/>
+      <w:marLeft w:val="0"/>
+      <w:marRight w:val="0"/>
+      <w:marTop w:val="0"/>
+      <w:marBottom w:val="0"/>
+      <w:divBdr>
+        <w:top w:val="none" w:sz="0" w:space="0" w:color="auto"/>
+        <w:left w:val="none" w:sz="0" w:space="0" w:color="auto"/>
+        <w:bottom w:val="none" w:sz="0" w:space="0" w:color="auto"/>
+        <w:right w:val="none" w:sz="0" w:space="0" w:color="auto"/>
+      </w:divBdr>
+      <w:divsChild>
+        <w:div w:id="1980644282">
+          <w:marLeft w:val="0"/>
+          <w:marRight w:val="0"/>
+          <w:marTop w:val="0"/>
+          <w:marBottom w:val="0"/>
+          <w:divBdr>
+            <w:top w:val="none" w:sz="0" w:space="0" w:color="auto"/>
+            <w:left w:val="none" w:sz="0" w:space="0" w:color="auto"/>
+            <w:bottom w:val="none" w:sz="0" w:space="0" w:color="auto"/>
+            <w:right w:val="none" w:sz="0" w:space="0" w:color="auto"/>
+          </w:divBdr>
+          <w:divsChild>
+            <w:div w:id="1353603429">
+              <w:marLeft w:val="0"/>
+              <w:marRight w:val="0"/>
+              <w:marTop w:val="0"/>
+              <w:marBottom w:val="0"/>
+              <w:divBdr>
+                <w:top w:val="none" w:sz="0" w:space="0" w:color="auto"/>
+                <w:left w:val="none" w:sz="0" w:space="0" w:color="auto"/>
+                <w:bottom w:val="none" w:sz="0" w:space="0" w:color="auto"/>
+                <w:right w:val="none" w:sz="0" w:space="0" w:color="auto"/>
+              </w:divBdr>
+            </w:div>
+            <w:div w:id="592013354">
+              <w:marLeft w:val="0"/>
+              <w:marRight w:val="0"/>
+              <w:marTop w:val="0"/>
+              <w:marBottom w:val="0"/>
+              <w:divBdr>
+                <w:top w:val="none" w:sz="0" w:space="0" w:color="auto"/>
+                <w:left w:val="none" w:sz="0" w:space="0" w:color="auto"/>
+                <w:bottom w:val="none" w:sz="0" w:space="0" w:color="auto"/>
+                <w:right w:val="none" w:sz="0" w:space="0" w:color="auto"/>
+              </w:divBdr>
+            </w:div>
+            <w:div w:id="990133726">
+              <w:marLeft w:val="0"/>
+              <w:marRight w:val="0"/>
+              <w:marTop w:val="0"/>
+              <w:marBottom w:val="0"/>
+              <w:divBdr>
+                <w:top w:val="none" w:sz="0" w:space="0" w:color="auto"/>
+                <w:left w:val="none" w:sz="0" w:space="0" w:color="auto"/>
+                <w:bottom w:val="none" w:sz="0" w:space="0" w:color="auto"/>
+                <w:right w:val="none" w:sz="0" w:space="0" w:color="auto"/>
+              </w:divBdr>
+            </w:div>
+          </w:divsChild>
+        </w:div>
+      </w:divsChild>
+    </w:div>
+    <w:div w:id="2073652328">
+      <w:bodyDiv w:val="1"/>
+      <w:marLeft w:val="0"/>
+      <w:marRight w:val="0"/>
+      <w:marTop w:val="0"/>
+      <w:marBottom w:val="0"/>
+      <w:divBdr>
+        <w:top w:val="none" w:sz="0" w:space="0" w:color="auto"/>
+        <w:left w:val="none" w:sz="0" w:space="0" w:color="auto"/>
+        <w:bottom w:val="none" w:sz="0" w:space="0" w:color="auto"/>
+        <w:right w:val="none" w:sz="0" w:space="0" w:color="auto"/>
+      </w:divBdr>
+    </w:div>
+  </w:divs>
+</w:webSettings>
+</file>
+
+<file path=word\webextensions\taskpanes.xml><?xml version="1.0" encoding="utf-8"?>
 <wetp:taskpanes xmlns:wetp="http://schemas.microsoft.com/office/webextensions/taskpanes/2010/11">
   <wetp:taskpane dockstate="right" visibility="0" width="438" row="2">
     <wetp:webextensionref xmlns:r="http://schemas.openxmlformats.org/officeDocument/2006/relationships" r:id="rId1"/>
@@ -10719,7 +11638,7 @@
 </wetp:taskpanes>
 </file>
 
-<file path=word/webextensions/webextension1.xml><?xml version="1.0" encoding="utf-8"?>
+<file path=word\webextensions\webextension1.xml><?xml version="1.0" encoding="utf-8"?>
 <we:webextension xmlns:we="http://schemas.microsoft.com/office/webextensions/webextension/2010/11" id="{1441E617-135C-4919-816D-0AA95B030E8A}">
   <we:reference id="1343d7cb-1432-460a-852f-699f4e76da37" version="1.0.1.1" store="\\localhost\Word add-in testing" storeType="Filesystem"/>
   <we:alternateReferences/>
@@ -10729,7 +11648,7 @@
 </we:webextension>
 </file>
 
-<file path=word/webextensions/webextension2.xml><?xml version="1.0" encoding="utf-8"?>
+<file path=word\webextensions\webextension2.xml><?xml version="1.0" encoding="utf-8"?>
 <we:webextension xmlns:we="http://schemas.microsoft.com/office/webextensions/webextension/2010/11" id="{9A732FA9-B07E-480A-99D8-DA35DE8D5A77}">
   <we:reference id="1343d7cb-1432-460a-852f-699f4e76da38" version="1.0.1.1" store="\\localhost\Word add-in testing" storeType="Filesystem"/>
   <we:alternateReferences/>

</xml_diff>

<commit_message>
Refactored the handling for the occupancy ordinance and updated the DOCX again.
</commit_message>
<xml_diff>
--- a/docassemble/MAEvictionDefense/data/templates/SummaryProcessAnswer.docx
+++ b/docassemble/MAEvictionDefense/data/templates/SummaryProcessAnswer.docx
@@ -1323,6 +1323,119 @@
     </w:p>
     <w:p>
       <w:pPr>
+        <w:pStyle w:val="ListwithNoSpace"/>
+        <w:ind w:left="360"/>
+      </w:pPr>
+      <w:r>
+        <w:t xml:space="preserve">{%p </w:t>
+      </w:r>
+      <w:r>
+        <w:t xml:space="preserve">if </w:t>
+      </w:r>
+      <w:proofErr w:type="spellStart"/>
+      <w:r>
+        <w:t>initial_</w:t>
+      </w:r>
+      <w:proofErr w:type="gramStart"/>
+      <w:r>
+        <w:t>defense.local</w:t>
+      </w:r>
+      <w:proofErr w:type="gramEnd"/>
+      <w:r>
+        <w:t>_occupancy_ordinance</w:t>
+      </w:r>
+      <w:proofErr w:type="spellEnd"/>
+      <w:r>
+        <w:t xml:space="preserve"> %}</w:t>
+      </w:r>
+    </w:p>
+    <w:p>
+      <w:pPr>
+        <w:pStyle w:val="ListwithNoSpace"/>
+        <w:numPr>
+          <w:ilvl w:val="0"/>
+          <w:numId w:val="14"/>
+        </w:numPr>
+        <w:suppressAutoHyphens/>
+      </w:pPr>
+      <w:r>
+        <w:t>The landlord may not have been allowed to collect rent without the required local permit or certification.</w:t>
+      </w:r>
+    </w:p>
+    <w:p>
+      <w:pPr>
+        <w:pStyle w:val="ListwithNoSpace"/>
+        <w:ind w:left="360"/>
+      </w:pPr>
+      <w:r>
+        <w:t xml:space="preserve">{%p if </w:t>
+      </w:r>
+      <w:proofErr w:type="spellStart"/>
+      <w:r>
+        <w:t>showifdef</w:t>
+      </w:r>
+      <w:proofErr w:type="spellEnd"/>
+      <w:r>
+        <w:t>('</w:t>
+      </w:r>
+      <w:proofErr w:type="spellStart"/>
+      <w:r>
+        <w:t>local_occupancy_ordinance_defense_summary</w:t>
+      </w:r>
+      <w:proofErr w:type="spellEnd"/>
+      <w:r>
+        <w:t>') %}</w:t>
+      </w:r>
+    </w:p>
+    <w:p>
+      <w:pPr>
+        <w:pStyle w:val="ListwithNoSpace"/>
+        <w:numPr>
+          <w:ilvl w:val="0"/>
+          <w:numId w:val="14"/>
+        </w:numPr>
+        <w:suppressAutoHyphens/>
+      </w:pPr>
+      <w:r>
+        <w:t xml:space="preserve"> </w:t>
+      </w:r>
+      <w:proofErr w:type="gramStart"/>
+      <w:r>
+        <w:t xml:space="preserve">{{ </w:t>
+      </w:r>
+      <w:proofErr w:type="spellStart"/>
+      <w:r>
+        <w:t>local</w:t>
+      </w:r>
+      <w:proofErr w:type="gramEnd"/>
+      <w:r>
+        <w:t>_occupancy_ordinance_defense_summary</w:t>
+      </w:r>
+      <w:proofErr w:type="spellEnd"/>
+      <w:r>
+        <w:t xml:space="preserve"> }}</w:t>
+      </w:r>
+    </w:p>
+    <w:p>
+      <w:pPr>
+        <w:pStyle w:val="ListwithNoSpace"/>
+        <w:ind w:left="360"/>
+      </w:pPr>
+      <w:r>
+        <w:t>{%p endif %}</w:t>
+      </w:r>
+    </w:p>
+    <w:p>
+      <w:pPr>
+        <w:pStyle w:val="ListwithNoSpace"/>
+        <w:ind w:left="360"/>
+      </w:pPr>
+      <w:r>
+        <w:t>{%p endif %}</w:t>
+      </w:r>
+    </w:p>
+    <w:p>
+      <w:pPr>
         <w:pStyle w:val="BodyText"/>
       </w:pPr>
       <w:r>
@@ -1527,6 +1640,7 @@
         <w:contextualSpacing/>
       </w:pPr>
       <w:r>
+        <w:lastRenderedPageBreak/>
         <w:t xml:space="preserve">{%p if </w:t>
       </w:r>
       <w:proofErr w:type="spellStart"/>
@@ -1616,7 +1730,6 @@
         <w:contextualSpacing/>
       </w:pPr>
       <w:r>
-        <w:lastRenderedPageBreak/>
         <w:t>I reside in federal public housing or subsidized Section 8 or other covered federal housing and have a defense under the Violence Against Women Act (42 U.S.C. 14043e-11).</w:t>
       </w:r>
     </w:p>
@@ -2017,6 +2130,7 @@
         <w:contextualSpacing/>
       </w:pPr>
       <w:r>
+        <w:lastRenderedPageBreak/>
         <w:t>{%p endif %}</w:t>
       </w:r>
     </w:p>
@@ -2106,7 +2220,6 @@
         <w:contextualSpacing/>
       </w:pPr>
       <w:r>
-        <w:lastRenderedPageBreak/>
         <w:t>I am a survivor of abuse, sexual assault, rape or stalking and the landlord is evicting me for exercising my rights to break my lease or change my locks for safety reasons under G.L. c. 186, §§23-29.</w:t>
       </w:r>
     </w:p>
@@ -2457,6 +2570,7 @@
         <w:suppressAutoHyphens/>
       </w:pPr>
       <w:r>
+        <w:lastRenderedPageBreak/>
         <w:t>If my landlord refuses to accept RAFT rental assistance, that is discrimination based on my source of income/rental subsidy under state law.</w:t>
       </w:r>
     </w:p>
@@ -2491,10 +2605,7 @@
       </w:r>
       <w:proofErr w:type="spellEnd"/>
       <w:r>
-        <w:t xml:space="preserve"> </w:t>
-      </w:r>
-      <w:r>
-        <w:t xml:space="preserve">and </w:t>
+        <w:t xml:space="preserve"> and </w:t>
       </w:r>
       <w:proofErr w:type="spellStart"/>
       <w:proofErr w:type="gramStart"/>
@@ -2855,6 +2966,7 @@
         <w:spacing w:line="360" w:lineRule="auto"/>
       </w:pPr>
       <w:r>
+        <w:lastRenderedPageBreak/>
         <w:t>Tenant Not Responsible for Alleged Behavior</w:t>
       </w:r>
     </w:p>
@@ -2905,7 +3017,6 @@
         <w:ind w:left="360"/>
       </w:pPr>
       <w:r>
-        <w:lastRenderedPageBreak/>
         <w:t xml:space="preserve">{%p if </w:t>
       </w:r>
       <w:proofErr w:type="spellStart"/>
@@ -3280,6 +3391,7 @@
         <w:suppressAutoHyphens/>
       </w:pPr>
       <w:r>
+        <w:lastRenderedPageBreak/>
         <w:t xml:space="preserve">The landlord knew or should have known about the bad conditions because: </w:t>
       </w:r>
     </w:p>
@@ -3360,11 +3472,7 @@
       </w:r>
       <w:r>
         <w:br/>
-        <w:t xml:space="preserve">(a) the full market rental value of my home in good condition, and (b) the reduced value of my </w:t>
-      </w:r>
-      <w:r>
-        <w:lastRenderedPageBreak/>
-        <w:t xml:space="preserve">home in its bad condition. </w:t>
+        <w:t xml:space="preserve">(a) the full market rental value of my home in good condition, and (b) the reduced value of my home in its bad condition. </w:t>
       </w:r>
       <w:r>
         <w:rPr>
@@ -3686,6 +3794,7 @@
         <w:pStyle w:val="BodyText"/>
       </w:pPr>
       <w:r>
+        <w:lastRenderedPageBreak/>
         <w:t>{%p endif %}</w:t>
       </w:r>
     </w:p>
@@ -3729,7 +3838,6 @@
         <w:pStyle w:val="CenterTitle"/>
       </w:pPr>
       <w:r>
-        <w:lastRenderedPageBreak/>
         <w:t>Interference with Utilities and Use of Home</w:t>
       </w:r>
       <w:r>
@@ -4261,6 +4369,7 @@
         <w:suppressAutoHyphens/>
       </w:pPr>
       <w:r>
+        <w:lastRenderedPageBreak/>
         <w:t xml:space="preserve">I have been billed for heat, hot water, electricity and/or gas and the landlord and I did not have a written agreement requiring me to pay for these utilities. I request that the landlord promptly start paying for such utilities.  This defense and counterclaim </w:t>
       </w:r>
       <w:proofErr w:type="gramStart"/>
@@ -4270,6 +4379,269 @@
       <w:proofErr w:type="gramEnd"/>
       <w:r>
         <w:t xml:space="preserve"> me to damages under G.L. c. 186, §14, and c. 93A. See also Mass. Sanitary Code, 105 CMR 410.354. </w:t>
+      </w:r>
+    </w:p>
+    <w:p>
+      <w:pPr>
+        <w:pStyle w:val="BodyText"/>
+        <w:ind w:left="360"/>
+      </w:pPr>
+      <w:r>
+        <w:t>{%p endif %}</w:t>
+      </w:r>
+    </w:p>
+    <w:p>
+      <w:pPr>
+        <w:pStyle w:val="BodyText"/>
+        <w:ind w:left="360"/>
+      </w:pPr>
+      <w:r>
+        <w:t xml:space="preserve">{%p if </w:t>
+      </w:r>
+      <w:proofErr w:type="spellStart"/>
+      <w:proofErr w:type="gramStart"/>
+      <w:r>
+        <w:t>bqe.billed</w:t>
+      </w:r>
+      <w:proofErr w:type="gramEnd"/>
+      <w:r>
+        <w:t>_for_others</w:t>
+      </w:r>
+      <w:proofErr w:type="spellEnd"/>
+      <w:r>
+        <w:t xml:space="preserve"> %}</w:t>
+      </w:r>
+    </w:p>
+    <w:p>
+      <w:pPr>
+        <w:pStyle w:val="BodyText"/>
+        <w:numPr>
+          <w:ilvl w:val="0"/>
+          <w:numId w:val="14"/>
+        </w:numPr>
+        <w:suppressAutoHyphens/>
+      </w:pPr>
+      <w:r>
+        <w:t xml:space="preserve">I have been billed for gas, oil and/or electricity that go to other people’s apartments or common areas (such as hallways, stairways, basements, or porches). This defense and counterclaim </w:t>
+      </w:r>
+      <w:proofErr w:type="gramStart"/>
+      <w:r>
+        <w:t>entitles</w:t>
+      </w:r>
+      <w:proofErr w:type="gramEnd"/>
+      <w:r>
+        <w:t xml:space="preserve"> me to damages under G.L. c. 186, §14, and/or c. 93A. See also Mass. Sanitary Code, 105 CMR 410.354. </w:t>
+      </w:r>
+    </w:p>
+    <w:p>
+      <w:pPr>
+        <w:pStyle w:val="BodyText"/>
+        <w:ind w:left="360"/>
+      </w:pPr>
+      <w:r>
+        <w:t>{%p endif %}</w:t>
+      </w:r>
+    </w:p>
+    <w:p>
+      <w:pPr>
+        <w:pStyle w:val="BodyText"/>
+      </w:pPr>
+      <w:r>
+        <w:t>{%p endif %}</w:t>
+      </w:r>
+    </w:p>
+    <w:p>
+      <w:pPr>
+        <w:pStyle w:val="BodyText"/>
+      </w:pPr>
+      <w:r>
+        <w:t xml:space="preserve">This defense and counterclaim </w:t>
+      </w:r>
+      <w:proofErr w:type="gramStart"/>
+      <w:r>
+        <w:t>entitles</w:t>
+      </w:r>
+      <w:proofErr w:type="gramEnd"/>
+      <w:r>
+        <w:t xml:space="preserve"> me to three times the rent (calculated at the full contract rent for tenants with subsidies) or my actual damages, whichever is greater.</w:t>
+      </w:r>
+    </w:p>
+    <w:p>
+      <w:pPr>
+        <w:pStyle w:val="BodyText"/>
+      </w:pPr>
+      <w:r>
+        <w:t>{%p endif %}</w:t>
+      </w:r>
+    </w:p>
+    <w:p>
+      <w:pPr>
+        <w:pStyle w:val="BodyText"/>
+      </w:pPr>
+      <w:r>
+        <w:t>{# End Counterclaims #}</w:t>
+      </w:r>
+    </w:p>
+    <w:p>
+      <w:pPr>
+        <w:pStyle w:val="BodyText"/>
+      </w:pPr>
+      <w:r>
+        <w:t>{%p endif %}</w:t>
+      </w:r>
+    </w:p>
+    <w:p>
+      <w:pPr>
+        <w:pStyle w:val="BodyText"/>
+      </w:pPr>
+      <w:r>
+        <w:t xml:space="preserve">{%p if </w:t>
+      </w:r>
+      <w:proofErr w:type="spellStart"/>
+      <w:proofErr w:type="gramStart"/>
+      <w:r>
+        <w:t>facts.tenant</w:t>
+      </w:r>
+      <w:proofErr w:type="gramEnd"/>
+      <w:r>
+        <w:t>_has_subsidy</w:t>
+      </w:r>
+      <w:proofErr w:type="spellEnd"/>
+      <w:r>
+        <w:t xml:space="preserve"> %}</w:t>
+      </w:r>
+    </w:p>
+    <w:p>
+      <w:pPr>
+        <w:pStyle w:val="BodyText"/>
+      </w:pPr>
+    </w:p>
+    <w:p>
+      <w:pPr>
+        <w:pStyle w:val="Caption"/>
+        <w:spacing w:line="276" w:lineRule="auto"/>
+      </w:pPr>
+      <w:r>
+        <w:t>Defense &amp; Counterclaim</w:t>
+      </w:r>
+      <w:r>
+        <w:br/>
+        <w:t>Or Offset to Any Claim for Use and Occupancy</w:t>
+      </w:r>
+    </w:p>
+    <w:p>
+      <w:pPr>
+        <w:pStyle w:val="CenterTitle"/>
+        <w:spacing w:line="360" w:lineRule="auto"/>
+      </w:pPr>
+      <w:r>
+        <w:t>Rent Liability in Public and Subsidized Housing</w:t>
+      </w:r>
+    </w:p>
+    <w:p>
+      <w:pPr>
+        <w:pStyle w:val="BodyText"/>
+        <w:ind w:left="360"/>
+      </w:pPr>
+      <w:r>
+        <w:t xml:space="preserve">{%p if </w:t>
+      </w:r>
+      <w:proofErr w:type="spellStart"/>
+      <w:r>
+        <w:t>subsidy_type</w:t>
+      </w:r>
+      <w:proofErr w:type="spellEnd"/>
+      <w:r>
+        <w:t xml:space="preserve"> in ['Section 8 voucher', 'MRVP'] and </w:t>
+      </w:r>
+      <w:proofErr w:type="spellStart"/>
+      <w:r>
+        <w:t>subsidized_</w:t>
+      </w:r>
+      <w:proofErr w:type="gramStart"/>
+      <w:r>
+        <w:t>housing.stopped</w:t>
+      </w:r>
+      <w:proofErr w:type="gramEnd"/>
+      <w:r>
+        <w:t>_payment</w:t>
+      </w:r>
+      <w:proofErr w:type="spellEnd"/>
+      <w:r>
+        <w:t xml:space="preserve"> %}</w:t>
+      </w:r>
+    </w:p>
+    <w:p>
+      <w:pPr>
+        <w:pStyle w:val="BodyText"/>
+        <w:numPr>
+          <w:ilvl w:val="0"/>
+          <w:numId w:val="14"/>
+        </w:numPr>
+        <w:suppressAutoHyphens/>
+      </w:pPr>
+      <w:r>
+        <w:t xml:space="preserve">The housing authority is responsible for rent. </w:t>
+      </w:r>
+    </w:p>
+    <w:p>
+      <w:pPr>
+        <w:pStyle w:val="BodyText"/>
+        <w:numPr>
+          <w:ilvl w:val="0"/>
+          <w:numId w:val="14"/>
+        </w:numPr>
+        <w:suppressAutoHyphens/>
+      </w:pPr>
+      <w:r>
+        <w:t xml:space="preserve">The housing authority stopped payments to the landlord because repairs were not made. </w:t>
+      </w:r>
+    </w:p>
+    <w:p>
+      <w:pPr>
+        <w:pStyle w:val="BodyText"/>
+        <w:ind w:left="360"/>
+      </w:pPr>
+      <w:r>
+        <w:t>{%p endif %}</w:t>
+      </w:r>
+    </w:p>
+    <w:p>
+      <w:pPr>
+        <w:pStyle w:val="BodyText"/>
+        <w:ind w:left="360"/>
+      </w:pPr>
+      <w:r>
+        <w:t xml:space="preserve">{%p if </w:t>
+      </w:r>
+      <w:proofErr w:type="spellStart"/>
+      <w:r>
+        <w:t>subsidized_</w:t>
+      </w:r>
+      <w:proofErr w:type="gramStart"/>
+      <w:r>
+        <w:t>housing.improper</w:t>
+      </w:r>
+      <w:proofErr w:type="gramEnd"/>
+      <w:r>
+        <w:t>_rent_calculation</w:t>
+      </w:r>
+      <w:proofErr w:type="spellEnd"/>
+      <w:r>
+        <w:t xml:space="preserve"> %}</w:t>
+      </w:r>
+    </w:p>
+    <w:p>
+      <w:pPr>
+        <w:pStyle w:val="BodyText"/>
+        <w:numPr>
+          <w:ilvl w:val="0"/>
+          <w:numId w:val="14"/>
+        </w:numPr>
+        <w:suppressAutoHyphens/>
+      </w:pPr>
+      <w:r>
+        <w:t>The housing authority/owner failed to properly calculate rent or to adjust the rent, and therefore I am entitled to a recalculation of rent and do not owe the amount claimed due.</w:t>
       </w:r>
     </w:p>
     <w:p>
@@ -4291,13 +4663,16 @@
         <w:t xml:space="preserve">{%p if </w:t>
       </w:r>
       <w:proofErr w:type="spellStart"/>
-      <w:proofErr w:type="gramStart"/>
-      <w:r>
-        <w:t>bqe.billed</w:t>
-      </w:r>
-      <w:proofErr w:type="gramEnd"/>
-      <w:r>
-        <w:t>_for_others</w:t>
+      <w:r>
+        <w:t>subsidized_</w:t>
+      </w:r>
+      <w:proofErr w:type="gramStart"/>
+      <w:r>
+        <w:t>housing.landlord</w:t>
+      </w:r>
+      <w:proofErr w:type="gramEnd"/>
+      <w:r>
+        <w:t>_overcharged</w:t>
       </w:r>
       <w:proofErr w:type="spellEnd"/>
       <w:r>
@@ -4314,15 +4689,7 @@
         <w:suppressAutoHyphens/>
       </w:pPr>
       <w:r>
-        <w:t xml:space="preserve">I have been billed for gas, oil and/or electricity that go to other people’s apartments or common areas (such as hallways, stairways, basements, or porches). This defense and counterclaim </w:t>
-      </w:r>
-      <w:proofErr w:type="gramStart"/>
-      <w:r>
-        <w:t>entitles</w:t>
-      </w:r>
-      <w:proofErr w:type="gramEnd"/>
-      <w:r>
-        <w:t xml:space="preserve"> me to damages under G.L. c. 186, §14, and/or c. 93A. See also Mass. Sanitary Code, 105 CMR 410.354. </w:t>
+        <w:t xml:space="preserve">The landlord charged me more rent than the amount approved by the housing agency. </w:t>
       </w:r>
     </w:p>
     <w:p>
@@ -4347,60 +4714,7 @@
         <w:pStyle w:val="BodyText"/>
       </w:pPr>
       <w:r>
-        <w:t xml:space="preserve">This defense and counterclaim </w:t>
-      </w:r>
-      <w:proofErr w:type="gramStart"/>
-      <w:r>
-        <w:t>entitles</w:t>
-      </w:r>
-      <w:proofErr w:type="gramEnd"/>
-      <w:r>
-        <w:t xml:space="preserve"> me to three times the rent (calculated at the full contract rent for tenants with subsidies) or my actual damages, whichever is greater.</w:t>
-      </w:r>
-    </w:p>
-    <w:p>
-      <w:pPr>
-        <w:pStyle w:val="BodyText"/>
-      </w:pPr>
-      <w:r>
-        <w:t>{%p endif %}</w:t>
-      </w:r>
-    </w:p>
-    <w:p>
-      <w:pPr>
-        <w:pStyle w:val="BodyText"/>
-      </w:pPr>
-      <w:r>
-        <w:t>{# End Counterclaims #}</w:t>
-      </w:r>
-    </w:p>
-    <w:p>
-      <w:pPr>
-        <w:pStyle w:val="BodyText"/>
-      </w:pPr>
-      <w:r>
-        <w:t>{%p endif %}</w:t>
-      </w:r>
-    </w:p>
-    <w:p>
-      <w:pPr>
-        <w:pStyle w:val="BodyText"/>
-      </w:pPr>
-      <w:r>
-        <w:t xml:space="preserve">{%p if </w:t>
-      </w:r>
-      <w:proofErr w:type="spellStart"/>
-      <w:proofErr w:type="gramStart"/>
-      <w:r>
-        <w:t>facts.tenant</w:t>
-      </w:r>
-      <w:proofErr w:type="gramEnd"/>
-      <w:r>
-        <w:t>_has_subsidy</w:t>
-      </w:r>
-      <w:proofErr w:type="spellEnd"/>
-      <w:r>
-        <w:t xml:space="preserve"> %}</w:t>
+        <w:t>{%p if plead_93a %}</w:t>
       </w:r>
     </w:p>
     <w:p>
@@ -4411,7 +4725,6 @@
     <w:p>
       <w:pPr>
         <w:pStyle w:val="Caption"/>
-        <w:spacing w:line="276" w:lineRule="auto"/>
       </w:pPr>
       <w:r>
         <w:t>Defense &amp; Counterclaim</w:t>
@@ -4424,43 +4737,17 @@
     <w:p>
       <w:pPr>
         <w:pStyle w:val="CenterTitle"/>
-        <w:spacing w:line="360" w:lineRule="auto"/>
-      </w:pPr>
-      <w:r>
-        <w:t>Rent Liability in Public and Subsidized Housing</w:t>
-      </w:r>
-    </w:p>
-    <w:p>
-      <w:pPr>
-        <w:pStyle w:val="BodyText"/>
-        <w:ind w:left="360"/>
-      </w:pPr>
-      <w:r>
-        <w:t xml:space="preserve">{%p if </w:t>
-      </w:r>
-      <w:proofErr w:type="spellStart"/>
-      <w:r>
-        <w:t>subsidy_type</w:t>
-      </w:r>
-      <w:proofErr w:type="spellEnd"/>
-      <w:r>
-        <w:t xml:space="preserve"> in ['Section 8 voucher', 'MRVP'] and </w:t>
-      </w:r>
-      <w:proofErr w:type="spellStart"/>
-      <w:r>
-        <w:t>subsidized_</w:t>
-      </w:r>
-      <w:proofErr w:type="gramStart"/>
-      <w:r>
-        <w:t>housing.stopped</w:t>
-      </w:r>
-      <w:proofErr w:type="gramEnd"/>
-      <w:r>
-        <w:t>_payment</w:t>
-      </w:r>
-      <w:proofErr w:type="spellEnd"/>
-      <w:r>
-        <w:t xml:space="preserve"> %}</w:t>
+      </w:pPr>
+      <w:r>
+        <w:t>Violation of the Consumer Protection Law</w:t>
+      </w:r>
+    </w:p>
+    <w:p>
+      <w:pPr>
+        <w:pStyle w:val="CenterTitle4"/>
+      </w:pPr>
+      <w:r>
+        <w:t>Mass. Gen. Laws c. 239 §8A, and/or c. 93A</w:t>
       </w:r>
     </w:p>
     <w:p>
@@ -4473,7 +4760,7 @@
         <w:suppressAutoHyphens/>
       </w:pPr>
       <w:r>
-        <w:t xml:space="preserve">The housing authority is responsible for rent. </w:t>
+        <w:t>Each of the acts stated in this Answer/Counterclaims was unfair and/or deceptive. My landlord is covered by this law because she or he is not a housing authority or the owner-occupant of only a 2 or 3-family property in which I live. This pleading is a demand for a reasonable settlement offer.</w:t>
       </w:r>
     </w:p>
     <w:p>
@@ -4486,41 +4773,340 @@
         <w:suppressAutoHyphens/>
       </w:pPr>
       <w:r>
-        <w:t xml:space="preserve">The housing authority stopped payments to the landlord because repairs were not made. </w:t>
-      </w:r>
-    </w:p>
-    <w:p>
-      <w:pPr>
-        <w:pStyle w:val="BodyText"/>
-        <w:ind w:left="360"/>
-      </w:pPr>
-      <w:r>
-        <w:t>{%p endif %}</w:t>
-      </w:r>
-    </w:p>
-    <w:p>
-      <w:pPr>
-        <w:pStyle w:val="BodyText"/>
-        <w:ind w:left="360"/>
+        <w:t>The landlord acted in additional unfair or deceptive ways, including but not limited to:</w:t>
+      </w:r>
+    </w:p>
+    <w:p>
+      <w:pPr>
+        <w:pStyle w:val="BodyText"/>
+        <w:spacing w:after="144"/>
+        <w:ind w:left="720"/>
+        <w:contextualSpacing/>
       </w:pPr>
       <w:r>
         <w:t xml:space="preserve">{%p if </w:t>
       </w:r>
       <w:proofErr w:type="spellStart"/>
       <w:r>
-        <w:t>subsidized_</w:t>
-      </w:r>
-      <w:proofErr w:type="gramStart"/>
-      <w:r>
-        <w:t>housing.improper</w:t>
-      </w:r>
-      <w:proofErr w:type="gramEnd"/>
-      <w:r>
-        <w:t>_rent_calculation</w:t>
+        <w:t>consumer_</w:t>
+      </w:r>
+      <w:proofErr w:type="gramStart"/>
+      <w:r>
+        <w:t>protection.late</w:t>
+      </w:r>
+      <w:proofErr w:type="gramEnd"/>
+      <w:r>
+        <w:t>_fees</w:t>
       </w:r>
       <w:proofErr w:type="spellEnd"/>
       <w:r>
         <w:t xml:space="preserve"> %}</w:t>
+      </w:r>
+    </w:p>
+    <w:p>
+      <w:pPr>
+        <w:pStyle w:val="BodyText"/>
+        <w:numPr>
+          <w:ilvl w:val="1"/>
+          <w:numId w:val="14"/>
+        </w:numPr>
+        <w:suppressAutoHyphens/>
+        <w:spacing w:after="144"/>
+        <w:contextualSpacing/>
+      </w:pPr>
+      <w:r>
+        <w:t>The landlord charged me late fees before my rent was thirty days late.</w:t>
+      </w:r>
+    </w:p>
+    <w:p>
+      <w:pPr>
+        <w:pStyle w:val="BodyText"/>
+        <w:spacing w:after="144"/>
+        <w:ind w:left="720"/>
+        <w:contextualSpacing/>
+      </w:pPr>
+      <w:r>
+        <w:t>{%p endif %}</w:t>
+      </w:r>
+    </w:p>
+    <w:p>
+      <w:pPr>
+        <w:pStyle w:val="BodyText"/>
+        <w:spacing w:after="144"/>
+        <w:ind w:left="720"/>
+        <w:contextualSpacing/>
+      </w:pPr>
+      <w:r>
+        <w:t xml:space="preserve">{%p if </w:t>
+      </w:r>
+      <w:proofErr w:type="spellStart"/>
+      <w:r>
+        <w:t>consumer_</w:t>
+      </w:r>
+      <w:proofErr w:type="gramStart"/>
+      <w:r>
+        <w:t>protection.nonagreed</w:t>
+      </w:r>
+      <w:proofErr w:type="gramEnd"/>
+      <w:r>
+        <w:t>_rent</w:t>
+      </w:r>
+      <w:proofErr w:type="spellEnd"/>
+      <w:r>
+        <w:t xml:space="preserve"> %}</w:t>
+      </w:r>
+    </w:p>
+    <w:p>
+      <w:pPr>
+        <w:pStyle w:val="BodyText"/>
+        <w:numPr>
+          <w:ilvl w:val="1"/>
+          <w:numId w:val="14"/>
+        </w:numPr>
+        <w:suppressAutoHyphens/>
+        <w:spacing w:after="144"/>
+        <w:contextualSpacing/>
+      </w:pPr>
+      <w:r>
+        <w:t>The landlord charged a rent amount that I never agreed to pay.</w:t>
+      </w:r>
+    </w:p>
+    <w:p>
+      <w:pPr>
+        <w:pStyle w:val="BodyText"/>
+        <w:spacing w:after="144"/>
+        <w:ind w:left="720"/>
+        <w:contextualSpacing/>
+      </w:pPr>
+      <w:r>
+        <w:t>{%p endif %}</w:t>
+      </w:r>
+    </w:p>
+    <w:p>
+      <w:pPr>
+        <w:pStyle w:val="BodyText"/>
+        <w:spacing w:after="144"/>
+        <w:ind w:left="720"/>
+        <w:contextualSpacing/>
+      </w:pPr>
+      <w:r>
+        <w:t xml:space="preserve">{%p if </w:t>
+      </w:r>
+      <w:proofErr w:type="spellStart"/>
+      <w:r>
+        <w:t>consumer_</w:t>
+      </w:r>
+      <w:proofErr w:type="gramStart"/>
+      <w:r>
+        <w:t>protection.unlawful</w:t>
+      </w:r>
+      <w:proofErr w:type="gramEnd"/>
+      <w:r>
+        <w:t>_court_fees</w:t>
+      </w:r>
+      <w:proofErr w:type="spellEnd"/>
+      <w:r>
+        <w:t xml:space="preserve"> %}</w:t>
+      </w:r>
+    </w:p>
+    <w:p>
+      <w:pPr>
+        <w:pStyle w:val="BodyText"/>
+        <w:numPr>
+          <w:ilvl w:val="1"/>
+          <w:numId w:val="14"/>
+        </w:numPr>
+        <w:suppressAutoHyphens/>
+        <w:spacing w:after="144"/>
+        <w:contextualSpacing/>
+      </w:pPr>
+      <w:r>
+        <w:t>The landlord charged me constable or court fees unlawfully.</w:t>
+      </w:r>
+    </w:p>
+    <w:p>
+      <w:pPr>
+        <w:pStyle w:val="BodyText"/>
+        <w:spacing w:after="144"/>
+        <w:ind w:left="720"/>
+        <w:contextualSpacing/>
+      </w:pPr>
+      <w:r>
+        <w:t>{%p endif %}</w:t>
+      </w:r>
+    </w:p>
+    <w:p>
+      <w:pPr>
+        <w:pStyle w:val="BodyText"/>
+        <w:spacing w:after="144"/>
+        <w:ind w:left="720"/>
+        <w:contextualSpacing/>
+      </w:pPr>
+      <w:r>
+        <w:t xml:space="preserve">{%p if </w:t>
+      </w:r>
+      <w:proofErr w:type="spellStart"/>
+      <w:r>
+        <w:t>consumer_</w:t>
+      </w:r>
+      <w:proofErr w:type="gramStart"/>
+      <w:r>
+        <w:t>protection.unlawful</w:t>
+      </w:r>
+      <w:proofErr w:type="gramEnd"/>
+      <w:r>
+        <w:t>_lease_terms</w:t>
+      </w:r>
+      <w:proofErr w:type="spellEnd"/>
+      <w:r>
+        <w:t xml:space="preserve"> %}</w:t>
+      </w:r>
+    </w:p>
+    <w:p>
+      <w:pPr>
+        <w:pStyle w:val="BodyText"/>
+        <w:numPr>
+          <w:ilvl w:val="1"/>
+          <w:numId w:val="14"/>
+        </w:numPr>
+        <w:suppressAutoHyphens/>
+        <w:spacing w:after="144"/>
+        <w:contextualSpacing/>
+      </w:pPr>
+      <w:r>
+        <w:t>There are unlawful terms in my lease.</w:t>
+      </w:r>
+    </w:p>
+    <w:p>
+      <w:pPr>
+        <w:pStyle w:val="BodyText"/>
+        <w:spacing w:after="144"/>
+        <w:ind w:left="720"/>
+        <w:contextualSpacing/>
+      </w:pPr>
+      <w:r>
+        <w:t>{%p endif %}</w:t>
+      </w:r>
+    </w:p>
+    <w:p>
+      <w:pPr>
+        <w:pStyle w:val="BodyText"/>
+        <w:spacing w:after="144"/>
+        <w:ind w:left="720"/>
+        <w:contextualSpacing/>
+      </w:pPr>
+      <w:r>
+        <w:t xml:space="preserve">{%p if </w:t>
+      </w:r>
+      <w:proofErr w:type="spellStart"/>
+      <w:r>
+        <w:t>consumer_</w:t>
+      </w:r>
+      <w:proofErr w:type="gramStart"/>
+      <w:r>
+        <w:t>protection.other</w:t>
+      </w:r>
+      <w:proofErr w:type="spellEnd"/>
+      <w:proofErr w:type="gramEnd"/>
+      <w:r>
+        <w:t xml:space="preserve"> %}</w:t>
+      </w:r>
+    </w:p>
+    <w:p>
+      <w:pPr>
+        <w:pStyle w:val="BodyText"/>
+        <w:numPr>
+          <w:ilvl w:val="1"/>
+          <w:numId w:val="14"/>
+        </w:numPr>
+        <w:suppressAutoHyphens/>
+        <w:spacing w:after="144"/>
+        <w:contextualSpacing/>
+      </w:pPr>
+      <w:r>
+        <w:t xml:space="preserve">Other: </w:t>
+      </w:r>
+      <w:proofErr w:type="gramStart"/>
+      <w:r>
+        <w:t xml:space="preserve">{{ </w:t>
+      </w:r>
+      <w:proofErr w:type="spellStart"/>
+      <w:r>
+        <w:t>consumer</w:t>
+      </w:r>
+      <w:proofErr w:type="gramEnd"/>
+      <w:r>
+        <w:t>_protection.other_reason</w:t>
+      </w:r>
+      <w:proofErr w:type="spellEnd"/>
+      <w:r>
+        <w:t xml:space="preserve"> }}</w:t>
+      </w:r>
+    </w:p>
+    <w:p>
+      <w:pPr>
+        <w:pStyle w:val="BodyText"/>
+        <w:spacing w:after="144"/>
+        <w:ind w:left="720"/>
+        <w:contextualSpacing/>
+      </w:pPr>
+      <w:r>
+        <w:t>{%p endif %}</w:t>
+      </w:r>
+    </w:p>
+    <w:p>
+      <w:pPr>
+        <w:pStyle w:val="BodyText"/>
+      </w:pPr>
+      <w:r>
+        <w:t>Therefore, under G.L. c. 93A, I am entitled to statutory damages for each violation, or actual damages (doubled or trebled because the landlord’s conduct was willful and knowing), whichever is greater.</w:t>
+      </w:r>
+    </w:p>
+    <w:p>
+      <w:pPr>
+        <w:pStyle w:val="BodyText"/>
+      </w:pPr>
+      <w:r>
+        <w:t>{%p endif %}</w:t>
+      </w:r>
+    </w:p>
+    <w:p>
+      <w:pPr>
+        <w:pStyle w:val="BodyText"/>
+      </w:pPr>
+      <w:r>
+        <w:lastRenderedPageBreak/>
+        <w:t xml:space="preserve">{%p </w:t>
+      </w:r>
+      <w:r>
+        <w:t xml:space="preserve">if </w:t>
+      </w:r>
+      <w:proofErr w:type="spellStart"/>
+      <w:r>
+        <w:t>plead_counterclaims</w:t>
+      </w:r>
+      <w:proofErr w:type="spellEnd"/>
+      <w:r>
+        <w:t xml:space="preserve"> and </w:t>
+      </w:r>
+      <w:proofErr w:type="spellStart"/>
+      <w:r>
+        <w:t>showifdef</w:t>
+      </w:r>
+      <w:proofErr w:type="spellEnd"/>
+      <w:r>
+        <w:t>('</w:t>
+      </w:r>
+      <w:proofErr w:type="spellStart"/>
+      <w:r>
+        <w:t>local_occupancy_ordinance_counterclaim_summary</w:t>
+      </w:r>
+      <w:proofErr w:type="spellEnd"/>
+      <w:r>
+        <w:t xml:space="preserve">') </w:t>
+      </w:r>
+      <w:r>
+        <w:t>%}</w:t>
       </w:r>
     </w:p>
     <w:p>
@@ -4532,432 +5118,24 @@
         </w:numPr>
         <w:suppressAutoHyphens/>
       </w:pPr>
-      <w:r>
-        <w:t>The housing authority/owner failed to properly calculate rent or to adjust the rent, and therefore I am entitled to a recalculation of rent and do not owe the amount claimed due.</w:t>
-      </w:r>
-    </w:p>
-    <w:p>
-      <w:pPr>
-        <w:pStyle w:val="BodyText"/>
-        <w:ind w:left="360"/>
-      </w:pPr>
-      <w:r>
-        <w:t>{%p endif %}</w:t>
-      </w:r>
-    </w:p>
-    <w:p>
-      <w:pPr>
-        <w:pStyle w:val="BodyText"/>
-        <w:ind w:left="360"/>
-      </w:pPr>
-      <w:r>
-        <w:t xml:space="preserve">{%p if </w:t>
-      </w:r>
-      <w:proofErr w:type="spellStart"/>
-      <w:r>
-        <w:t>subsidized_</w:t>
-      </w:r>
-      <w:proofErr w:type="gramStart"/>
-      <w:r>
-        <w:t>housing.landlord</w:t>
-      </w:r>
-      <w:proofErr w:type="gramEnd"/>
-      <w:r>
-        <w:t>_overcharged</w:t>
-      </w:r>
-      <w:proofErr w:type="spellEnd"/>
-      <w:r>
-        <w:t xml:space="preserve"> %}</w:t>
-      </w:r>
-    </w:p>
-    <w:p>
-      <w:pPr>
-        <w:pStyle w:val="BodyText"/>
-        <w:numPr>
-          <w:ilvl w:val="0"/>
-          <w:numId w:val="14"/>
-        </w:numPr>
-        <w:suppressAutoHyphens/>
-      </w:pPr>
-      <w:r>
-        <w:t xml:space="preserve">The landlord charged me more rent than the amount approved by the housing agency. </w:t>
-      </w:r>
-    </w:p>
-    <w:p>
-      <w:pPr>
-        <w:pStyle w:val="BodyText"/>
-        <w:ind w:left="360"/>
-      </w:pPr>
-      <w:r>
-        <w:t>{%p endif %}</w:t>
-      </w:r>
-    </w:p>
-    <w:p>
-      <w:pPr>
-        <w:pStyle w:val="BodyText"/>
-      </w:pPr>
-      <w:r>
-        <w:t>{%p endif %}</w:t>
-      </w:r>
-    </w:p>
-    <w:p>
-      <w:pPr>
-        <w:pStyle w:val="BodyText"/>
-      </w:pPr>
-      <w:r>
-        <w:lastRenderedPageBreak/>
-        <w:t>{%p if plead_93a %}</w:t>
-      </w:r>
-    </w:p>
-    <w:p>
-      <w:pPr>
-        <w:pStyle w:val="BodyText"/>
-      </w:pPr>
-    </w:p>
-    <w:p>
-      <w:pPr>
-        <w:pStyle w:val="Caption"/>
-      </w:pPr>
-      <w:r>
-        <w:t>Defense &amp; Counterclaim</w:t>
-      </w:r>
-      <w:r>
-        <w:br/>
-        <w:t>Or Offset to Any Claim for Use and Occupancy</w:t>
-      </w:r>
-    </w:p>
-    <w:p>
-      <w:pPr>
-        <w:pStyle w:val="CenterTitle"/>
-      </w:pPr>
-      <w:r>
-        <w:t>Violation of the Consumer Protection Law</w:t>
-      </w:r>
-    </w:p>
-    <w:p>
-      <w:pPr>
-        <w:pStyle w:val="CenterTitle4"/>
-      </w:pPr>
-      <w:r>
-        <w:t>Mass. Gen. Laws c. 239 §8A, and/or c. 93A</w:t>
-      </w:r>
-    </w:p>
-    <w:p>
-      <w:pPr>
-        <w:pStyle w:val="BodyText"/>
-        <w:numPr>
-          <w:ilvl w:val="0"/>
-          <w:numId w:val="14"/>
-        </w:numPr>
-        <w:suppressAutoHyphens/>
-      </w:pPr>
-      <w:r>
-        <w:t>Each of the acts stated in this Answer/Counterclaims was unfair and/or deceptive. My landlord is covered by this law because she or he is not a housing authority or the owner-occupant of only a 2 or 3-family property in which I live. This pleading is a demand for a reasonable settlement offer.</w:t>
-      </w:r>
-    </w:p>
-    <w:p>
-      <w:pPr>
-        <w:pStyle w:val="BodyText"/>
-        <w:numPr>
-          <w:ilvl w:val="0"/>
-          <w:numId w:val="14"/>
-        </w:numPr>
-        <w:suppressAutoHyphens/>
-      </w:pPr>
-      <w:r>
-        <w:t>The landlord acted in additional unfair or deceptive ways, including but not limited to:</w:t>
-      </w:r>
-    </w:p>
-    <w:p>
-      <w:pPr>
-        <w:pStyle w:val="BodyText"/>
-        <w:spacing w:after="144"/>
-        <w:ind w:left="720"/>
-        <w:contextualSpacing/>
-      </w:pPr>
-      <w:r>
-        <w:t xml:space="preserve">{%p if </w:t>
-      </w:r>
-      <w:proofErr w:type="spellStart"/>
-      <w:r>
-        <w:t>consumer_</w:t>
-      </w:r>
-      <w:proofErr w:type="gramStart"/>
-      <w:r>
-        <w:t>protection.late</w:t>
-      </w:r>
-      <w:proofErr w:type="gramEnd"/>
-      <w:r>
-        <w:t>_fees</w:t>
-      </w:r>
-      <w:proofErr w:type="spellEnd"/>
-      <w:r>
-        <w:t xml:space="preserve"> %}</w:t>
-      </w:r>
-    </w:p>
-    <w:p>
-      <w:pPr>
-        <w:pStyle w:val="BodyText"/>
-        <w:numPr>
-          <w:ilvl w:val="1"/>
-          <w:numId w:val="14"/>
-        </w:numPr>
-        <w:suppressAutoHyphens/>
-        <w:spacing w:after="144"/>
-        <w:contextualSpacing/>
-      </w:pPr>
-      <w:r>
-        <w:t>The landlord charged me late fees before my rent was thirty days late.</w:t>
-      </w:r>
-    </w:p>
-    <w:p>
-      <w:pPr>
-        <w:pStyle w:val="BodyText"/>
-        <w:spacing w:after="144"/>
-        <w:ind w:left="720"/>
-        <w:contextualSpacing/>
-      </w:pPr>
-      <w:r>
-        <w:t>{%p endif %}</w:t>
-      </w:r>
-    </w:p>
-    <w:p>
-      <w:pPr>
-        <w:pStyle w:val="BodyText"/>
-        <w:spacing w:after="144"/>
-        <w:ind w:left="720"/>
-        <w:contextualSpacing/>
-      </w:pPr>
-      <w:r>
-        <w:t xml:space="preserve">{%p if </w:t>
-      </w:r>
-      <w:proofErr w:type="spellStart"/>
-      <w:r>
-        <w:t>consumer_</w:t>
-      </w:r>
-      <w:proofErr w:type="gramStart"/>
-      <w:r>
-        <w:t>protection.nonagreed</w:t>
-      </w:r>
-      <w:proofErr w:type="gramEnd"/>
-      <w:r>
-        <w:t>_rent</w:t>
-      </w:r>
-      <w:proofErr w:type="spellEnd"/>
-      <w:r>
-        <w:t xml:space="preserve"> %}</w:t>
-      </w:r>
-    </w:p>
-    <w:p>
-      <w:pPr>
-        <w:pStyle w:val="BodyText"/>
-        <w:numPr>
-          <w:ilvl w:val="1"/>
-          <w:numId w:val="14"/>
-        </w:numPr>
-        <w:suppressAutoHyphens/>
-        <w:spacing w:after="144"/>
-        <w:contextualSpacing/>
-      </w:pPr>
-      <w:r>
-        <w:t>The landlord charged a rent amount that I never agreed to pay.</w:t>
-      </w:r>
-    </w:p>
-    <w:p>
-      <w:pPr>
-        <w:pStyle w:val="BodyText"/>
-        <w:spacing w:after="144"/>
-        <w:ind w:left="720"/>
-        <w:contextualSpacing/>
-      </w:pPr>
-      <w:r>
-        <w:t>{%p endif %}</w:t>
-      </w:r>
-    </w:p>
-    <w:p>
-      <w:pPr>
-        <w:pStyle w:val="BodyText"/>
-        <w:spacing w:after="144"/>
-        <w:ind w:left="720"/>
-        <w:contextualSpacing/>
-      </w:pPr>
-      <w:r>
-        <w:t xml:space="preserve">{%p if </w:t>
-      </w:r>
-      <w:proofErr w:type="spellStart"/>
-      <w:r>
-        <w:t>consumer_</w:t>
-      </w:r>
-      <w:proofErr w:type="gramStart"/>
-      <w:r>
-        <w:t>protection.unlawful</w:t>
-      </w:r>
-      <w:proofErr w:type="gramEnd"/>
-      <w:r>
-        <w:t>_court_fees</w:t>
-      </w:r>
-      <w:proofErr w:type="spellEnd"/>
-      <w:r>
-        <w:t xml:space="preserve"> %}</w:t>
-      </w:r>
-    </w:p>
-    <w:p>
-      <w:pPr>
-        <w:pStyle w:val="BodyText"/>
-        <w:numPr>
-          <w:ilvl w:val="1"/>
-          <w:numId w:val="14"/>
-        </w:numPr>
-        <w:suppressAutoHyphens/>
-        <w:spacing w:after="144"/>
-        <w:contextualSpacing/>
-      </w:pPr>
-      <w:r>
-        <w:t>The landlord charged me constable or court fees unlawfully.</w:t>
-      </w:r>
-    </w:p>
-    <w:p>
-      <w:pPr>
-        <w:pStyle w:val="BodyText"/>
-        <w:spacing w:after="144"/>
-        <w:ind w:left="720"/>
-        <w:contextualSpacing/>
-      </w:pPr>
-      <w:r>
-        <w:t>{%p endif %}</w:t>
-      </w:r>
-    </w:p>
-    <w:p>
-      <w:pPr>
-        <w:pStyle w:val="BodyText"/>
-        <w:spacing w:after="144"/>
-        <w:ind w:left="720"/>
-        <w:contextualSpacing/>
-      </w:pPr>
-      <w:r>
-        <w:t xml:space="preserve">{%p if </w:t>
-      </w:r>
-      <w:proofErr w:type="spellStart"/>
-      <w:r>
-        <w:t>consumer_</w:t>
-      </w:r>
-      <w:proofErr w:type="gramStart"/>
-      <w:r>
-        <w:t>protection.unlawful</w:t>
-      </w:r>
-      <w:proofErr w:type="gramEnd"/>
-      <w:r>
-        <w:t>_lease_terms</w:t>
-      </w:r>
-      <w:proofErr w:type="spellEnd"/>
-      <w:r>
-        <w:t xml:space="preserve"> %}</w:t>
-      </w:r>
-    </w:p>
-    <w:p>
-      <w:pPr>
-        <w:pStyle w:val="BodyText"/>
-        <w:numPr>
-          <w:ilvl w:val="1"/>
-          <w:numId w:val="14"/>
-        </w:numPr>
-        <w:suppressAutoHyphens/>
-        <w:spacing w:after="144"/>
-        <w:contextualSpacing/>
-      </w:pPr>
-      <w:r>
-        <w:t>There are unlawful terms in my lease.</w:t>
-      </w:r>
-    </w:p>
-    <w:p>
-      <w:pPr>
-        <w:pStyle w:val="BodyText"/>
-        <w:spacing w:after="144"/>
-        <w:ind w:left="720"/>
-        <w:contextualSpacing/>
-      </w:pPr>
-      <w:r>
-        <w:t>{%p endif %}</w:t>
-      </w:r>
-    </w:p>
-    <w:p>
-      <w:pPr>
-        <w:pStyle w:val="BodyText"/>
-        <w:spacing w:after="144"/>
-        <w:ind w:left="720"/>
-        <w:contextualSpacing/>
-      </w:pPr>
-      <w:r>
-        <w:t xml:space="preserve">{%p if </w:t>
-      </w:r>
-      <w:proofErr w:type="spellStart"/>
-      <w:r>
-        <w:t>consumer_</w:t>
-      </w:r>
-      <w:proofErr w:type="gramStart"/>
-      <w:r>
-        <w:t>protection.other</w:t>
-      </w:r>
-      <w:proofErr w:type="spellEnd"/>
-      <w:proofErr w:type="gramEnd"/>
-      <w:r>
-        <w:t xml:space="preserve"> %}</w:t>
-      </w:r>
-    </w:p>
-    <w:p>
-      <w:pPr>
-        <w:pStyle w:val="BodyText"/>
-        <w:numPr>
-          <w:ilvl w:val="1"/>
-          <w:numId w:val="14"/>
-        </w:numPr>
-        <w:suppressAutoHyphens/>
-        <w:spacing w:after="144"/>
-        <w:contextualSpacing/>
-      </w:pPr>
-      <w:r>
-        <w:t xml:space="preserve">Other: </w:t>
-      </w:r>
       <w:proofErr w:type="gramStart"/>
       <w:r>
         <w:t xml:space="preserve">{{ </w:t>
       </w:r>
       <w:proofErr w:type="spellStart"/>
       <w:r>
-        <w:t>consumer</w:t>
-      </w:r>
-      <w:proofErr w:type="gramEnd"/>
-      <w:r>
-        <w:t>_protection.other_reason</w:t>
+        <w:t>local</w:t>
+      </w:r>
+      <w:proofErr w:type="gramEnd"/>
+      <w:r>
+        <w:t>_occupancy_ordinance_counterclaim_summary</w:t>
       </w:r>
       <w:proofErr w:type="spellEnd"/>
       <w:r>
         <w:t xml:space="preserve"> }}</w:t>
       </w:r>
-    </w:p>
-    <w:p>
-      <w:pPr>
-        <w:pStyle w:val="BodyText"/>
-        <w:spacing w:after="144"/>
-        <w:ind w:left="720"/>
-        <w:contextualSpacing/>
-      </w:pPr>
-      <w:r>
-        <w:t>{%p endif %}</w:t>
-      </w:r>
-    </w:p>
-    <w:p>
-      <w:pPr>
-        <w:pStyle w:val="BodyText"/>
-      </w:pPr>
-      <w:r>
-        <w:t>Therefore, under G.L. c. 93A, I am entitled to statutory damages for each violation, or actual damages (doubled or trebled because the landlord’s conduct was willful and knowing), whichever</w:t>
-      </w:r>
       <w:r>
         <w:t xml:space="preserve"> </w:t>
-      </w:r>
-      <w:r>
-        <w:t>is greater.</w:t>
       </w:r>
     </w:p>
     <w:p>
@@ -5059,7 +5237,6 @@
         <w:rPr>
           <w:color w:val="000000"/>
         </w:rPr>
-        <w:lastRenderedPageBreak/>
         <w:t xml:space="preserve">Because </w:t>
       </w:r>
       <w:r>
@@ -5349,6 +5526,7 @@
         <w:ind w:left="1080"/>
       </w:pPr>
       <w:r>
+        <w:lastRenderedPageBreak/>
         <w:t xml:space="preserve">{%p for violation in </w:t>
       </w:r>
       <w:proofErr w:type="spellStart"/>
@@ -5488,7 +5666,6 @@
         <w:ind w:left="360"/>
       </w:pPr>
       <w:r>
-        <w:lastRenderedPageBreak/>
         <w:t xml:space="preserve">{%p if </w:t>
       </w:r>
       <w:proofErr w:type="spellStart"/>
@@ -5524,6 +5701,329 @@
       </w:pPr>
       <w:r>
         <w:t xml:space="preserve">The landlord required me to pay for water in violation of G.L. c. 186, §22. </w:t>
+      </w:r>
+    </w:p>
+    <w:p>
+      <w:pPr>
+        <w:pStyle w:val="BodyText"/>
+        <w:ind w:left="360"/>
+      </w:pPr>
+      <w:r>
+        <w:t>{%p endif %}</w:t>
+      </w:r>
+    </w:p>
+    <w:p>
+      <w:pPr>
+        <w:pStyle w:val="BodyText"/>
+        <w:ind w:left="360"/>
+      </w:pPr>
+    </w:p>
+    <w:p>
+      <w:pPr>
+        <w:pStyle w:val="BodyText"/>
+        <w:ind w:left="360"/>
+      </w:pPr>
+      <w:r>
+        <w:t xml:space="preserve">{%p if </w:t>
+      </w:r>
+      <w:proofErr w:type="spellStart"/>
+      <w:r>
+        <w:t>has_city_specific_occupancy_ordinance</w:t>
+      </w:r>
+      <w:proofErr w:type="spellEnd"/>
+      <w:r>
+        <w:t xml:space="preserve"> and </w:t>
+      </w:r>
+      <w:proofErr w:type="spellStart"/>
+      <w:r>
+        <w:t>occupancy_ordinance_applies</w:t>
+      </w:r>
+      <w:proofErr w:type="spellEnd"/>
+      <w:r>
+        <w:t xml:space="preserve"> %}</w:t>
+      </w:r>
+    </w:p>
+    <w:p>
+      <w:pPr>
+        <w:pStyle w:val="BodyText"/>
+        <w:numPr>
+          <w:ilvl w:val="0"/>
+          <w:numId w:val="14"/>
+        </w:numPr>
+        <w:suppressAutoHyphens/>
+      </w:pPr>
+      <w:r>
+        <w:t xml:space="preserve">Local Occupancy Permit or Apartment Certification Requirement. I live in </w:t>
+      </w:r>
+      <w:proofErr w:type="gramStart"/>
+      <w:r>
+        <w:t xml:space="preserve">{{ </w:t>
+      </w:r>
+      <w:proofErr w:type="spellStart"/>
+      <w:r>
+        <w:t>tenant</w:t>
+      </w:r>
+      <w:proofErr w:type="gramEnd"/>
+      <w:r>
+        <w:t>.address.city</w:t>
+      </w:r>
+      <w:proofErr w:type="spellEnd"/>
+      <w:r>
+        <w:t xml:space="preserve"> }}, where local law may require a landlord to have a valid occupancy permit or apartment certification before collecting rent. {% if </w:t>
+      </w:r>
+      <w:proofErr w:type="spellStart"/>
+      <w:r>
+        <w:t>occupancy_ordinance_use_as_defense</w:t>
+      </w:r>
+      <w:proofErr w:type="spellEnd"/>
+      <w:r>
+        <w:t xml:space="preserve"> and </w:t>
+      </w:r>
+      <w:proofErr w:type="spellStart"/>
+      <w:r>
+        <w:t>plead_counterclaims</w:t>
+      </w:r>
+      <w:proofErr w:type="spellEnd"/>
+      <w:r>
+        <w:t xml:space="preserve"> and </w:t>
+      </w:r>
+      <w:proofErr w:type="spellStart"/>
+      <w:r>
+        <w:t>occupancy_ordinance_use_as_counterclaim</w:t>
+      </w:r>
+      <w:proofErr w:type="spellEnd"/>
+      <w:r>
+        <w:t xml:space="preserve"> %}I raise this as both a defense and a counterclaim.{% </w:t>
+      </w:r>
+      <w:proofErr w:type="spellStart"/>
+      <w:r>
+        <w:t>elif</w:t>
+      </w:r>
+      <w:proofErr w:type="spellEnd"/>
+      <w:r>
+        <w:t xml:space="preserve"> </w:t>
+      </w:r>
+      <w:proofErr w:type="spellStart"/>
+      <w:r>
+        <w:t>occupancy_ordinance_use_as_defense</w:t>
+      </w:r>
+      <w:proofErr w:type="spellEnd"/>
+      <w:r>
+        <w:t xml:space="preserve"> %}I raise this as a defense.{% </w:t>
+      </w:r>
+      <w:proofErr w:type="spellStart"/>
+      <w:r>
+        <w:t>elif</w:t>
+      </w:r>
+      <w:proofErr w:type="spellEnd"/>
+      <w:r>
+        <w:t xml:space="preserve"> </w:t>
+      </w:r>
+      <w:proofErr w:type="spellStart"/>
+      <w:r>
+        <w:t>plead_counterclaims</w:t>
+      </w:r>
+      <w:proofErr w:type="spellEnd"/>
+      <w:r>
+        <w:t xml:space="preserve"> and </w:t>
+      </w:r>
+      <w:proofErr w:type="spellStart"/>
+      <w:r>
+        <w:t>occupancy_ordinance_use_as_counterclaim</w:t>
+      </w:r>
+      <w:proofErr w:type="spellEnd"/>
+      <w:r>
+        <w:t xml:space="preserve"> %}I raise this as a counterclaim.{% endif %}</w:t>
+      </w:r>
+    </w:p>
+    <w:p>
+      <w:pPr>
+        <w:pStyle w:val="BodyText"/>
+        <w:numPr>
+          <w:ilvl w:val="0"/>
+          <w:numId w:val="14"/>
+        </w:numPr>
+      </w:pPr>
+      <w:r>
+        <w:t xml:space="preserve">The applicable local ordinance is: </w:t>
+      </w:r>
+      <w:proofErr w:type="gramStart"/>
+      <w:r>
+        <w:t xml:space="preserve">{{ </w:t>
+      </w:r>
+      <w:proofErr w:type="spellStart"/>
+      <w:r>
+        <w:t>local</w:t>
+      </w:r>
+      <w:proofErr w:type="gramEnd"/>
+      <w:r>
+        <w:t>_occupancy_ordinance_name</w:t>
+      </w:r>
+      <w:proofErr w:type="spellEnd"/>
+      <w:r>
+        <w:t xml:space="preserve"> }}.</w:t>
+      </w:r>
+    </w:p>
+    <w:p>
+      <w:pPr>
+        <w:pStyle w:val="BodyText"/>
+        <w:ind w:left="360"/>
+      </w:pPr>
+      <w:r>
+        <w:t xml:space="preserve">{%p if </w:t>
+      </w:r>
+      <w:proofErr w:type="spellStart"/>
+      <w:r>
+        <w:t>local_occupancy_ordinance_requirement</w:t>
+      </w:r>
+      <w:proofErr w:type="spellEnd"/>
+      <w:r>
+        <w:t xml:space="preserve"> %}</w:t>
+      </w:r>
+    </w:p>
+    <w:p>
+      <w:pPr>
+        <w:pStyle w:val="BodyText"/>
+        <w:numPr>
+          <w:ilvl w:val="0"/>
+          <w:numId w:val="14"/>
+        </w:numPr>
+      </w:pPr>
+      <w:proofErr w:type="gramStart"/>
+      <w:r>
+        <w:t xml:space="preserve">{{ </w:t>
+      </w:r>
+      <w:proofErr w:type="spellStart"/>
+      <w:r>
+        <w:t>local</w:t>
+      </w:r>
+      <w:proofErr w:type="gramEnd"/>
+      <w:r>
+        <w:t>_occupancy_ordinance_requirement</w:t>
+      </w:r>
+      <w:proofErr w:type="spellEnd"/>
+      <w:r>
+        <w:t xml:space="preserve"> }}</w:t>
+      </w:r>
+    </w:p>
+    <w:p>
+      <w:pPr>
+        <w:pStyle w:val="BodyText"/>
+        <w:ind w:left="360"/>
+      </w:pPr>
+      <w:r>
+        <w:t>{%p endif %}</w:t>
+      </w:r>
+    </w:p>
+    <w:p>
+      <w:pPr>
+        <w:pStyle w:val="BodyText"/>
+        <w:ind w:firstLine="360"/>
+      </w:pPr>
+      <w:r>
+        <w:t xml:space="preserve">{%p if </w:t>
+      </w:r>
+      <w:proofErr w:type="spellStart"/>
+      <w:r>
+        <w:t>occupancy_ordinance_use_as_defense</w:t>
+      </w:r>
+      <w:proofErr w:type="spellEnd"/>
+      <w:r>
+        <w:t xml:space="preserve"> %}</w:t>
+      </w:r>
+    </w:p>
+    <w:p>
+      <w:pPr>
+        <w:pStyle w:val="BodyText"/>
+        <w:numPr>
+          <w:ilvl w:val="0"/>
+          <w:numId w:val="14"/>
+        </w:numPr>
+      </w:pPr>
+      <w:proofErr w:type="gramStart"/>
+      <w:r>
+        <w:t xml:space="preserve">{{ </w:t>
+      </w:r>
+      <w:proofErr w:type="spellStart"/>
+      <w:r>
+        <w:t>local</w:t>
+      </w:r>
+      <w:proofErr w:type="gramEnd"/>
+      <w:r>
+        <w:t>_occupancy_ordinance_defense_summary</w:t>
+      </w:r>
+      <w:proofErr w:type="spellEnd"/>
+      <w:r>
+        <w:t xml:space="preserve"> }}</w:t>
+      </w:r>
+    </w:p>
+    <w:p>
+      <w:pPr>
+        <w:pStyle w:val="BodyText"/>
+        <w:ind w:left="360"/>
+      </w:pPr>
+      <w:r>
+        <w:t>{%p endif %}</w:t>
+      </w:r>
+    </w:p>
+    <w:p>
+      <w:pPr>
+        <w:pStyle w:val="BodyText"/>
+        <w:ind w:firstLine="360"/>
+      </w:pPr>
+      <w:r>
+        <w:t xml:space="preserve">{%p if </w:t>
+      </w:r>
+      <w:proofErr w:type="spellStart"/>
+      <w:r>
+        <w:t>plead_counterclaims</w:t>
+      </w:r>
+      <w:proofErr w:type="spellEnd"/>
+      <w:r>
+        <w:t xml:space="preserve"> and </w:t>
+      </w:r>
+      <w:proofErr w:type="spellStart"/>
+      <w:r>
+        <w:t>occupancy_ordinance_use_as_counterclaim</w:t>
+      </w:r>
+      <w:proofErr w:type="spellEnd"/>
+      <w:r>
+        <w:t xml:space="preserve"> %}</w:t>
+      </w:r>
+    </w:p>
+    <w:p>
+      <w:pPr>
+        <w:pStyle w:val="BodyText"/>
+        <w:numPr>
+          <w:ilvl w:val="0"/>
+          <w:numId w:val="14"/>
+        </w:numPr>
+      </w:pPr>
+      <w:proofErr w:type="gramStart"/>
+      <w:r>
+        <w:lastRenderedPageBreak/>
+        <w:t xml:space="preserve">{{ </w:t>
+      </w:r>
+      <w:proofErr w:type="spellStart"/>
+      <w:r>
+        <w:t>local</w:t>
+      </w:r>
+      <w:proofErr w:type="gramEnd"/>
+      <w:r>
+        <w:t>_occupancy_ordinance_counterclaim_summary</w:t>
+      </w:r>
+      <w:proofErr w:type="spellEnd"/>
+      <w:r>
+        <w:t xml:space="preserve"> }}</w:t>
+      </w:r>
+    </w:p>
+    <w:p>
+      <w:pPr>
+        <w:pStyle w:val="BodyText"/>
+        <w:ind w:firstLine="360"/>
+      </w:pPr>
+      <w:r>
+        <w:t>{%p endif %}</w:t>
       </w:r>
     </w:p>
     <w:p>
@@ -7502,6 +8002,7 @@
         <w:t>('include_SignatureBlock.docx')}}</w:t>
       </w:r>
     </w:p>
+    <w:p/>
     <w:p/>
     <w:p/>
     <w:sectPr>
@@ -9597,6 +10098,119 @@
     </w:lvl>
   </w:abstractNum>
   <w:abstractNum w:abstractNumId="18" w15:restartNumberingAfterBreak="0">
+    <w:nsid w:val="79A15AEB"/>
+    <w:multiLevelType w:val="multilevel"/>
+    <w:tmpl w:val="63DECA5E"/>
+    <w:lvl w:ilvl="0">
+      <w:start w:val="1"/>
+      <w:numFmt w:val="decimal"/>
+      <w:lvlText w:val="%1."/>
+      <w:lvlJc w:val="left"/>
+      <w:pPr>
+        <w:tabs>
+          <w:tab w:val="num" w:pos="0"/>
+        </w:tabs>
+        <w:ind w:left="720" w:hanging="360"/>
+      </w:pPr>
+    </w:lvl>
+    <w:lvl w:ilvl="1">
+      <w:start w:val="1"/>
+      <w:numFmt w:val="lowerLetter"/>
+      <w:lvlText w:val="%2."/>
+      <w:lvlJc w:val="left"/>
+      <w:pPr>
+        <w:tabs>
+          <w:tab w:val="num" w:pos="0"/>
+        </w:tabs>
+        <w:ind w:left="1080" w:hanging="360"/>
+      </w:pPr>
+    </w:lvl>
+    <w:lvl w:ilvl="2">
+      <w:start w:val="1"/>
+      <w:numFmt w:val="decimal"/>
+      <w:lvlText w:val="%3."/>
+      <w:lvlJc w:val="left"/>
+      <w:pPr>
+        <w:tabs>
+          <w:tab w:val="num" w:pos="0"/>
+        </w:tabs>
+        <w:ind w:left="1440" w:hanging="360"/>
+      </w:pPr>
+    </w:lvl>
+    <w:lvl w:ilvl="3">
+      <w:start w:val="1"/>
+      <w:numFmt w:val="decimal"/>
+      <w:lvlText w:val="%4."/>
+      <w:lvlJc w:val="left"/>
+      <w:pPr>
+        <w:tabs>
+          <w:tab w:val="num" w:pos="0"/>
+        </w:tabs>
+        <w:ind w:left="1800" w:hanging="360"/>
+      </w:pPr>
+    </w:lvl>
+    <w:lvl w:ilvl="4">
+      <w:start w:val="1"/>
+      <w:numFmt w:val="decimal"/>
+      <w:lvlText w:val="%5."/>
+      <w:lvlJc w:val="left"/>
+      <w:pPr>
+        <w:tabs>
+          <w:tab w:val="num" w:pos="0"/>
+        </w:tabs>
+        <w:ind w:left="2160" w:hanging="360"/>
+      </w:pPr>
+    </w:lvl>
+    <w:lvl w:ilvl="5">
+      <w:start w:val="1"/>
+      <w:numFmt w:val="decimal"/>
+      <w:lvlText w:val="%6."/>
+      <w:lvlJc w:val="left"/>
+      <w:pPr>
+        <w:tabs>
+          <w:tab w:val="num" w:pos="0"/>
+        </w:tabs>
+        <w:ind w:left="2520" w:hanging="360"/>
+      </w:pPr>
+    </w:lvl>
+    <w:lvl w:ilvl="6">
+      <w:start w:val="1"/>
+      <w:numFmt w:val="decimal"/>
+      <w:lvlText w:val="%7."/>
+      <w:lvlJc w:val="left"/>
+      <w:pPr>
+        <w:tabs>
+          <w:tab w:val="num" w:pos="0"/>
+        </w:tabs>
+        <w:ind w:left="2880" w:hanging="360"/>
+      </w:pPr>
+    </w:lvl>
+    <w:lvl w:ilvl="7">
+      <w:start w:val="1"/>
+      <w:numFmt w:val="decimal"/>
+      <w:lvlText w:val="%8."/>
+      <w:lvlJc w:val="left"/>
+      <w:pPr>
+        <w:tabs>
+          <w:tab w:val="num" w:pos="0"/>
+        </w:tabs>
+        <w:ind w:left="3240" w:hanging="360"/>
+      </w:pPr>
+    </w:lvl>
+    <w:lvl w:ilvl="8">
+      <w:start w:val="1"/>
+      <w:numFmt w:val="decimal"/>
+      <w:lvlText w:val="%9."/>
+      <w:lvlJc w:val="left"/>
+      <w:pPr>
+        <w:tabs>
+          <w:tab w:val="num" w:pos="0"/>
+        </w:tabs>
+        <w:ind w:left="3600" w:hanging="360"/>
+      </w:pPr>
+    </w:lvl>
+  </w:abstractNum>
+  <w:abstractNum w:abstractNumId="19" w15:restartNumberingAfterBreak="0">
     <w:nsid w:val="7D630F78"/>
     <w:multiLevelType w:val="multilevel"/>
     <w:tmpl w:val="63DECA5E"/>
@@ -9749,7 +10363,7 @@
     <w:abstractNumId w:val="7"/>
   </w:num>
   <w:num w:numId="14" w16cid:durableId="1469974183">
-    <w:abstractNumId w:val="18"/>
+    <w:abstractNumId w:val="19"/>
   </w:num>
   <w:num w:numId="15" w16cid:durableId="881092125">
     <w:abstractNumId w:val="12"/>
@@ -9765,6 +10379,9 @@
   </w:num>
   <w:num w:numId="19" w16cid:durableId="1161317211">
     <w:abstractNumId w:val="5"/>
+  </w:num>
+  <w:num w:numId="20" w16cid:durableId="972828813">
+    <w:abstractNumId w:val="18"/>
   </w:num>
 </w:numbering>
 </file>
@@ -10168,7 +10785,6 @@
   <w:style w:type="character" w:default="1" w:styleId="DefaultParagraphFont">
     <w:name w:val="Default Paragraph Font"/>
     <w:uiPriority w:val="1"/>
-    <w:semiHidden/>
     <w:unhideWhenUsed/>
   </w:style>
   <w:style w:type="table" w:default="1" w:styleId="TableNormal">

</xml_diff>

<commit_message>
Made sure to check if the occupancy ordinance applies.
</commit_message>
<xml_diff>
--- a/docassemble/MAEvictionDefense/data/templates/SummaryProcessAnswer.docx
+++ b/docassemble/MAEvictionDefense/data/templates/SummaryProcessAnswer.docx
@@ -5925,11 +5925,14 @@
       </w:r>
       <w:proofErr w:type="spellStart"/>
       <w:r>
-        <w:t>occupancy_ordinance_use_as_defense</w:t>
-      </w:r>
-      <w:proofErr w:type="spellEnd"/>
-      <w:r>
-        <w:t xml:space="preserve"> %}</w:t>
+        <w:t>occupancy_ordinance_defense_selected</w:t>
+      </w:r>
+      <w:proofErr w:type="spellEnd"/>
+      <w:r>
+        <w:t xml:space="preserve"> </w:t>
+      </w:r>
+      <w:r>
+        <w:t>%}</w:t>
       </w:r>
     </w:p>
     <w:p>

</xml_diff>

<commit_message>
Sync/updated changes to DOCX merged in from main.
</commit_message>
<xml_diff>
--- a/docassemble/MAEvictionDefense/data/templates/SummaryProcessAnswer.docx
+++ b/docassemble/MAEvictionDefense/data/templates/SummaryProcessAnswer.docx
@@ -154,76 +154,6 @@
         <w:t>) }}</w:t>
       </w:r>
     </w:p>
-    <w:p/>
-    <w:p>
-      <w:pPr>
-        <w:spacing w:line="276" w:lineRule="auto"/>
-      </w:pPr>
-      <w:r>
-        <w:rPr>
-          <w:b/>
-        </w:rPr>
-        <w:t xml:space="preserve">TRIAL DATE: {% if </w:t>
-      </w:r>
-      <w:proofErr w:type="spellStart"/>
-      <w:proofErr w:type="gramStart"/>
-      <w:r>
-        <w:t>case.status</w:t>
-      </w:r>
-      <w:proofErr w:type="spellEnd"/>
-      <w:proofErr w:type="gramEnd"/>
-      <w:r>
-        <w:t xml:space="preserve"> == "late" %} {{</w:t>
-      </w:r>
-      <w:proofErr w:type="spellStart"/>
-      <w:r>
-        <w:t>case.original_date</w:t>
-      </w:r>
-      <w:proofErr w:type="spellEnd"/>
-      <w:r>
-        <w:t>}}(No Discovery requested)</w:t>
-      </w:r>
-    </w:p>
-    <w:p>
-      <w:pPr>
-        <w:spacing w:line="276" w:lineRule="auto"/>
-      </w:pPr>
-      <w:r>
-        <w:t xml:space="preserve">{% endif </w:t>
-      </w:r>
-      <w:proofErr w:type="gramStart"/>
-      <w:r>
-        <w:t>%}{</w:t>
-      </w:r>
-      <w:proofErr w:type="gramEnd"/>
-      <w:r>
-        <w:t xml:space="preserve">% if </w:t>
-      </w:r>
-      <w:proofErr w:type="spellStart"/>
-      <w:r>
-        <w:t>case.status</w:t>
-      </w:r>
-      <w:proofErr w:type="spellEnd"/>
-      <w:r>
-        <w:t xml:space="preserve"> == "summons" %}Rescheduled Trial Date: {{</w:t>
-      </w:r>
-      <w:proofErr w:type="spellStart"/>
-      <w:r>
-        <w:t>case.rescheduled_date</w:t>
-      </w:r>
-      <w:proofErr w:type="spellEnd"/>
-      <w:r>
-        <w:t>}} (Discovery requested)</w:t>
-      </w:r>
-    </w:p>
-    <w:p>
-      <w:pPr>
-        <w:spacing w:line="276" w:lineRule="auto"/>
-      </w:pPr>
-      <w:r>
-        <w:t>{% endif %}</w:t>
-      </w:r>
-    </w:p>
     <w:p>
       <w:pPr>
         <w:pStyle w:val="CenterTitle"/>
@@ -272,15 +202,15 @@
       </w:r>
       <w:proofErr w:type="spellStart"/>
       <w:r>
-        <w:t>tenant</w:t>
-      </w:r>
-      <w:proofErr w:type="gramEnd"/>
-      <w:r>
-        <w:t>.address.on_one_line</w:t>
-      </w:r>
-      <w:proofErr w:type="spellEnd"/>
-      <w:r>
-        <w:t xml:space="preserve">() }}. I moved in on or about </w:t>
+        <w:t>premises</w:t>
+      </w:r>
+      <w:proofErr w:type="gramEnd"/>
+      <w:r>
+        <w:t>_address</w:t>
+      </w:r>
+      <w:proofErr w:type="spellEnd"/>
+      <w:r>
+        <w:t xml:space="preserve"> }}. I moved in on or about </w:t>
       </w:r>
       <w:proofErr w:type="gramStart"/>
       <w:r>
@@ -654,7 +584,6 @@
           <w:rFonts w:cs="Times New Roman"/>
           <w:shd w:val="clear" w:color="auto" w:fill="FFFFFF"/>
         </w:rPr>
-        <w:lastRenderedPageBreak/>
         <w:t>I received a Notice to Quit for nonpayment of rent, but did not receive with it a required form called “Form to Accompany Residential Notice to Quit” about my rights, including how to get rental assistance and court rules on evictions.</w:t>
       </w:r>
     </w:p>
@@ -697,6 +626,7 @@
         <w:suppressAutoHyphens/>
       </w:pPr>
       <w:r>
+        <w:lastRenderedPageBreak/>
         <w:t xml:space="preserve">The landlord did not terminate my tenancy properly, for reasons not limited to but including the following: </w:t>
       </w:r>
     </w:p>
@@ -1157,7 +1087,6 @@
         <w:ind w:left="360"/>
       </w:pPr>
       <w:r>
-        <w:lastRenderedPageBreak/>
         <w:t>{%p endif %}</w:t>
       </w:r>
     </w:p>
@@ -1197,6 +1126,7 @@
         <w:ind w:left="360"/>
       </w:pPr>
       <w:r>
+        <w:lastRenderedPageBreak/>
         <w:t>{%p endif %}</w:t>
       </w:r>
     </w:p>
@@ -1640,7 +1570,6 @@
         <w:contextualSpacing/>
       </w:pPr>
       <w:r>
-        <w:lastRenderedPageBreak/>
         <w:t xml:space="preserve">{%p if </w:t>
       </w:r>
       <w:proofErr w:type="spellStart"/>
@@ -1672,7 +1601,11 @@
         <w:contextualSpacing/>
       </w:pPr>
       <w:r>
-        <w:t>I am a tenant in public or subsidized housing and the landlord did not give me my right to a grievance hearing or conference as required by the lease and/or program rules or I requested a hearing/</w:t>
+        <w:t xml:space="preserve">I am a tenant in public or subsidized housing and the landlord did not give me my right to a grievance hearing or conference as required by the lease and/or program </w:t>
+      </w:r>
+      <w:r>
+        <w:lastRenderedPageBreak/>
+        <w:t>rules or I requested a hearing/</w:t>
       </w:r>
       <w:proofErr w:type="gramStart"/>
       <w:r>
@@ -2130,7 +2063,6 @@
         <w:contextualSpacing/>
       </w:pPr>
       <w:r>
-        <w:lastRenderedPageBreak/>
         <w:t>{%p endif %}</w:t>
       </w:r>
     </w:p>
@@ -2170,6 +2102,7 @@
         <w:contextualSpacing/>
       </w:pPr>
       <w:r>
+        <w:lastRenderedPageBreak/>
         <w:t>I or a member of my household reported an incident of domestic violence, rape, sexual assault or stalking to law enforcement or reported a violation of a protection or harassment prevention order.</w:t>
       </w:r>
     </w:p>
@@ -5211,7 +5144,7 @@
         <w:rPr>
           <w:color w:val="000000"/>
         </w:rPr>
-        <w:t>St. 2020, Ch. 257 (Section 2(b)) amended by St. 2021, c. 20.</w:t>
+        <w:t>G.L. c. 239, § 15</w:t>
       </w:r>
       <w:r>
         <w:rPr>
@@ -5761,11 +5694,11 @@
       </w:r>
       <w:proofErr w:type="spellStart"/>
       <w:r>
-        <w:t>tenant</w:t>
-      </w:r>
-      <w:proofErr w:type="gramEnd"/>
-      <w:r>
-        <w:t>.address.city</w:t>
+        <w:t>premises</w:t>
+      </w:r>
+      <w:proofErr w:type="gramEnd"/>
+      <w:r>
+        <w:t>_city</w:t>
       </w:r>
       <w:proofErr w:type="spellEnd"/>
       <w:r>
@@ -7630,7 +7563,7 @@
         <w:suppressAutoHyphens/>
       </w:pPr>
       <w:r>
-        <w:t>The court should postpone this case for as such time as needed for a determination of all available rental assistance and upon approval and payment of the full rent due, the landlord’s claims for rent and possession must be dismissed. St. 2020, Ch. 257 (Section 2(b)) amended by St. 2021, c. 20.</w:t>
+        <w:t>The court should postpone this case for as such time as needed for a determination of all available rental assistance and upon approval and payment of the full rent due, the landlord’s claims for rent and possession must be dismissed. G.L. c. 239, § 15.</w:t>
       </w:r>
     </w:p>
     <w:p>
@@ -7810,7 +7743,6 @@
         <w:pStyle w:val="BodyText"/>
       </w:pPr>
       <w:r>
-        <w:lastRenderedPageBreak/>
         <w:t xml:space="preserve">{% if </w:t>
       </w:r>
       <w:proofErr w:type="spellStart"/>
@@ -8005,6 +7937,7 @@
         <w:t>('include_SignatureBlock.docx')}}</w:t>
       </w:r>
     </w:p>
+    <w:p/>
     <w:p/>
     <w:p/>
     <w:p/>
@@ -10788,6 +10721,7 @@
   <w:style w:type="character" w:default="1" w:styleId="DefaultParagraphFont">
     <w:name w:val="Default Paragraph Font"/>
     <w:uiPriority w:val="1"/>
+    <w:semiHidden/>
     <w:unhideWhenUsed/>
   </w:style>
   <w:style w:type="table" w:default="1" w:styleId="TableNormal">

</xml_diff>